<commit_message>
Start Curious Mode Response Algorithm Design
</commit_message>
<xml_diff>
--- a/Documents/SwiftBot Task10 - Requirements (1).docx
+++ b/Documents/SwiftBot Task10 - Requirements (1).docx
@@ -1596,7 +1596,7 @@
                 </mc:Choice>
                 <mc:Fallback>
                   <w:pict>
-                    <v:shapetype w14:anchorId="68A72434" id="_x0000_t32" coordsize="21600,21600" o:spt="32" o:oned="t" path="m,l21600,21600e" filled="f">
+                    <v:shapetype w14:anchorId="3F575BA3" id="_x0000_t32" coordsize="21600,21600" o:spt="32" o:oned="t" path="m,l21600,21600e" filled="f">
                       <v:path arrowok="t" fillok="f" o:connecttype="none"/>
                       <o:lock v:ext="edit" shapetype="t"/>
                     </v:shapetype>
@@ -1678,7 +1678,7 @@
                 </mc:Choice>
                 <mc:Fallback>
                   <w:pict>
-                    <v:shape w14:anchorId="0BF0482C" id="Straight Arrow Connector 2" o:spid="_x0000_s1026" type="#_x0000_t32" style="position:absolute;margin-left:36.85pt;margin-top:8.25pt;width:29.5pt;height:0;z-index:251650560;visibility:visible;mso-wrap-style:square;mso-wrap-distance-left:9pt;mso-wrap-distance-top:0;mso-wrap-distance-right:9pt;mso-wrap-distance-bottom:0;mso-position-horizontal:absolute;mso-position-horizontal-relative:text;mso-position-vertical:absolute;mso-position-vertical-relative:text" o:gfxdata="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" strokecolor="#156082 [3204]" strokeweight="1.5pt">
+                    <v:shape w14:anchorId="4EB3FEB6" id="Straight Arrow Connector 2" o:spid="_x0000_s1026" type="#_x0000_t32" style="position:absolute;margin-left:36.85pt;margin-top:8.25pt;width:29.5pt;height:0;z-index:251650560;visibility:visible;mso-wrap-style:square;mso-wrap-distance-left:9pt;mso-wrap-distance-top:0;mso-wrap-distance-right:9pt;mso-wrap-distance-bottom:0;mso-position-horizontal:absolute;mso-position-horizontal-relative:text;mso-position-vertical:absolute;mso-position-vertical-relative:text" o:gfxdata="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" strokecolor="#156082 [3204]" strokeweight="1.5pt">
                       <v:stroke endarrow="block" joinstyle="miter"/>
                     </v:shape>
                   </w:pict>
@@ -1835,7 +1835,7 @@
                 </mc:Choice>
                 <mc:Fallback>
                   <w:pict>
-                    <v:shape w14:anchorId="081F12B4" id="Straight Arrow Connector 3" o:spid="_x0000_s1026" type="#_x0000_t32" style="position:absolute;margin-left:46.35pt;margin-top:7.9pt;width:29pt;height:0;z-index:251651584;visibility:visible;mso-wrap-style:square;mso-wrap-distance-left:9pt;mso-wrap-distance-top:0;mso-wrap-distance-right:9pt;mso-wrap-distance-bottom:0;mso-position-horizontal:absolute;mso-position-horizontal-relative:text;mso-position-vertical:absolute;mso-position-vertical-relative:text" o:gfxdata="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" strokecolor="#156082 [3204]" strokeweight="1.5pt">
+                    <v:shape w14:anchorId="18CBB484" id="Straight Arrow Connector 3" o:spid="_x0000_s1026" type="#_x0000_t32" style="position:absolute;margin-left:46.35pt;margin-top:7.9pt;width:29pt;height:0;z-index:251651584;visibility:visible;mso-wrap-style:square;mso-wrap-distance-left:9pt;mso-wrap-distance-top:0;mso-wrap-distance-right:9pt;mso-wrap-distance-bottom:0;mso-position-horizontal:absolute;mso-position-horizontal-relative:text;mso-position-vertical:absolute;mso-position-vertical-relative:text" o:gfxdata="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" strokecolor="#156082 [3204]" strokeweight="1.5pt">
                       <v:stroke endarrow="block" joinstyle="miter"/>
                     </v:shape>
                   </w:pict>
@@ -1922,7 +1922,7 @@
                 </mc:Choice>
                 <mc:Fallback>
                   <w:pict>
-                    <v:shape w14:anchorId="61412886" id="Straight Arrow Connector 4" o:spid="_x0000_s1026" type="#_x0000_t32" style="position:absolute;margin-left:46.85pt;margin-top:5.75pt;width:30.5pt;height:.5pt;z-index:251653632;visibility:visible;mso-wrap-style:square;mso-wrap-distance-left:9pt;mso-wrap-distance-top:0;mso-wrap-distance-right:9pt;mso-wrap-distance-bottom:0;mso-position-horizontal:absolute;mso-position-horizontal-relative:text;mso-position-vertical:absolute;mso-position-vertical-relative:text" o:gfxdata="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" strokecolor="#156082 [3204]" strokeweight="1.5pt">
+                    <v:shape w14:anchorId="1A04B827" id="Straight Arrow Connector 4" o:spid="_x0000_s1026" type="#_x0000_t32" style="position:absolute;margin-left:46.85pt;margin-top:5.75pt;width:30.5pt;height:.5pt;z-index:251653632;visibility:visible;mso-wrap-style:square;mso-wrap-distance-left:9pt;mso-wrap-distance-top:0;mso-wrap-distance-right:9pt;mso-wrap-distance-bottom:0;mso-position-horizontal:absolute;mso-position-horizontal-relative:text;mso-position-vertical:absolute;mso-position-vertical-relative:text" o:gfxdata="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" strokecolor="#156082 [3204]" strokeweight="1.5pt">
                       <v:stroke endarrow="block" joinstyle="miter"/>
                     </v:shape>
                   </w:pict>
@@ -3840,7 +3840,7 @@
           </mc:Choice>
           <mc:Fallback>
             <w:pict>
-              <v:oval w14:anchorId="5A381368" id="Oval 1" o:spid="_x0000_s1026" style="position:absolute;margin-left:158.95pt;margin-top:2.1pt;width:138.55pt;height:52.95pt;z-index:251655680;visibility:visible;mso-wrap-style:square;mso-width-percent:0;mso-wrap-distance-left:9pt;mso-wrap-distance-top:0;mso-wrap-distance-right:9pt;mso-wrap-distance-bottom:0;mso-position-horizontal:absolute;mso-position-horizontal-relative:text;mso-position-vertical:absolute;mso-position-vertical-relative:text;mso-width-percent:0;mso-width-relative:margin;v-text-anchor:middle" o:gfxdata="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" fillcolor="#156082 [3204]" strokecolor="#030e13 [484]" strokeweight="1.5pt">
+              <v:oval w14:anchorId="4C2E978A" id="Oval 1" o:spid="_x0000_s1026" style="position:absolute;margin-left:158.95pt;margin-top:2.1pt;width:138.55pt;height:52.95pt;z-index:251655680;visibility:visible;mso-wrap-style:square;mso-width-percent:0;mso-wrap-distance-left:9pt;mso-wrap-distance-top:0;mso-wrap-distance-right:9pt;mso-wrap-distance-bottom:0;mso-position-horizontal:absolute;mso-position-horizontal-relative:text;mso-position-vertical:absolute;mso-position-vertical-relative:text;mso-width-percent:0;mso-width-relative:margin;v-text-anchor:middle" o:gfxdata="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" fillcolor="#156082 [3204]" strokecolor="#030e13 [484]" strokeweight="1.5pt">
                 <v:stroke joinstyle="miter"/>
               </v:oval>
             </w:pict>
@@ -4021,7 +4021,7 @@
           </mc:Choice>
           <mc:Fallback>
             <w:pict>
-              <v:line w14:anchorId="591A23F3" id="Straight Connector 3" o:spid="_x0000_s1026" style="position:absolute;z-index:251658752;visibility:visible;mso-wrap-style:square;mso-wrap-distance-left:9pt;mso-wrap-distance-top:0;mso-wrap-distance-right:9pt;mso-wrap-distance-bottom:0;mso-position-horizontal:absolute;mso-position-horizontal-relative:text;mso-position-vertical:absolute;mso-position-vertical-relative:text" from="227.55pt,9.7pt" to="227.55pt,51.8pt" o:gfxdata="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" strokecolor="#156082 [3204]" strokeweight="1.5pt">
+              <v:line w14:anchorId="300D304E" id="Straight Connector 3" o:spid="_x0000_s1026" style="position:absolute;z-index:251658752;visibility:visible;mso-wrap-style:square;mso-wrap-distance-left:9pt;mso-wrap-distance-top:0;mso-wrap-distance-right:9pt;mso-wrap-distance-bottom:0;mso-position-horizontal:absolute;mso-position-horizontal-relative:text;mso-position-vertical:absolute;mso-position-vertical-relative:text" from="227.55pt,9.7pt" to="227.55pt,51.8pt" o:gfxdata="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" strokecolor="#156082 [3204]" strokeweight="1.5pt">
                 <v:stroke joinstyle="miter"/>
               </v:line>
             </w:pict>
@@ -4107,7 +4107,7 @@
           </mc:Choice>
           <mc:Fallback>
             <w:pict>
-              <v:rect w14:anchorId="51D23D60" id="Rectangle 8" o:spid="_x0000_s1026" style="position:absolute;margin-left:118.5pt;margin-top:5.1pt;width:221pt;height:35.5pt;z-index:251649024;visibility:visible;mso-wrap-style:square;mso-width-percent:0;mso-height-percent:0;mso-wrap-distance-left:9pt;mso-wrap-distance-top:0;mso-wrap-distance-right:9pt;mso-wrap-distance-bottom:0;mso-position-horizontal:absolute;mso-position-horizontal-relative:text;mso-position-vertical:absolute;mso-position-vertical-relative:text;mso-width-percent:0;mso-height-percent:0;mso-width-relative:margin;mso-height-relative:margin;v-text-anchor:middle" o:gfxdata="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" fillcolor="#156082 [3204]" strokecolor="#030e13 [484]" strokeweight="1.5pt"/>
+              <v:rect w14:anchorId="45008092" id="Rectangle 8" o:spid="_x0000_s1026" style="position:absolute;margin-left:118.5pt;margin-top:5.1pt;width:221pt;height:35.5pt;z-index:251649024;visibility:visible;mso-wrap-style:square;mso-width-percent:0;mso-height-percent:0;mso-wrap-distance-left:9pt;mso-wrap-distance-top:0;mso-wrap-distance-right:9pt;mso-wrap-distance-bottom:0;mso-position-horizontal:absolute;mso-position-horizontal-relative:text;mso-position-vertical:absolute;mso-position-vertical-relative:text;mso-width-percent:0;mso-height-percent:0;mso-width-relative:margin;mso-height-relative:margin;v-text-anchor:middle" o:gfxdata="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" fillcolor="#156082 [3204]" strokecolor="#030e13 [484]" strokeweight="1.5pt"/>
             </w:pict>
           </mc:Fallback>
         </mc:AlternateContent>
@@ -4261,7 +4261,7 @@
           </mc:Choice>
           <mc:Fallback>
             <w:pict>
-              <v:line w14:anchorId="567CAAA3" id="Straight Connector 10" o:spid="_x0000_s1026" style="position:absolute;z-index:251659776;visibility:visible;mso-wrap-style:square;mso-width-percent:0;mso-height-percent:0;mso-wrap-distance-left:9pt;mso-wrap-distance-top:0;mso-wrap-distance-right:9pt;mso-wrap-distance-bottom:0;mso-position-horizontal:absolute;mso-position-horizontal-relative:text;mso-position-vertical:absolute;mso-position-vertical-relative:text;mso-width-percent:0;mso-height-percent:0;mso-width-relative:margin;mso-height-relative:margin" from="226pt,16.95pt" to="227pt,53.95pt" o:gfxdata="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" strokecolor="#156082 [3204]" strokeweight="1.5pt">
+              <v:line w14:anchorId="12AAFAE7" id="Straight Connector 10" o:spid="_x0000_s1026" style="position:absolute;z-index:251659776;visibility:visible;mso-wrap-style:square;mso-width-percent:0;mso-height-percent:0;mso-wrap-distance-left:9pt;mso-wrap-distance-top:0;mso-wrap-distance-right:9pt;mso-wrap-distance-bottom:0;mso-position-horizontal:absolute;mso-position-horizontal-relative:text;mso-position-vertical:absolute;mso-position-vertical-relative:text;mso-width-percent:0;mso-height-percent:0;mso-width-relative:margin;mso-height-relative:margin" from="226pt,16.95pt" to="227pt,53.95pt" o:gfxdata="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" strokecolor="#156082 [3204]" strokeweight="1.5pt">
                 <v:stroke joinstyle="miter"/>
               </v:line>
             </w:pict>
@@ -4347,7 +4347,7 @@
           </mc:Choice>
           <mc:Fallback>
             <w:pict>
-              <v:rect w14:anchorId="682E71E3" id="Rectangle 11" o:spid="_x0000_s1026" style="position:absolute;margin-left:118pt;margin-top:9.65pt;width:224pt;height:37.5pt;z-index:251653120;visibility:visible;mso-wrap-style:square;mso-width-percent:0;mso-height-percent:0;mso-wrap-distance-left:9pt;mso-wrap-distance-top:0;mso-wrap-distance-right:9pt;mso-wrap-distance-bottom:0;mso-position-horizontal:absolute;mso-position-horizontal-relative:text;mso-position-vertical:absolute;mso-position-vertical-relative:text;mso-width-percent:0;mso-height-percent:0;mso-width-relative:margin;mso-height-relative:margin;v-text-anchor:middle" o:gfxdata="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" fillcolor="#156082 [3204]" strokecolor="#030e13 [484]" strokeweight="1.5pt"/>
+              <v:rect w14:anchorId="6809528B" id="Rectangle 11" o:spid="_x0000_s1026" style="position:absolute;margin-left:118pt;margin-top:9.65pt;width:224pt;height:37.5pt;z-index:251653120;visibility:visible;mso-wrap-style:square;mso-width-percent:0;mso-height-percent:0;mso-wrap-distance-left:9pt;mso-wrap-distance-top:0;mso-wrap-distance-right:9pt;mso-wrap-distance-bottom:0;mso-position-horizontal:absolute;mso-position-horizontal-relative:text;mso-position-vertical:absolute;mso-position-vertical-relative:text;mso-width-percent:0;mso-height-percent:0;mso-width-relative:margin;mso-height-relative:margin;v-text-anchor:middle" o:gfxdata="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" fillcolor="#156082 [3204]" strokecolor="#030e13 [484]" strokeweight="1.5pt"/>
             </w:pict>
           </mc:Fallback>
         </mc:AlternateContent>
@@ -4518,7 +4518,7 @@
           </mc:Choice>
           <mc:Fallback>
             <w:pict>
-              <v:line w14:anchorId="47C559BA" id="Straight Connector 13" o:spid="_x0000_s1026" style="position:absolute;z-index:251660800;visibility:visible;mso-wrap-style:square;mso-wrap-distance-left:9pt;mso-wrap-distance-top:0;mso-wrap-distance-right:9pt;mso-wrap-distance-bottom:0;mso-position-horizontal:absolute;mso-position-horizontal-relative:text;mso-position-vertical:absolute;mso-position-vertical-relative:text" from="226.5pt,.35pt" to="226.5pt,42.35pt" o:gfxdata="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" strokecolor="#156082 [3204]" strokeweight="1.5pt">
+              <v:line w14:anchorId="3AAA0CC7" id="Straight Connector 13" o:spid="_x0000_s1026" style="position:absolute;z-index:251660800;visibility:visible;mso-wrap-style:square;mso-wrap-distance-left:9pt;mso-wrap-distance-top:0;mso-wrap-distance-right:9pt;mso-wrap-distance-bottom:0;mso-position-horizontal:absolute;mso-position-horizontal-relative:text;mso-position-vertical:absolute;mso-position-vertical-relative:text" from="226.5pt,.35pt" to="226.5pt,42.35pt" o:gfxdata="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" strokecolor="#156082 [3204]" strokeweight="1.5pt">
                 <v:stroke joinstyle="miter"/>
               </v:line>
             </w:pict>
@@ -4599,7 +4599,7 @@
           </mc:Choice>
           <mc:Fallback>
             <w:pict>
-              <v:shapetype w14:anchorId="648631EF" id="_x0000_t4" coordsize="21600,21600" o:spt="4" path="m10800,l,10800,10800,21600,21600,10800xe">
+              <v:shapetype w14:anchorId="3F796CBB" id="_x0000_t4" coordsize="21600,21600" o:spt="4" path="m10800,l,10800,10800,21600,21600,10800xe">
                 <v:stroke joinstyle="miter"/>
                 <v:path gradientshapeok="t" o:connecttype="rect" textboxrect="5400,5400,16200,16200"/>
               </v:shapetype>
@@ -4776,7 +4776,7 @@
           </mc:Choice>
           <mc:Fallback>
             <w:pict>
-              <v:line w14:anchorId="526B891B" id="Straight Connector 16" o:spid="_x0000_s1026" style="position:absolute;z-index:251663872;visibility:visible;mso-wrap-style:square;mso-wrap-distance-left:9pt;mso-wrap-distance-top:0;mso-wrap-distance-right:9pt;mso-wrap-distance-bottom:0;mso-position-horizontal:absolute;mso-position-horizontal-relative:text;mso-position-vertical:absolute;mso-position-vertical-relative:text" from="228.5pt,9.75pt" to="228.5pt,39.25pt" o:gfxdata="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" strokecolor="#156082 [3204]" strokeweight="1.5pt">
+              <v:line w14:anchorId="7C098ECD" id="Straight Connector 16" o:spid="_x0000_s1026" style="position:absolute;z-index:251663872;visibility:visible;mso-wrap-style:square;mso-wrap-distance-left:9pt;mso-wrap-distance-top:0;mso-wrap-distance-right:9pt;mso-wrap-distance-bottom:0;mso-position-horizontal:absolute;mso-position-horizontal-relative:text;mso-position-vertical:absolute;mso-position-vertical-relative:text" from="228.5pt,9.75pt" to="228.5pt,39.25pt" o:gfxdata="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" strokecolor="#156082 [3204]" strokeweight="1.5pt">
                 <v:stroke joinstyle="miter"/>
               </v:line>
             </w:pict>
@@ -4936,7 +4936,7 @@
           </mc:Choice>
           <mc:Fallback>
             <w:pict>
-              <v:rect w14:anchorId="7D17CDF5" id="Rectangle 17" o:spid="_x0000_s1026" style="position:absolute;margin-left:114.5pt;margin-top:16.1pt;width:230pt;height:38.5pt;z-index:251664896;visibility:visible;mso-wrap-style:square;mso-width-percent:0;mso-wrap-distance-left:9pt;mso-wrap-distance-top:0;mso-wrap-distance-right:9pt;mso-wrap-distance-bottom:0;mso-position-horizontal:absolute;mso-position-horizontal-relative:text;mso-position-vertical:absolute;mso-position-vertical-relative:text;mso-width-percent:0;mso-width-relative:margin;v-text-anchor:middle" o:gfxdata="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" fillcolor="#156082 [3204]" strokecolor="#030e13 [484]" strokeweight="1.5pt"/>
+              <v:rect w14:anchorId="7A4DEB21" id="Rectangle 17" o:spid="_x0000_s1026" style="position:absolute;margin-left:114.5pt;margin-top:16.1pt;width:230pt;height:38.5pt;z-index:251664896;visibility:visible;mso-wrap-style:square;mso-width-percent:0;mso-wrap-distance-left:9pt;mso-wrap-distance-top:0;mso-wrap-distance-right:9pt;mso-wrap-distance-bottom:0;mso-position-horizontal:absolute;mso-position-horizontal-relative:text;mso-position-vertical:absolute;mso-position-vertical-relative:text;mso-width-percent:0;mso-width-relative:margin;v-text-anchor:middle" o:gfxdata="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" fillcolor="#156082 [3204]" strokecolor="#030e13 [484]" strokeweight="1.5pt"/>
             </w:pict>
           </mc:Fallback>
         </mc:AlternateContent>
@@ -5007,7 +5007,7 @@
           </mc:Choice>
           <mc:Fallback>
             <w:pict>
-              <v:line w14:anchorId="1C69205C" id="Straight Connector 19" o:spid="_x0000_s1026" style="position:absolute;z-index:251666944;visibility:visible;mso-wrap-style:square;mso-wrap-distance-left:9pt;mso-wrap-distance-top:0;mso-wrap-distance-right:9pt;mso-wrap-distance-bottom:0;mso-position-horizontal:absolute;mso-position-horizontal-relative:text;mso-position-vertical:absolute;mso-position-vertical-relative:text" from="228pt,9.3pt" to="228pt,39.3pt" o:gfxdata="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" strokecolor="#156082 [3204]" strokeweight="1.5pt">
+              <v:line w14:anchorId="616582FA" id="Straight Connector 19" o:spid="_x0000_s1026" style="position:absolute;z-index:251666944;visibility:visible;mso-wrap-style:square;mso-wrap-distance-left:9pt;mso-wrap-distance-top:0;mso-wrap-distance-right:9pt;mso-wrap-distance-bottom:0;mso-position-horizontal:absolute;mso-position-horizontal-relative:text;mso-position-vertical:absolute;mso-position-vertical-relative:text" from="228pt,9.3pt" to="228pt,39.3pt" o:gfxdata="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" strokecolor="#156082 [3204]" strokeweight="1.5pt">
                 <v:stroke joinstyle="miter"/>
               </v:line>
             </w:pict>
@@ -5088,7 +5088,7 @@
           </mc:Choice>
           <mc:Fallback>
             <w:pict>
-              <v:shape w14:anchorId="7B5C7E3A" id="Diamond 20" o:spid="_x0000_s1026" type="#_x0000_t4" style="position:absolute;margin-left:105.5pt;margin-top:15.15pt;width:247.5pt;height:55.5pt;z-index:251667968;visibility:visible;mso-wrap-style:square;mso-width-percent:0;mso-height-percent:0;mso-wrap-distance-left:9pt;mso-wrap-distance-top:0;mso-wrap-distance-right:9pt;mso-wrap-distance-bottom:0;mso-position-horizontal:absolute;mso-position-horizontal-relative:text;mso-position-vertical:absolute;mso-position-vertical-relative:text;mso-width-percent:0;mso-height-percent:0;mso-width-relative:margin;mso-height-relative:margin;v-text-anchor:middle" o:gfxdata="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" fillcolor="#156082 [3204]" strokecolor="#030e13 [484]" strokeweight="1.5pt"/>
+              <v:shape w14:anchorId="361711E5" id="Diamond 20" o:spid="_x0000_s1026" type="#_x0000_t4" style="position:absolute;margin-left:105.5pt;margin-top:15.15pt;width:247.5pt;height:55.5pt;z-index:251667968;visibility:visible;mso-wrap-style:square;mso-width-percent:0;mso-height-percent:0;mso-wrap-distance-left:9pt;mso-wrap-distance-top:0;mso-wrap-distance-right:9pt;mso-wrap-distance-bottom:0;mso-position-horizontal:absolute;mso-position-horizontal-relative:text;mso-position-vertical:absolute;mso-position-vertical-relative:text;mso-width-percent:0;mso-height-percent:0;mso-width-relative:margin;mso-height-relative:margin;v-text-anchor:middle" o:gfxdata="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" fillcolor="#156082 [3204]" strokecolor="#030e13 [484]" strokeweight="1.5pt"/>
             </w:pict>
           </mc:Fallback>
         </mc:AlternateContent>
@@ -5246,7 +5246,7 @@
           </mc:Choice>
           <mc:Fallback>
             <w:pict>
-              <v:line w14:anchorId="2FFA14A5" id="Straight Connector 22" o:spid="_x0000_s1026" style="position:absolute;z-index:251670016;visibility:visible;mso-wrap-style:square;mso-wrap-distance-left:9pt;mso-wrap-distance-top:0;mso-wrap-distance-right:9pt;mso-wrap-distance-bottom:0;mso-position-horizontal:absolute;mso-position-horizontal-relative:text;mso-position-vertical:absolute;mso-position-vertical-relative:text" from="228.5pt,3.7pt" to="229pt,35.7pt" o:gfxdata="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" strokecolor="#156082 [3204]" strokeweight="1.5pt">
+              <v:line w14:anchorId="11F9CC96" id="Straight Connector 22" o:spid="_x0000_s1026" style="position:absolute;z-index:251670016;visibility:visible;mso-wrap-style:square;mso-wrap-distance-left:9pt;mso-wrap-distance-top:0;mso-wrap-distance-right:9pt;mso-wrap-distance-bottom:0;mso-position-horizontal:absolute;mso-position-horizontal-relative:text;mso-position-vertical:absolute;mso-position-vertical-relative:text" from="228.5pt,3.7pt" to="229pt,35.7pt" o:gfxdata="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" strokecolor="#156082 [3204]" strokeweight="1.5pt">
                 <v:stroke joinstyle="miter"/>
               </v:line>
             </w:pict>
@@ -5409,7 +5409,7 @@
           </mc:Choice>
           <mc:Fallback>
             <w:pict>
-              <v:rect w14:anchorId="5837D6EF" id="Rectangle 23" o:spid="_x0000_s1026" style="position:absolute;margin-left:149.5pt;margin-top:12.55pt;width:164.5pt;height:36.5pt;z-index:251659264;visibility:visible;mso-wrap-style:square;mso-width-percent:0;mso-height-percent:0;mso-wrap-distance-left:9pt;mso-wrap-distance-top:0;mso-wrap-distance-right:9pt;mso-wrap-distance-bottom:0;mso-position-horizontal:absolute;mso-position-horizontal-relative:text;mso-position-vertical:absolute;mso-position-vertical-relative:text;mso-width-percent:0;mso-height-percent:0;mso-width-relative:margin;mso-height-relative:margin;v-text-anchor:middle" o:gfxdata="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" fillcolor="#156082 [3204]" strokecolor="#030e13 [484]" strokeweight="1.5pt"/>
+              <v:rect w14:anchorId="5C6B5D89" id="Rectangle 23" o:spid="_x0000_s1026" style="position:absolute;margin-left:149.5pt;margin-top:12.55pt;width:164.5pt;height:36.5pt;z-index:251659264;visibility:visible;mso-wrap-style:square;mso-width-percent:0;mso-height-percent:0;mso-wrap-distance-left:9pt;mso-wrap-distance-top:0;mso-wrap-distance-right:9pt;mso-wrap-distance-bottom:0;mso-position-horizontal:absolute;mso-position-horizontal-relative:text;mso-position-vertical:absolute;mso-position-vertical-relative:text;mso-width-percent:0;mso-height-percent:0;mso-width-relative:margin;mso-height-relative:margin;v-text-anchor:middle" o:gfxdata="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" fillcolor="#156082 [3204]" strokecolor="#030e13 [484]" strokeweight="1.5pt"/>
             </w:pict>
           </mc:Fallback>
         </mc:AlternateContent>
@@ -5486,7 +5486,7 @@
           </mc:Choice>
           <mc:Fallback>
             <w:pict>
-              <v:line w14:anchorId="19F99674" id="Straight Connector 25" o:spid="_x0000_s1026" style="position:absolute;z-index:251671040;visibility:visible;mso-wrap-style:square;mso-width-percent:0;mso-height-percent:0;mso-wrap-distance-left:9pt;mso-wrap-distance-top:0;mso-wrap-distance-right:9pt;mso-wrap-distance-bottom:0;mso-position-horizontal:absolute;mso-position-horizontal-relative:text;mso-position-vertical:absolute;mso-position-vertical-relative:text;mso-width-percent:0;mso-height-percent:0;mso-width-relative:margin;mso-height-relative:margin" from="229.5pt,4.25pt" to="230pt,35.25pt" o:gfxdata="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" strokecolor="#156082 [3204]" strokeweight="1.5pt">
+              <v:line w14:anchorId="057DF694" id="Straight Connector 25" o:spid="_x0000_s1026" style="position:absolute;z-index:251671040;visibility:visible;mso-wrap-style:square;mso-width-percent:0;mso-height-percent:0;mso-wrap-distance-left:9pt;mso-wrap-distance-top:0;mso-wrap-distance-right:9pt;mso-wrap-distance-bottom:0;mso-position-horizontal:absolute;mso-position-horizontal-relative:text;mso-position-vertical:absolute;mso-position-vertical-relative:text;mso-width-percent:0;mso-height-percent:0;mso-width-relative:margin;mso-height-relative:margin" from="229.5pt,4.25pt" to="230pt,35.25pt" o:gfxdata="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" strokecolor="#156082 [3204]" strokeweight="1.5pt">
                 <v:stroke joinstyle="miter"/>
               </v:line>
             </w:pict>
@@ -5564,7 +5564,7 @@
           </mc:Choice>
           <mc:Fallback>
             <w:pict>
-              <v:oval w14:anchorId="6B5569DF" id="Oval 26" o:spid="_x0000_s1026" style="position:absolute;margin-left:176.5pt;margin-top:10.1pt;width:106.5pt;height:37.5pt;z-index:251665408;visibility:visible;mso-wrap-style:square;mso-width-percent:0;mso-wrap-distance-left:9pt;mso-wrap-distance-top:0;mso-wrap-distance-right:9pt;mso-wrap-distance-bottom:0;mso-position-horizontal:absolute;mso-position-horizontal-relative:text;mso-position-vertical:absolute;mso-position-vertical-relative:text;mso-width-percent:0;mso-width-relative:margin;v-text-anchor:middle" o:gfxdata="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" fillcolor="#156082 [3204]" strokecolor="#030e13 [484]" strokeweight="1.5pt">
+              <v:oval w14:anchorId="5376526F" id="Oval 26" o:spid="_x0000_s1026" style="position:absolute;margin-left:176.5pt;margin-top:10.1pt;width:106.5pt;height:37.5pt;z-index:251665408;visibility:visible;mso-wrap-style:square;mso-width-percent:0;mso-wrap-distance-left:9pt;mso-wrap-distance-top:0;mso-wrap-distance-right:9pt;mso-wrap-distance-bottom:0;mso-position-horizontal:absolute;mso-position-horizontal-relative:text;mso-position-vertical:absolute;mso-position-vertical-relative:text;mso-width-percent:0;mso-width-relative:margin;v-text-anchor:middle" o:gfxdata="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" fillcolor="#156082 [3204]" strokecolor="#030e13 [484]" strokeweight="1.5pt">
                 <v:stroke joinstyle="miter"/>
               </v:oval>
             </w:pict>
@@ -5682,7 +5682,205 @@
     <w:p>
       <w:pPr>
         <w:spacing w:line="240" w:lineRule="auto"/>
-      </w:pPr>
+        <w:jc w:val="center"/>
+        <w:rPr>
+          <w:b/>
+          <w:bCs/>
+          <w:u w:val="single"/>
+        </w:rPr>
+      </w:pPr>
+      <w:r>
+        <w:rPr>
+          <w:b/>
+          <w:bCs/>
+          <w:u w:val="single"/>
+        </w:rPr>
+        <w:t>CURIOUS MODE RESPONSE ALO</w:t>
+      </w:r>
+      <w:r>
+        <w:rPr>
+          <w:b/>
+          <w:bCs/>
+          <w:u w:val="single"/>
+        </w:rPr>
+        <w:t>RIGTH DESIGN</w:t>
+      </w:r>
+    </w:p>
+    <w:p>
+      <w:pPr>
+        <w:spacing w:line="240" w:lineRule="auto"/>
+        <w:jc w:val="center"/>
+      </w:pPr>
+      <w:r>
+        <w:rPr>
+          <w:noProof/>
+        </w:rPr>
+        <mc:AlternateContent>
+          <mc:Choice Requires="wps">
+            <w:drawing>
+              <wp:anchor distT="0" distB="0" distL="114300" distR="114300" simplePos="0" relativeHeight="251673088" behindDoc="0" locked="0" layoutInCell="1" allowOverlap="1" wp14:anchorId="06190D94" wp14:editId="1B31B1F8">
+                <wp:simplePos x="0" y="0"/>
+                <wp:positionH relativeFrom="column">
+                  <wp:posOffset>2457450</wp:posOffset>
+                </wp:positionH>
+                <wp:positionV relativeFrom="paragraph">
+                  <wp:posOffset>144145</wp:posOffset>
+                </wp:positionV>
+                <wp:extent cx="939800" cy="304800"/>
+                <wp:effectExtent l="0" t="0" r="12700" b="19050"/>
+                <wp:wrapNone/>
+                <wp:docPr id="1793986665" name="Text Box 29"/>
+                <wp:cNvGraphicFramePr/>
+                <a:graphic xmlns:a="http://schemas.openxmlformats.org/drawingml/2006/main">
+                  <a:graphicData uri="http://schemas.microsoft.com/office/word/2010/wordprocessingShape">
+                    <wps:wsp>
+                      <wps:cNvSpPr txBox="1"/>
+                      <wps:spPr>
+                        <a:xfrm>
+                          <a:off x="0" y="0"/>
+                          <a:ext cx="939800" cy="304800"/>
+                        </a:xfrm>
+                        <a:prstGeom prst="rect">
+                          <a:avLst/>
+                        </a:prstGeom>
+                        <a:solidFill>
+                          <a:schemeClr val="lt1"/>
+                        </a:solidFill>
+                        <a:ln w="6350">
+                          <a:solidFill>
+                            <a:prstClr val="black"/>
+                          </a:solidFill>
+                        </a:ln>
+                      </wps:spPr>
+                      <wps:txbx>
+                        <w:txbxContent>
+                          <w:p>
+                            <w:r>
+                              <w:t xml:space="preserve">      START</w:t>
+                            </w:r>
+                          </w:p>
+                        </w:txbxContent>
+                      </wps:txbx>
+                      <wps:bodyPr rot="0" spcFirstLastPara="0" vertOverflow="overflow" horzOverflow="overflow" vert="horz" wrap="square" lIns="91440" tIns="45720" rIns="91440" bIns="45720" numCol="1" spcCol="0" rtlCol="0" fromWordArt="0" anchor="t" anchorCtr="0" forceAA="0" compatLnSpc="1">
+                        <a:prstTxWarp prst="textNoShape">
+                          <a:avLst/>
+                        </a:prstTxWarp>
+                        <a:noAutofit/>
+                      </wps:bodyPr>
+                    </wps:wsp>
+                  </a:graphicData>
+                </a:graphic>
+              </wp:anchor>
+            </w:drawing>
+          </mc:Choice>
+          <mc:Fallback>
+            <w:pict>
+              <v:shape w14:anchorId="06190D94" id="Text Box 29" o:spid="_x0000_s1034" type="#_x0000_t202" style="position:absolute;left:0;text-align:left;margin-left:193.5pt;margin-top:11.35pt;width:74pt;height:24pt;z-index:251673088;visibility:visible;mso-wrap-style:square;mso-wrap-distance-left:9pt;mso-wrap-distance-top:0;mso-wrap-distance-right:9pt;mso-wrap-distance-bottom:0;mso-position-horizontal:absolute;mso-position-horizontal-relative:text;mso-position-vertical:absolute;mso-position-vertical-relative:text;v-text-anchor:top" o:gfxdata="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" fillcolor="white [3201]" strokeweight=".5pt">
+                <v:textbox>
+                  <w:txbxContent>
+                    <w:p>
+                      <w:r>
+                        <w:t xml:space="preserve">      START</w:t>
+                      </w:r>
+                    </w:p>
+                  </w:txbxContent>
+                </v:textbox>
+              </v:shape>
+            </w:pict>
+          </mc:Fallback>
+        </mc:AlternateContent>
+      </w:r>
+      <w:r>
+        <w:rPr>
+          <w:noProof/>
+        </w:rPr>
+        <mc:AlternateContent>
+          <mc:Choice Requires="wps">
+            <w:drawing>
+              <wp:anchor distT="0" distB="0" distL="114300" distR="114300" simplePos="0" relativeHeight="251672064" behindDoc="0" locked="0" layoutInCell="1" allowOverlap="1" wp14:anchorId="5B5B90FB" wp14:editId="088FAA67">
+                <wp:simplePos x="0" y="0"/>
+                <wp:positionH relativeFrom="column">
+                  <wp:posOffset>2254250</wp:posOffset>
+                </wp:positionH>
+                <wp:positionV relativeFrom="paragraph">
+                  <wp:posOffset>61595</wp:posOffset>
+                </wp:positionV>
+                <wp:extent cx="1314450" cy="476250"/>
+                <wp:effectExtent l="0" t="0" r="19050" b="19050"/>
+                <wp:wrapNone/>
+                <wp:docPr id="535365173" name="Oval 28"/>
+                <wp:cNvGraphicFramePr/>
+                <a:graphic xmlns:a="http://schemas.openxmlformats.org/drawingml/2006/main">
+                  <a:graphicData uri="http://schemas.microsoft.com/office/word/2010/wordprocessingShape">
+                    <wps:wsp>
+                      <wps:cNvSpPr/>
+                      <wps:spPr>
+                        <a:xfrm>
+                          <a:off x="0" y="0"/>
+                          <a:ext cx="1314450" cy="476250"/>
+                        </a:xfrm>
+                        <a:prstGeom prst="ellipse">
+                          <a:avLst/>
+                        </a:prstGeom>
+                      </wps:spPr>
+                      <wps:style>
+                        <a:lnRef idx="2">
+                          <a:schemeClr val="accent1">
+                            <a:shade val="15000"/>
+                          </a:schemeClr>
+                        </a:lnRef>
+                        <a:fillRef idx="1">
+                          <a:schemeClr val="accent1"/>
+                        </a:fillRef>
+                        <a:effectRef idx="0">
+                          <a:schemeClr val="accent1"/>
+                        </a:effectRef>
+                        <a:fontRef idx="minor">
+                          <a:schemeClr val="lt1"/>
+                        </a:fontRef>
+                      </wps:style>
+                      <wps:bodyPr rot="0" spcFirstLastPara="0" vertOverflow="overflow" horzOverflow="overflow" vert="horz" wrap="square" lIns="91440" tIns="45720" rIns="91440" bIns="45720" numCol="1" spcCol="0" rtlCol="0" fromWordArt="0" anchor="ctr" anchorCtr="0" forceAA="0" compatLnSpc="1">
+                        <a:prstTxWarp prst="textNoShape">
+                          <a:avLst/>
+                        </a:prstTxWarp>
+                        <a:noAutofit/>
+                      </wps:bodyPr>
+                    </wps:wsp>
+                  </a:graphicData>
+                </a:graphic>
+                <wp14:sizeRelH relativeFrom="margin">
+                  <wp14:pctWidth>0</wp14:pctWidth>
+                </wp14:sizeRelH>
+              </wp:anchor>
+            </w:drawing>
+          </mc:Choice>
+          <mc:Fallback>
+            <w:pict>
+              <v:oval w14:anchorId="47CE810D" id="Oval 28" o:spid="_x0000_s1026" style="position:absolute;margin-left:177.5pt;margin-top:4.85pt;width:103.5pt;height:37.5pt;z-index:251672064;visibility:visible;mso-wrap-style:square;mso-width-percent:0;mso-wrap-distance-left:9pt;mso-wrap-distance-top:0;mso-wrap-distance-right:9pt;mso-wrap-distance-bottom:0;mso-position-horizontal:absolute;mso-position-horizontal-relative:text;mso-position-vertical:absolute;mso-position-vertical-relative:text;mso-width-percent:0;mso-width-relative:margin;v-text-anchor:middle" o:gfxdata="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" fillcolor="#156082 [3204]" strokecolor="#030e13 [484]" strokeweight="1.5pt">
+                <v:stroke joinstyle="miter"/>
+              </v:oval>
+            </w:pict>
+          </mc:Fallback>
+        </mc:AlternateContent>
+      </w:r>
+    </w:p>
+    <w:p>
+      <w:pPr>
+        <w:spacing w:line="240" w:lineRule="auto"/>
+        <w:rPr>
+          <w:b/>
+          <w:bCs/>
+          <w:u w:val="single"/>
+        </w:rPr>
+      </w:pPr>
+      <w:r>
+        <w:rPr>
+          <w:b/>
+          <w:bCs/>
+          <w:u w:val="single"/>
+        </w:rPr>
+        <w:t xml:space="preserve">                                              </w:t>
+      </w:r>
     </w:p>
     <w:p>
       <w:pPr>

</xml_diff>

<commit_message>
Curious Mode Response Alogorithm Design Done
</commit_message>
<xml_diff>
--- a/Documents/SwiftBot Task10 - Requirements (1).docx
+++ b/Documents/SwiftBot Task10 - Requirements (1).docx
@@ -1596,7 +1596,7 @@
                 </mc:Choice>
                 <mc:Fallback>
                   <w:pict>
-                    <v:shapetype w14:anchorId="3F575BA3" id="_x0000_t32" coordsize="21600,21600" o:spt="32" o:oned="t" path="m,l21600,21600e" filled="f">
+                    <v:shapetype w14:anchorId="6A2DC2EA" id="_x0000_t32" coordsize="21600,21600" o:spt="32" o:oned="t" path="m,l21600,21600e" filled="f">
                       <v:path arrowok="t" fillok="f" o:connecttype="none"/>
                       <o:lock v:ext="edit" shapetype="t"/>
                     </v:shapetype>
@@ -1678,7 +1678,7 @@
                 </mc:Choice>
                 <mc:Fallback>
                   <w:pict>
-                    <v:shape w14:anchorId="4EB3FEB6" id="Straight Arrow Connector 2" o:spid="_x0000_s1026" type="#_x0000_t32" style="position:absolute;margin-left:36.85pt;margin-top:8.25pt;width:29.5pt;height:0;z-index:251650560;visibility:visible;mso-wrap-style:square;mso-wrap-distance-left:9pt;mso-wrap-distance-top:0;mso-wrap-distance-right:9pt;mso-wrap-distance-bottom:0;mso-position-horizontal:absolute;mso-position-horizontal-relative:text;mso-position-vertical:absolute;mso-position-vertical-relative:text" o:gfxdata="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" strokecolor="#156082 [3204]" strokeweight="1.5pt">
+                    <v:shape w14:anchorId="6442150E" id="Straight Arrow Connector 2" o:spid="_x0000_s1026" type="#_x0000_t32" style="position:absolute;margin-left:36.85pt;margin-top:8.25pt;width:29.5pt;height:0;z-index:251650560;visibility:visible;mso-wrap-style:square;mso-wrap-distance-left:9pt;mso-wrap-distance-top:0;mso-wrap-distance-right:9pt;mso-wrap-distance-bottom:0;mso-position-horizontal:absolute;mso-position-horizontal-relative:text;mso-position-vertical:absolute;mso-position-vertical-relative:text" o:gfxdata="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" strokecolor="#156082 [3204]" strokeweight="1.5pt">
                       <v:stroke endarrow="block" joinstyle="miter"/>
                     </v:shape>
                   </w:pict>
@@ -1835,7 +1835,7 @@
                 </mc:Choice>
                 <mc:Fallback>
                   <w:pict>
-                    <v:shape w14:anchorId="18CBB484" id="Straight Arrow Connector 3" o:spid="_x0000_s1026" type="#_x0000_t32" style="position:absolute;margin-left:46.35pt;margin-top:7.9pt;width:29pt;height:0;z-index:251651584;visibility:visible;mso-wrap-style:square;mso-wrap-distance-left:9pt;mso-wrap-distance-top:0;mso-wrap-distance-right:9pt;mso-wrap-distance-bottom:0;mso-position-horizontal:absolute;mso-position-horizontal-relative:text;mso-position-vertical:absolute;mso-position-vertical-relative:text" o:gfxdata="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" strokecolor="#156082 [3204]" strokeweight="1.5pt">
+                    <v:shape w14:anchorId="76E3D9AF" id="Straight Arrow Connector 3" o:spid="_x0000_s1026" type="#_x0000_t32" style="position:absolute;margin-left:46.35pt;margin-top:7.9pt;width:29pt;height:0;z-index:251651584;visibility:visible;mso-wrap-style:square;mso-wrap-distance-left:9pt;mso-wrap-distance-top:0;mso-wrap-distance-right:9pt;mso-wrap-distance-bottom:0;mso-position-horizontal:absolute;mso-position-horizontal-relative:text;mso-position-vertical:absolute;mso-position-vertical-relative:text" o:gfxdata="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" strokecolor="#156082 [3204]" strokeweight="1.5pt">
                       <v:stroke endarrow="block" joinstyle="miter"/>
                     </v:shape>
                   </w:pict>
@@ -1922,7 +1922,7 @@
                 </mc:Choice>
                 <mc:Fallback>
                   <w:pict>
-                    <v:shape w14:anchorId="1A04B827" id="Straight Arrow Connector 4" o:spid="_x0000_s1026" type="#_x0000_t32" style="position:absolute;margin-left:46.85pt;margin-top:5.75pt;width:30.5pt;height:.5pt;z-index:251653632;visibility:visible;mso-wrap-style:square;mso-wrap-distance-left:9pt;mso-wrap-distance-top:0;mso-wrap-distance-right:9pt;mso-wrap-distance-bottom:0;mso-position-horizontal:absolute;mso-position-horizontal-relative:text;mso-position-vertical:absolute;mso-position-vertical-relative:text" o:gfxdata="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" strokecolor="#156082 [3204]" strokeweight="1.5pt">
+                    <v:shape w14:anchorId="3F2042D8" id="Straight Arrow Connector 4" o:spid="_x0000_s1026" type="#_x0000_t32" style="position:absolute;margin-left:46.85pt;margin-top:5.75pt;width:30.5pt;height:.5pt;z-index:251653632;visibility:visible;mso-wrap-style:square;mso-wrap-distance-left:9pt;mso-wrap-distance-top:0;mso-wrap-distance-right:9pt;mso-wrap-distance-bottom:0;mso-position-horizontal:absolute;mso-position-horizontal-relative:text;mso-position-vertical:absolute;mso-position-vertical-relative:text" o:gfxdata="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" strokecolor="#156082 [3204]" strokeweight="1.5pt">
                       <v:stroke endarrow="block" joinstyle="miter"/>
                     </v:shape>
                   </w:pict>
@@ -3840,7 +3840,7 @@
           </mc:Choice>
           <mc:Fallback>
             <w:pict>
-              <v:oval w14:anchorId="4C2E978A" id="Oval 1" o:spid="_x0000_s1026" style="position:absolute;margin-left:158.95pt;margin-top:2.1pt;width:138.55pt;height:52.95pt;z-index:251655680;visibility:visible;mso-wrap-style:square;mso-width-percent:0;mso-wrap-distance-left:9pt;mso-wrap-distance-top:0;mso-wrap-distance-right:9pt;mso-wrap-distance-bottom:0;mso-position-horizontal:absolute;mso-position-horizontal-relative:text;mso-position-vertical:absolute;mso-position-vertical-relative:text;mso-width-percent:0;mso-width-relative:margin;v-text-anchor:middle" o:gfxdata="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" fillcolor="#156082 [3204]" strokecolor="#030e13 [484]" strokeweight="1.5pt">
+              <v:oval w14:anchorId="12DA3734" id="Oval 1" o:spid="_x0000_s1026" style="position:absolute;margin-left:158.95pt;margin-top:2.1pt;width:138.55pt;height:52.95pt;z-index:251655680;visibility:visible;mso-wrap-style:square;mso-width-percent:0;mso-wrap-distance-left:9pt;mso-wrap-distance-top:0;mso-wrap-distance-right:9pt;mso-wrap-distance-bottom:0;mso-position-horizontal:absolute;mso-position-horizontal-relative:text;mso-position-vertical:absolute;mso-position-vertical-relative:text;mso-width-percent:0;mso-width-relative:margin;v-text-anchor:middle" o:gfxdata="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" fillcolor="#156082 [3204]" strokecolor="#030e13 [484]" strokeweight="1.5pt">
                 <v:stroke joinstyle="miter"/>
               </v:oval>
             </w:pict>
@@ -4021,7 +4021,7 @@
           </mc:Choice>
           <mc:Fallback>
             <w:pict>
-              <v:line w14:anchorId="300D304E" id="Straight Connector 3" o:spid="_x0000_s1026" style="position:absolute;z-index:251658752;visibility:visible;mso-wrap-style:square;mso-wrap-distance-left:9pt;mso-wrap-distance-top:0;mso-wrap-distance-right:9pt;mso-wrap-distance-bottom:0;mso-position-horizontal:absolute;mso-position-horizontal-relative:text;mso-position-vertical:absolute;mso-position-vertical-relative:text" from="227.55pt,9.7pt" to="227.55pt,51.8pt" o:gfxdata="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" strokecolor="#156082 [3204]" strokeweight="1.5pt">
+              <v:line w14:anchorId="744B2C0C" id="Straight Connector 3" o:spid="_x0000_s1026" style="position:absolute;z-index:251658752;visibility:visible;mso-wrap-style:square;mso-wrap-distance-left:9pt;mso-wrap-distance-top:0;mso-wrap-distance-right:9pt;mso-wrap-distance-bottom:0;mso-position-horizontal:absolute;mso-position-horizontal-relative:text;mso-position-vertical:absolute;mso-position-vertical-relative:text" from="227.55pt,9.7pt" to="227.55pt,51.8pt" o:gfxdata="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" strokecolor="#156082 [3204]" strokeweight="1.5pt">
                 <v:stroke joinstyle="miter"/>
               </v:line>
             </w:pict>
@@ -4107,7 +4107,7 @@
           </mc:Choice>
           <mc:Fallback>
             <w:pict>
-              <v:rect w14:anchorId="45008092" id="Rectangle 8" o:spid="_x0000_s1026" style="position:absolute;margin-left:118.5pt;margin-top:5.1pt;width:221pt;height:35.5pt;z-index:251649024;visibility:visible;mso-wrap-style:square;mso-width-percent:0;mso-height-percent:0;mso-wrap-distance-left:9pt;mso-wrap-distance-top:0;mso-wrap-distance-right:9pt;mso-wrap-distance-bottom:0;mso-position-horizontal:absolute;mso-position-horizontal-relative:text;mso-position-vertical:absolute;mso-position-vertical-relative:text;mso-width-percent:0;mso-height-percent:0;mso-width-relative:margin;mso-height-relative:margin;v-text-anchor:middle" o:gfxdata="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" fillcolor="#156082 [3204]" strokecolor="#030e13 [484]" strokeweight="1.5pt"/>
+              <v:rect w14:anchorId="3049291C" id="Rectangle 8" o:spid="_x0000_s1026" style="position:absolute;margin-left:118.5pt;margin-top:5.1pt;width:221pt;height:35.5pt;z-index:251649024;visibility:visible;mso-wrap-style:square;mso-width-percent:0;mso-height-percent:0;mso-wrap-distance-left:9pt;mso-wrap-distance-top:0;mso-wrap-distance-right:9pt;mso-wrap-distance-bottom:0;mso-position-horizontal:absolute;mso-position-horizontal-relative:text;mso-position-vertical:absolute;mso-position-vertical-relative:text;mso-width-percent:0;mso-height-percent:0;mso-width-relative:margin;mso-height-relative:margin;v-text-anchor:middle" o:gfxdata="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" fillcolor="#156082 [3204]" strokecolor="#030e13 [484]" strokeweight="1.5pt"/>
             </w:pict>
           </mc:Fallback>
         </mc:AlternateContent>
@@ -4261,7 +4261,7 @@
           </mc:Choice>
           <mc:Fallback>
             <w:pict>
-              <v:line w14:anchorId="12AAFAE7" id="Straight Connector 10" o:spid="_x0000_s1026" style="position:absolute;z-index:251659776;visibility:visible;mso-wrap-style:square;mso-width-percent:0;mso-height-percent:0;mso-wrap-distance-left:9pt;mso-wrap-distance-top:0;mso-wrap-distance-right:9pt;mso-wrap-distance-bottom:0;mso-position-horizontal:absolute;mso-position-horizontal-relative:text;mso-position-vertical:absolute;mso-position-vertical-relative:text;mso-width-percent:0;mso-height-percent:0;mso-width-relative:margin;mso-height-relative:margin" from="226pt,16.95pt" to="227pt,53.95pt" o:gfxdata="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" strokecolor="#156082 [3204]" strokeweight="1.5pt">
+              <v:line w14:anchorId="2269F394" id="Straight Connector 10" o:spid="_x0000_s1026" style="position:absolute;z-index:251659776;visibility:visible;mso-wrap-style:square;mso-width-percent:0;mso-height-percent:0;mso-wrap-distance-left:9pt;mso-wrap-distance-top:0;mso-wrap-distance-right:9pt;mso-wrap-distance-bottom:0;mso-position-horizontal:absolute;mso-position-horizontal-relative:text;mso-position-vertical:absolute;mso-position-vertical-relative:text;mso-width-percent:0;mso-height-percent:0;mso-width-relative:margin;mso-height-relative:margin" from="226pt,16.95pt" to="227pt,53.95pt" o:gfxdata="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" strokecolor="#156082 [3204]" strokeweight="1.5pt">
                 <v:stroke joinstyle="miter"/>
               </v:line>
             </w:pict>
@@ -4347,7 +4347,7 @@
           </mc:Choice>
           <mc:Fallback>
             <w:pict>
-              <v:rect w14:anchorId="6809528B" id="Rectangle 11" o:spid="_x0000_s1026" style="position:absolute;margin-left:118pt;margin-top:9.65pt;width:224pt;height:37.5pt;z-index:251653120;visibility:visible;mso-wrap-style:square;mso-width-percent:0;mso-height-percent:0;mso-wrap-distance-left:9pt;mso-wrap-distance-top:0;mso-wrap-distance-right:9pt;mso-wrap-distance-bottom:0;mso-position-horizontal:absolute;mso-position-horizontal-relative:text;mso-position-vertical:absolute;mso-position-vertical-relative:text;mso-width-percent:0;mso-height-percent:0;mso-width-relative:margin;mso-height-relative:margin;v-text-anchor:middle" o:gfxdata="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" fillcolor="#156082 [3204]" strokecolor="#030e13 [484]" strokeweight="1.5pt"/>
+              <v:rect w14:anchorId="51B5FF59" id="Rectangle 11" o:spid="_x0000_s1026" style="position:absolute;margin-left:118pt;margin-top:9.65pt;width:224pt;height:37.5pt;z-index:251653120;visibility:visible;mso-wrap-style:square;mso-width-percent:0;mso-height-percent:0;mso-wrap-distance-left:9pt;mso-wrap-distance-top:0;mso-wrap-distance-right:9pt;mso-wrap-distance-bottom:0;mso-position-horizontal:absolute;mso-position-horizontal-relative:text;mso-position-vertical:absolute;mso-position-vertical-relative:text;mso-width-percent:0;mso-height-percent:0;mso-width-relative:margin;mso-height-relative:margin;v-text-anchor:middle" o:gfxdata="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" fillcolor="#156082 [3204]" strokecolor="#030e13 [484]" strokeweight="1.5pt"/>
             </w:pict>
           </mc:Fallback>
         </mc:AlternateContent>
@@ -4518,7 +4518,7 @@
           </mc:Choice>
           <mc:Fallback>
             <w:pict>
-              <v:line w14:anchorId="3AAA0CC7" id="Straight Connector 13" o:spid="_x0000_s1026" style="position:absolute;z-index:251660800;visibility:visible;mso-wrap-style:square;mso-wrap-distance-left:9pt;mso-wrap-distance-top:0;mso-wrap-distance-right:9pt;mso-wrap-distance-bottom:0;mso-position-horizontal:absolute;mso-position-horizontal-relative:text;mso-position-vertical:absolute;mso-position-vertical-relative:text" from="226.5pt,.35pt" to="226.5pt,42.35pt" o:gfxdata="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" strokecolor="#156082 [3204]" strokeweight="1.5pt">
+              <v:line w14:anchorId="59A031D9" id="Straight Connector 13" o:spid="_x0000_s1026" style="position:absolute;z-index:251660800;visibility:visible;mso-wrap-style:square;mso-wrap-distance-left:9pt;mso-wrap-distance-top:0;mso-wrap-distance-right:9pt;mso-wrap-distance-bottom:0;mso-position-horizontal:absolute;mso-position-horizontal-relative:text;mso-position-vertical:absolute;mso-position-vertical-relative:text" from="226.5pt,.35pt" to="226.5pt,42.35pt" o:gfxdata="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" strokecolor="#156082 [3204]" strokeweight="1.5pt">
                 <v:stroke joinstyle="miter"/>
               </v:line>
             </w:pict>
@@ -4599,7 +4599,7 @@
           </mc:Choice>
           <mc:Fallback>
             <w:pict>
-              <v:shapetype w14:anchorId="3F796CBB" id="_x0000_t4" coordsize="21600,21600" o:spt="4" path="m10800,l,10800,10800,21600,21600,10800xe">
+              <v:shapetype w14:anchorId="136034EE" id="_x0000_t4" coordsize="21600,21600" o:spt="4" path="m10800,l,10800,10800,21600,21600,10800xe">
                 <v:stroke joinstyle="miter"/>
                 <v:path gradientshapeok="t" o:connecttype="rect" textboxrect="5400,5400,16200,16200"/>
               </v:shapetype>
@@ -4776,7 +4776,7 @@
           </mc:Choice>
           <mc:Fallback>
             <w:pict>
-              <v:line w14:anchorId="7C098ECD" id="Straight Connector 16" o:spid="_x0000_s1026" style="position:absolute;z-index:251663872;visibility:visible;mso-wrap-style:square;mso-wrap-distance-left:9pt;mso-wrap-distance-top:0;mso-wrap-distance-right:9pt;mso-wrap-distance-bottom:0;mso-position-horizontal:absolute;mso-position-horizontal-relative:text;mso-position-vertical:absolute;mso-position-vertical-relative:text" from="228.5pt,9.75pt" to="228.5pt,39.25pt" o:gfxdata="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" strokecolor="#156082 [3204]" strokeweight="1.5pt">
+              <v:line w14:anchorId="69042535" id="Straight Connector 16" o:spid="_x0000_s1026" style="position:absolute;z-index:251663872;visibility:visible;mso-wrap-style:square;mso-wrap-distance-left:9pt;mso-wrap-distance-top:0;mso-wrap-distance-right:9pt;mso-wrap-distance-bottom:0;mso-position-horizontal:absolute;mso-position-horizontal-relative:text;mso-position-vertical:absolute;mso-position-vertical-relative:text" from="228.5pt,9.75pt" to="228.5pt,39.25pt" o:gfxdata="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" strokecolor="#156082 [3204]" strokeweight="1.5pt">
                 <v:stroke joinstyle="miter"/>
               </v:line>
             </w:pict>
@@ -4936,7 +4936,7 @@
           </mc:Choice>
           <mc:Fallback>
             <w:pict>
-              <v:rect w14:anchorId="7A4DEB21" id="Rectangle 17" o:spid="_x0000_s1026" style="position:absolute;margin-left:114.5pt;margin-top:16.1pt;width:230pt;height:38.5pt;z-index:251664896;visibility:visible;mso-wrap-style:square;mso-width-percent:0;mso-wrap-distance-left:9pt;mso-wrap-distance-top:0;mso-wrap-distance-right:9pt;mso-wrap-distance-bottom:0;mso-position-horizontal:absolute;mso-position-horizontal-relative:text;mso-position-vertical:absolute;mso-position-vertical-relative:text;mso-width-percent:0;mso-width-relative:margin;v-text-anchor:middle" o:gfxdata="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" fillcolor="#156082 [3204]" strokecolor="#030e13 [484]" strokeweight="1.5pt"/>
+              <v:rect w14:anchorId="70A9B710" id="Rectangle 17" o:spid="_x0000_s1026" style="position:absolute;margin-left:114.5pt;margin-top:16.1pt;width:230pt;height:38.5pt;z-index:251664896;visibility:visible;mso-wrap-style:square;mso-width-percent:0;mso-wrap-distance-left:9pt;mso-wrap-distance-top:0;mso-wrap-distance-right:9pt;mso-wrap-distance-bottom:0;mso-position-horizontal:absolute;mso-position-horizontal-relative:text;mso-position-vertical:absolute;mso-position-vertical-relative:text;mso-width-percent:0;mso-width-relative:margin;v-text-anchor:middle" o:gfxdata="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" fillcolor="#156082 [3204]" strokecolor="#030e13 [484]" strokeweight="1.5pt"/>
             </w:pict>
           </mc:Fallback>
         </mc:AlternateContent>
@@ -5007,7 +5007,7 @@
           </mc:Choice>
           <mc:Fallback>
             <w:pict>
-              <v:line w14:anchorId="616582FA" id="Straight Connector 19" o:spid="_x0000_s1026" style="position:absolute;z-index:251666944;visibility:visible;mso-wrap-style:square;mso-wrap-distance-left:9pt;mso-wrap-distance-top:0;mso-wrap-distance-right:9pt;mso-wrap-distance-bottom:0;mso-position-horizontal:absolute;mso-position-horizontal-relative:text;mso-position-vertical:absolute;mso-position-vertical-relative:text" from="228pt,9.3pt" to="228pt,39.3pt" o:gfxdata="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" strokecolor="#156082 [3204]" strokeweight="1.5pt">
+              <v:line w14:anchorId="0E0721E6" id="Straight Connector 19" o:spid="_x0000_s1026" style="position:absolute;z-index:251666944;visibility:visible;mso-wrap-style:square;mso-wrap-distance-left:9pt;mso-wrap-distance-top:0;mso-wrap-distance-right:9pt;mso-wrap-distance-bottom:0;mso-position-horizontal:absolute;mso-position-horizontal-relative:text;mso-position-vertical:absolute;mso-position-vertical-relative:text" from="228pt,9.3pt" to="228pt,39.3pt" o:gfxdata="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" strokecolor="#156082 [3204]" strokeweight="1.5pt">
                 <v:stroke joinstyle="miter"/>
               </v:line>
             </w:pict>
@@ -5088,7 +5088,7 @@
           </mc:Choice>
           <mc:Fallback>
             <w:pict>
-              <v:shape w14:anchorId="361711E5" id="Diamond 20" o:spid="_x0000_s1026" type="#_x0000_t4" style="position:absolute;margin-left:105.5pt;margin-top:15.15pt;width:247.5pt;height:55.5pt;z-index:251667968;visibility:visible;mso-wrap-style:square;mso-width-percent:0;mso-height-percent:0;mso-wrap-distance-left:9pt;mso-wrap-distance-top:0;mso-wrap-distance-right:9pt;mso-wrap-distance-bottom:0;mso-position-horizontal:absolute;mso-position-horizontal-relative:text;mso-position-vertical:absolute;mso-position-vertical-relative:text;mso-width-percent:0;mso-height-percent:0;mso-width-relative:margin;mso-height-relative:margin;v-text-anchor:middle" o:gfxdata="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" fillcolor="#156082 [3204]" strokecolor="#030e13 [484]" strokeweight="1.5pt"/>
+              <v:shape w14:anchorId="37740138" id="Diamond 20" o:spid="_x0000_s1026" type="#_x0000_t4" style="position:absolute;margin-left:105.5pt;margin-top:15.15pt;width:247.5pt;height:55.5pt;z-index:251667968;visibility:visible;mso-wrap-style:square;mso-width-percent:0;mso-height-percent:0;mso-wrap-distance-left:9pt;mso-wrap-distance-top:0;mso-wrap-distance-right:9pt;mso-wrap-distance-bottom:0;mso-position-horizontal:absolute;mso-position-horizontal-relative:text;mso-position-vertical:absolute;mso-position-vertical-relative:text;mso-width-percent:0;mso-height-percent:0;mso-width-relative:margin;mso-height-relative:margin;v-text-anchor:middle" o:gfxdata="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" fillcolor="#156082 [3204]" strokecolor="#030e13 [484]" strokeweight="1.5pt"/>
             </w:pict>
           </mc:Fallback>
         </mc:AlternateContent>
@@ -5246,7 +5246,7 @@
           </mc:Choice>
           <mc:Fallback>
             <w:pict>
-              <v:line w14:anchorId="11F9CC96" id="Straight Connector 22" o:spid="_x0000_s1026" style="position:absolute;z-index:251670016;visibility:visible;mso-wrap-style:square;mso-wrap-distance-left:9pt;mso-wrap-distance-top:0;mso-wrap-distance-right:9pt;mso-wrap-distance-bottom:0;mso-position-horizontal:absolute;mso-position-horizontal-relative:text;mso-position-vertical:absolute;mso-position-vertical-relative:text" from="228.5pt,3.7pt" to="229pt,35.7pt" o:gfxdata="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" strokecolor="#156082 [3204]" strokeweight="1.5pt">
+              <v:line w14:anchorId="44307EC1" id="Straight Connector 22" o:spid="_x0000_s1026" style="position:absolute;z-index:251670016;visibility:visible;mso-wrap-style:square;mso-wrap-distance-left:9pt;mso-wrap-distance-top:0;mso-wrap-distance-right:9pt;mso-wrap-distance-bottom:0;mso-position-horizontal:absolute;mso-position-horizontal-relative:text;mso-position-vertical:absolute;mso-position-vertical-relative:text" from="228.5pt,3.7pt" to="229pt,35.7pt" o:gfxdata="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" strokecolor="#156082 [3204]" strokeweight="1.5pt">
                 <v:stroke joinstyle="miter"/>
               </v:line>
             </w:pict>
@@ -5409,7 +5409,7 @@
           </mc:Choice>
           <mc:Fallback>
             <w:pict>
-              <v:rect w14:anchorId="5C6B5D89" id="Rectangle 23" o:spid="_x0000_s1026" style="position:absolute;margin-left:149.5pt;margin-top:12.55pt;width:164.5pt;height:36.5pt;z-index:251659264;visibility:visible;mso-wrap-style:square;mso-width-percent:0;mso-height-percent:0;mso-wrap-distance-left:9pt;mso-wrap-distance-top:0;mso-wrap-distance-right:9pt;mso-wrap-distance-bottom:0;mso-position-horizontal:absolute;mso-position-horizontal-relative:text;mso-position-vertical:absolute;mso-position-vertical-relative:text;mso-width-percent:0;mso-height-percent:0;mso-width-relative:margin;mso-height-relative:margin;v-text-anchor:middle" o:gfxdata="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" fillcolor="#156082 [3204]" strokecolor="#030e13 [484]" strokeweight="1.5pt"/>
+              <v:rect w14:anchorId="53350062" id="Rectangle 23" o:spid="_x0000_s1026" style="position:absolute;margin-left:149.5pt;margin-top:12.55pt;width:164.5pt;height:36.5pt;z-index:251659264;visibility:visible;mso-wrap-style:square;mso-width-percent:0;mso-height-percent:0;mso-wrap-distance-left:9pt;mso-wrap-distance-top:0;mso-wrap-distance-right:9pt;mso-wrap-distance-bottom:0;mso-position-horizontal:absolute;mso-position-horizontal-relative:text;mso-position-vertical:absolute;mso-position-vertical-relative:text;mso-width-percent:0;mso-height-percent:0;mso-width-relative:margin;mso-height-relative:margin;v-text-anchor:middle" o:gfxdata="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" fillcolor="#156082 [3204]" strokecolor="#030e13 [484]" strokeweight="1.5pt"/>
             </w:pict>
           </mc:Fallback>
         </mc:AlternateContent>
@@ -5486,7 +5486,7 @@
           </mc:Choice>
           <mc:Fallback>
             <w:pict>
-              <v:line w14:anchorId="057DF694" id="Straight Connector 25" o:spid="_x0000_s1026" style="position:absolute;z-index:251671040;visibility:visible;mso-wrap-style:square;mso-width-percent:0;mso-height-percent:0;mso-wrap-distance-left:9pt;mso-wrap-distance-top:0;mso-wrap-distance-right:9pt;mso-wrap-distance-bottom:0;mso-position-horizontal:absolute;mso-position-horizontal-relative:text;mso-position-vertical:absolute;mso-position-vertical-relative:text;mso-width-percent:0;mso-height-percent:0;mso-width-relative:margin;mso-height-relative:margin" from="229.5pt,4.25pt" to="230pt,35.25pt" o:gfxdata="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" strokecolor="#156082 [3204]" strokeweight="1.5pt">
+              <v:line w14:anchorId="7A620FB2" id="Straight Connector 25" o:spid="_x0000_s1026" style="position:absolute;z-index:251671040;visibility:visible;mso-wrap-style:square;mso-width-percent:0;mso-height-percent:0;mso-wrap-distance-left:9pt;mso-wrap-distance-top:0;mso-wrap-distance-right:9pt;mso-wrap-distance-bottom:0;mso-position-horizontal:absolute;mso-position-horizontal-relative:text;mso-position-vertical:absolute;mso-position-vertical-relative:text;mso-width-percent:0;mso-height-percent:0;mso-width-relative:margin;mso-height-relative:margin" from="229.5pt,4.25pt" to="230pt,35.25pt" o:gfxdata="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" strokecolor="#156082 [3204]" strokeweight="1.5pt">
                 <v:stroke joinstyle="miter"/>
               </v:line>
             </w:pict>
@@ -5564,7 +5564,7 @@
           </mc:Choice>
           <mc:Fallback>
             <w:pict>
-              <v:oval w14:anchorId="5376526F" id="Oval 26" o:spid="_x0000_s1026" style="position:absolute;margin-left:176.5pt;margin-top:10.1pt;width:106.5pt;height:37.5pt;z-index:251665408;visibility:visible;mso-wrap-style:square;mso-width-percent:0;mso-wrap-distance-left:9pt;mso-wrap-distance-top:0;mso-wrap-distance-right:9pt;mso-wrap-distance-bottom:0;mso-position-horizontal:absolute;mso-position-horizontal-relative:text;mso-position-vertical:absolute;mso-position-vertical-relative:text;mso-width-percent:0;mso-width-relative:margin;v-text-anchor:middle" o:gfxdata="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" fillcolor="#156082 [3204]" strokecolor="#030e13 [484]" strokeweight="1.5pt">
+              <v:oval w14:anchorId="74335E67" id="Oval 26" o:spid="_x0000_s1026" style="position:absolute;margin-left:176.5pt;margin-top:10.1pt;width:106.5pt;height:37.5pt;z-index:251665408;visibility:visible;mso-wrap-style:square;mso-width-percent:0;mso-wrap-distance-left:9pt;mso-wrap-distance-top:0;mso-wrap-distance-right:9pt;mso-wrap-distance-bottom:0;mso-position-horizontal:absolute;mso-position-horizontal-relative:text;mso-position-vertical:absolute;mso-position-vertical-relative:text;mso-width-percent:0;mso-width-relative:margin;v-text-anchor:middle" o:gfxdata="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" fillcolor="#156082 [3204]" strokecolor="#030e13 [484]" strokeweight="1.5pt">
                 <v:stroke joinstyle="miter"/>
               </v:oval>
             </w:pict>
@@ -5856,7 +5856,7 @@
           </mc:Choice>
           <mc:Fallback>
             <w:pict>
-              <v:oval w14:anchorId="47CE810D" id="Oval 28" o:spid="_x0000_s1026" style="position:absolute;margin-left:177.5pt;margin-top:4.85pt;width:103.5pt;height:37.5pt;z-index:251672064;visibility:visible;mso-wrap-style:square;mso-width-percent:0;mso-wrap-distance-left:9pt;mso-wrap-distance-top:0;mso-wrap-distance-right:9pt;mso-wrap-distance-bottom:0;mso-position-horizontal:absolute;mso-position-horizontal-relative:text;mso-position-vertical:absolute;mso-position-vertical-relative:text;mso-width-percent:0;mso-width-relative:margin;v-text-anchor:middle" o:gfxdata="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" fillcolor="#156082 [3204]" strokecolor="#030e13 [484]" strokeweight="1.5pt">
+              <v:oval w14:anchorId="00994F69" id="Oval 28" o:spid="_x0000_s1026" style="position:absolute;margin-left:177.5pt;margin-top:4.85pt;width:103.5pt;height:37.5pt;z-index:251672064;visibility:visible;mso-wrap-style:square;mso-width-percent:0;mso-wrap-distance-left:9pt;mso-wrap-distance-top:0;mso-wrap-distance-right:9pt;mso-wrap-distance-bottom:0;mso-position-horizontal:absolute;mso-position-horizontal-relative:text;mso-position-vertical:absolute;mso-position-vertical-relative:text;mso-width-percent:0;mso-width-relative:margin;v-text-anchor:middle" o:gfxdata="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" fillcolor="#156082 [3204]" strokecolor="#030e13 [484]" strokeweight="1.5pt">
                 <v:stroke joinstyle="miter"/>
               </v:oval>
             </w:pict>
@@ -5877,8 +5877,74 @@
         <w:rPr>
           <w:b/>
           <w:bCs/>
+          <w:noProof/>
           <w:u w:val="single"/>
         </w:rPr>
+        <mc:AlternateContent>
+          <mc:Choice Requires="wps">
+            <w:drawing>
+              <wp:anchor distT="0" distB="0" distL="114300" distR="114300" simplePos="0" relativeHeight="251674112" behindDoc="0" locked="0" layoutInCell="1" allowOverlap="1" wp14:anchorId="56EB355D" wp14:editId="3B15F185">
+                <wp:simplePos x="0" y="0"/>
+                <wp:positionH relativeFrom="column">
+                  <wp:posOffset>2901950</wp:posOffset>
+                </wp:positionH>
+                <wp:positionV relativeFrom="paragraph">
+                  <wp:posOffset>243840</wp:posOffset>
+                </wp:positionV>
+                <wp:extent cx="6350" cy="285750"/>
+                <wp:effectExtent l="0" t="0" r="31750" b="19050"/>
+                <wp:wrapNone/>
+                <wp:docPr id="1277122995" name="Straight Connector 30"/>
+                <wp:cNvGraphicFramePr/>
+                <a:graphic xmlns:a="http://schemas.openxmlformats.org/drawingml/2006/main">
+                  <a:graphicData uri="http://schemas.microsoft.com/office/word/2010/wordprocessingShape">
+                    <wps:wsp>
+                      <wps:cNvCnPr/>
+                      <wps:spPr>
+                        <a:xfrm>
+                          <a:off x="0" y="0"/>
+                          <a:ext cx="6350" cy="285750"/>
+                        </a:xfrm>
+                        <a:prstGeom prst="line">
+                          <a:avLst/>
+                        </a:prstGeom>
+                      </wps:spPr>
+                      <wps:style>
+                        <a:lnRef idx="2">
+                          <a:schemeClr val="accent1"/>
+                        </a:lnRef>
+                        <a:fillRef idx="0">
+                          <a:schemeClr val="accent1"/>
+                        </a:fillRef>
+                        <a:effectRef idx="1">
+                          <a:schemeClr val="accent1"/>
+                        </a:effectRef>
+                        <a:fontRef idx="minor">
+                          <a:schemeClr val="tx1"/>
+                        </a:fontRef>
+                      </wps:style>
+                      <wps:bodyPr/>
+                    </wps:wsp>
+                  </a:graphicData>
+                </a:graphic>
+              </wp:anchor>
+            </w:drawing>
+          </mc:Choice>
+          <mc:Fallback>
+            <w:pict>
+              <v:line w14:anchorId="24622AE1" id="Straight Connector 30" o:spid="_x0000_s1026" style="position:absolute;z-index:251674112;visibility:visible;mso-wrap-style:square;mso-wrap-distance-left:9pt;mso-wrap-distance-top:0;mso-wrap-distance-right:9pt;mso-wrap-distance-bottom:0;mso-position-horizontal:absolute;mso-position-horizontal-relative:text;mso-position-vertical:absolute;mso-position-vertical-relative:text" from="228.5pt,19.2pt" to="229pt,41.7pt" o:gfxdata="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" strokecolor="#156082 [3204]" strokeweight="1.5pt">
+                <v:stroke joinstyle="miter"/>
+              </v:line>
+            </w:pict>
+          </mc:Fallback>
+        </mc:AlternateContent>
+      </w:r>
+      <w:r>
+        <w:rPr>
+          <w:b/>
+          <w:bCs/>
+          <w:u w:val="single"/>
+        </w:rPr>
         <w:t xml:space="preserve">                                              </w:t>
       </w:r>
     </w:p>
@@ -5886,66 +5952,1139 @@
       <w:pPr>
         <w:spacing w:line="240" w:lineRule="auto"/>
       </w:pPr>
-    </w:p>
-    <w:p>
-      <w:pPr>
-        <w:spacing w:line="240" w:lineRule="auto"/>
-      </w:pPr>
-    </w:p>
-    <w:p>
-      <w:pPr>
-        <w:spacing w:line="240" w:lineRule="auto"/>
-      </w:pPr>
-    </w:p>
-    <w:p>
-      <w:pPr>
-        <w:spacing w:line="240" w:lineRule="auto"/>
-      </w:pPr>
-    </w:p>
-    <w:p>
-      <w:pPr>
-        <w:spacing w:line="240" w:lineRule="auto"/>
-      </w:pPr>
-    </w:p>
-    <w:p>
-      <w:pPr>
-        <w:spacing w:line="240" w:lineRule="auto"/>
-      </w:pPr>
-    </w:p>
-    <w:p>
-      <w:pPr>
-        <w:spacing w:line="240" w:lineRule="auto"/>
-      </w:pPr>
-    </w:p>
-    <w:p>
-      <w:pPr>
-        <w:spacing w:line="240" w:lineRule="auto"/>
-      </w:pPr>
-    </w:p>
-    <w:p>
-      <w:pPr>
-        <w:spacing w:line="240" w:lineRule="auto"/>
-      </w:pPr>
-    </w:p>
-    <w:p>
-      <w:pPr>
-        <w:spacing w:line="240" w:lineRule="auto"/>
-      </w:pPr>
-    </w:p>
-    <w:p>
-      <w:pPr>
-        <w:spacing w:line="240" w:lineRule="auto"/>
-      </w:pPr>
-    </w:p>
-    <w:p>
-      <w:pPr>
-        <w:spacing w:line="240" w:lineRule="auto"/>
-      </w:pPr>
-    </w:p>
-    <w:p>
-      <w:pPr>
-        <w:spacing w:line="240" w:lineRule="auto"/>
-      </w:pPr>
+      <w:r>
+        <w:rPr>
+          <w:noProof/>
+        </w:rPr>
+        <mc:AlternateContent>
+          <mc:Choice Requires="wps">
+            <w:drawing>
+              <wp:anchor distT="0" distB="0" distL="114300" distR="114300" simplePos="0" relativeHeight="251675136" behindDoc="0" locked="0" layoutInCell="1" allowOverlap="1" wp14:anchorId="7CF4C648" wp14:editId="5AB1CEBC">
+                <wp:simplePos x="0" y="0"/>
+                <wp:positionH relativeFrom="column">
+                  <wp:posOffset>1809750</wp:posOffset>
+                </wp:positionH>
+                <wp:positionV relativeFrom="paragraph">
+                  <wp:posOffset>235585</wp:posOffset>
+                </wp:positionV>
+                <wp:extent cx="2197100" cy="412750"/>
+                <wp:effectExtent l="0" t="0" r="12700" b="25400"/>
+                <wp:wrapNone/>
+                <wp:docPr id="558329727" name="Rectangle 31"/>
+                <wp:cNvGraphicFramePr/>
+                <a:graphic xmlns:a="http://schemas.openxmlformats.org/drawingml/2006/main">
+                  <a:graphicData uri="http://schemas.microsoft.com/office/word/2010/wordprocessingShape">
+                    <wps:wsp>
+                      <wps:cNvSpPr/>
+                      <wps:spPr>
+                        <a:xfrm>
+                          <a:off x="0" y="0"/>
+                          <a:ext cx="2197100" cy="412750"/>
+                        </a:xfrm>
+                        <a:prstGeom prst="rect">
+                          <a:avLst/>
+                        </a:prstGeom>
+                      </wps:spPr>
+                      <wps:style>
+                        <a:lnRef idx="2">
+                          <a:schemeClr val="accent1">
+                            <a:shade val="15000"/>
+                          </a:schemeClr>
+                        </a:lnRef>
+                        <a:fillRef idx="1">
+                          <a:schemeClr val="accent1"/>
+                        </a:fillRef>
+                        <a:effectRef idx="0">
+                          <a:schemeClr val="accent1"/>
+                        </a:effectRef>
+                        <a:fontRef idx="minor">
+                          <a:schemeClr val="lt1"/>
+                        </a:fontRef>
+                      </wps:style>
+                      <wps:bodyPr rot="0" spcFirstLastPara="0" vertOverflow="overflow" horzOverflow="overflow" vert="horz" wrap="square" lIns="91440" tIns="45720" rIns="91440" bIns="45720" numCol="1" spcCol="0" rtlCol="0" fromWordArt="0" anchor="ctr" anchorCtr="0" forceAA="0" compatLnSpc="1">
+                        <a:prstTxWarp prst="textNoShape">
+                          <a:avLst/>
+                        </a:prstTxWarp>
+                        <a:noAutofit/>
+                      </wps:bodyPr>
+                    </wps:wsp>
+                  </a:graphicData>
+                </a:graphic>
+                <wp14:sizeRelH relativeFrom="margin">
+                  <wp14:pctWidth>0</wp14:pctWidth>
+                </wp14:sizeRelH>
+                <wp14:sizeRelV relativeFrom="margin">
+                  <wp14:pctHeight>0</wp14:pctHeight>
+                </wp14:sizeRelV>
+              </wp:anchor>
+            </w:drawing>
+          </mc:Choice>
+          <mc:Fallback>
+            <w:pict>
+              <v:rect w14:anchorId="0C61C998" id="Rectangle 31" o:spid="_x0000_s1026" style="position:absolute;margin-left:142.5pt;margin-top:18.55pt;width:173pt;height:32.5pt;z-index:251675136;visibility:visible;mso-wrap-style:square;mso-width-percent:0;mso-height-percent:0;mso-wrap-distance-left:9pt;mso-wrap-distance-top:0;mso-wrap-distance-right:9pt;mso-wrap-distance-bottom:0;mso-position-horizontal:absolute;mso-position-horizontal-relative:text;mso-position-vertical:absolute;mso-position-vertical-relative:text;mso-width-percent:0;mso-height-percent:0;mso-width-relative:margin;mso-height-relative:margin;v-text-anchor:middle" o:gfxdata="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" fillcolor="#156082 [3204]" strokecolor="#030e13 [484]" strokeweight="1.5pt"/>
+            </w:pict>
+          </mc:Fallback>
+        </mc:AlternateContent>
+      </w:r>
+    </w:p>
+    <w:p>
+      <w:pPr>
+        <w:spacing w:line="240" w:lineRule="auto"/>
+      </w:pPr>
+      <w:r>
+        <w:rPr>
+          <w:noProof/>
+        </w:rPr>
+        <mc:AlternateContent>
+          <mc:Choice Requires="wps">
+            <w:drawing>
+              <wp:anchor distT="0" distB="0" distL="114300" distR="114300" simplePos="0" relativeHeight="251676160" behindDoc="0" locked="0" layoutInCell="1" allowOverlap="1" wp14:anchorId="4A4FD52B" wp14:editId="384744F1">
+                <wp:simplePos x="0" y="0"/>
+                <wp:positionH relativeFrom="column">
+                  <wp:posOffset>1962150</wp:posOffset>
+                </wp:positionH>
+                <wp:positionV relativeFrom="paragraph">
+                  <wp:posOffset>24130</wp:posOffset>
+                </wp:positionV>
+                <wp:extent cx="1949450" cy="285750"/>
+                <wp:effectExtent l="0" t="0" r="12700" b="19050"/>
+                <wp:wrapNone/>
+                <wp:docPr id="2139649620" name="Text Box 32"/>
+                <wp:cNvGraphicFramePr/>
+                <a:graphic xmlns:a="http://schemas.openxmlformats.org/drawingml/2006/main">
+                  <a:graphicData uri="http://schemas.microsoft.com/office/word/2010/wordprocessingShape">
+                    <wps:wsp>
+                      <wps:cNvSpPr txBox="1"/>
+                      <wps:spPr>
+                        <a:xfrm>
+                          <a:off x="0" y="0"/>
+                          <a:ext cx="1949450" cy="285750"/>
+                        </a:xfrm>
+                        <a:prstGeom prst="rect">
+                          <a:avLst/>
+                        </a:prstGeom>
+                        <a:solidFill>
+                          <a:schemeClr val="lt1"/>
+                        </a:solidFill>
+                        <a:ln w="6350">
+                          <a:solidFill>
+                            <a:prstClr val="black"/>
+                          </a:solidFill>
+                        </a:ln>
+                      </wps:spPr>
+                      <wps:txbx>
+                        <w:txbxContent>
+                          <w:p>
+                            <w:r>
+                              <w:t>READ OBJECT DISTANCE</w:t>
+                            </w:r>
+                          </w:p>
+                        </w:txbxContent>
+                      </wps:txbx>
+                      <wps:bodyPr rot="0" spcFirstLastPara="0" vertOverflow="overflow" horzOverflow="overflow" vert="horz" wrap="square" lIns="91440" tIns="45720" rIns="91440" bIns="45720" numCol="1" spcCol="0" rtlCol="0" fromWordArt="0" anchor="t" anchorCtr="0" forceAA="0" compatLnSpc="1">
+                        <a:prstTxWarp prst="textNoShape">
+                          <a:avLst/>
+                        </a:prstTxWarp>
+                        <a:noAutofit/>
+                      </wps:bodyPr>
+                    </wps:wsp>
+                  </a:graphicData>
+                </a:graphic>
+                <wp14:sizeRelV relativeFrom="margin">
+                  <wp14:pctHeight>0</wp14:pctHeight>
+                </wp14:sizeRelV>
+              </wp:anchor>
+            </w:drawing>
+          </mc:Choice>
+          <mc:Fallback>
+            <w:pict>
+              <v:shape w14:anchorId="4A4FD52B" id="Text Box 32" o:spid="_x0000_s1035" type="#_x0000_t202" style="position:absolute;margin-left:154.5pt;margin-top:1.9pt;width:153.5pt;height:22.5pt;z-index:251676160;visibility:visible;mso-wrap-style:square;mso-height-percent:0;mso-wrap-distance-left:9pt;mso-wrap-distance-top:0;mso-wrap-distance-right:9pt;mso-wrap-distance-bottom:0;mso-position-horizontal:absolute;mso-position-horizontal-relative:text;mso-position-vertical:absolute;mso-position-vertical-relative:text;mso-height-percent:0;mso-height-relative:margin;v-text-anchor:top" o:gfxdata="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" fillcolor="white [3201]" strokeweight=".5pt">
+                <v:textbox>
+                  <w:txbxContent>
+                    <w:p>
+                      <w:r>
+                        <w:t>READ OBJECT DISTANCE</w:t>
+                      </w:r>
+                    </w:p>
+                  </w:txbxContent>
+                </v:textbox>
+              </v:shape>
+            </w:pict>
+          </mc:Fallback>
+        </mc:AlternateContent>
+      </w:r>
+    </w:p>
+    <w:p>
+      <w:pPr>
+        <w:spacing w:line="240" w:lineRule="auto"/>
+      </w:pPr>
+      <w:r>
+        <w:rPr>
+          <w:noProof/>
+        </w:rPr>
+        <mc:AlternateContent>
+          <mc:Choice Requires="wps">
+            <w:drawing>
+              <wp:anchor distT="0" distB="0" distL="114300" distR="114300" simplePos="0" relativeHeight="251677184" behindDoc="0" locked="0" layoutInCell="1" allowOverlap="1" wp14:anchorId="5BC5CEED" wp14:editId="406C5645">
+                <wp:simplePos x="0" y="0"/>
+                <wp:positionH relativeFrom="column">
+                  <wp:posOffset>2908300</wp:posOffset>
+                </wp:positionH>
+                <wp:positionV relativeFrom="paragraph">
+                  <wp:posOffset>66675</wp:posOffset>
+                </wp:positionV>
+                <wp:extent cx="12700" cy="387350"/>
+                <wp:effectExtent l="0" t="0" r="25400" b="31750"/>
+                <wp:wrapNone/>
+                <wp:docPr id="1922555650" name="Straight Connector 34"/>
+                <wp:cNvGraphicFramePr/>
+                <a:graphic xmlns:a="http://schemas.openxmlformats.org/drawingml/2006/main">
+                  <a:graphicData uri="http://schemas.microsoft.com/office/word/2010/wordprocessingShape">
+                    <wps:wsp>
+                      <wps:cNvCnPr/>
+                      <wps:spPr>
+                        <a:xfrm>
+                          <a:off x="0" y="0"/>
+                          <a:ext cx="12700" cy="387350"/>
+                        </a:xfrm>
+                        <a:prstGeom prst="line">
+                          <a:avLst/>
+                        </a:prstGeom>
+                      </wps:spPr>
+                      <wps:style>
+                        <a:lnRef idx="2">
+                          <a:schemeClr val="accent1"/>
+                        </a:lnRef>
+                        <a:fillRef idx="0">
+                          <a:schemeClr val="accent1"/>
+                        </a:fillRef>
+                        <a:effectRef idx="1">
+                          <a:schemeClr val="accent1"/>
+                        </a:effectRef>
+                        <a:fontRef idx="minor">
+                          <a:schemeClr val="tx1"/>
+                        </a:fontRef>
+                      </wps:style>
+                      <wps:bodyPr/>
+                    </wps:wsp>
+                  </a:graphicData>
+                </a:graphic>
+                <wp14:sizeRelH relativeFrom="margin">
+                  <wp14:pctWidth>0</wp14:pctWidth>
+                </wp14:sizeRelH>
+                <wp14:sizeRelV relativeFrom="margin">
+                  <wp14:pctHeight>0</wp14:pctHeight>
+                </wp14:sizeRelV>
+              </wp:anchor>
+            </w:drawing>
+          </mc:Choice>
+          <mc:Fallback>
+            <w:pict>
+              <v:line w14:anchorId="257A1467" id="Straight Connector 34" o:spid="_x0000_s1026" style="position:absolute;z-index:251677184;visibility:visible;mso-wrap-style:square;mso-width-percent:0;mso-height-percent:0;mso-wrap-distance-left:9pt;mso-wrap-distance-top:0;mso-wrap-distance-right:9pt;mso-wrap-distance-bottom:0;mso-position-horizontal:absolute;mso-position-horizontal-relative:text;mso-position-vertical:absolute;mso-position-vertical-relative:text;mso-width-percent:0;mso-height-percent:0;mso-width-relative:margin;mso-height-relative:margin" from="229pt,5.25pt" to="230pt,35.75pt" o:gfxdata="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" strokecolor="#156082 [3204]" strokeweight="1.5pt">
+                <v:stroke joinstyle="miter"/>
+              </v:line>
+            </w:pict>
+          </mc:Fallback>
+        </mc:AlternateContent>
+      </w:r>
+    </w:p>
+    <w:p>
+      <w:pPr>
+        <w:spacing w:line="240" w:lineRule="auto"/>
+      </w:pPr>
+      <w:r>
+        <w:rPr>
+          <w:noProof/>
+        </w:rPr>
+        <mc:AlternateContent>
+          <mc:Choice Requires="wps">
+            <w:drawing>
+              <wp:anchor distT="0" distB="0" distL="114300" distR="114300" simplePos="0" relativeHeight="251678208" behindDoc="0" locked="0" layoutInCell="1" allowOverlap="1" wp14:anchorId="0958ACFF" wp14:editId="7E95ECBC">
+                <wp:simplePos x="0" y="0"/>
+                <wp:positionH relativeFrom="column">
+                  <wp:posOffset>1587500</wp:posOffset>
+                </wp:positionH>
+                <wp:positionV relativeFrom="paragraph">
+                  <wp:posOffset>128270</wp:posOffset>
+                </wp:positionV>
+                <wp:extent cx="2679700" cy="762000"/>
+                <wp:effectExtent l="38100" t="19050" r="44450" b="38100"/>
+                <wp:wrapNone/>
+                <wp:docPr id="717401019" name="Diamond 35"/>
+                <wp:cNvGraphicFramePr/>
+                <a:graphic xmlns:a="http://schemas.openxmlformats.org/drawingml/2006/main">
+                  <a:graphicData uri="http://schemas.microsoft.com/office/word/2010/wordprocessingShape">
+                    <wps:wsp>
+                      <wps:cNvSpPr/>
+                      <wps:spPr>
+                        <a:xfrm>
+                          <a:off x="0" y="0"/>
+                          <a:ext cx="2679700" cy="762000"/>
+                        </a:xfrm>
+                        <a:prstGeom prst="diamond">
+                          <a:avLst/>
+                        </a:prstGeom>
+                      </wps:spPr>
+                      <wps:style>
+                        <a:lnRef idx="2">
+                          <a:schemeClr val="accent1">
+                            <a:shade val="15000"/>
+                          </a:schemeClr>
+                        </a:lnRef>
+                        <a:fillRef idx="1">
+                          <a:schemeClr val="accent1"/>
+                        </a:fillRef>
+                        <a:effectRef idx="0">
+                          <a:schemeClr val="accent1"/>
+                        </a:effectRef>
+                        <a:fontRef idx="minor">
+                          <a:schemeClr val="lt1"/>
+                        </a:fontRef>
+                      </wps:style>
+                      <wps:bodyPr rot="0" spcFirstLastPara="0" vertOverflow="overflow" horzOverflow="overflow" vert="horz" wrap="square" lIns="91440" tIns="45720" rIns="91440" bIns="45720" numCol="1" spcCol="0" rtlCol="0" fromWordArt="0" anchor="ctr" anchorCtr="0" forceAA="0" compatLnSpc="1">
+                        <a:prstTxWarp prst="textNoShape">
+                          <a:avLst/>
+                        </a:prstTxWarp>
+                        <a:noAutofit/>
+                      </wps:bodyPr>
+                    </wps:wsp>
+                  </a:graphicData>
+                </a:graphic>
+                <wp14:sizeRelH relativeFrom="margin">
+                  <wp14:pctWidth>0</wp14:pctWidth>
+                </wp14:sizeRelH>
+                <wp14:sizeRelV relativeFrom="margin">
+                  <wp14:pctHeight>0</wp14:pctHeight>
+                </wp14:sizeRelV>
+              </wp:anchor>
+            </w:drawing>
+          </mc:Choice>
+          <mc:Fallback>
+            <w:pict>
+              <v:shape w14:anchorId="5F128458" id="Diamond 35" o:spid="_x0000_s1026" type="#_x0000_t4" style="position:absolute;margin-left:125pt;margin-top:10.1pt;width:211pt;height:60pt;z-index:251678208;visibility:visible;mso-wrap-style:square;mso-width-percent:0;mso-height-percent:0;mso-wrap-distance-left:9pt;mso-wrap-distance-top:0;mso-wrap-distance-right:9pt;mso-wrap-distance-bottom:0;mso-position-horizontal:absolute;mso-position-horizontal-relative:text;mso-position-vertical:absolute;mso-position-vertical-relative:text;mso-width-percent:0;mso-height-percent:0;mso-width-relative:margin;mso-height-relative:margin;v-text-anchor:middle" o:gfxdata="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" fillcolor="#156082 [3204]" strokecolor="#030e13 [484]" strokeweight="1.5pt"/>
+            </w:pict>
+          </mc:Fallback>
+        </mc:AlternateContent>
+      </w:r>
+    </w:p>
+    <w:p>
+      <w:pPr>
+        <w:spacing w:line="240" w:lineRule="auto"/>
+      </w:pPr>
+      <w:r>
+        <w:rPr>
+          <w:noProof/>
+        </w:rPr>
+        <mc:AlternateContent>
+          <mc:Choice Requires="wps">
+            <w:drawing>
+              <wp:anchor distT="0" distB="0" distL="114300" distR="114300" simplePos="0" relativeHeight="251679232" behindDoc="0" locked="0" layoutInCell="1" allowOverlap="1" wp14:anchorId="7CC309E5" wp14:editId="77A6D5BF">
+                <wp:simplePos x="0" y="0"/>
+                <wp:positionH relativeFrom="column">
+                  <wp:posOffset>2057400</wp:posOffset>
+                </wp:positionH>
+                <wp:positionV relativeFrom="paragraph">
+                  <wp:posOffset>56515</wp:posOffset>
+                </wp:positionV>
+                <wp:extent cx="1682750" cy="304800"/>
+                <wp:effectExtent l="0" t="0" r="12700" b="19050"/>
+                <wp:wrapNone/>
+                <wp:docPr id="1783185617" name="Text Box 38"/>
+                <wp:cNvGraphicFramePr/>
+                <a:graphic xmlns:a="http://schemas.openxmlformats.org/drawingml/2006/main">
+                  <a:graphicData uri="http://schemas.microsoft.com/office/word/2010/wordprocessingShape">
+                    <wps:wsp>
+                      <wps:cNvSpPr txBox="1"/>
+                      <wps:spPr>
+                        <a:xfrm>
+                          <a:off x="0" y="0"/>
+                          <a:ext cx="1682750" cy="304800"/>
+                        </a:xfrm>
+                        <a:prstGeom prst="rect">
+                          <a:avLst/>
+                        </a:prstGeom>
+                        <a:solidFill>
+                          <a:schemeClr val="lt1"/>
+                        </a:solidFill>
+                        <a:ln w="6350">
+                          <a:solidFill>
+                            <a:prstClr val="black"/>
+                          </a:solidFill>
+                        </a:ln>
+                      </wps:spPr>
+                      <wps:txbx>
+                        <w:txbxContent>
+                          <w:p>
+                            <w:r>
+                              <w:t>DISTANCE &gt; BUFFER</w:t>
+                            </w:r>
+                            <w:r>
+                              <w:t>?</w:t>
+                            </w:r>
+                          </w:p>
+                        </w:txbxContent>
+                      </wps:txbx>
+                      <wps:bodyPr rot="0" spcFirstLastPara="0" vertOverflow="overflow" horzOverflow="overflow" vert="horz" wrap="square" lIns="91440" tIns="45720" rIns="91440" bIns="45720" numCol="1" spcCol="0" rtlCol="0" fromWordArt="0" anchor="t" anchorCtr="0" forceAA="0" compatLnSpc="1">
+                        <a:prstTxWarp prst="textNoShape">
+                          <a:avLst/>
+                        </a:prstTxWarp>
+                        <a:noAutofit/>
+                      </wps:bodyPr>
+                    </wps:wsp>
+                  </a:graphicData>
+                </a:graphic>
+                <wp14:sizeRelH relativeFrom="margin">
+                  <wp14:pctWidth>0</wp14:pctWidth>
+                </wp14:sizeRelH>
+              </wp:anchor>
+            </w:drawing>
+          </mc:Choice>
+          <mc:Fallback>
+            <w:pict>
+              <v:shape w14:anchorId="7CC309E5" id="Text Box 38" o:spid="_x0000_s1036" type="#_x0000_t202" style="position:absolute;margin-left:162pt;margin-top:4.45pt;width:132.5pt;height:24pt;z-index:251679232;visibility:visible;mso-wrap-style:square;mso-width-percent:0;mso-wrap-distance-left:9pt;mso-wrap-distance-top:0;mso-wrap-distance-right:9pt;mso-wrap-distance-bottom:0;mso-position-horizontal:absolute;mso-position-horizontal-relative:text;mso-position-vertical:absolute;mso-position-vertical-relative:text;mso-width-percent:0;mso-width-relative:margin;v-text-anchor:top" o:gfxdata="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" fillcolor="white [3201]" strokeweight=".5pt">
+                <v:textbox>
+                  <w:txbxContent>
+                    <w:p>
+                      <w:r>
+                        <w:t>DISTANCE &gt; BUFFER</w:t>
+                      </w:r>
+                      <w:r>
+                        <w:t>?</w:t>
+                      </w:r>
+                    </w:p>
+                  </w:txbxContent>
+                </v:textbox>
+              </v:shape>
+            </w:pict>
+          </mc:Fallback>
+        </mc:AlternateContent>
+      </w:r>
+    </w:p>
+    <w:p>
+      <w:pPr>
+        <w:spacing w:line="240" w:lineRule="auto"/>
+      </w:pPr>
+    </w:p>
+    <w:p>
+      <w:pPr>
+        <w:spacing w:line="240" w:lineRule="auto"/>
+      </w:pPr>
+      <w:r>
+        <w:rPr>
+          <w:noProof/>
+        </w:rPr>
+        <mc:AlternateContent>
+          <mc:Choice Requires="wps">
+            <w:drawing>
+              <wp:anchor distT="0" distB="0" distL="114300" distR="114300" simplePos="0" relativeHeight="251680256" behindDoc="0" locked="0" layoutInCell="1" allowOverlap="1" wp14:anchorId="7087165D" wp14:editId="6C32292C">
+                <wp:simplePos x="0" y="0"/>
+                <wp:positionH relativeFrom="column">
+                  <wp:posOffset>2921000</wp:posOffset>
+                </wp:positionH>
+                <wp:positionV relativeFrom="paragraph">
+                  <wp:posOffset>14605</wp:posOffset>
+                </wp:positionV>
+                <wp:extent cx="6350" cy="311150"/>
+                <wp:effectExtent l="0" t="0" r="31750" b="31750"/>
+                <wp:wrapNone/>
+                <wp:docPr id="1942963627" name="Straight Connector 40"/>
+                <wp:cNvGraphicFramePr/>
+                <a:graphic xmlns:a="http://schemas.openxmlformats.org/drawingml/2006/main">
+                  <a:graphicData uri="http://schemas.microsoft.com/office/word/2010/wordprocessingShape">
+                    <wps:wsp>
+                      <wps:cNvCnPr/>
+                      <wps:spPr>
+                        <a:xfrm>
+                          <a:off x="0" y="0"/>
+                          <a:ext cx="6350" cy="311150"/>
+                        </a:xfrm>
+                        <a:prstGeom prst="line">
+                          <a:avLst/>
+                        </a:prstGeom>
+                      </wps:spPr>
+                      <wps:style>
+                        <a:lnRef idx="2">
+                          <a:schemeClr val="accent1"/>
+                        </a:lnRef>
+                        <a:fillRef idx="0">
+                          <a:schemeClr val="accent1"/>
+                        </a:fillRef>
+                        <a:effectRef idx="1">
+                          <a:schemeClr val="accent1"/>
+                        </a:effectRef>
+                        <a:fontRef idx="minor">
+                          <a:schemeClr val="tx1"/>
+                        </a:fontRef>
+                      </wps:style>
+                      <wps:bodyPr/>
+                    </wps:wsp>
+                  </a:graphicData>
+                </a:graphic>
+              </wp:anchor>
+            </w:drawing>
+          </mc:Choice>
+          <mc:Fallback>
+            <w:pict>
+              <v:line w14:anchorId="7391BE72" id="Straight Connector 40" o:spid="_x0000_s1026" style="position:absolute;z-index:251680256;visibility:visible;mso-wrap-style:square;mso-wrap-distance-left:9pt;mso-wrap-distance-top:0;mso-wrap-distance-right:9pt;mso-wrap-distance-bottom:0;mso-position-horizontal:absolute;mso-position-horizontal-relative:text;mso-position-vertical:absolute;mso-position-vertical-relative:text" from="230pt,1.15pt" to="230.5pt,25.65pt" o:gfxdata="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" strokecolor="#156082 [3204]" strokeweight="1.5pt">
+                <v:stroke joinstyle="miter"/>
+              </v:line>
+            </w:pict>
+          </mc:Fallback>
+        </mc:AlternateContent>
+      </w:r>
+    </w:p>
+    <w:p>
+      <w:pPr>
+        <w:spacing w:line="240" w:lineRule="auto"/>
+      </w:pPr>
+      <w:r>
+        <w:rPr>
+          <w:noProof/>
+        </w:rPr>
+        <mc:AlternateContent>
+          <mc:Choice Requires="wps">
+            <w:drawing>
+              <wp:anchor distT="0" distB="0" distL="114300" distR="114300" simplePos="0" relativeHeight="251682304" behindDoc="0" locked="0" layoutInCell="1" allowOverlap="1" wp14:anchorId="6BD3DE40" wp14:editId="4B20F753">
+                <wp:simplePos x="0" y="0"/>
+                <wp:positionH relativeFrom="column">
+                  <wp:posOffset>2184400</wp:posOffset>
+                </wp:positionH>
+                <wp:positionV relativeFrom="paragraph">
+                  <wp:posOffset>120650</wp:posOffset>
+                </wp:positionV>
+                <wp:extent cx="1530350" cy="279400"/>
+                <wp:effectExtent l="0" t="0" r="12700" b="25400"/>
+                <wp:wrapNone/>
+                <wp:docPr id="413348691" name="Text Box 42"/>
+                <wp:cNvGraphicFramePr/>
+                <a:graphic xmlns:a="http://schemas.openxmlformats.org/drawingml/2006/main">
+                  <a:graphicData uri="http://schemas.microsoft.com/office/word/2010/wordprocessingShape">
+                    <wps:wsp>
+                      <wps:cNvSpPr txBox="1"/>
+                      <wps:spPr>
+                        <a:xfrm>
+                          <a:off x="0" y="0"/>
+                          <a:ext cx="1530350" cy="279400"/>
+                        </a:xfrm>
+                        <a:prstGeom prst="rect">
+                          <a:avLst/>
+                        </a:prstGeom>
+                        <a:solidFill>
+                          <a:schemeClr val="lt1"/>
+                        </a:solidFill>
+                        <a:ln w="6350">
+                          <a:solidFill>
+                            <a:prstClr val="black"/>
+                          </a:solidFill>
+                        </a:ln>
+                      </wps:spPr>
+                      <wps:txbx>
+                        <w:txbxContent>
+                          <w:p>
+                            <w:r>
+                              <w:t xml:space="preserve">   MOVE FORWARD </w:t>
+                            </w:r>
+                          </w:p>
+                        </w:txbxContent>
+                      </wps:txbx>
+                      <wps:bodyPr rot="0" spcFirstLastPara="0" vertOverflow="overflow" horzOverflow="overflow" vert="horz" wrap="square" lIns="91440" tIns="45720" rIns="91440" bIns="45720" numCol="1" spcCol="0" rtlCol="0" fromWordArt="0" anchor="t" anchorCtr="0" forceAA="0" compatLnSpc="1">
+                        <a:prstTxWarp prst="textNoShape">
+                          <a:avLst/>
+                        </a:prstTxWarp>
+                        <a:noAutofit/>
+                      </wps:bodyPr>
+                    </wps:wsp>
+                  </a:graphicData>
+                </a:graphic>
+                <wp14:sizeRelH relativeFrom="margin">
+                  <wp14:pctWidth>0</wp14:pctWidth>
+                </wp14:sizeRelH>
+                <wp14:sizeRelV relativeFrom="margin">
+                  <wp14:pctHeight>0</wp14:pctHeight>
+                </wp14:sizeRelV>
+              </wp:anchor>
+            </w:drawing>
+          </mc:Choice>
+          <mc:Fallback>
+            <w:pict>
+              <v:shape w14:anchorId="6BD3DE40" id="Text Box 42" o:spid="_x0000_s1037" type="#_x0000_t202" style="position:absolute;margin-left:172pt;margin-top:9.5pt;width:120.5pt;height:22pt;z-index:251682304;visibility:visible;mso-wrap-style:square;mso-width-percent:0;mso-height-percent:0;mso-wrap-distance-left:9pt;mso-wrap-distance-top:0;mso-wrap-distance-right:9pt;mso-wrap-distance-bottom:0;mso-position-horizontal:absolute;mso-position-horizontal-relative:text;mso-position-vertical:absolute;mso-position-vertical-relative:text;mso-width-percent:0;mso-height-percent:0;mso-width-relative:margin;mso-height-relative:margin;v-text-anchor:top" o:gfxdata="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" fillcolor="white [3201]" strokeweight=".5pt">
+                <v:textbox>
+                  <w:txbxContent>
+                    <w:p>
+                      <w:r>
+                        <w:t xml:space="preserve">   MOVE FORWARD </w:t>
+                      </w:r>
+                    </w:p>
+                  </w:txbxContent>
+                </v:textbox>
+              </v:shape>
+            </w:pict>
+          </mc:Fallback>
+        </mc:AlternateContent>
+      </w:r>
+      <w:r>
+        <w:rPr>
+          <w:noProof/>
+        </w:rPr>
+        <mc:AlternateContent>
+          <mc:Choice Requires="wps">
+            <w:drawing>
+              <wp:anchor distT="0" distB="0" distL="114300" distR="114300" simplePos="0" relativeHeight="251681280" behindDoc="0" locked="0" layoutInCell="1" allowOverlap="1" wp14:anchorId="31363475" wp14:editId="7FFAA55E">
+                <wp:simplePos x="0" y="0"/>
+                <wp:positionH relativeFrom="column">
+                  <wp:posOffset>1981200</wp:posOffset>
+                </wp:positionH>
+                <wp:positionV relativeFrom="paragraph">
+                  <wp:posOffset>44450</wp:posOffset>
+                </wp:positionV>
+                <wp:extent cx="1917700" cy="412750"/>
+                <wp:effectExtent l="0" t="0" r="25400" b="25400"/>
+                <wp:wrapNone/>
+                <wp:docPr id="1958906667" name="Rectangle 41"/>
+                <wp:cNvGraphicFramePr/>
+                <a:graphic xmlns:a="http://schemas.openxmlformats.org/drawingml/2006/main">
+                  <a:graphicData uri="http://schemas.microsoft.com/office/word/2010/wordprocessingShape">
+                    <wps:wsp>
+                      <wps:cNvSpPr/>
+                      <wps:spPr>
+                        <a:xfrm>
+                          <a:off x="0" y="0"/>
+                          <a:ext cx="1917700" cy="412750"/>
+                        </a:xfrm>
+                        <a:prstGeom prst="rect">
+                          <a:avLst/>
+                        </a:prstGeom>
+                      </wps:spPr>
+                      <wps:style>
+                        <a:lnRef idx="2">
+                          <a:schemeClr val="accent1">
+                            <a:shade val="15000"/>
+                          </a:schemeClr>
+                        </a:lnRef>
+                        <a:fillRef idx="1">
+                          <a:schemeClr val="accent1"/>
+                        </a:fillRef>
+                        <a:effectRef idx="0">
+                          <a:schemeClr val="accent1"/>
+                        </a:effectRef>
+                        <a:fontRef idx="minor">
+                          <a:schemeClr val="lt1"/>
+                        </a:fontRef>
+                      </wps:style>
+                      <wps:bodyPr rot="0" spcFirstLastPara="0" vertOverflow="overflow" horzOverflow="overflow" vert="horz" wrap="square" lIns="91440" tIns="45720" rIns="91440" bIns="45720" numCol="1" spcCol="0" rtlCol="0" fromWordArt="0" anchor="ctr" anchorCtr="0" forceAA="0" compatLnSpc="1">
+                        <a:prstTxWarp prst="textNoShape">
+                          <a:avLst/>
+                        </a:prstTxWarp>
+                        <a:noAutofit/>
+                      </wps:bodyPr>
+                    </wps:wsp>
+                  </a:graphicData>
+                </a:graphic>
+                <wp14:sizeRelH relativeFrom="margin">
+                  <wp14:pctWidth>0</wp14:pctWidth>
+                </wp14:sizeRelH>
+                <wp14:sizeRelV relativeFrom="margin">
+                  <wp14:pctHeight>0</wp14:pctHeight>
+                </wp14:sizeRelV>
+              </wp:anchor>
+            </w:drawing>
+          </mc:Choice>
+          <mc:Fallback>
+            <w:pict>
+              <v:rect w14:anchorId="5C735A31" id="Rectangle 41" o:spid="_x0000_s1026" style="position:absolute;margin-left:156pt;margin-top:3.5pt;width:151pt;height:32.5pt;z-index:251681280;visibility:visible;mso-wrap-style:square;mso-width-percent:0;mso-height-percent:0;mso-wrap-distance-left:9pt;mso-wrap-distance-top:0;mso-wrap-distance-right:9pt;mso-wrap-distance-bottom:0;mso-position-horizontal:absolute;mso-position-horizontal-relative:text;mso-position-vertical:absolute;mso-position-vertical-relative:text;mso-width-percent:0;mso-height-percent:0;mso-width-relative:margin;mso-height-relative:margin;v-text-anchor:middle" o:gfxdata="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" fillcolor="#156082 [3204]" strokecolor="#030e13 [484]" strokeweight="1.5pt"/>
+            </w:pict>
+          </mc:Fallback>
+        </mc:AlternateContent>
+      </w:r>
+    </w:p>
+    <w:p>
+      <w:pPr>
+        <w:spacing w:line="240" w:lineRule="auto"/>
+      </w:pPr>
+      <w:r>
+        <w:rPr>
+          <w:noProof/>
+        </w:rPr>
+        <mc:AlternateContent>
+          <mc:Choice Requires="wps">
+            <w:drawing>
+              <wp:anchor distT="0" distB="0" distL="114300" distR="114300" simplePos="0" relativeHeight="251683328" behindDoc="0" locked="0" layoutInCell="1" allowOverlap="1" wp14:anchorId="4F24DBF3" wp14:editId="638D0E27">
+                <wp:simplePos x="0" y="0"/>
+                <wp:positionH relativeFrom="column">
+                  <wp:posOffset>2914650</wp:posOffset>
+                </wp:positionH>
+                <wp:positionV relativeFrom="paragraph">
+                  <wp:posOffset>175895</wp:posOffset>
+                </wp:positionV>
+                <wp:extent cx="6350" cy="292100"/>
+                <wp:effectExtent l="0" t="0" r="31750" b="31750"/>
+                <wp:wrapNone/>
+                <wp:docPr id="1264150797" name="Straight Connector 43"/>
+                <wp:cNvGraphicFramePr/>
+                <a:graphic xmlns:a="http://schemas.openxmlformats.org/drawingml/2006/main">
+                  <a:graphicData uri="http://schemas.microsoft.com/office/word/2010/wordprocessingShape">
+                    <wps:wsp>
+                      <wps:cNvCnPr/>
+                      <wps:spPr>
+                        <a:xfrm>
+                          <a:off x="0" y="0"/>
+                          <a:ext cx="6350" cy="292100"/>
+                        </a:xfrm>
+                        <a:prstGeom prst="line">
+                          <a:avLst/>
+                        </a:prstGeom>
+                      </wps:spPr>
+                      <wps:style>
+                        <a:lnRef idx="2">
+                          <a:schemeClr val="accent1"/>
+                        </a:lnRef>
+                        <a:fillRef idx="0">
+                          <a:schemeClr val="accent1"/>
+                        </a:fillRef>
+                        <a:effectRef idx="1">
+                          <a:schemeClr val="accent1"/>
+                        </a:effectRef>
+                        <a:fontRef idx="minor">
+                          <a:schemeClr val="tx1"/>
+                        </a:fontRef>
+                      </wps:style>
+                      <wps:bodyPr/>
+                    </wps:wsp>
+                  </a:graphicData>
+                </a:graphic>
+              </wp:anchor>
+            </w:drawing>
+          </mc:Choice>
+          <mc:Fallback>
+            <w:pict>
+              <v:line w14:anchorId="112F678F" id="Straight Connector 43" o:spid="_x0000_s1026" style="position:absolute;z-index:251683328;visibility:visible;mso-wrap-style:square;mso-wrap-distance-left:9pt;mso-wrap-distance-top:0;mso-wrap-distance-right:9pt;mso-wrap-distance-bottom:0;mso-position-horizontal:absolute;mso-position-horizontal-relative:text;mso-position-vertical:absolute;mso-position-vertical-relative:text" from="229.5pt,13.85pt" to="230pt,36.85pt" o:gfxdata="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" strokecolor="#156082 [3204]" strokeweight="1.5pt">
+                <v:stroke joinstyle="miter"/>
+              </v:line>
+            </w:pict>
+          </mc:Fallback>
+        </mc:AlternateContent>
+      </w:r>
+    </w:p>
+    <w:p>
+      <w:pPr>
+        <w:spacing w:line="240" w:lineRule="auto"/>
+      </w:pPr>
+      <w:r>
+        <w:rPr>
+          <w:noProof/>
+        </w:rPr>
+        <mc:AlternateContent>
+          <mc:Choice Requires="wps">
+            <w:drawing>
+              <wp:anchor distT="0" distB="0" distL="114300" distR="114300" simplePos="0" relativeHeight="251684352" behindDoc="0" locked="0" layoutInCell="1" allowOverlap="1" wp14:anchorId="397A5F35" wp14:editId="06ECF6DF">
+                <wp:simplePos x="0" y="0"/>
+                <wp:positionH relativeFrom="column">
+                  <wp:posOffset>2000250</wp:posOffset>
+                </wp:positionH>
+                <wp:positionV relativeFrom="paragraph">
+                  <wp:posOffset>186690</wp:posOffset>
+                </wp:positionV>
+                <wp:extent cx="1955800" cy="400050"/>
+                <wp:effectExtent l="0" t="0" r="25400" b="19050"/>
+                <wp:wrapNone/>
+                <wp:docPr id="2122529973" name="Rectangle 44"/>
+                <wp:cNvGraphicFramePr/>
+                <a:graphic xmlns:a="http://schemas.openxmlformats.org/drawingml/2006/main">
+                  <a:graphicData uri="http://schemas.microsoft.com/office/word/2010/wordprocessingShape">
+                    <wps:wsp>
+                      <wps:cNvSpPr/>
+                      <wps:spPr>
+                        <a:xfrm>
+                          <a:off x="0" y="0"/>
+                          <a:ext cx="1955800" cy="400050"/>
+                        </a:xfrm>
+                        <a:prstGeom prst="rect">
+                          <a:avLst/>
+                        </a:prstGeom>
+                      </wps:spPr>
+                      <wps:style>
+                        <a:lnRef idx="2">
+                          <a:schemeClr val="accent1">
+                            <a:shade val="15000"/>
+                          </a:schemeClr>
+                        </a:lnRef>
+                        <a:fillRef idx="1">
+                          <a:schemeClr val="accent1"/>
+                        </a:fillRef>
+                        <a:effectRef idx="0">
+                          <a:schemeClr val="accent1"/>
+                        </a:effectRef>
+                        <a:fontRef idx="minor">
+                          <a:schemeClr val="lt1"/>
+                        </a:fontRef>
+                      </wps:style>
+                      <wps:bodyPr rot="0" spcFirstLastPara="0" vertOverflow="overflow" horzOverflow="overflow" vert="horz" wrap="square" lIns="91440" tIns="45720" rIns="91440" bIns="45720" numCol="1" spcCol="0" rtlCol="0" fromWordArt="0" anchor="ctr" anchorCtr="0" forceAA="0" compatLnSpc="1">
+                        <a:prstTxWarp prst="textNoShape">
+                          <a:avLst/>
+                        </a:prstTxWarp>
+                        <a:noAutofit/>
+                      </wps:bodyPr>
+                    </wps:wsp>
+                  </a:graphicData>
+                </a:graphic>
+                <wp14:sizeRelH relativeFrom="margin">
+                  <wp14:pctWidth>0</wp14:pctWidth>
+                </wp14:sizeRelH>
+                <wp14:sizeRelV relativeFrom="margin">
+                  <wp14:pctHeight>0</wp14:pctHeight>
+                </wp14:sizeRelV>
+              </wp:anchor>
+            </w:drawing>
+          </mc:Choice>
+          <mc:Fallback>
+            <w:pict>
+              <v:rect w14:anchorId="331A38FF" id="Rectangle 44" o:spid="_x0000_s1026" style="position:absolute;margin-left:157.5pt;margin-top:14.7pt;width:154pt;height:31.5pt;z-index:251684352;visibility:visible;mso-wrap-style:square;mso-width-percent:0;mso-height-percent:0;mso-wrap-distance-left:9pt;mso-wrap-distance-top:0;mso-wrap-distance-right:9pt;mso-wrap-distance-bottom:0;mso-position-horizontal:absolute;mso-position-horizontal-relative:text;mso-position-vertical:absolute;mso-position-vertical-relative:text;mso-width-percent:0;mso-height-percent:0;mso-width-relative:margin;mso-height-relative:margin;v-text-anchor:middle" o:gfxdata="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" fillcolor="#156082 [3204]" strokecolor="#030e13 [484]" strokeweight="1.5pt"/>
+            </w:pict>
+          </mc:Fallback>
+        </mc:AlternateContent>
+      </w:r>
+      <w:r>
+        <w:rPr>
+          <w:noProof/>
+        </w:rPr>
+        <mc:AlternateContent>
+          <mc:Choice Requires="wps">
+            <w:drawing>
+              <wp:anchor distT="0" distB="0" distL="114300" distR="114300" simplePos="0" relativeHeight="251685376" behindDoc="0" locked="0" layoutInCell="1" allowOverlap="1" wp14:anchorId="38E5C1C6" wp14:editId="3F0A53A8">
+                <wp:simplePos x="0" y="0"/>
+                <wp:positionH relativeFrom="column">
+                  <wp:posOffset>2254250</wp:posOffset>
+                </wp:positionH>
+                <wp:positionV relativeFrom="paragraph">
+                  <wp:posOffset>243840</wp:posOffset>
+                </wp:positionV>
+                <wp:extent cx="1511300" cy="292100"/>
+                <wp:effectExtent l="0" t="0" r="12700" b="12700"/>
+                <wp:wrapNone/>
+                <wp:docPr id="495404595" name="Text Box 45"/>
+                <wp:cNvGraphicFramePr/>
+                <a:graphic xmlns:a="http://schemas.openxmlformats.org/drawingml/2006/main">
+                  <a:graphicData uri="http://schemas.microsoft.com/office/word/2010/wordprocessingShape">
+                    <wps:wsp>
+                      <wps:cNvSpPr txBox="1"/>
+                      <wps:spPr>
+                        <a:xfrm>
+                          <a:off x="0" y="0"/>
+                          <a:ext cx="1511300" cy="292100"/>
+                        </a:xfrm>
+                        <a:prstGeom prst="rect">
+                          <a:avLst/>
+                        </a:prstGeom>
+                        <a:solidFill>
+                          <a:schemeClr val="lt1"/>
+                        </a:solidFill>
+                        <a:ln w="6350">
+                          <a:solidFill>
+                            <a:prstClr val="black"/>
+                          </a:solidFill>
+                        </a:ln>
+                      </wps:spPr>
+                      <wps:txbx>
+                        <w:txbxContent>
+                          <w:p>
+                            <w:r>
+                              <w:t xml:space="preserve">   </w:t>
+                            </w:r>
+                            <w:r>
+                              <w:t>CAPTU</w:t>
+                            </w:r>
+                            <w:r>
+                              <w:t xml:space="preserve">RE </w:t>
+                            </w:r>
+                            <w:r>
+                              <w:t xml:space="preserve">IMAGE </w:t>
+                            </w:r>
+                          </w:p>
+                        </w:txbxContent>
+                      </wps:txbx>
+                      <wps:bodyPr rot="0" spcFirstLastPara="0" vertOverflow="overflow" horzOverflow="overflow" vert="horz" wrap="square" lIns="91440" tIns="45720" rIns="91440" bIns="45720" numCol="1" spcCol="0" rtlCol="0" fromWordArt="0" anchor="t" anchorCtr="0" forceAA="0" compatLnSpc="1">
+                        <a:prstTxWarp prst="textNoShape">
+                          <a:avLst/>
+                        </a:prstTxWarp>
+                        <a:noAutofit/>
+                      </wps:bodyPr>
+                    </wps:wsp>
+                  </a:graphicData>
+                </a:graphic>
+                <wp14:sizeRelH relativeFrom="margin">
+                  <wp14:pctWidth>0</wp14:pctWidth>
+                </wp14:sizeRelH>
+                <wp14:sizeRelV relativeFrom="margin">
+                  <wp14:pctHeight>0</wp14:pctHeight>
+                </wp14:sizeRelV>
+              </wp:anchor>
+            </w:drawing>
+          </mc:Choice>
+          <mc:Fallback>
+            <w:pict>
+              <v:shape w14:anchorId="38E5C1C6" id="Text Box 45" o:spid="_x0000_s1038" type="#_x0000_t202" style="position:absolute;margin-left:177.5pt;margin-top:19.2pt;width:119pt;height:23pt;z-index:251685376;visibility:visible;mso-wrap-style:square;mso-width-percent:0;mso-height-percent:0;mso-wrap-distance-left:9pt;mso-wrap-distance-top:0;mso-wrap-distance-right:9pt;mso-wrap-distance-bottom:0;mso-position-horizontal:absolute;mso-position-horizontal-relative:text;mso-position-vertical:absolute;mso-position-vertical-relative:text;mso-width-percent:0;mso-height-percent:0;mso-width-relative:margin;mso-height-relative:margin;v-text-anchor:top" o:gfxdata="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" fillcolor="white [3201]" strokeweight=".5pt">
+                <v:textbox>
+                  <w:txbxContent>
+                    <w:p>
+                      <w:r>
+                        <w:t xml:space="preserve">   </w:t>
+                      </w:r>
+                      <w:r>
+                        <w:t>CAPTU</w:t>
+                      </w:r>
+                      <w:r>
+                        <w:t xml:space="preserve">RE </w:t>
+                      </w:r>
+                      <w:r>
+                        <w:t xml:space="preserve">IMAGE </w:t>
+                      </w:r>
+                    </w:p>
+                  </w:txbxContent>
+                </v:textbox>
+              </v:shape>
+            </w:pict>
+          </mc:Fallback>
+        </mc:AlternateContent>
+      </w:r>
+    </w:p>
+    <w:p>
+      <w:pPr>
+        <w:spacing w:line="240" w:lineRule="auto"/>
+      </w:pPr>
+    </w:p>
+    <w:p>
+      <w:pPr>
+        <w:spacing w:line="240" w:lineRule="auto"/>
+      </w:pPr>
+      <w:r>
+        <w:rPr>
+          <w:noProof/>
+        </w:rPr>
+        <mc:AlternateContent>
+          <mc:Choice Requires="wps">
+            <w:drawing>
+              <wp:anchor distT="0" distB="0" distL="114300" distR="114300" simplePos="0" relativeHeight="251686400" behindDoc="0" locked="0" layoutInCell="1" allowOverlap="1" wp14:anchorId="1E56E45F" wp14:editId="3A197AF5">
+                <wp:simplePos x="0" y="0"/>
+                <wp:positionH relativeFrom="column">
+                  <wp:posOffset>2927350</wp:posOffset>
+                </wp:positionH>
+                <wp:positionV relativeFrom="paragraph">
+                  <wp:posOffset>17780</wp:posOffset>
+                </wp:positionV>
+                <wp:extent cx="6350" cy="368300"/>
+                <wp:effectExtent l="0" t="0" r="31750" b="31750"/>
+                <wp:wrapNone/>
+                <wp:docPr id="449426169" name="Straight Connector 46"/>
+                <wp:cNvGraphicFramePr/>
+                <a:graphic xmlns:a="http://schemas.openxmlformats.org/drawingml/2006/main">
+                  <a:graphicData uri="http://schemas.microsoft.com/office/word/2010/wordprocessingShape">
+                    <wps:wsp>
+                      <wps:cNvCnPr/>
+                      <wps:spPr>
+                        <a:xfrm>
+                          <a:off x="0" y="0"/>
+                          <a:ext cx="6350" cy="368300"/>
+                        </a:xfrm>
+                        <a:prstGeom prst="line">
+                          <a:avLst/>
+                        </a:prstGeom>
+                      </wps:spPr>
+                      <wps:style>
+                        <a:lnRef idx="2">
+                          <a:schemeClr val="accent1"/>
+                        </a:lnRef>
+                        <a:fillRef idx="0">
+                          <a:schemeClr val="accent1"/>
+                        </a:fillRef>
+                        <a:effectRef idx="1">
+                          <a:schemeClr val="accent1"/>
+                        </a:effectRef>
+                        <a:fontRef idx="minor">
+                          <a:schemeClr val="tx1"/>
+                        </a:fontRef>
+                      </wps:style>
+                      <wps:bodyPr/>
+                    </wps:wsp>
+                  </a:graphicData>
+                </a:graphic>
+              </wp:anchor>
+            </w:drawing>
+          </mc:Choice>
+          <mc:Fallback>
+            <w:pict>
+              <v:line w14:anchorId="27C4557D" id="Straight Connector 46" o:spid="_x0000_s1026" style="position:absolute;z-index:251686400;visibility:visible;mso-wrap-style:square;mso-wrap-distance-left:9pt;mso-wrap-distance-top:0;mso-wrap-distance-right:9pt;mso-wrap-distance-bottom:0;mso-position-horizontal:absolute;mso-position-horizontal-relative:text;mso-position-vertical:absolute;mso-position-vertical-relative:text" from="230.5pt,1.4pt" to="231pt,30.4pt" o:gfxdata="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" strokecolor="#156082 [3204]" strokeweight="1.5pt">
+                <v:stroke joinstyle="miter"/>
+              </v:line>
+            </w:pict>
+          </mc:Fallback>
+        </mc:AlternateContent>
+      </w:r>
+    </w:p>
+    <w:p>
+      <w:pPr>
+        <w:spacing w:line="240" w:lineRule="auto"/>
+      </w:pPr>
+      <w:r>
+        <w:rPr>
+          <w:noProof/>
+        </w:rPr>
+        <mc:AlternateContent>
+          <mc:Choice Requires="wps">
+            <w:drawing>
+              <wp:anchor distT="0" distB="0" distL="114300" distR="114300" simplePos="0" relativeHeight="251687424" behindDoc="0" locked="0" layoutInCell="1" allowOverlap="1" wp14:anchorId="6AA3D722" wp14:editId="56173837">
+                <wp:simplePos x="0" y="0"/>
+                <wp:positionH relativeFrom="column">
+                  <wp:posOffset>2228850</wp:posOffset>
+                </wp:positionH>
+                <wp:positionV relativeFrom="paragraph">
+                  <wp:posOffset>79375</wp:posOffset>
+                </wp:positionV>
+                <wp:extent cx="1416050" cy="514350"/>
+                <wp:effectExtent l="0" t="0" r="12700" b="19050"/>
+                <wp:wrapNone/>
+                <wp:docPr id="1124709223" name="Oval 47"/>
+                <wp:cNvGraphicFramePr/>
+                <a:graphic xmlns:a="http://schemas.openxmlformats.org/drawingml/2006/main">
+                  <a:graphicData uri="http://schemas.microsoft.com/office/word/2010/wordprocessingShape">
+                    <wps:wsp>
+                      <wps:cNvSpPr/>
+                      <wps:spPr>
+                        <a:xfrm>
+                          <a:off x="0" y="0"/>
+                          <a:ext cx="1416050" cy="514350"/>
+                        </a:xfrm>
+                        <a:prstGeom prst="ellipse">
+                          <a:avLst/>
+                        </a:prstGeom>
+                      </wps:spPr>
+                      <wps:style>
+                        <a:lnRef idx="2">
+                          <a:schemeClr val="accent1">
+                            <a:shade val="15000"/>
+                          </a:schemeClr>
+                        </a:lnRef>
+                        <a:fillRef idx="1">
+                          <a:schemeClr val="accent1"/>
+                        </a:fillRef>
+                        <a:effectRef idx="0">
+                          <a:schemeClr val="accent1"/>
+                        </a:effectRef>
+                        <a:fontRef idx="minor">
+                          <a:schemeClr val="lt1"/>
+                        </a:fontRef>
+                      </wps:style>
+                      <wps:bodyPr rot="0" spcFirstLastPara="0" vertOverflow="overflow" horzOverflow="overflow" vert="horz" wrap="square" lIns="91440" tIns="45720" rIns="91440" bIns="45720" numCol="1" spcCol="0" rtlCol="0" fromWordArt="0" anchor="ctr" anchorCtr="0" forceAA="0" compatLnSpc="1">
+                        <a:prstTxWarp prst="textNoShape">
+                          <a:avLst/>
+                        </a:prstTxWarp>
+                        <a:noAutofit/>
+                      </wps:bodyPr>
+                    </wps:wsp>
+                  </a:graphicData>
+                </a:graphic>
+                <wp14:sizeRelH relativeFrom="margin">
+                  <wp14:pctWidth>0</wp14:pctWidth>
+                </wp14:sizeRelH>
+              </wp:anchor>
+            </w:drawing>
+          </mc:Choice>
+          <mc:Fallback>
+            <w:pict>
+              <v:oval w14:anchorId="48F2F85A" id="Oval 47" o:spid="_x0000_s1026" style="position:absolute;margin-left:175.5pt;margin-top:6.25pt;width:111.5pt;height:40.5pt;z-index:251687424;visibility:visible;mso-wrap-style:square;mso-width-percent:0;mso-wrap-distance-left:9pt;mso-wrap-distance-top:0;mso-wrap-distance-right:9pt;mso-wrap-distance-bottom:0;mso-position-horizontal:absolute;mso-position-horizontal-relative:text;mso-position-vertical:absolute;mso-position-vertical-relative:text;mso-width-percent:0;mso-width-relative:margin;v-text-anchor:middle" o:gfxdata="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" fillcolor="#156082 [3204]" strokecolor="#030e13 [484]" strokeweight="1.5pt">
+                <v:stroke joinstyle="miter"/>
+              </v:oval>
+            </w:pict>
+          </mc:Fallback>
+        </mc:AlternateContent>
+      </w:r>
+      <w:r>
+        <w:rPr>
+          <w:noProof/>
+        </w:rPr>
+        <mc:AlternateContent>
+          <mc:Choice Requires="wps">
+            <w:drawing>
+              <wp:anchor distT="0" distB="0" distL="114300" distR="114300" simplePos="0" relativeHeight="251688448" behindDoc="0" locked="0" layoutInCell="1" allowOverlap="1" wp14:anchorId="3B7D1A12" wp14:editId="45D0AB1C">
+                <wp:simplePos x="0" y="0"/>
+                <wp:positionH relativeFrom="column">
+                  <wp:posOffset>2508250</wp:posOffset>
+                </wp:positionH>
+                <wp:positionV relativeFrom="paragraph">
+                  <wp:posOffset>193675</wp:posOffset>
+                </wp:positionV>
+                <wp:extent cx="971550" cy="292100"/>
+                <wp:effectExtent l="0" t="0" r="19050" b="12700"/>
+                <wp:wrapNone/>
+                <wp:docPr id="1367887781" name="Text Box 48"/>
+                <wp:cNvGraphicFramePr/>
+                <a:graphic xmlns:a="http://schemas.openxmlformats.org/drawingml/2006/main">
+                  <a:graphicData uri="http://schemas.microsoft.com/office/word/2010/wordprocessingShape">
+                    <wps:wsp>
+                      <wps:cNvSpPr txBox="1"/>
+                      <wps:spPr>
+                        <a:xfrm>
+                          <a:off x="0" y="0"/>
+                          <a:ext cx="971550" cy="292100"/>
+                        </a:xfrm>
+                        <a:prstGeom prst="rect">
+                          <a:avLst/>
+                        </a:prstGeom>
+                        <a:solidFill>
+                          <a:schemeClr val="lt1"/>
+                        </a:solidFill>
+                        <a:ln w="6350">
+                          <a:solidFill>
+                            <a:prstClr val="black"/>
+                          </a:solidFill>
+                        </a:ln>
+                      </wps:spPr>
+                      <wps:txbx>
+                        <w:txbxContent>
+                          <w:p>
+                            <w:r>
+                              <w:t xml:space="preserve">  </w:t>
+                            </w:r>
+                            <w:r>
+                              <w:t>RETURN</w:t>
+                            </w:r>
+                          </w:p>
+                        </w:txbxContent>
+                      </wps:txbx>
+                      <wps:bodyPr rot="0" spcFirstLastPara="0" vertOverflow="overflow" horzOverflow="overflow" vert="horz" wrap="square" lIns="91440" tIns="45720" rIns="91440" bIns="45720" numCol="1" spcCol="0" rtlCol="0" fromWordArt="0" anchor="t" anchorCtr="0" forceAA="0" compatLnSpc="1">
+                        <a:prstTxWarp prst="textNoShape">
+                          <a:avLst/>
+                        </a:prstTxWarp>
+                        <a:noAutofit/>
+                      </wps:bodyPr>
+                    </wps:wsp>
+                  </a:graphicData>
+                </a:graphic>
+                <wp14:sizeRelH relativeFrom="margin">
+                  <wp14:pctWidth>0</wp14:pctWidth>
+                </wp14:sizeRelH>
+              </wp:anchor>
+            </w:drawing>
+          </mc:Choice>
+          <mc:Fallback>
+            <w:pict>
+              <v:shape w14:anchorId="3B7D1A12" id="Text Box 48" o:spid="_x0000_s1039" type="#_x0000_t202" style="position:absolute;margin-left:197.5pt;margin-top:15.25pt;width:76.5pt;height:23pt;z-index:251688448;visibility:visible;mso-wrap-style:square;mso-width-percent:0;mso-wrap-distance-left:9pt;mso-wrap-distance-top:0;mso-wrap-distance-right:9pt;mso-wrap-distance-bottom:0;mso-position-horizontal:absolute;mso-position-horizontal-relative:text;mso-position-vertical:absolute;mso-position-vertical-relative:text;mso-width-percent:0;mso-width-relative:margin;v-text-anchor:top" o:gfxdata="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" fillcolor="white [3201]" strokeweight=".5pt">
+                <v:textbox>
+                  <w:txbxContent>
+                    <w:p>
+                      <w:r>
+                        <w:t xml:space="preserve">  </w:t>
+                      </w:r>
+                      <w:r>
+                        <w:t>RETURN</w:t>
+                      </w:r>
+                    </w:p>
+                  </w:txbxContent>
+                </v:textbox>
+              </v:shape>
+            </w:pict>
+          </mc:Fallback>
+        </mc:AlternateContent>
+      </w:r>
     </w:p>
     <w:p>
       <w:pPr>
@@ -7709,7 +8848,6 @@
   <w:style w:type="character" w:default="1" w:styleId="DefaultParagraphFont">
     <w:name w:val="Default Paragraph Font"/>
     <w:uiPriority w:val="1"/>
-    <w:semiHidden/>
     <w:unhideWhenUsed/>
   </w:style>
   <w:style w:type="table" w:default="1" w:styleId="TableNormal">

</xml_diff>

<commit_message>
Start Scaredy Mode Response Algorithm Design
</commit_message>
<xml_diff>
--- a/Documents/SwiftBot Task10 - Requirements (1).docx
+++ b/Documents/SwiftBot Task10 - Requirements (1).docx
@@ -1596,7 +1596,7 @@
                 </mc:Choice>
                 <mc:Fallback>
                   <w:pict>
-                    <v:shapetype w14:anchorId="6A2DC2EA" id="_x0000_t32" coordsize="21600,21600" o:spt="32" o:oned="t" path="m,l21600,21600e" filled="f">
+                    <v:shapetype w14:anchorId="31FE0EE8" id="_x0000_t32" coordsize="21600,21600" o:spt="32" o:oned="t" path="m,l21600,21600e" filled="f">
                       <v:path arrowok="t" fillok="f" o:connecttype="none"/>
                       <o:lock v:ext="edit" shapetype="t"/>
                     </v:shapetype>
@@ -1678,7 +1678,7 @@
                 </mc:Choice>
                 <mc:Fallback>
                   <w:pict>
-                    <v:shape w14:anchorId="6442150E" id="Straight Arrow Connector 2" o:spid="_x0000_s1026" type="#_x0000_t32" style="position:absolute;margin-left:36.85pt;margin-top:8.25pt;width:29.5pt;height:0;z-index:251650560;visibility:visible;mso-wrap-style:square;mso-wrap-distance-left:9pt;mso-wrap-distance-top:0;mso-wrap-distance-right:9pt;mso-wrap-distance-bottom:0;mso-position-horizontal:absolute;mso-position-horizontal-relative:text;mso-position-vertical:absolute;mso-position-vertical-relative:text" o:gfxdata="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" strokecolor="#156082 [3204]" strokeweight="1.5pt">
+                    <v:shape w14:anchorId="60C9199D" id="Straight Arrow Connector 2" o:spid="_x0000_s1026" type="#_x0000_t32" style="position:absolute;margin-left:36.85pt;margin-top:8.25pt;width:29.5pt;height:0;z-index:251650560;visibility:visible;mso-wrap-style:square;mso-wrap-distance-left:9pt;mso-wrap-distance-top:0;mso-wrap-distance-right:9pt;mso-wrap-distance-bottom:0;mso-position-horizontal:absolute;mso-position-horizontal-relative:text;mso-position-vertical:absolute;mso-position-vertical-relative:text" o:gfxdata="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" strokecolor="#156082 [3204]" strokeweight="1.5pt">
                       <v:stroke endarrow="block" joinstyle="miter"/>
                     </v:shape>
                   </w:pict>
@@ -1835,7 +1835,7 @@
                 </mc:Choice>
                 <mc:Fallback>
                   <w:pict>
-                    <v:shape w14:anchorId="76E3D9AF" id="Straight Arrow Connector 3" o:spid="_x0000_s1026" type="#_x0000_t32" style="position:absolute;margin-left:46.35pt;margin-top:7.9pt;width:29pt;height:0;z-index:251651584;visibility:visible;mso-wrap-style:square;mso-wrap-distance-left:9pt;mso-wrap-distance-top:0;mso-wrap-distance-right:9pt;mso-wrap-distance-bottom:0;mso-position-horizontal:absolute;mso-position-horizontal-relative:text;mso-position-vertical:absolute;mso-position-vertical-relative:text" o:gfxdata="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" strokecolor="#156082 [3204]" strokeweight="1.5pt">
+                    <v:shape w14:anchorId="04AAEBA1" id="Straight Arrow Connector 3" o:spid="_x0000_s1026" type="#_x0000_t32" style="position:absolute;margin-left:46.35pt;margin-top:7.9pt;width:29pt;height:0;z-index:251651584;visibility:visible;mso-wrap-style:square;mso-wrap-distance-left:9pt;mso-wrap-distance-top:0;mso-wrap-distance-right:9pt;mso-wrap-distance-bottom:0;mso-position-horizontal:absolute;mso-position-horizontal-relative:text;mso-position-vertical:absolute;mso-position-vertical-relative:text" o:gfxdata="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" strokecolor="#156082 [3204]" strokeweight="1.5pt">
                       <v:stroke endarrow="block" joinstyle="miter"/>
                     </v:shape>
                   </w:pict>
@@ -1922,7 +1922,7 @@
                 </mc:Choice>
                 <mc:Fallback>
                   <w:pict>
-                    <v:shape w14:anchorId="3F2042D8" id="Straight Arrow Connector 4" o:spid="_x0000_s1026" type="#_x0000_t32" style="position:absolute;margin-left:46.85pt;margin-top:5.75pt;width:30.5pt;height:.5pt;z-index:251653632;visibility:visible;mso-wrap-style:square;mso-wrap-distance-left:9pt;mso-wrap-distance-top:0;mso-wrap-distance-right:9pt;mso-wrap-distance-bottom:0;mso-position-horizontal:absolute;mso-position-horizontal-relative:text;mso-position-vertical:absolute;mso-position-vertical-relative:text" o:gfxdata="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" strokecolor="#156082 [3204]" strokeweight="1.5pt">
+                    <v:shape w14:anchorId="278FD606" id="Straight Arrow Connector 4" o:spid="_x0000_s1026" type="#_x0000_t32" style="position:absolute;margin-left:46.85pt;margin-top:5.75pt;width:30.5pt;height:.5pt;z-index:251653632;visibility:visible;mso-wrap-style:square;mso-wrap-distance-left:9pt;mso-wrap-distance-top:0;mso-wrap-distance-right:9pt;mso-wrap-distance-bottom:0;mso-position-horizontal:absolute;mso-position-horizontal-relative:text;mso-position-vertical:absolute;mso-position-vertical-relative:text" o:gfxdata="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" strokecolor="#156082 [3204]" strokeweight="1.5pt">
                       <v:stroke endarrow="block" joinstyle="miter"/>
                     </v:shape>
                   </w:pict>
@@ -3840,7 +3840,7 @@
           </mc:Choice>
           <mc:Fallback>
             <w:pict>
-              <v:oval w14:anchorId="12DA3734" id="Oval 1" o:spid="_x0000_s1026" style="position:absolute;margin-left:158.95pt;margin-top:2.1pt;width:138.55pt;height:52.95pt;z-index:251655680;visibility:visible;mso-wrap-style:square;mso-width-percent:0;mso-wrap-distance-left:9pt;mso-wrap-distance-top:0;mso-wrap-distance-right:9pt;mso-wrap-distance-bottom:0;mso-position-horizontal:absolute;mso-position-horizontal-relative:text;mso-position-vertical:absolute;mso-position-vertical-relative:text;mso-width-percent:0;mso-width-relative:margin;v-text-anchor:middle" o:gfxdata="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" fillcolor="#156082 [3204]" strokecolor="#030e13 [484]" strokeweight="1.5pt">
+              <v:oval w14:anchorId="08BC6347" id="Oval 1" o:spid="_x0000_s1026" style="position:absolute;margin-left:158.95pt;margin-top:2.1pt;width:138.55pt;height:52.95pt;z-index:251655680;visibility:visible;mso-wrap-style:square;mso-width-percent:0;mso-wrap-distance-left:9pt;mso-wrap-distance-top:0;mso-wrap-distance-right:9pt;mso-wrap-distance-bottom:0;mso-position-horizontal:absolute;mso-position-horizontal-relative:text;mso-position-vertical:absolute;mso-position-vertical-relative:text;mso-width-percent:0;mso-width-relative:margin;v-text-anchor:middle" o:gfxdata="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" fillcolor="#156082 [3204]" strokecolor="#030e13 [484]" strokeweight="1.5pt">
                 <v:stroke joinstyle="miter"/>
               </v:oval>
             </w:pict>
@@ -4021,7 +4021,7 @@
           </mc:Choice>
           <mc:Fallback>
             <w:pict>
-              <v:line w14:anchorId="744B2C0C" id="Straight Connector 3" o:spid="_x0000_s1026" style="position:absolute;z-index:251658752;visibility:visible;mso-wrap-style:square;mso-wrap-distance-left:9pt;mso-wrap-distance-top:0;mso-wrap-distance-right:9pt;mso-wrap-distance-bottom:0;mso-position-horizontal:absolute;mso-position-horizontal-relative:text;mso-position-vertical:absolute;mso-position-vertical-relative:text" from="227.55pt,9.7pt" to="227.55pt,51.8pt" o:gfxdata="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" strokecolor="#156082 [3204]" strokeweight="1.5pt">
+              <v:line w14:anchorId="7700DCF0" id="Straight Connector 3" o:spid="_x0000_s1026" style="position:absolute;z-index:251658752;visibility:visible;mso-wrap-style:square;mso-wrap-distance-left:9pt;mso-wrap-distance-top:0;mso-wrap-distance-right:9pt;mso-wrap-distance-bottom:0;mso-position-horizontal:absolute;mso-position-horizontal-relative:text;mso-position-vertical:absolute;mso-position-vertical-relative:text" from="227.55pt,9.7pt" to="227.55pt,51.8pt" o:gfxdata="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" strokecolor="#156082 [3204]" strokeweight="1.5pt">
                 <v:stroke joinstyle="miter"/>
               </v:line>
             </w:pict>
@@ -4107,7 +4107,7 @@
           </mc:Choice>
           <mc:Fallback>
             <w:pict>
-              <v:rect w14:anchorId="3049291C" id="Rectangle 8" o:spid="_x0000_s1026" style="position:absolute;margin-left:118.5pt;margin-top:5.1pt;width:221pt;height:35.5pt;z-index:251649024;visibility:visible;mso-wrap-style:square;mso-width-percent:0;mso-height-percent:0;mso-wrap-distance-left:9pt;mso-wrap-distance-top:0;mso-wrap-distance-right:9pt;mso-wrap-distance-bottom:0;mso-position-horizontal:absolute;mso-position-horizontal-relative:text;mso-position-vertical:absolute;mso-position-vertical-relative:text;mso-width-percent:0;mso-height-percent:0;mso-width-relative:margin;mso-height-relative:margin;v-text-anchor:middle" o:gfxdata="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" fillcolor="#156082 [3204]" strokecolor="#030e13 [484]" strokeweight="1.5pt"/>
+              <v:rect w14:anchorId="63E62DEE" id="Rectangle 8" o:spid="_x0000_s1026" style="position:absolute;margin-left:118.5pt;margin-top:5.1pt;width:221pt;height:35.5pt;z-index:251649024;visibility:visible;mso-wrap-style:square;mso-width-percent:0;mso-height-percent:0;mso-wrap-distance-left:9pt;mso-wrap-distance-top:0;mso-wrap-distance-right:9pt;mso-wrap-distance-bottom:0;mso-position-horizontal:absolute;mso-position-horizontal-relative:text;mso-position-vertical:absolute;mso-position-vertical-relative:text;mso-width-percent:0;mso-height-percent:0;mso-width-relative:margin;mso-height-relative:margin;v-text-anchor:middle" o:gfxdata="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" fillcolor="#156082 [3204]" strokecolor="#030e13 [484]" strokeweight="1.5pt"/>
             </w:pict>
           </mc:Fallback>
         </mc:AlternateContent>
@@ -4261,7 +4261,7 @@
           </mc:Choice>
           <mc:Fallback>
             <w:pict>
-              <v:line w14:anchorId="2269F394" id="Straight Connector 10" o:spid="_x0000_s1026" style="position:absolute;z-index:251659776;visibility:visible;mso-wrap-style:square;mso-width-percent:0;mso-height-percent:0;mso-wrap-distance-left:9pt;mso-wrap-distance-top:0;mso-wrap-distance-right:9pt;mso-wrap-distance-bottom:0;mso-position-horizontal:absolute;mso-position-horizontal-relative:text;mso-position-vertical:absolute;mso-position-vertical-relative:text;mso-width-percent:0;mso-height-percent:0;mso-width-relative:margin;mso-height-relative:margin" from="226pt,16.95pt" to="227pt,53.95pt" o:gfxdata="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" strokecolor="#156082 [3204]" strokeweight="1.5pt">
+              <v:line w14:anchorId="40B3E973" id="Straight Connector 10" o:spid="_x0000_s1026" style="position:absolute;z-index:251659776;visibility:visible;mso-wrap-style:square;mso-width-percent:0;mso-height-percent:0;mso-wrap-distance-left:9pt;mso-wrap-distance-top:0;mso-wrap-distance-right:9pt;mso-wrap-distance-bottom:0;mso-position-horizontal:absolute;mso-position-horizontal-relative:text;mso-position-vertical:absolute;mso-position-vertical-relative:text;mso-width-percent:0;mso-height-percent:0;mso-width-relative:margin;mso-height-relative:margin" from="226pt,16.95pt" to="227pt,53.95pt" o:gfxdata="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" strokecolor="#156082 [3204]" strokeweight="1.5pt">
                 <v:stroke joinstyle="miter"/>
               </v:line>
             </w:pict>
@@ -4347,7 +4347,7 @@
           </mc:Choice>
           <mc:Fallback>
             <w:pict>
-              <v:rect w14:anchorId="51B5FF59" id="Rectangle 11" o:spid="_x0000_s1026" style="position:absolute;margin-left:118pt;margin-top:9.65pt;width:224pt;height:37.5pt;z-index:251653120;visibility:visible;mso-wrap-style:square;mso-width-percent:0;mso-height-percent:0;mso-wrap-distance-left:9pt;mso-wrap-distance-top:0;mso-wrap-distance-right:9pt;mso-wrap-distance-bottom:0;mso-position-horizontal:absolute;mso-position-horizontal-relative:text;mso-position-vertical:absolute;mso-position-vertical-relative:text;mso-width-percent:0;mso-height-percent:0;mso-width-relative:margin;mso-height-relative:margin;v-text-anchor:middle" o:gfxdata="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" fillcolor="#156082 [3204]" strokecolor="#030e13 [484]" strokeweight="1.5pt"/>
+              <v:rect w14:anchorId="0DF64A80" id="Rectangle 11" o:spid="_x0000_s1026" style="position:absolute;margin-left:118pt;margin-top:9.65pt;width:224pt;height:37.5pt;z-index:251653120;visibility:visible;mso-wrap-style:square;mso-width-percent:0;mso-height-percent:0;mso-wrap-distance-left:9pt;mso-wrap-distance-top:0;mso-wrap-distance-right:9pt;mso-wrap-distance-bottom:0;mso-position-horizontal:absolute;mso-position-horizontal-relative:text;mso-position-vertical:absolute;mso-position-vertical-relative:text;mso-width-percent:0;mso-height-percent:0;mso-width-relative:margin;mso-height-relative:margin;v-text-anchor:middle" o:gfxdata="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" fillcolor="#156082 [3204]" strokecolor="#030e13 [484]" strokeweight="1.5pt"/>
             </w:pict>
           </mc:Fallback>
         </mc:AlternateContent>
@@ -4518,7 +4518,7 @@
           </mc:Choice>
           <mc:Fallback>
             <w:pict>
-              <v:line w14:anchorId="59A031D9" id="Straight Connector 13" o:spid="_x0000_s1026" style="position:absolute;z-index:251660800;visibility:visible;mso-wrap-style:square;mso-wrap-distance-left:9pt;mso-wrap-distance-top:0;mso-wrap-distance-right:9pt;mso-wrap-distance-bottom:0;mso-position-horizontal:absolute;mso-position-horizontal-relative:text;mso-position-vertical:absolute;mso-position-vertical-relative:text" from="226.5pt,.35pt" to="226.5pt,42.35pt" o:gfxdata="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" strokecolor="#156082 [3204]" strokeweight="1.5pt">
+              <v:line w14:anchorId="0C9CD72C" id="Straight Connector 13" o:spid="_x0000_s1026" style="position:absolute;z-index:251660800;visibility:visible;mso-wrap-style:square;mso-wrap-distance-left:9pt;mso-wrap-distance-top:0;mso-wrap-distance-right:9pt;mso-wrap-distance-bottom:0;mso-position-horizontal:absolute;mso-position-horizontal-relative:text;mso-position-vertical:absolute;mso-position-vertical-relative:text" from="226.5pt,.35pt" to="226.5pt,42.35pt" o:gfxdata="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" strokecolor="#156082 [3204]" strokeweight="1.5pt">
                 <v:stroke joinstyle="miter"/>
               </v:line>
             </w:pict>
@@ -4599,7 +4599,7 @@
           </mc:Choice>
           <mc:Fallback>
             <w:pict>
-              <v:shapetype w14:anchorId="136034EE" id="_x0000_t4" coordsize="21600,21600" o:spt="4" path="m10800,l,10800,10800,21600,21600,10800xe">
+              <v:shapetype w14:anchorId="2DB7B646" id="_x0000_t4" coordsize="21600,21600" o:spt="4" path="m10800,l,10800,10800,21600,21600,10800xe">
                 <v:stroke joinstyle="miter"/>
                 <v:path gradientshapeok="t" o:connecttype="rect" textboxrect="5400,5400,16200,16200"/>
               </v:shapetype>
@@ -4776,7 +4776,7 @@
           </mc:Choice>
           <mc:Fallback>
             <w:pict>
-              <v:line w14:anchorId="69042535" id="Straight Connector 16" o:spid="_x0000_s1026" style="position:absolute;z-index:251663872;visibility:visible;mso-wrap-style:square;mso-wrap-distance-left:9pt;mso-wrap-distance-top:0;mso-wrap-distance-right:9pt;mso-wrap-distance-bottom:0;mso-position-horizontal:absolute;mso-position-horizontal-relative:text;mso-position-vertical:absolute;mso-position-vertical-relative:text" from="228.5pt,9.75pt" to="228.5pt,39.25pt" o:gfxdata="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" strokecolor="#156082 [3204]" strokeweight="1.5pt">
+              <v:line w14:anchorId="4B930220" id="Straight Connector 16" o:spid="_x0000_s1026" style="position:absolute;z-index:251663872;visibility:visible;mso-wrap-style:square;mso-wrap-distance-left:9pt;mso-wrap-distance-top:0;mso-wrap-distance-right:9pt;mso-wrap-distance-bottom:0;mso-position-horizontal:absolute;mso-position-horizontal-relative:text;mso-position-vertical:absolute;mso-position-vertical-relative:text" from="228.5pt,9.75pt" to="228.5pt,39.25pt" o:gfxdata="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" strokecolor="#156082 [3204]" strokeweight="1.5pt">
                 <v:stroke joinstyle="miter"/>
               </v:line>
             </w:pict>
@@ -4936,7 +4936,7 @@
           </mc:Choice>
           <mc:Fallback>
             <w:pict>
-              <v:rect w14:anchorId="70A9B710" id="Rectangle 17" o:spid="_x0000_s1026" style="position:absolute;margin-left:114.5pt;margin-top:16.1pt;width:230pt;height:38.5pt;z-index:251664896;visibility:visible;mso-wrap-style:square;mso-width-percent:0;mso-wrap-distance-left:9pt;mso-wrap-distance-top:0;mso-wrap-distance-right:9pt;mso-wrap-distance-bottom:0;mso-position-horizontal:absolute;mso-position-horizontal-relative:text;mso-position-vertical:absolute;mso-position-vertical-relative:text;mso-width-percent:0;mso-width-relative:margin;v-text-anchor:middle" o:gfxdata="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" fillcolor="#156082 [3204]" strokecolor="#030e13 [484]" strokeweight="1.5pt"/>
+              <v:rect w14:anchorId="418863FF" id="Rectangle 17" o:spid="_x0000_s1026" style="position:absolute;margin-left:114.5pt;margin-top:16.1pt;width:230pt;height:38.5pt;z-index:251664896;visibility:visible;mso-wrap-style:square;mso-width-percent:0;mso-wrap-distance-left:9pt;mso-wrap-distance-top:0;mso-wrap-distance-right:9pt;mso-wrap-distance-bottom:0;mso-position-horizontal:absolute;mso-position-horizontal-relative:text;mso-position-vertical:absolute;mso-position-vertical-relative:text;mso-width-percent:0;mso-width-relative:margin;v-text-anchor:middle" o:gfxdata="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" fillcolor="#156082 [3204]" strokecolor="#030e13 [484]" strokeweight="1.5pt"/>
             </w:pict>
           </mc:Fallback>
         </mc:AlternateContent>
@@ -5007,7 +5007,7 @@
           </mc:Choice>
           <mc:Fallback>
             <w:pict>
-              <v:line w14:anchorId="0E0721E6" id="Straight Connector 19" o:spid="_x0000_s1026" style="position:absolute;z-index:251666944;visibility:visible;mso-wrap-style:square;mso-wrap-distance-left:9pt;mso-wrap-distance-top:0;mso-wrap-distance-right:9pt;mso-wrap-distance-bottom:0;mso-position-horizontal:absolute;mso-position-horizontal-relative:text;mso-position-vertical:absolute;mso-position-vertical-relative:text" from="228pt,9.3pt" to="228pt,39.3pt" o:gfxdata="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" strokecolor="#156082 [3204]" strokeweight="1.5pt">
+              <v:line w14:anchorId="07F1F2F0" id="Straight Connector 19" o:spid="_x0000_s1026" style="position:absolute;z-index:251666944;visibility:visible;mso-wrap-style:square;mso-wrap-distance-left:9pt;mso-wrap-distance-top:0;mso-wrap-distance-right:9pt;mso-wrap-distance-bottom:0;mso-position-horizontal:absolute;mso-position-horizontal-relative:text;mso-position-vertical:absolute;mso-position-vertical-relative:text" from="228pt,9.3pt" to="228pt,39.3pt" o:gfxdata="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" strokecolor="#156082 [3204]" strokeweight="1.5pt">
                 <v:stroke joinstyle="miter"/>
               </v:line>
             </w:pict>
@@ -5088,7 +5088,7 @@
           </mc:Choice>
           <mc:Fallback>
             <w:pict>
-              <v:shape w14:anchorId="37740138" id="Diamond 20" o:spid="_x0000_s1026" type="#_x0000_t4" style="position:absolute;margin-left:105.5pt;margin-top:15.15pt;width:247.5pt;height:55.5pt;z-index:251667968;visibility:visible;mso-wrap-style:square;mso-width-percent:0;mso-height-percent:0;mso-wrap-distance-left:9pt;mso-wrap-distance-top:0;mso-wrap-distance-right:9pt;mso-wrap-distance-bottom:0;mso-position-horizontal:absolute;mso-position-horizontal-relative:text;mso-position-vertical:absolute;mso-position-vertical-relative:text;mso-width-percent:0;mso-height-percent:0;mso-width-relative:margin;mso-height-relative:margin;v-text-anchor:middle" o:gfxdata="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" fillcolor="#156082 [3204]" strokecolor="#030e13 [484]" strokeweight="1.5pt"/>
+              <v:shape w14:anchorId="29D44EE0" id="Diamond 20" o:spid="_x0000_s1026" type="#_x0000_t4" style="position:absolute;margin-left:105.5pt;margin-top:15.15pt;width:247.5pt;height:55.5pt;z-index:251667968;visibility:visible;mso-wrap-style:square;mso-width-percent:0;mso-height-percent:0;mso-wrap-distance-left:9pt;mso-wrap-distance-top:0;mso-wrap-distance-right:9pt;mso-wrap-distance-bottom:0;mso-position-horizontal:absolute;mso-position-horizontal-relative:text;mso-position-vertical:absolute;mso-position-vertical-relative:text;mso-width-percent:0;mso-height-percent:0;mso-width-relative:margin;mso-height-relative:margin;v-text-anchor:middle" o:gfxdata="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" fillcolor="#156082 [3204]" strokecolor="#030e13 [484]" strokeweight="1.5pt"/>
             </w:pict>
           </mc:Fallback>
         </mc:AlternateContent>
@@ -5246,7 +5246,7 @@
           </mc:Choice>
           <mc:Fallback>
             <w:pict>
-              <v:line w14:anchorId="44307EC1" id="Straight Connector 22" o:spid="_x0000_s1026" style="position:absolute;z-index:251670016;visibility:visible;mso-wrap-style:square;mso-wrap-distance-left:9pt;mso-wrap-distance-top:0;mso-wrap-distance-right:9pt;mso-wrap-distance-bottom:0;mso-position-horizontal:absolute;mso-position-horizontal-relative:text;mso-position-vertical:absolute;mso-position-vertical-relative:text" from="228.5pt,3.7pt" to="229pt,35.7pt" o:gfxdata="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" strokecolor="#156082 [3204]" strokeweight="1.5pt">
+              <v:line w14:anchorId="0AF20C08" id="Straight Connector 22" o:spid="_x0000_s1026" style="position:absolute;z-index:251670016;visibility:visible;mso-wrap-style:square;mso-wrap-distance-left:9pt;mso-wrap-distance-top:0;mso-wrap-distance-right:9pt;mso-wrap-distance-bottom:0;mso-position-horizontal:absolute;mso-position-horizontal-relative:text;mso-position-vertical:absolute;mso-position-vertical-relative:text" from="228.5pt,3.7pt" to="229pt,35.7pt" o:gfxdata="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" strokecolor="#156082 [3204]" strokeweight="1.5pt">
                 <v:stroke joinstyle="miter"/>
               </v:line>
             </w:pict>
@@ -5409,7 +5409,7 @@
           </mc:Choice>
           <mc:Fallback>
             <w:pict>
-              <v:rect w14:anchorId="53350062" id="Rectangle 23" o:spid="_x0000_s1026" style="position:absolute;margin-left:149.5pt;margin-top:12.55pt;width:164.5pt;height:36.5pt;z-index:251659264;visibility:visible;mso-wrap-style:square;mso-width-percent:0;mso-height-percent:0;mso-wrap-distance-left:9pt;mso-wrap-distance-top:0;mso-wrap-distance-right:9pt;mso-wrap-distance-bottom:0;mso-position-horizontal:absolute;mso-position-horizontal-relative:text;mso-position-vertical:absolute;mso-position-vertical-relative:text;mso-width-percent:0;mso-height-percent:0;mso-width-relative:margin;mso-height-relative:margin;v-text-anchor:middle" o:gfxdata="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" fillcolor="#156082 [3204]" strokecolor="#030e13 [484]" strokeweight="1.5pt"/>
+              <v:rect w14:anchorId="018FF5AC" id="Rectangle 23" o:spid="_x0000_s1026" style="position:absolute;margin-left:149.5pt;margin-top:12.55pt;width:164.5pt;height:36.5pt;z-index:251659264;visibility:visible;mso-wrap-style:square;mso-width-percent:0;mso-height-percent:0;mso-wrap-distance-left:9pt;mso-wrap-distance-top:0;mso-wrap-distance-right:9pt;mso-wrap-distance-bottom:0;mso-position-horizontal:absolute;mso-position-horizontal-relative:text;mso-position-vertical:absolute;mso-position-vertical-relative:text;mso-width-percent:0;mso-height-percent:0;mso-width-relative:margin;mso-height-relative:margin;v-text-anchor:middle" o:gfxdata="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" fillcolor="#156082 [3204]" strokecolor="#030e13 [484]" strokeweight="1.5pt"/>
             </w:pict>
           </mc:Fallback>
         </mc:AlternateContent>
@@ -5486,7 +5486,7 @@
           </mc:Choice>
           <mc:Fallback>
             <w:pict>
-              <v:line w14:anchorId="7A620FB2" id="Straight Connector 25" o:spid="_x0000_s1026" style="position:absolute;z-index:251671040;visibility:visible;mso-wrap-style:square;mso-width-percent:0;mso-height-percent:0;mso-wrap-distance-left:9pt;mso-wrap-distance-top:0;mso-wrap-distance-right:9pt;mso-wrap-distance-bottom:0;mso-position-horizontal:absolute;mso-position-horizontal-relative:text;mso-position-vertical:absolute;mso-position-vertical-relative:text;mso-width-percent:0;mso-height-percent:0;mso-width-relative:margin;mso-height-relative:margin" from="229.5pt,4.25pt" to="230pt,35.25pt" o:gfxdata="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" strokecolor="#156082 [3204]" strokeweight="1.5pt">
+              <v:line w14:anchorId="2076E235" id="Straight Connector 25" o:spid="_x0000_s1026" style="position:absolute;z-index:251671040;visibility:visible;mso-wrap-style:square;mso-width-percent:0;mso-height-percent:0;mso-wrap-distance-left:9pt;mso-wrap-distance-top:0;mso-wrap-distance-right:9pt;mso-wrap-distance-bottom:0;mso-position-horizontal:absolute;mso-position-horizontal-relative:text;mso-position-vertical:absolute;mso-position-vertical-relative:text;mso-width-percent:0;mso-height-percent:0;mso-width-relative:margin;mso-height-relative:margin" from="229.5pt,4.25pt" to="230pt,35.25pt" o:gfxdata="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" strokecolor="#156082 [3204]" strokeweight="1.5pt">
                 <v:stroke joinstyle="miter"/>
               </v:line>
             </w:pict>
@@ -5564,7 +5564,7 @@
           </mc:Choice>
           <mc:Fallback>
             <w:pict>
-              <v:oval w14:anchorId="74335E67" id="Oval 26" o:spid="_x0000_s1026" style="position:absolute;margin-left:176.5pt;margin-top:10.1pt;width:106.5pt;height:37.5pt;z-index:251665408;visibility:visible;mso-wrap-style:square;mso-width-percent:0;mso-wrap-distance-left:9pt;mso-wrap-distance-top:0;mso-wrap-distance-right:9pt;mso-wrap-distance-bottom:0;mso-position-horizontal:absolute;mso-position-horizontal-relative:text;mso-position-vertical:absolute;mso-position-vertical-relative:text;mso-width-percent:0;mso-width-relative:margin;v-text-anchor:middle" o:gfxdata="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" fillcolor="#156082 [3204]" strokecolor="#030e13 [484]" strokeweight="1.5pt">
+              <v:oval w14:anchorId="7114F5A8" id="Oval 26" o:spid="_x0000_s1026" style="position:absolute;margin-left:176.5pt;margin-top:10.1pt;width:106.5pt;height:37.5pt;z-index:251665408;visibility:visible;mso-wrap-style:square;mso-width-percent:0;mso-wrap-distance-left:9pt;mso-wrap-distance-top:0;mso-wrap-distance-right:9pt;mso-wrap-distance-bottom:0;mso-position-horizontal:absolute;mso-position-horizontal-relative:text;mso-position-vertical:absolute;mso-position-vertical-relative:text;mso-width-percent:0;mso-width-relative:margin;v-text-anchor:middle" o:gfxdata="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" fillcolor="#156082 [3204]" strokecolor="#030e13 [484]" strokeweight="1.5pt">
                 <v:stroke joinstyle="miter"/>
               </v:oval>
             </w:pict>
@@ -5856,7 +5856,7 @@
           </mc:Choice>
           <mc:Fallback>
             <w:pict>
-              <v:oval w14:anchorId="00994F69" id="Oval 28" o:spid="_x0000_s1026" style="position:absolute;margin-left:177.5pt;margin-top:4.85pt;width:103.5pt;height:37.5pt;z-index:251672064;visibility:visible;mso-wrap-style:square;mso-width-percent:0;mso-wrap-distance-left:9pt;mso-wrap-distance-top:0;mso-wrap-distance-right:9pt;mso-wrap-distance-bottom:0;mso-position-horizontal:absolute;mso-position-horizontal-relative:text;mso-position-vertical:absolute;mso-position-vertical-relative:text;mso-width-percent:0;mso-width-relative:margin;v-text-anchor:middle" o:gfxdata="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" fillcolor="#156082 [3204]" strokecolor="#030e13 [484]" strokeweight="1.5pt">
+              <v:oval w14:anchorId="1A09C3C4" id="Oval 28" o:spid="_x0000_s1026" style="position:absolute;margin-left:177.5pt;margin-top:4.85pt;width:103.5pt;height:37.5pt;z-index:251672064;visibility:visible;mso-wrap-style:square;mso-width-percent:0;mso-wrap-distance-left:9pt;mso-wrap-distance-top:0;mso-wrap-distance-right:9pt;mso-wrap-distance-bottom:0;mso-position-horizontal:absolute;mso-position-horizontal-relative:text;mso-position-vertical:absolute;mso-position-vertical-relative:text;mso-width-percent:0;mso-width-relative:margin;v-text-anchor:middle" o:gfxdata="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" fillcolor="#156082 [3204]" strokecolor="#030e13 [484]" strokeweight="1.5pt">
                 <v:stroke joinstyle="miter"/>
               </v:oval>
             </w:pict>
@@ -5932,7 +5932,7 @@
           </mc:Choice>
           <mc:Fallback>
             <w:pict>
-              <v:line w14:anchorId="24622AE1" id="Straight Connector 30" o:spid="_x0000_s1026" style="position:absolute;z-index:251674112;visibility:visible;mso-wrap-style:square;mso-wrap-distance-left:9pt;mso-wrap-distance-top:0;mso-wrap-distance-right:9pt;mso-wrap-distance-bottom:0;mso-position-horizontal:absolute;mso-position-horizontal-relative:text;mso-position-vertical:absolute;mso-position-vertical-relative:text" from="228.5pt,19.2pt" to="229pt,41.7pt" o:gfxdata="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" strokecolor="#156082 [3204]" strokeweight="1.5pt">
+              <v:line w14:anchorId="35F7FCD5" id="Straight Connector 30" o:spid="_x0000_s1026" style="position:absolute;z-index:251674112;visibility:visible;mso-wrap-style:square;mso-wrap-distance-left:9pt;mso-wrap-distance-top:0;mso-wrap-distance-right:9pt;mso-wrap-distance-bottom:0;mso-position-horizontal:absolute;mso-position-horizontal-relative:text;mso-position-vertical:absolute;mso-position-vertical-relative:text" from="228.5pt,19.2pt" to="229pt,41.7pt" o:gfxdata="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" strokecolor="#156082 [3204]" strokeweight="1.5pt">
                 <v:stroke joinstyle="miter"/>
               </v:line>
             </w:pict>
@@ -6021,7 +6021,7 @@
           </mc:Choice>
           <mc:Fallback>
             <w:pict>
-              <v:rect w14:anchorId="0C61C998" id="Rectangle 31" o:spid="_x0000_s1026" style="position:absolute;margin-left:142.5pt;margin-top:18.55pt;width:173pt;height:32.5pt;z-index:251675136;visibility:visible;mso-wrap-style:square;mso-width-percent:0;mso-height-percent:0;mso-wrap-distance-left:9pt;mso-wrap-distance-top:0;mso-wrap-distance-right:9pt;mso-wrap-distance-bottom:0;mso-position-horizontal:absolute;mso-position-horizontal-relative:text;mso-position-vertical:absolute;mso-position-vertical-relative:text;mso-width-percent:0;mso-height-percent:0;mso-width-relative:margin;mso-height-relative:margin;v-text-anchor:middle" o:gfxdata="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" fillcolor="#156082 [3204]" strokecolor="#030e13 [484]" strokeweight="1.5pt"/>
+              <v:rect w14:anchorId="640BD66F" id="Rectangle 31" o:spid="_x0000_s1026" style="position:absolute;margin-left:142.5pt;margin-top:18.55pt;width:173pt;height:32.5pt;z-index:251675136;visibility:visible;mso-wrap-style:square;mso-width-percent:0;mso-height-percent:0;mso-wrap-distance-left:9pt;mso-wrap-distance-top:0;mso-wrap-distance-right:9pt;mso-wrap-distance-bottom:0;mso-position-horizontal:absolute;mso-position-horizontal-relative:text;mso-position-vertical:absolute;mso-position-vertical-relative:text;mso-width-percent:0;mso-height-percent:0;mso-width-relative:margin;mso-height-relative:margin;v-text-anchor:middle" o:gfxdata="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" fillcolor="#156082 [3204]" strokecolor="#030e13 [484]" strokeweight="1.5pt"/>
             </w:pict>
           </mc:Fallback>
         </mc:AlternateContent>
@@ -6180,7 +6180,7 @@
           </mc:Choice>
           <mc:Fallback>
             <w:pict>
-              <v:line w14:anchorId="257A1467" id="Straight Connector 34" o:spid="_x0000_s1026" style="position:absolute;z-index:251677184;visibility:visible;mso-wrap-style:square;mso-width-percent:0;mso-height-percent:0;mso-wrap-distance-left:9pt;mso-wrap-distance-top:0;mso-wrap-distance-right:9pt;mso-wrap-distance-bottom:0;mso-position-horizontal:absolute;mso-position-horizontal-relative:text;mso-position-vertical:absolute;mso-position-vertical-relative:text;mso-width-percent:0;mso-height-percent:0;mso-width-relative:margin;mso-height-relative:margin" from="229pt,5.25pt" to="230pt,35.75pt" o:gfxdata="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" strokecolor="#156082 [3204]" strokeweight="1.5pt">
+              <v:line w14:anchorId="626644C9" id="Straight Connector 34" o:spid="_x0000_s1026" style="position:absolute;z-index:251677184;visibility:visible;mso-wrap-style:square;mso-width-percent:0;mso-height-percent:0;mso-wrap-distance-left:9pt;mso-wrap-distance-top:0;mso-wrap-distance-right:9pt;mso-wrap-distance-bottom:0;mso-position-horizontal:absolute;mso-position-horizontal-relative:text;mso-position-vertical:absolute;mso-position-vertical-relative:text;mso-width-percent:0;mso-height-percent:0;mso-width-relative:margin;mso-height-relative:margin" from="229pt,5.25pt" to="230pt,35.75pt" o:gfxdata="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" strokecolor="#156082 [3204]" strokeweight="1.5pt">
                 <v:stroke joinstyle="miter"/>
               </v:line>
             </w:pict>
@@ -6261,7 +6261,7 @@
           </mc:Choice>
           <mc:Fallback>
             <w:pict>
-              <v:shape w14:anchorId="5F128458" id="Diamond 35" o:spid="_x0000_s1026" type="#_x0000_t4" style="position:absolute;margin-left:125pt;margin-top:10.1pt;width:211pt;height:60pt;z-index:251678208;visibility:visible;mso-wrap-style:square;mso-width-percent:0;mso-height-percent:0;mso-wrap-distance-left:9pt;mso-wrap-distance-top:0;mso-wrap-distance-right:9pt;mso-wrap-distance-bottom:0;mso-position-horizontal:absolute;mso-position-horizontal-relative:text;mso-position-vertical:absolute;mso-position-vertical-relative:text;mso-width-percent:0;mso-height-percent:0;mso-width-relative:margin;mso-height-relative:margin;v-text-anchor:middle" o:gfxdata="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" fillcolor="#156082 [3204]" strokecolor="#030e13 [484]" strokeweight="1.5pt"/>
+              <v:shape w14:anchorId="1CDF0F1C" id="Diamond 35" o:spid="_x0000_s1026" type="#_x0000_t4" style="position:absolute;margin-left:125pt;margin-top:10.1pt;width:211pt;height:60pt;z-index:251678208;visibility:visible;mso-wrap-style:square;mso-width-percent:0;mso-height-percent:0;mso-wrap-distance-left:9pt;mso-wrap-distance-top:0;mso-wrap-distance-right:9pt;mso-wrap-distance-bottom:0;mso-position-horizontal:absolute;mso-position-horizontal-relative:text;mso-position-vertical:absolute;mso-position-vertical-relative:text;mso-width-percent:0;mso-height-percent:0;mso-width-relative:margin;mso-height-relative:margin;v-text-anchor:middle" o:gfxdata="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" fillcolor="#156082 [3204]" strokecolor="#030e13 [484]" strokeweight="1.5pt"/>
             </w:pict>
           </mc:Fallback>
         </mc:AlternateContent>
@@ -6425,7 +6425,7 @@
           </mc:Choice>
           <mc:Fallback>
             <w:pict>
-              <v:line w14:anchorId="7391BE72" id="Straight Connector 40" o:spid="_x0000_s1026" style="position:absolute;z-index:251680256;visibility:visible;mso-wrap-style:square;mso-wrap-distance-left:9pt;mso-wrap-distance-top:0;mso-wrap-distance-right:9pt;mso-wrap-distance-bottom:0;mso-position-horizontal:absolute;mso-position-horizontal-relative:text;mso-position-vertical:absolute;mso-position-vertical-relative:text" from="230pt,1.15pt" to="230.5pt,25.65pt" o:gfxdata="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" strokecolor="#156082 [3204]" strokeweight="1.5pt">
+              <v:line w14:anchorId="3F79B0AB" id="Straight Connector 40" o:spid="_x0000_s1026" style="position:absolute;z-index:251680256;visibility:visible;mso-wrap-style:square;mso-wrap-distance-left:9pt;mso-wrap-distance-top:0;mso-wrap-distance-right:9pt;mso-wrap-distance-bottom:0;mso-position-horizontal:absolute;mso-position-horizontal-relative:text;mso-position-vertical:absolute;mso-position-vertical-relative:text" from="230pt,1.15pt" to="230.5pt,25.65pt" o:gfxdata="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" strokecolor="#156082 [3204]" strokeweight="1.5pt">
                 <v:stroke joinstyle="miter"/>
               </v:line>
             </w:pict>
@@ -6591,7 +6591,7 @@
           </mc:Choice>
           <mc:Fallback>
             <w:pict>
-              <v:rect w14:anchorId="5C735A31" id="Rectangle 41" o:spid="_x0000_s1026" style="position:absolute;margin-left:156pt;margin-top:3.5pt;width:151pt;height:32.5pt;z-index:251681280;visibility:visible;mso-wrap-style:square;mso-width-percent:0;mso-height-percent:0;mso-wrap-distance-left:9pt;mso-wrap-distance-top:0;mso-wrap-distance-right:9pt;mso-wrap-distance-bottom:0;mso-position-horizontal:absolute;mso-position-horizontal-relative:text;mso-position-vertical:absolute;mso-position-vertical-relative:text;mso-width-percent:0;mso-height-percent:0;mso-width-relative:margin;mso-height-relative:margin;v-text-anchor:middle" o:gfxdata="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" fillcolor="#156082 [3204]" strokecolor="#030e13 [484]" strokeweight="1.5pt"/>
+              <v:rect w14:anchorId="58CAEE9D" id="Rectangle 41" o:spid="_x0000_s1026" style="position:absolute;margin-left:156pt;margin-top:3.5pt;width:151pt;height:32.5pt;z-index:251681280;visibility:visible;mso-wrap-style:square;mso-width-percent:0;mso-height-percent:0;mso-wrap-distance-left:9pt;mso-wrap-distance-top:0;mso-wrap-distance-right:9pt;mso-wrap-distance-bottom:0;mso-position-horizontal:absolute;mso-position-horizontal-relative:text;mso-position-vertical:absolute;mso-position-vertical-relative:text;mso-width-percent:0;mso-height-percent:0;mso-width-relative:margin;mso-height-relative:margin;v-text-anchor:middle" o:gfxdata="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" fillcolor="#156082 [3204]" strokecolor="#030e13 [484]" strokeweight="1.5pt"/>
             </w:pict>
           </mc:Fallback>
         </mc:AlternateContent>
@@ -6657,7 +6657,7 @@
           </mc:Choice>
           <mc:Fallback>
             <w:pict>
-              <v:line w14:anchorId="112F678F" id="Straight Connector 43" o:spid="_x0000_s1026" style="position:absolute;z-index:251683328;visibility:visible;mso-wrap-style:square;mso-wrap-distance-left:9pt;mso-wrap-distance-top:0;mso-wrap-distance-right:9pt;mso-wrap-distance-bottom:0;mso-position-horizontal:absolute;mso-position-horizontal-relative:text;mso-position-vertical:absolute;mso-position-vertical-relative:text" from="229.5pt,13.85pt" to="230pt,36.85pt" o:gfxdata="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" strokecolor="#156082 [3204]" strokeweight="1.5pt">
+              <v:line w14:anchorId="2BF7F615" id="Straight Connector 43" o:spid="_x0000_s1026" style="position:absolute;z-index:251683328;visibility:visible;mso-wrap-style:square;mso-wrap-distance-left:9pt;mso-wrap-distance-top:0;mso-wrap-distance-right:9pt;mso-wrap-distance-bottom:0;mso-position-horizontal:absolute;mso-position-horizontal-relative:text;mso-position-vertical:absolute;mso-position-vertical-relative:text" from="229.5pt,13.85pt" to="230pt,36.85pt" o:gfxdata="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" strokecolor="#156082 [3204]" strokeweight="1.5pt">
                 <v:stroke joinstyle="miter"/>
               </v:line>
             </w:pict>
@@ -6738,7 +6738,7 @@
           </mc:Choice>
           <mc:Fallback>
             <w:pict>
-              <v:rect w14:anchorId="331A38FF" id="Rectangle 44" o:spid="_x0000_s1026" style="position:absolute;margin-left:157.5pt;margin-top:14.7pt;width:154pt;height:31.5pt;z-index:251684352;visibility:visible;mso-wrap-style:square;mso-width-percent:0;mso-height-percent:0;mso-wrap-distance-left:9pt;mso-wrap-distance-top:0;mso-wrap-distance-right:9pt;mso-wrap-distance-bottom:0;mso-position-horizontal:absolute;mso-position-horizontal-relative:text;mso-position-vertical:absolute;mso-position-vertical-relative:text;mso-width-percent:0;mso-height-percent:0;mso-width-relative:margin;mso-height-relative:margin;v-text-anchor:middle" o:gfxdata="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" fillcolor="#156082 [3204]" strokecolor="#030e13 [484]" strokeweight="1.5pt"/>
+              <v:rect w14:anchorId="3BD24945" id="Rectangle 44" o:spid="_x0000_s1026" style="position:absolute;margin-left:157.5pt;margin-top:14.7pt;width:154pt;height:31.5pt;z-index:251684352;visibility:visible;mso-wrap-style:square;mso-width-percent:0;mso-height-percent:0;mso-wrap-distance-left:9pt;mso-wrap-distance-top:0;mso-wrap-distance-right:9pt;mso-wrap-distance-bottom:0;mso-position-horizontal:absolute;mso-position-horizontal-relative:text;mso-position-vertical:absolute;mso-position-vertical-relative:text;mso-width-percent:0;mso-height-percent:0;mso-width-relative:margin;mso-height-relative:margin;v-text-anchor:middle" o:gfxdata="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" fillcolor="#156082 [3204]" strokecolor="#030e13 [484]" strokeweight="1.5pt"/>
             </w:pict>
           </mc:Fallback>
         </mc:AlternateContent>
@@ -6912,7 +6912,7 @@
           </mc:Choice>
           <mc:Fallback>
             <w:pict>
-              <v:line w14:anchorId="27C4557D" id="Straight Connector 46" o:spid="_x0000_s1026" style="position:absolute;z-index:251686400;visibility:visible;mso-wrap-style:square;mso-wrap-distance-left:9pt;mso-wrap-distance-top:0;mso-wrap-distance-right:9pt;mso-wrap-distance-bottom:0;mso-position-horizontal:absolute;mso-position-horizontal-relative:text;mso-position-vertical:absolute;mso-position-vertical-relative:text" from="230.5pt,1.4pt" to="231pt,30.4pt" o:gfxdata="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" strokecolor="#156082 [3204]" strokeweight="1.5pt">
+              <v:line w14:anchorId="4F37C858" id="Straight Connector 46" o:spid="_x0000_s1026" style="position:absolute;z-index:251686400;visibility:visible;mso-wrap-style:square;mso-wrap-distance-left:9pt;mso-wrap-distance-top:0;mso-wrap-distance-right:9pt;mso-wrap-distance-bottom:0;mso-position-horizontal:absolute;mso-position-horizontal-relative:text;mso-position-vertical:absolute;mso-position-vertical-relative:text" from="230.5pt,1.4pt" to="231pt,30.4pt" o:gfxdata="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" strokecolor="#156082 [3204]" strokeweight="1.5pt">
                 <v:stroke joinstyle="miter"/>
               </v:line>
             </w:pict>
@@ -6990,7 +6990,7 @@
           </mc:Choice>
           <mc:Fallback>
             <w:pict>
-              <v:oval w14:anchorId="48F2F85A" id="Oval 47" o:spid="_x0000_s1026" style="position:absolute;margin-left:175.5pt;margin-top:6.25pt;width:111.5pt;height:40.5pt;z-index:251687424;visibility:visible;mso-wrap-style:square;mso-width-percent:0;mso-wrap-distance-left:9pt;mso-wrap-distance-top:0;mso-wrap-distance-right:9pt;mso-wrap-distance-bottom:0;mso-position-horizontal:absolute;mso-position-horizontal-relative:text;mso-position-vertical:absolute;mso-position-vertical-relative:text;mso-width-percent:0;mso-width-relative:margin;v-text-anchor:middle" o:gfxdata="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" fillcolor="#156082 [3204]" strokecolor="#030e13 [484]" strokeweight="1.5pt">
+              <v:oval w14:anchorId="44312FF6" id="Oval 47" o:spid="_x0000_s1026" style="position:absolute;margin-left:175.5pt;margin-top:6.25pt;width:111.5pt;height:40.5pt;z-index:251687424;visibility:visible;mso-wrap-style:square;mso-width-percent:0;mso-wrap-distance-left:9pt;mso-wrap-distance-top:0;mso-wrap-distance-right:9pt;mso-wrap-distance-bottom:0;mso-position-horizontal:absolute;mso-position-horizontal-relative:text;mso-position-vertical:absolute;mso-position-vertical-relative:text;mso-width-percent:0;mso-width-relative:margin;v-text-anchor:middle" o:gfxdata="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" fillcolor="#156082 [3204]" strokecolor="#030e13 [484]" strokeweight="1.5pt">
                 <v:stroke joinstyle="miter"/>
               </v:oval>
             </w:pict>
@@ -7104,16 +7104,7 @@
     <w:p>
       <w:pPr>
         <w:spacing w:line="240" w:lineRule="auto"/>
-      </w:pPr>
-    </w:p>
-    <w:p>
-      <w:pPr>
-        <w:spacing w:line="240" w:lineRule="auto"/>
-      </w:pPr>
-    </w:p>
-    <w:p>
-      <w:pPr>
-        <w:spacing w:line="240" w:lineRule="auto"/>
+        <w:jc w:val="center"/>
         <w:rPr>
           <w:b/>
           <w:bCs/>
@@ -7126,6 +7117,422 @@
           <w:bCs/>
           <w:u w:val="single"/>
         </w:rPr>
+        <w:t xml:space="preserve">SCAREDY MODE </w:t>
+      </w:r>
+      <w:r>
+        <w:rPr>
+          <w:b/>
+          <w:bCs/>
+          <w:u w:val="single"/>
+        </w:rPr>
+        <w:t>RESPONSE</w:t>
+      </w:r>
+    </w:p>
+    <w:p>
+      <w:pPr>
+        <w:spacing w:line="240" w:lineRule="auto"/>
+        <w:jc w:val="center"/>
+      </w:pPr>
+      <w:r>
+        <w:rPr>
+          <w:noProof/>
+        </w:rPr>
+        <mc:AlternateContent>
+          <mc:Choice Requires="wps">
+            <w:drawing>
+              <wp:anchor distT="0" distB="0" distL="114300" distR="114300" simplePos="0" relativeHeight="251690496" behindDoc="0" locked="0" layoutInCell="1" allowOverlap="1" wp14:anchorId="27222750" wp14:editId="210EE692">
+                <wp:simplePos x="0" y="0"/>
+                <wp:positionH relativeFrom="column">
+                  <wp:posOffset>2476500</wp:posOffset>
+                </wp:positionH>
+                <wp:positionV relativeFrom="paragraph">
+                  <wp:posOffset>121285</wp:posOffset>
+                </wp:positionV>
+                <wp:extent cx="831850" cy="349250"/>
+                <wp:effectExtent l="0" t="0" r="25400" b="12700"/>
+                <wp:wrapNone/>
+                <wp:docPr id="2125646534" name="Text Box 50"/>
+                <wp:cNvGraphicFramePr/>
+                <a:graphic xmlns:a="http://schemas.openxmlformats.org/drawingml/2006/main">
+                  <a:graphicData uri="http://schemas.microsoft.com/office/word/2010/wordprocessingShape">
+                    <wps:wsp>
+                      <wps:cNvSpPr txBox="1"/>
+                      <wps:spPr>
+                        <a:xfrm>
+                          <a:off x="0" y="0"/>
+                          <a:ext cx="831850" cy="349250"/>
+                        </a:xfrm>
+                        <a:prstGeom prst="rect">
+                          <a:avLst/>
+                        </a:prstGeom>
+                        <a:solidFill>
+                          <a:schemeClr val="lt1"/>
+                        </a:solidFill>
+                        <a:ln w="6350">
+                          <a:solidFill>
+                            <a:prstClr val="black"/>
+                          </a:solidFill>
+                        </a:ln>
+                      </wps:spPr>
+                      <wps:txbx>
+                        <w:txbxContent>
+                          <w:p>
+                            <w:r>
+                              <w:t xml:space="preserve">    START </w:t>
+                            </w:r>
+                          </w:p>
+                        </w:txbxContent>
+                      </wps:txbx>
+                      <wps:bodyPr rot="0" spcFirstLastPara="0" vertOverflow="overflow" horzOverflow="overflow" vert="horz" wrap="square" lIns="91440" tIns="45720" rIns="91440" bIns="45720" numCol="1" spcCol="0" rtlCol="0" fromWordArt="0" anchor="t" anchorCtr="0" forceAA="0" compatLnSpc="1">
+                        <a:prstTxWarp prst="textNoShape">
+                          <a:avLst/>
+                        </a:prstTxWarp>
+                        <a:noAutofit/>
+                      </wps:bodyPr>
+                    </wps:wsp>
+                  </a:graphicData>
+                </a:graphic>
+              </wp:anchor>
+            </w:drawing>
+          </mc:Choice>
+          <mc:Fallback>
+            <w:pict>
+              <v:shape w14:anchorId="27222750" id="Text Box 50" o:spid="_x0000_s1040" type="#_x0000_t202" style="position:absolute;left:0;text-align:left;margin-left:195pt;margin-top:9.55pt;width:65.5pt;height:27.5pt;z-index:251690496;visibility:visible;mso-wrap-style:square;mso-wrap-distance-left:9pt;mso-wrap-distance-top:0;mso-wrap-distance-right:9pt;mso-wrap-distance-bottom:0;mso-position-horizontal:absolute;mso-position-horizontal-relative:text;mso-position-vertical:absolute;mso-position-vertical-relative:text;v-text-anchor:top" o:gfxdata="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" fillcolor="white [3201]" strokeweight=".5pt">
+                <v:textbox>
+                  <w:txbxContent>
+                    <w:p>
+                      <w:r>
+                        <w:t xml:space="preserve">    START </w:t>
+                      </w:r>
+                    </w:p>
+                  </w:txbxContent>
+                </v:textbox>
+              </v:shape>
+            </w:pict>
+          </mc:Fallback>
+        </mc:AlternateContent>
+      </w:r>
+      <w:r>
+        <w:rPr>
+          <w:noProof/>
+        </w:rPr>
+        <mc:AlternateContent>
+          <mc:Choice Requires="wps">
+            <w:drawing>
+              <wp:anchor distT="0" distB="0" distL="114300" distR="114300" simplePos="0" relativeHeight="251689472" behindDoc="0" locked="0" layoutInCell="1" allowOverlap="1" wp14:anchorId="21D451A4" wp14:editId="253D37EE">
+                <wp:simplePos x="0" y="0"/>
+                <wp:positionH relativeFrom="column">
+                  <wp:posOffset>2330450</wp:posOffset>
+                </wp:positionH>
+                <wp:positionV relativeFrom="paragraph">
+                  <wp:posOffset>19685</wp:posOffset>
+                </wp:positionV>
+                <wp:extent cx="1111250" cy="527050"/>
+                <wp:effectExtent l="0" t="0" r="12700" b="25400"/>
+                <wp:wrapNone/>
+                <wp:docPr id="111922275" name="Oval 49"/>
+                <wp:cNvGraphicFramePr/>
+                <a:graphic xmlns:a="http://schemas.openxmlformats.org/drawingml/2006/main">
+                  <a:graphicData uri="http://schemas.microsoft.com/office/word/2010/wordprocessingShape">
+                    <wps:wsp>
+                      <wps:cNvSpPr/>
+                      <wps:spPr>
+                        <a:xfrm>
+                          <a:off x="0" y="0"/>
+                          <a:ext cx="1111250" cy="527050"/>
+                        </a:xfrm>
+                        <a:prstGeom prst="ellipse">
+                          <a:avLst/>
+                        </a:prstGeom>
+                      </wps:spPr>
+                      <wps:style>
+                        <a:lnRef idx="2">
+                          <a:schemeClr val="accent1">
+                            <a:shade val="15000"/>
+                          </a:schemeClr>
+                        </a:lnRef>
+                        <a:fillRef idx="1">
+                          <a:schemeClr val="accent1"/>
+                        </a:fillRef>
+                        <a:effectRef idx="0">
+                          <a:schemeClr val="accent1"/>
+                        </a:effectRef>
+                        <a:fontRef idx="minor">
+                          <a:schemeClr val="lt1"/>
+                        </a:fontRef>
+                      </wps:style>
+                      <wps:bodyPr rot="0" spcFirstLastPara="0" vertOverflow="overflow" horzOverflow="overflow" vert="horz" wrap="square" lIns="91440" tIns="45720" rIns="91440" bIns="45720" numCol="1" spcCol="0" rtlCol="0" fromWordArt="0" anchor="ctr" anchorCtr="0" forceAA="0" compatLnSpc="1">
+                        <a:prstTxWarp prst="textNoShape">
+                          <a:avLst/>
+                        </a:prstTxWarp>
+                        <a:noAutofit/>
+                      </wps:bodyPr>
+                    </wps:wsp>
+                  </a:graphicData>
+                </a:graphic>
+                <wp14:sizeRelH relativeFrom="margin">
+                  <wp14:pctWidth>0</wp14:pctWidth>
+                </wp14:sizeRelH>
+              </wp:anchor>
+            </w:drawing>
+          </mc:Choice>
+          <mc:Fallback>
+            <w:pict>
+              <v:oval w14:anchorId="7F0BBF8A" id="Oval 49" o:spid="_x0000_s1026" style="position:absolute;margin-left:183.5pt;margin-top:1.55pt;width:87.5pt;height:41.5pt;z-index:251689472;visibility:visible;mso-wrap-style:square;mso-width-percent:0;mso-wrap-distance-left:9pt;mso-wrap-distance-top:0;mso-wrap-distance-right:9pt;mso-wrap-distance-bottom:0;mso-position-horizontal:absolute;mso-position-horizontal-relative:text;mso-position-vertical:absolute;mso-position-vertical-relative:text;mso-width-percent:0;mso-width-relative:margin;v-text-anchor:middle" o:gfxdata="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" fillcolor="#156082 [3204]" strokecolor="#030e13 [484]" strokeweight="1.5pt">
+                <v:stroke joinstyle="miter"/>
+              </v:oval>
+            </w:pict>
+          </mc:Fallback>
+        </mc:AlternateContent>
+      </w:r>
+    </w:p>
+    <w:p>
+      <w:pPr>
+        <w:spacing w:line="240" w:lineRule="auto"/>
+      </w:pPr>
+      <w:r>
+        <w:rPr>
+          <w:noProof/>
+        </w:rPr>
+        <mc:AlternateContent>
+          <mc:Choice Requires="wps">
+            <w:drawing>
+              <wp:anchor distT="0" distB="0" distL="114300" distR="114300" simplePos="0" relativeHeight="251691520" behindDoc="0" locked="0" layoutInCell="1" allowOverlap="1" wp14:anchorId="3CE8F275" wp14:editId="3D634D8F">
+                <wp:simplePos x="0" y="0"/>
+                <wp:positionH relativeFrom="column">
+                  <wp:posOffset>2882900</wp:posOffset>
+                </wp:positionH>
+                <wp:positionV relativeFrom="paragraph">
+                  <wp:posOffset>265430</wp:posOffset>
+                </wp:positionV>
+                <wp:extent cx="6350" cy="254000"/>
+                <wp:effectExtent l="0" t="0" r="31750" b="31750"/>
+                <wp:wrapNone/>
+                <wp:docPr id="420696586" name="Straight Connector 51"/>
+                <wp:cNvGraphicFramePr/>
+                <a:graphic xmlns:a="http://schemas.openxmlformats.org/drawingml/2006/main">
+                  <a:graphicData uri="http://schemas.microsoft.com/office/word/2010/wordprocessingShape">
+                    <wps:wsp>
+                      <wps:cNvCnPr/>
+                      <wps:spPr>
+                        <a:xfrm>
+                          <a:off x="0" y="0"/>
+                          <a:ext cx="6350" cy="254000"/>
+                        </a:xfrm>
+                        <a:prstGeom prst="line">
+                          <a:avLst/>
+                        </a:prstGeom>
+                      </wps:spPr>
+                      <wps:style>
+                        <a:lnRef idx="2">
+                          <a:schemeClr val="accent1"/>
+                        </a:lnRef>
+                        <a:fillRef idx="0">
+                          <a:schemeClr val="accent1"/>
+                        </a:fillRef>
+                        <a:effectRef idx="1">
+                          <a:schemeClr val="accent1"/>
+                        </a:effectRef>
+                        <a:fontRef idx="minor">
+                          <a:schemeClr val="tx1"/>
+                        </a:fontRef>
+                      </wps:style>
+                      <wps:bodyPr/>
+                    </wps:wsp>
+                  </a:graphicData>
+                </a:graphic>
+              </wp:anchor>
+            </w:drawing>
+          </mc:Choice>
+          <mc:Fallback>
+            <w:pict>
+              <v:line w14:anchorId="1B7CCB12" id="Straight Connector 51" o:spid="_x0000_s1026" style="position:absolute;z-index:251691520;visibility:visible;mso-wrap-style:square;mso-wrap-distance-left:9pt;mso-wrap-distance-top:0;mso-wrap-distance-right:9pt;mso-wrap-distance-bottom:0;mso-position-horizontal:absolute;mso-position-horizontal-relative:text;mso-position-vertical:absolute;mso-position-vertical-relative:text" from="227pt,20.9pt" to="227.5pt,40.9pt" o:gfxdata="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" strokecolor="#156082 [3204]" strokeweight="1.5pt">
+                <v:stroke joinstyle="miter"/>
+              </v:line>
+            </w:pict>
+          </mc:Fallback>
+        </mc:AlternateContent>
+      </w:r>
+    </w:p>
+    <w:p>
+      <w:pPr>
+        <w:spacing w:line="240" w:lineRule="auto"/>
+      </w:pPr>
+      <w:r>
+        <w:rPr>
+          <w:noProof/>
+        </w:rPr>
+        <mc:AlternateContent>
+          <mc:Choice Requires="wps">
+            <w:drawing>
+              <wp:anchor distT="0" distB="0" distL="114300" distR="114300" simplePos="0" relativeHeight="251692544" behindDoc="0" locked="0" layoutInCell="1" allowOverlap="1" wp14:anchorId="388073E2" wp14:editId="62529599">
+                <wp:simplePos x="0" y="0"/>
+                <wp:positionH relativeFrom="column">
+                  <wp:posOffset>1695450</wp:posOffset>
+                </wp:positionH>
+                <wp:positionV relativeFrom="paragraph">
+                  <wp:posOffset>225425</wp:posOffset>
+                </wp:positionV>
+                <wp:extent cx="2419350" cy="654050"/>
+                <wp:effectExtent l="38100" t="19050" r="38100" b="31750"/>
+                <wp:wrapNone/>
+                <wp:docPr id="463575077" name="Diamond 52"/>
+                <wp:cNvGraphicFramePr/>
+                <a:graphic xmlns:a="http://schemas.openxmlformats.org/drawingml/2006/main">
+                  <a:graphicData uri="http://schemas.microsoft.com/office/word/2010/wordprocessingShape">
+                    <wps:wsp>
+                      <wps:cNvSpPr/>
+                      <wps:spPr>
+                        <a:xfrm>
+                          <a:off x="0" y="0"/>
+                          <a:ext cx="2419350" cy="654050"/>
+                        </a:xfrm>
+                        <a:prstGeom prst="diamond">
+                          <a:avLst/>
+                        </a:prstGeom>
+                      </wps:spPr>
+                      <wps:style>
+                        <a:lnRef idx="2">
+                          <a:schemeClr val="accent1">
+                            <a:shade val="15000"/>
+                          </a:schemeClr>
+                        </a:lnRef>
+                        <a:fillRef idx="1">
+                          <a:schemeClr val="accent1"/>
+                        </a:fillRef>
+                        <a:effectRef idx="0">
+                          <a:schemeClr val="accent1"/>
+                        </a:effectRef>
+                        <a:fontRef idx="minor">
+                          <a:schemeClr val="lt1"/>
+                        </a:fontRef>
+                      </wps:style>
+                      <wps:bodyPr rot="0" spcFirstLastPara="0" vertOverflow="overflow" horzOverflow="overflow" vert="horz" wrap="square" lIns="91440" tIns="45720" rIns="91440" bIns="45720" numCol="1" spcCol="0" rtlCol="0" fromWordArt="0" anchor="ctr" anchorCtr="0" forceAA="0" compatLnSpc="1">
+                        <a:prstTxWarp prst="textNoShape">
+                          <a:avLst/>
+                        </a:prstTxWarp>
+                        <a:noAutofit/>
+                      </wps:bodyPr>
+                    </wps:wsp>
+                  </a:graphicData>
+                </a:graphic>
+                <wp14:sizeRelH relativeFrom="margin">
+                  <wp14:pctWidth>0</wp14:pctWidth>
+                </wp14:sizeRelH>
+                <wp14:sizeRelV relativeFrom="margin">
+                  <wp14:pctHeight>0</wp14:pctHeight>
+                </wp14:sizeRelV>
+              </wp:anchor>
+            </w:drawing>
+          </mc:Choice>
+          <mc:Fallback>
+            <w:pict>
+              <v:shape w14:anchorId="44A2A991" id="Diamond 52" o:spid="_x0000_s1026" type="#_x0000_t4" style="position:absolute;margin-left:133.5pt;margin-top:17.75pt;width:190.5pt;height:51.5pt;z-index:251692544;visibility:visible;mso-wrap-style:square;mso-width-percent:0;mso-height-percent:0;mso-wrap-distance-left:9pt;mso-wrap-distance-top:0;mso-wrap-distance-right:9pt;mso-wrap-distance-bottom:0;mso-position-horizontal:absolute;mso-position-horizontal-relative:text;mso-position-vertical:absolute;mso-position-vertical-relative:text;mso-width-percent:0;mso-height-percent:0;mso-width-relative:margin;mso-height-relative:margin;v-text-anchor:middle" o:gfxdata="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" fillcolor="#156082 [3204]" strokecolor="#030e13 [484]" strokeweight="1.5pt"/>
+            </w:pict>
+          </mc:Fallback>
+        </mc:AlternateContent>
+      </w:r>
+    </w:p>
+    <w:p>
+      <w:pPr>
+        <w:spacing w:line="240" w:lineRule="auto"/>
+        <w:rPr>
+          <w:b/>
+          <w:bCs/>
+          <w:u w:val="single"/>
+        </w:rPr>
+      </w:pPr>
+      <w:r>
+        <w:rPr>
+          <w:b/>
+          <w:bCs/>
+          <w:noProof/>
+          <w:u w:val="single"/>
+        </w:rPr>
+        <mc:AlternateContent>
+          <mc:Choice Requires="wps">
+            <w:drawing>
+              <wp:anchor distT="0" distB="0" distL="114300" distR="114300" simplePos="0" relativeHeight="251693568" behindDoc="0" locked="0" layoutInCell="1" allowOverlap="1" wp14:anchorId="5A094149" wp14:editId="105C91EA">
+                <wp:simplePos x="0" y="0"/>
+                <wp:positionH relativeFrom="column">
+                  <wp:posOffset>2209800</wp:posOffset>
+                </wp:positionH>
+                <wp:positionV relativeFrom="paragraph">
+                  <wp:posOffset>140970</wp:posOffset>
+                </wp:positionV>
+                <wp:extent cx="1397000" cy="292100"/>
+                <wp:effectExtent l="0" t="0" r="12700" b="12700"/>
+                <wp:wrapNone/>
+                <wp:docPr id="524384694" name="Text Box 53"/>
+                <wp:cNvGraphicFramePr/>
+                <a:graphic xmlns:a="http://schemas.openxmlformats.org/drawingml/2006/main">
+                  <a:graphicData uri="http://schemas.microsoft.com/office/word/2010/wordprocessingShape">
+                    <wps:wsp>
+                      <wps:cNvSpPr txBox="1"/>
+                      <wps:spPr>
+                        <a:xfrm>
+                          <a:off x="0" y="0"/>
+                          <a:ext cx="1397000" cy="292100"/>
+                        </a:xfrm>
+                        <a:prstGeom prst="rect">
+                          <a:avLst/>
+                        </a:prstGeom>
+                        <a:solidFill>
+                          <a:schemeClr val="lt1"/>
+                        </a:solidFill>
+                        <a:ln w="6350">
+                          <a:solidFill>
+                            <a:prstClr val="black"/>
+                          </a:solidFill>
+                        </a:ln>
+                      </wps:spPr>
+                      <wps:txbx>
+                        <w:txbxContent>
+                          <w:p>
+                            <w:r>
+                              <w:t>OBJECT &lt;= 50cm?</w:t>
+                            </w:r>
+                          </w:p>
+                        </w:txbxContent>
+                      </wps:txbx>
+                      <wps:bodyPr rot="0" spcFirstLastPara="0" vertOverflow="overflow" horzOverflow="overflow" vert="horz" wrap="square" lIns="91440" tIns="45720" rIns="91440" bIns="45720" numCol="1" spcCol="0" rtlCol="0" fromWordArt="0" anchor="t" anchorCtr="0" forceAA="0" compatLnSpc="1">
+                        <a:prstTxWarp prst="textNoShape">
+                          <a:avLst/>
+                        </a:prstTxWarp>
+                        <a:noAutofit/>
+                      </wps:bodyPr>
+                    </wps:wsp>
+                  </a:graphicData>
+                </a:graphic>
+                <wp14:sizeRelH relativeFrom="margin">
+                  <wp14:pctWidth>0</wp14:pctWidth>
+                </wp14:sizeRelH>
+              </wp:anchor>
+            </w:drawing>
+          </mc:Choice>
+          <mc:Fallback>
+            <w:pict>
+              <v:shape w14:anchorId="5A094149" id="Text Box 53" o:spid="_x0000_s1041" type="#_x0000_t202" style="position:absolute;margin-left:174pt;margin-top:11.1pt;width:110pt;height:23pt;z-index:251693568;visibility:visible;mso-wrap-style:square;mso-width-percent:0;mso-wrap-distance-left:9pt;mso-wrap-distance-top:0;mso-wrap-distance-right:9pt;mso-wrap-distance-bottom:0;mso-position-horizontal:absolute;mso-position-horizontal-relative:text;mso-position-vertical:absolute;mso-position-vertical-relative:text;mso-width-percent:0;mso-width-relative:margin;v-text-anchor:top" o:gfxdata="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" fillcolor="white [3201]" strokeweight=".5pt">
+                <v:textbox>
+                  <w:txbxContent>
+                    <w:p>
+                      <w:r>
+                        <w:t>OBJECT &lt;= 50cm?</w:t>
+                      </w:r>
+                    </w:p>
+                  </w:txbxContent>
+                </v:textbox>
+              </v:shape>
+            </w:pict>
+          </mc:Fallback>
+        </mc:AlternateContent>
+      </w:r>
+      <w:r>
+        <w:rPr>
+          <w:b/>
+          <w:bCs/>
+          <w:u w:val="single"/>
+        </w:rPr>
         <w:br/>
       </w:r>
     </w:p>
@@ -7133,11 +7540,230 @@
       <w:pPr>
         <w:spacing w:line="240" w:lineRule="auto"/>
       </w:pPr>
-    </w:p>
-    <w:p>
-      <w:pPr>
-        <w:spacing w:line="240" w:lineRule="auto"/>
-      </w:pPr>
+      <w:r>
+        <w:rPr>
+          <w:noProof/>
+        </w:rPr>
+        <mc:AlternateContent>
+          <mc:Choice Requires="wps">
+            <w:drawing>
+              <wp:anchor distT="0" distB="0" distL="114300" distR="114300" simplePos="0" relativeHeight="251694592" behindDoc="0" locked="0" layoutInCell="1" allowOverlap="1" wp14:anchorId="71F176C2" wp14:editId="02D82BC2">
+                <wp:simplePos x="0" y="0"/>
+                <wp:positionH relativeFrom="column">
+                  <wp:posOffset>2895600</wp:posOffset>
+                </wp:positionH>
+                <wp:positionV relativeFrom="paragraph">
+                  <wp:posOffset>105410</wp:posOffset>
+                </wp:positionV>
+                <wp:extent cx="6350" cy="355600"/>
+                <wp:effectExtent l="0" t="0" r="31750" b="25400"/>
+                <wp:wrapNone/>
+                <wp:docPr id="1136757613" name="Straight Connector 54"/>
+                <wp:cNvGraphicFramePr/>
+                <a:graphic xmlns:a="http://schemas.openxmlformats.org/drawingml/2006/main">
+                  <a:graphicData uri="http://schemas.microsoft.com/office/word/2010/wordprocessingShape">
+                    <wps:wsp>
+                      <wps:cNvCnPr/>
+                      <wps:spPr>
+                        <a:xfrm>
+                          <a:off x="0" y="0"/>
+                          <a:ext cx="6350" cy="355600"/>
+                        </a:xfrm>
+                        <a:prstGeom prst="line">
+                          <a:avLst/>
+                        </a:prstGeom>
+                      </wps:spPr>
+                      <wps:style>
+                        <a:lnRef idx="2">
+                          <a:schemeClr val="accent1"/>
+                        </a:lnRef>
+                        <a:fillRef idx="0">
+                          <a:schemeClr val="accent1"/>
+                        </a:fillRef>
+                        <a:effectRef idx="1">
+                          <a:schemeClr val="accent1"/>
+                        </a:effectRef>
+                        <a:fontRef idx="minor">
+                          <a:schemeClr val="tx1"/>
+                        </a:fontRef>
+                      </wps:style>
+                      <wps:bodyPr/>
+                    </wps:wsp>
+                  </a:graphicData>
+                </a:graphic>
+              </wp:anchor>
+            </w:drawing>
+          </mc:Choice>
+          <mc:Fallback>
+            <w:pict>
+              <v:line w14:anchorId="3238D835" id="Straight Connector 54" o:spid="_x0000_s1026" style="position:absolute;z-index:251694592;visibility:visible;mso-wrap-style:square;mso-wrap-distance-left:9pt;mso-wrap-distance-top:0;mso-wrap-distance-right:9pt;mso-wrap-distance-bottom:0;mso-position-horizontal:absolute;mso-position-horizontal-relative:text;mso-position-vertical:absolute;mso-position-vertical-relative:text" from="228pt,8.3pt" to="228.5pt,36.3pt" o:gfxdata="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" strokecolor="#156082 [3204]" strokeweight="1.5pt">
+                <v:stroke joinstyle="miter"/>
+              </v:line>
+            </w:pict>
+          </mc:Fallback>
+        </mc:AlternateContent>
+      </w:r>
+    </w:p>
+    <w:p>
+      <w:pPr>
+        <w:spacing w:line="240" w:lineRule="auto"/>
+      </w:pPr>
+      <w:r>
+        <w:rPr>
+          <w:noProof/>
+        </w:rPr>
+        <mc:AlternateContent>
+          <mc:Choice Requires="wps">
+            <w:drawing>
+              <wp:anchor distT="0" distB="0" distL="114300" distR="114300" simplePos="0" relativeHeight="251695616" behindDoc="0" locked="0" layoutInCell="1" allowOverlap="1" wp14:anchorId="4D31962E" wp14:editId="52413180">
+                <wp:simplePos x="0" y="0"/>
+                <wp:positionH relativeFrom="column">
+                  <wp:posOffset>2139950</wp:posOffset>
+                </wp:positionH>
+                <wp:positionV relativeFrom="paragraph">
+                  <wp:posOffset>179705</wp:posOffset>
+                </wp:positionV>
+                <wp:extent cx="1549400" cy="438150"/>
+                <wp:effectExtent l="0" t="0" r="12700" b="19050"/>
+                <wp:wrapNone/>
+                <wp:docPr id="2097733511" name="Rectangle 55"/>
+                <wp:cNvGraphicFramePr/>
+                <a:graphic xmlns:a="http://schemas.openxmlformats.org/drawingml/2006/main">
+                  <a:graphicData uri="http://schemas.microsoft.com/office/word/2010/wordprocessingShape">
+                    <wps:wsp>
+                      <wps:cNvSpPr/>
+                      <wps:spPr>
+                        <a:xfrm>
+                          <a:off x="0" y="0"/>
+                          <a:ext cx="1549400" cy="438150"/>
+                        </a:xfrm>
+                        <a:prstGeom prst="rect">
+                          <a:avLst/>
+                        </a:prstGeom>
+                      </wps:spPr>
+                      <wps:style>
+                        <a:lnRef idx="2">
+                          <a:schemeClr val="accent1">
+                            <a:shade val="15000"/>
+                          </a:schemeClr>
+                        </a:lnRef>
+                        <a:fillRef idx="1">
+                          <a:schemeClr val="accent1"/>
+                        </a:fillRef>
+                        <a:effectRef idx="0">
+                          <a:schemeClr val="accent1"/>
+                        </a:effectRef>
+                        <a:fontRef idx="minor">
+                          <a:schemeClr val="lt1"/>
+                        </a:fontRef>
+                      </wps:style>
+                      <wps:bodyPr rot="0" spcFirstLastPara="0" vertOverflow="overflow" horzOverflow="overflow" vert="horz" wrap="square" lIns="91440" tIns="45720" rIns="91440" bIns="45720" numCol="1" spcCol="0" rtlCol="0" fromWordArt="0" anchor="ctr" anchorCtr="0" forceAA="0" compatLnSpc="1">
+                        <a:prstTxWarp prst="textNoShape">
+                          <a:avLst/>
+                        </a:prstTxWarp>
+                        <a:noAutofit/>
+                      </wps:bodyPr>
+                    </wps:wsp>
+                  </a:graphicData>
+                </a:graphic>
+                <wp14:sizeRelH relativeFrom="margin">
+                  <wp14:pctWidth>0</wp14:pctWidth>
+                </wp14:sizeRelH>
+                <wp14:sizeRelV relativeFrom="margin">
+                  <wp14:pctHeight>0</wp14:pctHeight>
+                </wp14:sizeRelV>
+              </wp:anchor>
+            </w:drawing>
+          </mc:Choice>
+          <mc:Fallback>
+            <w:pict>
+              <v:rect w14:anchorId="369803B2" id="Rectangle 55" o:spid="_x0000_s1026" style="position:absolute;margin-left:168.5pt;margin-top:14.15pt;width:122pt;height:34.5pt;z-index:251695616;visibility:visible;mso-wrap-style:square;mso-width-percent:0;mso-height-percent:0;mso-wrap-distance-left:9pt;mso-wrap-distance-top:0;mso-wrap-distance-right:9pt;mso-wrap-distance-bottom:0;mso-position-horizontal:absolute;mso-position-horizontal-relative:text;mso-position-vertical:absolute;mso-position-vertical-relative:text;mso-width-percent:0;mso-height-percent:0;mso-width-relative:margin;mso-height-relative:margin;v-text-anchor:middle" o:gfxdata="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" fillcolor="#156082 [3204]" strokecolor="#030e13 [484]" strokeweight="1.5pt"/>
+            </w:pict>
+          </mc:Fallback>
+        </mc:AlternateContent>
+      </w:r>
+      <w:r>
+        <w:rPr>
+          <w:noProof/>
+        </w:rPr>
+        <mc:AlternateContent>
+          <mc:Choice Requires="wps">
+            <w:drawing>
+              <wp:anchor distT="0" distB="0" distL="114300" distR="114300" simplePos="0" relativeHeight="251696640" behindDoc="0" locked="0" layoutInCell="1" allowOverlap="1" wp14:anchorId="0A116C71" wp14:editId="3A6011C7">
+                <wp:simplePos x="0" y="0"/>
+                <wp:positionH relativeFrom="column">
+                  <wp:posOffset>2362200</wp:posOffset>
+                </wp:positionH>
+                <wp:positionV relativeFrom="paragraph">
+                  <wp:posOffset>249555</wp:posOffset>
+                </wp:positionV>
+                <wp:extent cx="1143000" cy="279400"/>
+                <wp:effectExtent l="0" t="0" r="19050" b="25400"/>
+                <wp:wrapNone/>
+                <wp:docPr id="674413529" name="Text Box 56"/>
+                <wp:cNvGraphicFramePr/>
+                <a:graphic xmlns:a="http://schemas.openxmlformats.org/drawingml/2006/main">
+                  <a:graphicData uri="http://schemas.microsoft.com/office/word/2010/wordprocessingShape">
+                    <wps:wsp>
+                      <wps:cNvSpPr txBox="1"/>
+                      <wps:spPr>
+                        <a:xfrm>
+                          <a:off x="0" y="0"/>
+                          <a:ext cx="1143000" cy="279400"/>
+                        </a:xfrm>
+                        <a:prstGeom prst="rect">
+                          <a:avLst/>
+                        </a:prstGeom>
+                        <a:solidFill>
+                          <a:schemeClr val="lt1"/>
+                        </a:solidFill>
+                        <a:ln w="6350">
+                          <a:solidFill>
+                            <a:prstClr val="black"/>
+                          </a:solidFill>
+                        </a:ln>
+                      </wps:spPr>
+                      <wps:txbx>
+                        <w:txbxContent>
+                          <w:p>
+                            <w:r>
+                              <w:t xml:space="preserve">     BLINK RED</w:t>
+                            </w:r>
+                          </w:p>
+                        </w:txbxContent>
+                      </wps:txbx>
+                      <wps:bodyPr rot="0" spcFirstLastPara="0" vertOverflow="overflow" horzOverflow="overflow" vert="horz" wrap="square" lIns="91440" tIns="45720" rIns="91440" bIns="45720" numCol="1" spcCol="0" rtlCol="0" fromWordArt="0" anchor="t" anchorCtr="0" forceAA="0" compatLnSpc="1">
+                        <a:prstTxWarp prst="textNoShape">
+                          <a:avLst/>
+                        </a:prstTxWarp>
+                        <a:noAutofit/>
+                      </wps:bodyPr>
+                    </wps:wsp>
+                  </a:graphicData>
+                </a:graphic>
+                <wp14:sizeRelH relativeFrom="margin">
+                  <wp14:pctWidth>0</wp14:pctWidth>
+                </wp14:sizeRelH>
+              </wp:anchor>
+            </w:drawing>
+          </mc:Choice>
+          <mc:Fallback>
+            <w:pict>
+              <v:shape w14:anchorId="0A116C71" id="Text Box 56" o:spid="_x0000_s1042" type="#_x0000_t202" style="position:absolute;margin-left:186pt;margin-top:19.65pt;width:90pt;height:22pt;z-index:251696640;visibility:visible;mso-wrap-style:square;mso-width-percent:0;mso-wrap-distance-left:9pt;mso-wrap-distance-top:0;mso-wrap-distance-right:9pt;mso-wrap-distance-bottom:0;mso-position-horizontal:absolute;mso-position-horizontal-relative:text;mso-position-vertical:absolute;mso-position-vertical-relative:text;mso-width-percent:0;mso-width-relative:margin;v-text-anchor:top" o:gfxdata="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" fillcolor="white [3201]" strokeweight=".5pt">
+                <v:textbox>
+                  <w:txbxContent>
+                    <w:p>
+                      <w:r>
+                        <w:t xml:space="preserve">     BLINK RED</w:t>
+                      </w:r>
+                    </w:p>
+                  </w:txbxContent>
+                </v:textbox>
+              </v:shape>
+            </w:pict>
+          </mc:Fallback>
+        </mc:AlternateContent>
+      </w:r>
     </w:p>
     <w:p/>
     <w:p/>

</xml_diff>

<commit_message>
Scaredy Mode Response Alogrithm Design Done
</commit_message>
<xml_diff>
--- a/Documents/SwiftBot Task10 - Requirements (1).docx
+++ b/Documents/SwiftBot Task10 - Requirements (1).docx
@@ -1596,7 +1596,7 @@
                 </mc:Choice>
                 <mc:Fallback>
                   <w:pict>
-                    <v:shapetype w14:anchorId="31FE0EE8" id="_x0000_t32" coordsize="21600,21600" o:spt="32" o:oned="t" path="m,l21600,21600e" filled="f">
+                    <v:shapetype w14:anchorId="5EA6D2EA" id="_x0000_t32" coordsize="21600,21600" o:spt="32" o:oned="t" path="m,l21600,21600e" filled="f">
                       <v:path arrowok="t" fillok="f" o:connecttype="none"/>
                       <o:lock v:ext="edit" shapetype="t"/>
                     </v:shapetype>
@@ -1678,7 +1678,7 @@
                 </mc:Choice>
                 <mc:Fallback>
                   <w:pict>
-                    <v:shape w14:anchorId="60C9199D" id="Straight Arrow Connector 2" o:spid="_x0000_s1026" type="#_x0000_t32" style="position:absolute;margin-left:36.85pt;margin-top:8.25pt;width:29.5pt;height:0;z-index:251650560;visibility:visible;mso-wrap-style:square;mso-wrap-distance-left:9pt;mso-wrap-distance-top:0;mso-wrap-distance-right:9pt;mso-wrap-distance-bottom:0;mso-position-horizontal:absolute;mso-position-horizontal-relative:text;mso-position-vertical:absolute;mso-position-vertical-relative:text" o:gfxdata="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" strokecolor="#156082 [3204]" strokeweight="1.5pt">
+                    <v:shape w14:anchorId="0D616FAF" id="Straight Arrow Connector 2" o:spid="_x0000_s1026" type="#_x0000_t32" style="position:absolute;margin-left:36.85pt;margin-top:8.25pt;width:29.5pt;height:0;z-index:251650560;visibility:visible;mso-wrap-style:square;mso-wrap-distance-left:9pt;mso-wrap-distance-top:0;mso-wrap-distance-right:9pt;mso-wrap-distance-bottom:0;mso-position-horizontal:absolute;mso-position-horizontal-relative:text;mso-position-vertical:absolute;mso-position-vertical-relative:text" o:gfxdata="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" strokecolor="#156082 [3204]" strokeweight="1.5pt">
                       <v:stroke endarrow="block" joinstyle="miter"/>
                     </v:shape>
                   </w:pict>
@@ -1835,7 +1835,7 @@
                 </mc:Choice>
                 <mc:Fallback>
                   <w:pict>
-                    <v:shape w14:anchorId="04AAEBA1" id="Straight Arrow Connector 3" o:spid="_x0000_s1026" type="#_x0000_t32" style="position:absolute;margin-left:46.35pt;margin-top:7.9pt;width:29pt;height:0;z-index:251651584;visibility:visible;mso-wrap-style:square;mso-wrap-distance-left:9pt;mso-wrap-distance-top:0;mso-wrap-distance-right:9pt;mso-wrap-distance-bottom:0;mso-position-horizontal:absolute;mso-position-horizontal-relative:text;mso-position-vertical:absolute;mso-position-vertical-relative:text" o:gfxdata="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" strokecolor="#156082 [3204]" strokeweight="1.5pt">
+                    <v:shape w14:anchorId="6D514219" id="Straight Arrow Connector 3" o:spid="_x0000_s1026" type="#_x0000_t32" style="position:absolute;margin-left:46.35pt;margin-top:7.9pt;width:29pt;height:0;z-index:251651584;visibility:visible;mso-wrap-style:square;mso-wrap-distance-left:9pt;mso-wrap-distance-top:0;mso-wrap-distance-right:9pt;mso-wrap-distance-bottom:0;mso-position-horizontal:absolute;mso-position-horizontal-relative:text;mso-position-vertical:absolute;mso-position-vertical-relative:text" o:gfxdata="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" strokecolor="#156082 [3204]" strokeweight="1.5pt">
                       <v:stroke endarrow="block" joinstyle="miter"/>
                     </v:shape>
                   </w:pict>
@@ -1922,7 +1922,7 @@
                 </mc:Choice>
                 <mc:Fallback>
                   <w:pict>
-                    <v:shape w14:anchorId="278FD606" id="Straight Arrow Connector 4" o:spid="_x0000_s1026" type="#_x0000_t32" style="position:absolute;margin-left:46.85pt;margin-top:5.75pt;width:30.5pt;height:.5pt;z-index:251653632;visibility:visible;mso-wrap-style:square;mso-wrap-distance-left:9pt;mso-wrap-distance-top:0;mso-wrap-distance-right:9pt;mso-wrap-distance-bottom:0;mso-position-horizontal:absolute;mso-position-horizontal-relative:text;mso-position-vertical:absolute;mso-position-vertical-relative:text" o:gfxdata="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" strokecolor="#156082 [3204]" strokeweight="1.5pt">
+                    <v:shape w14:anchorId="3523D488" id="Straight Arrow Connector 4" o:spid="_x0000_s1026" type="#_x0000_t32" style="position:absolute;margin-left:46.85pt;margin-top:5.75pt;width:30.5pt;height:.5pt;z-index:251653632;visibility:visible;mso-wrap-style:square;mso-wrap-distance-left:9pt;mso-wrap-distance-top:0;mso-wrap-distance-right:9pt;mso-wrap-distance-bottom:0;mso-position-horizontal:absolute;mso-position-horizontal-relative:text;mso-position-vertical:absolute;mso-position-vertical-relative:text" o:gfxdata="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" strokecolor="#156082 [3204]" strokeweight="1.5pt">
                       <v:stroke endarrow="block" joinstyle="miter"/>
                     </v:shape>
                   </w:pict>
@@ -3840,7 +3840,7 @@
           </mc:Choice>
           <mc:Fallback>
             <w:pict>
-              <v:oval w14:anchorId="08BC6347" id="Oval 1" o:spid="_x0000_s1026" style="position:absolute;margin-left:158.95pt;margin-top:2.1pt;width:138.55pt;height:52.95pt;z-index:251655680;visibility:visible;mso-wrap-style:square;mso-width-percent:0;mso-wrap-distance-left:9pt;mso-wrap-distance-top:0;mso-wrap-distance-right:9pt;mso-wrap-distance-bottom:0;mso-position-horizontal:absolute;mso-position-horizontal-relative:text;mso-position-vertical:absolute;mso-position-vertical-relative:text;mso-width-percent:0;mso-width-relative:margin;v-text-anchor:middle" o:gfxdata="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" fillcolor="#156082 [3204]" strokecolor="#030e13 [484]" strokeweight="1.5pt">
+              <v:oval w14:anchorId="0607128C" id="Oval 1" o:spid="_x0000_s1026" style="position:absolute;margin-left:158.95pt;margin-top:2.1pt;width:138.55pt;height:52.95pt;z-index:251655680;visibility:visible;mso-wrap-style:square;mso-width-percent:0;mso-wrap-distance-left:9pt;mso-wrap-distance-top:0;mso-wrap-distance-right:9pt;mso-wrap-distance-bottom:0;mso-position-horizontal:absolute;mso-position-horizontal-relative:text;mso-position-vertical:absolute;mso-position-vertical-relative:text;mso-width-percent:0;mso-width-relative:margin;v-text-anchor:middle" o:gfxdata="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" fillcolor="#156082 [3204]" strokecolor="#030e13 [484]" strokeweight="1.5pt">
                 <v:stroke joinstyle="miter"/>
               </v:oval>
             </w:pict>
@@ -4021,7 +4021,7 @@
           </mc:Choice>
           <mc:Fallback>
             <w:pict>
-              <v:line w14:anchorId="7700DCF0" id="Straight Connector 3" o:spid="_x0000_s1026" style="position:absolute;z-index:251658752;visibility:visible;mso-wrap-style:square;mso-wrap-distance-left:9pt;mso-wrap-distance-top:0;mso-wrap-distance-right:9pt;mso-wrap-distance-bottom:0;mso-position-horizontal:absolute;mso-position-horizontal-relative:text;mso-position-vertical:absolute;mso-position-vertical-relative:text" from="227.55pt,9.7pt" to="227.55pt,51.8pt" o:gfxdata="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" strokecolor="#156082 [3204]" strokeweight="1.5pt">
+              <v:line w14:anchorId="22E848D5" id="Straight Connector 3" o:spid="_x0000_s1026" style="position:absolute;z-index:251658752;visibility:visible;mso-wrap-style:square;mso-wrap-distance-left:9pt;mso-wrap-distance-top:0;mso-wrap-distance-right:9pt;mso-wrap-distance-bottom:0;mso-position-horizontal:absolute;mso-position-horizontal-relative:text;mso-position-vertical:absolute;mso-position-vertical-relative:text" from="227.55pt,9.7pt" to="227.55pt,51.8pt" o:gfxdata="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" strokecolor="#156082 [3204]" strokeweight="1.5pt">
                 <v:stroke joinstyle="miter"/>
               </v:line>
             </w:pict>
@@ -4107,7 +4107,7 @@
           </mc:Choice>
           <mc:Fallback>
             <w:pict>
-              <v:rect w14:anchorId="63E62DEE" id="Rectangle 8" o:spid="_x0000_s1026" style="position:absolute;margin-left:118.5pt;margin-top:5.1pt;width:221pt;height:35.5pt;z-index:251649024;visibility:visible;mso-wrap-style:square;mso-width-percent:0;mso-height-percent:0;mso-wrap-distance-left:9pt;mso-wrap-distance-top:0;mso-wrap-distance-right:9pt;mso-wrap-distance-bottom:0;mso-position-horizontal:absolute;mso-position-horizontal-relative:text;mso-position-vertical:absolute;mso-position-vertical-relative:text;mso-width-percent:0;mso-height-percent:0;mso-width-relative:margin;mso-height-relative:margin;v-text-anchor:middle" o:gfxdata="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" fillcolor="#156082 [3204]" strokecolor="#030e13 [484]" strokeweight="1.5pt"/>
+              <v:rect w14:anchorId="2F38A717" id="Rectangle 8" o:spid="_x0000_s1026" style="position:absolute;margin-left:118.5pt;margin-top:5.1pt;width:221pt;height:35.5pt;z-index:251649024;visibility:visible;mso-wrap-style:square;mso-width-percent:0;mso-height-percent:0;mso-wrap-distance-left:9pt;mso-wrap-distance-top:0;mso-wrap-distance-right:9pt;mso-wrap-distance-bottom:0;mso-position-horizontal:absolute;mso-position-horizontal-relative:text;mso-position-vertical:absolute;mso-position-vertical-relative:text;mso-width-percent:0;mso-height-percent:0;mso-width-relative:margin;mso-height-relative:margin;v-text-anchor:middle" o:gfxdata="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" fillcolor="#156082 [3204]" strokecolor="#030e13 [484]" strokeweight="1.5pt"/>
             </w:pict>
           </mc:Fallback>
         </mc:AlternateContent>
@@ -4261,7 +4261,7 @@
           </mc:Choice>
           <mc:Fallback>
             <w:pict>
-              <v:line w14:anchorId="40B3E973" id="Straight Connector 10" o:spid="_x0000_s1026" style="position:absolute;z-index:251659776;visibility:visible;mso-wrap-style:square;mso-width-percent:0;mso-height-percent:0;mso-wrap-distance-left:9pt;mso-wrap-distance-top:0;mso-wrap-distance-right:9pt;mso-wrap-distance-bottom:0;mso-position-horizontal:absolute;mso-position-horizontal-relative:text;mso-position-vertical:absolute;mso-position-vertical-relative:text;mso-width-percent:0;mso-height-percent:0;mso-width-relative:margin;mso-height-relative:margin" from="226pt,16.95pt" to="227pt,53.95pt" o:gfxdata="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" strokecolor="#156082 [3204]" strokeweight="1.5pt">
+              <v:line w14:anchorId="427C4624" id="Straight Connector 10" o:spid="_x0000_s1026" style="position:absolute;z-index:251659776;visibility:visible;mso-wrap-style:square;mso-width-percent:0;mso-height-percent:0;mso-wrap-distance-left:9pt;mso-wrap-distance-top:0;mso-wrap-distance-right:9pt;mso-wrap-distance-bottom:0;mso-position-horizontal:absolute;mso-position-horizontal-relative:text;mso-position-vertical:absolute;mso-position-vertical-relative:text;mso-width-percent:0;mso-height-percent:0;mso-width-relative:margin;mso-height-relative:margin" from="226pt,16.95pt" to="227pt,53.95pt" o:gfxdata="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" strokecolor="#156082 [3204]" strokeweight="1.5pt">
                 <v:stroke joinstyle="miter"/>
               </v:line>
             </w:pict>
@@ -4347,7 +4347,7 @@
           </mc:Choice>
           <mc:Fallback>
             <w:pict>
-              <v:rect w14:anchorId="0DF64A80" id="Rectangle 11" o:spid="_x0000_s1026" style="position:absolute;margin-left:118pt;margin-top:9.65pt;width:224pt;height:37.5pt;z-index:251653120;visibility:visible;mso-wrap-style:square;mso-width-percent:0;mso-height-percent:0;mso-wrap-distance-left:9pt;mso-wrap-distance-top:0;mso-wrap-distance-right:9pt;mso-wrap-distance-bottom:0;mso-position-horizontal:absolute;mso-position-horizontal-relative:text;mso-position-vertical:absolute;mso-position-vertical-relative:text;mso-width-percent:0;mso-height-percent:0;mso-width-relative:margin;mso-height-relative:margin;v-text-anchor:middle" o:gfxdata="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" fillcolor="#156082 [3204]" strokecolor="#030e13 [484]" strokeweight="1.5pt"/>
+              <v:rect w14:anchorId="25260ADC" id="Rectangle 11" o:spid="_x0000_s1026" style="position:absolute;margin-left:118pt;margin-top:9.65pt;width:224pt;height:37.5pt;z-index:251653120;visibility:visible;mso-wrap-style:square;mso-width-percent:0;mso-height-percent:0;mso-wrap-distance-left:9pt;mso-wrap-distance-top:0;mso-wrap-distance-right:9pt;mso-wrap-distance-bottom:0;mso-position-horizontal:absolute;mso-position-horizontal-relative:text;mso-position-vertical:absolute;mso-position-vertical-relative:text;mso-width-percent:0;mso-height-percent:0;mso-width-relative:margin;mso-height-relative:margin;v-text-anchor:middle" o:gfxdata="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" fillcolor="#156082 [3204]" strokecolor="#030e13 [484]" strokeweight="1.5pt"/>
             </w:pict>
           </mc:Fallback>
         </mc:AlternateContent>
@@ -4518,7 +4518,7 @@
           </mc:Choice>
           <mc:Fallback>
             <w:pict>
-              <v:line w14:anchorId="0C9CD72C" id="Straight Connector 13" o:spid="_x0000_s1026" style="position:absolute;z-index:251660800;visibility:visible;mso-wrap-style:square;mso-wrap-distance-left:9pt;mso-wrap-distance-top:0;mso-wrap-distance-right:9pt;mso-wrap-distance-bottom:0;mso-position-horizontal:absolute;mso-position-horizontal-relative:text;mso-position-vertical:absolute;mso-position-vertical-relative:text" from="226.5pt,.35pt" to="226.5pt,42.35pt" o:gfxdata="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" strokecolor="#156082 [3204]" strokeweight="1.5pt">
+              <v:line w14:anchorId="2D5CDD82" id="Straight Connector 13" o:spid="_x0000_s1026" style="position:absolute;z-index:251660800;visibility:visible;mso-wrap-style:square;mso-wrap-distance-left:9pt;mso-wrap-distance-top:0;mso-wrap-distance-right:9pt;mso-wrap-distance-bottom:0;mso-position-horizontal:absolute;mso-position-horizontal-relative:text;mso-position-vertical:absolute;mso-position-vertical-relative:text" from="226.5pt,.35pt" to="226.5pt,42.35pt" o:gfxdata="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" strokecolor="#156082 [3204]" strokeweight="1.5pt">
                 <v:stroke joinstyle="miter"/>
               </v:line>
             </w:pict>
@@ -4599,7 +4599,7 @@
           </mc:Choice>
           <mc:Fallback>
             <w:pict>
-              <v:shapetype w14:anchorId="2DB7B646" id="_x0000_t4" coordsize="21600,21600" o:spt="4" path="m10800,l,10800,10800,21600,21600,10800xe">
+              <v:shapetype w14:anchorId="6F093B08" id="_x0000_t4" coordsize="21600,21600" o:spt="4" path="m10800,l,10800,10800,21600,21600,10800xe">
                 <v:stroke joinstyle="miter"/>
                 <v:path gradientshapeok="t" o:connecttype="rect" textboxrect="5400,5400,16200,16200"/>
               </v:shapetype>
@@ -4776,7 +4776,7 @@
           </mc:Choice>
           <mc:Fallback>
             <w:pict>
-              <v:line w14:anchorId="4B930220" id="Straight Connector 16" o:spid="_x0000_s1026" style="position:absolute;z-index:251663872;visibility:visible;mso-wrap-style:square;mso-wrap-distance-left:9pt;mso-wrap-distance-top:0;mso-wrap-distance-right:9pt;mso-wrap-distance-bottom:0;mso-position-horizontal:absolute;mso-position-horizontal-relative:text;mso-position-vertical:absolute;mso-position-vertical-relative:text" from="228.5pt,9.75pt" to="228.5pt,39.25pt" o:gfxdata="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" strokecolor="#156082 [3204]" strokeweight="1.5pt">
+              <v:line w14:anchorId="29EFDBFB" id="Straight Connector 16" o:spid="_x0000_s1026" style="position:absolute;z-index:251663872;visibility:visible;mso-wrap-style:square;mso-wrap-distance-left:9pt;mso-wrap-distance-top:0;mso-wrap-distance-right:9pt;mso-wrap-distance-bottom:0;mso-position-horizontal:absolute;mso-position-horizontal-relative:text;mso-position-vertical:absolute;mso-position-vertical-relative:text" from="228.5pt,9.75pt" to="228.5pt,39.25pt" o:gfxdata="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" strokecolor="#156082 [3204]" strokeweight="1.5pt">
                 <v:stroke joinstyle="miter"/>
               </v:line>
             </w:pict>
@@ -4936,7 +4936,7 @@
           </mc:Choice>
           <mc:Fallback>
             <w:pict>
-              <v:rect w14:anchorId="418863FF" id="Rectangle 17" o:spid="_x0000_s1026" style="position:absolute;margin-left:114.5pt;margin-top:16.1pt;width:230pt;height:38.5pt;z-index:251664896;visibility:visible;mso-wrap-style:square;mso-width-percent:0;mso-wrap-distance-left:9pt;mso-wrap-distance-top:0;mso-wrap-distance-right:9pt;mso-wrap-distance-bottom:0;mso-position-horizontal:absolute;mso-position-horizontal-relative:text;mso-position-vertical:absolute;mso-position-vertical-relative:text;mso-width-percent:0;mso-width-relative:margin;v-text-anchor:middle" o:gfxdata="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" fillcolor="#156082 [3204]" strokecolor="#030e13 [484]" strokeweight="1.5pt"/>
+              <v:rect w14:anchorId="737D9673" id="Rectangle 17" o:spid="_x0000_s1026" style="position:absolute;margin-left:114.5pt;margin-top:16.1pt;width:230pt;height:38.5pt;z-index:251664896;visibility:visible;mso-wrap-style:square;mso-width-percent:0;mso-wrap-distance-left:9pt;mso-wrap-distance-top:0;mso-wrap-distance-right:9pt;mso-wrap-distance-bottom:0;mso-position-horizontal:absolute;mso-position-horizontal-relative:text;mso-position-vertical:absolute;mso-position-vertical-relative:text;mso-width-percent:0;mso-width-relative:margin;v-text-anchor:middle" o:gfxdata="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" fillcolor="#156082 [3204]" strokecolor="#030e13 [484]" strokeweight="1.5pt"/>
             </w:pict>
           </mc:Fallback>
         </mc:AlternateContent>
@@ -5007,7 +5007,7 @@
           </mc:Choice>
           <mc:Fallback>
             <w:pict>
-              <v:line w14:anchorId="07F1F2F0" id="Straight Connector 19" o:spid="_x0000_s1026" style="position:absolute;z-index:251666944;visibility:visible;mso-wrap-style:square;mso-wrap-distance-left:9pt;mso-wrap-distance-top:0;mso-wrap-distance-right:9pt;mso-wrap-distance-bottom:0;mso-position-horizontal:absolute;mso-position-horizontal-relative:text;mso-position-vertical:absolute;mso-position-vertical-relative:text" from="228pt,9.3pt" to="228pt,39.3pt" o:gfxdata="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" strokecolor="#156082 [3204]" strokeweight="1.5pt">
+              <v:line w14:anchorId="146F110A" id="Straight Connector 19" o:spid="_x0000_s1026" style="position:absolute;z-index:251666944;visibility:visible;mso-wrap-style:square;mso-wrap-distance-left:9pt;mso-wrap-distance-top:0;mso-wrap-distance-right:9pt;mso-wrap-distance-bottom:0;mso-position-horizontal:absolute;mso-position-horizontal-relative:text;mso-position-vertical:absolute;mso-position-vertical-relative:text" from="228pt,9.3pt" to="228pt,39.3pt" o:gfxdata="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" strokecolor="#156082 [3204]" strokeweight="1.5pt">
                 <v:stroke joinstyle="miter"/>
               </v:line>
             </w:pict>
@@ -5088,7 +5088,7 @@
           </mc:Choice>
           <mc:Fallback>
             <w:pict>
-              <v:shape w14:anchorId="29D44EE0" id="Diamond 20" o:spid="_x0000_s1026" type="#_x0000_t4" style="position:absolute;margin-left:105.5pt;margin-top:15.15pt;width:247.5pt;height:55.5pt;z-index:251667968;visibility:visible;mso-wrap-style:square;mso-width-percent:0;mso-height-percent:0;mso-wrap-distance-left:9pt;mso-wrap-distance-top:0;mso-wrap-distance-right:9pt;mso-wrap-distance-bottom:0;mso-position-horizontal:absolute;mso-position-horizontal-relative:text;mso-position-vertical:absolute;mso-position-vertical-relative:text;mso-width-percent:0;mso-height-percent:0;mso-width-relative:margin;mso-height-relative:margin;v-text-anchor:middle" o:gfxdata="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" fillcolor="#156082 [3204]" strokecolor="#030e13 [484]" strokeweight="1.5pt"/>
+              <v:shape w14:anchorId="35758F5C" id="Diamond 20" o:spid="_x0000_s1026" type="#_x0000_t4" style="position:absolute;margin-left:105.5pt;margin-top:15.15pt;width:247.5pt;height:55.5pt;z-index:251667968;visibility:visible;mso-wrap-style:square;mso-width-percent:0;mso-height-percent:0;mso-wrap-distance-left:9pt;mso-wrap-distance-top:0;mso-wrap-distance-right:9pt;mso-wrap-distance-bottom:0;mso-position-horizontal:absolute;mso-position-horizontal-relative:text;mso-position-vertical:absolute;mso-position-vertical-relative:text;mso-width-percent:0;mso-height-percent:0;mso-width-relative:margin;mso-height-relative:margin;v-text-anchor:middle" o:gfxdata="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" fillcolor="#156082 [3204]" strokecolor="#030e13 [484]" strokeweight="1.5pt"/>
             </w:pict>
           </mc:Fallback>
         </mc:AlternateContent>
@@ -5246,7 +5246,7 @@
           </mc:Choice>
           <mc:Fallback>
             <w:pict>
-              <v:line w14:anchorId="0AF20C08" id="Straight Connector 22" o:spid="_x0000_s1026" style="position:absolute;z-index:251670016;visibility:visible;mso-wrap-style:square;mso-wrap-distance-left:9pt;mso-wrap-distance-top:0;mso-wrap-distance-right:9pt;mso-wrap-distance-bottom:0;mso-position-horizontal:absolute;mso-position-horizontal-relative:text;mso-position-vertical:absolute;mso-position-vertical-relative:text" from="228.5pt,3.7pt" to="229pt,35.7pt" o:gfxdata="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" strokecolor="#156082 [3204]" strokeweight="1.5pt">
+              <v:line w14:anchorId="386CBE6E" id="Straight Connector 22" o:spid="_x0000_s1026" style="position:absolute;z-index:251670016;visibility:visible;mso-wrap-style:square;mso-wrap-distance-left:9pt;mso-wrap-distance-top:0;mso-wrap-distance-right:9pt;mso-wrap-distance-bottom:0;mso-position-horizontal:absolute;mso-position-horizontal-relative:text;mso-position-vertical:absolute;mso-position-vertical-relative:text" from="228.5pt,3.7pt" to="229pt,35.7pt" o:gfxdata="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" strokecolor="#156082 [3204]" strokeweight="1.5pt">
                 <v:stroke joinstyle="miter"/>
               </v:line>
             </w:pict>
@@ -5409,7 +5409,7 @@
           </mc:Choice>
           <mc:Fallback>
             <w:pict>
-              <v:rect w14:anchorId="018FF5AC" id="Rectangle 23" o:spid="_x0000_s1026" style="position:absolute;margin-left:149.5pt;margin-top:12.55pt;width:164.5pt;height:36.5pt;z-index:251659264;visibility:visible;mso-wrap-style:square;mso-width-percent:0;mso-height-percent:0;mso-wrap-distance-left:9pt;mso-wrap-distance-top:0;mso-wrap-distance-right:9pt;mso-wrap-distance-bottom:0;mso-position-horizontal:absolute;mso-position-horizontal-relative:text;mso-position-vertical:absolute;mso-position-vertical-relative:text;mso-width-percent:0;mso-height-percent:0;mso-width-relative:margin;mso-height-relative:margin;v-text-anchor:middle" o:gfxdata="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" fillcolor="#156082 [3204]" strokecolor="#030e13 [484]" strokeweight="1.5pt"/>
+              <v:rect w14:anchorId="6D971072" id="Rectangle 23" o:spid="_x0000_s1026" style="position:absolute;margin-left:149.5pt;margin-top:12.55pt;width:164.5pt;height:36.5pt;z-index:251659264;visibility:visible;mso-wrap-style:square;mso-width-percent:0;mso-height-percent:0;mso-wrap-distance-left:9pt;mso-wrap-distance-top:0;mso-wrap-distance-right:9pt;mso-wrap-distance-bottom:0;mso-position-horizontal:absolute;mso-position-horizontal-relative:text;mso-position-vertical:absolute;mso-position-vertical-relative:text;mso-width-percent:0;mso-height-percent:0;mso-width-relative:margin;mso-height-relative:margin;v-text-anchor:middle" o:gfxdata="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" fillcolor="#156082 [3204]" strokecolor="#030e13 [484]" strokeweight="1.5pt"/>
             </w:pict>
           </mc:Fallback>
         </mc:AlternateContent>
@@ -5486,7 +5486,7 @@
           </mc:Choice>
           <mc:Fallback>
             <w:pict>
-              <v:line w14:anchorId="2076E235" id="Straight Connector 25" o:spid="_x0000_s1026" style="position:absolute;z-index:251671040;visibility:visible;mso-wrap-style:square;mso-width-percent:0;mso-height-percent:0;mso-wrap-distance-left:9pt;mso-wrap-distance-top:0;mso-wrap-distance-right:9pt;mso-wrap-distance-bottom:0;mso-position-horizontal:absolute;mso-position-horizontal-relative:text;mso-position-vertical:absolute;mso-position-vertical-relative:text;mso-width-percent:0;mso-height-percent:0;mso-width-relative:margin;mso-height-relative:margin" from="229.5pt,4.25pt" to="230pt,35.25pt" o:gfxdata="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" strokecolor="#156082 [3204]" strokeweight="1.5pt">
+              <v:line w14:anchorId="6CCCF558" id="Straight Connector 25" o:spid="_x0000_s1026" style="position:absolute;z-index:251671040;visibility:visible;mso-wrap-style:square;mso-width-percent:0;mso-height-percent:0;mso-wrap-distance-left:9pt;mso-wrap-distance-top:0;mso-wrap-distance-right:9pt;mso-wrap-distance-bottom:0;mso-position-horizontal:absolute;mso-position-horizontal-relative:text;mso-position-vertical:absolute;mso-position-vertical-relative:text;mso-width-percent:0;mso-height-percent:0;mso-width-relative:margin;mso-height-relative:margin" from="229.5pt,4.25pt" to="230pt,35.25pt" o:gfxdata="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" strokecolor="#156082 [3204]" strokeweight="1.5pt">
                 <v:stroke joinstyle="miter"/>
               </v:line>
             </w:pict>
@@ -5564,7 +5564,7 @@
           </mc:Choice>
           <mc:Fallback>
             <w:pict>
-              <v:oval w14:anchorId="7114F5A8" id="Oval 26" o:spid="_x0000_s1026" style="position:absolute;margin-left:176.5pt;margin-top:10.1pt;width:106.5pt;height:37.5pt;z-index:251665408;visibility:visible;mso-wrap-style:square;mso-width-percent:0;mso-wrap-distance-left:9pt;mso-wrap-distance-top:0;mso-wrap-distance-right:9pt;mso-wrap-distance-bottom:0;mso-position-horizontal:absolute;mso-position-horizontal-relative:text;mso-position-vertical:absolute;mso-position-vertical-relative:text;mso-width-percent:0;mso-width-relative:margin;v-text-anchor:middle" o:gfxdata="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" fillcolor="#156082 [3204]" strokecolor="#030e13 [484]" strokeweight="1.5pt">
+              <v:oval w14:anchorId="0AE7492B" id="Oval 26" o:spid="_x0000_s1026" style="position:absolute;margin-left:176.5pt;margin-top:10.1pt;width:106.5pt;height:37.5pt;z-index:251665408;visibility:visible;mso-wrap-style:square;mso-width-percent:0;mso-wrap-distance-left:9pt;mso-wrap-distance-top:0;mso-wrap-distance-right:9pt;mso-wrap-distance-bottom:0;mso-position-horizontal:absolute;mso-position-horizontal-relative:text;mso-position-vertical:absolute;mso-position-vertical-relative:text;mso-width-percent:0;mso-width-relative:margin;v-text-anchor:middle" o:gfxdata="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" fillcolor="#156082 [3204]" strokecolor="#030e13 [484]" strokeweight="1.5pt">
                 <v:stroke joinstyle="miter"/>
               </v:oval>
             </w:pict>
@@ -5856,7 +5856,7 @@
           </mc:Choice>
           <mc:Fallback>
             <w:pict>
-              <v:oval w14:anchorId="1A09C3C4" id="Oval 28" o:spid="_x0000_s1026" style="position:absolute;margin-left:177.5pt;margin-top:4.85pt;width:103.5pt;height:37.5pt;z-index:251672064;visibility:visible;mso-wrap-style:square;mso-width-percent:0;mso-wrap-distance-left:9pt;mso-wrap-distance-top:0;mso-wrap-distance-right:9pt;mso-wrap-distance-bottom:0;mso-position-horizontal:absolute;mso-position-horizontal-relative:text;mso-position-vertical:absolute;mso-position-vertical-relative:text;mso-width-percent:0;mso-width-relative:margin;v-text-anchor:middle" o:gfxdata="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" fillcolor="#156082 [3204]" strokecolor="#030e13 [484]" strokeweight="1.5pt">
+              <v:oval w14:anchorId="0C74F1AF" id="Oval 28" o:spid="_x0000_s1026" style="position:absolute;margin-left:177.5pt;margin-top:4.85pt;width:103.5pt;height:37.5pt;z-index:251672064;visibility:visible;mso-wrap-style:square;mso-width-percent:0;mso-wrap-distance-left:9pt;mso-wrap-distance-top:0;mso-wrap-distance-right:9pt;mso-wrap-distance-bottom:0;mso-position-horizontal:absolute;mso-position-horizontal-relative:text;mso-position-vertical:absolute;mso-position-vertical-relative:text;mso-width-percent:0;mso-width-relative:margin;v-text-anchor:middle" o:gfxdata="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" fillcolor="#156082 [3204]" strokecolor="#030e13 [484]" strokeweight="1.5pt">
                 <v:stroke joinstyle="miter"/>
               </v:oval>
             </w:pict>
@@ -5932,7 +5932,7 @@
           </mc:Choice>
           <mc:Fallback>
             <w:pict>
-              <v:line w14:anchorId="35F7FCD5" id="Straight Connector 30" o:spid="_x0000_s1026" style="position:absolute;z-index:251674112;visibility:visible;mso-wrap-style:square;mso-wrap-distance-left:9pt;mso-wrap-distance-top:0;mso-wrap-distance-right:9pt;mso-wrap-distance-bottom:0;mso-position-horizontal:absolute;mso-position-horizontal-relative:text;mso-position-vertical:absolute;mso-position-vertical-relative:text" from="228.5pt,19.2pt" to="229pt,41.7pt" o:gfxdata="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" strokecolor="#156082 [3204]" strokeweight="1.5pt">
+              <v:line w14:anchorId="7C064A79" id="Straight Connector 30" o:spid="_x0000_s1026" style="position:absolute;z-index:251674112;visibility:visible;mso-wrap-style:square;mso-wrap-distance-left:9pt;mso-wrap-distance-top:0;mso-wrap-distance-right:9pt;mso-wrap-distance-bottom:0;mso-position-horizontal:absolute;mso-position-horizontal-relative:text;mso-position-vertical:absolute;mso-position-vertical-relative:text" from="228.5pt,19.2pt" to="229pt,41.7pt" o:gfxdata="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" strokecolor="#156082 [3204]" strokeweight="1.5pt">
                 <v:stroke joinstyle="miter"/>
               </v:line>
             </w:pict>
@@ -6021,7 +6021,7 @@
           </mc:Choice>
           <mc:Fallback>
             <w:pict>
-              <v:rect w14:anchorId="640BD66F" id="Rectangle 31" o:spid="_x0000_s1026" style="position:absolute;margin-left:142.5pt;margin-top:18.55pt;width:173pt;height:32.5pt;z-index:251675136;visibility:visible;mso-wrap-style:square;mso-width-percent:0;mso-height-percent:0;mso-wrap-distance-left:9pt;mso-wrap-distance-top:0;mso-wrap-distance-right:9pt;mso-wrap-distance-bottom:0;mso-position-horizontal:absolute;mso-position-horizontal-relative:text;mso-position-vertical:absolute;mso-position-vertical-relative:text;mso-width-percent:0;mso-height-percent:0;mso-width-relative:margin;mso-height-relative:margin;v-text-anchor:middle" o:gfxdata="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" fillcolor="#156082 [3204]" strokecolor="#030e13 [484]" strokeweight="1.5pt"/>
+              <v:rect w14:anchorId="70C63BD1" id="Rectangle 31" o:spid="_x0000_s1026" style="position:absolute;margin-left:142.5pt;margin-top:18.55pt;width:173pt;height:32.5pt;z-index:251675136;visibility:visible;mso-wrap-style:square;mso-width-percent:0;mso-height-percent:0;mso-wrap-distance-left:9pt;mso-wrap-distance-top:0;mso-wrap-distance-right:9pt;mso-wrap-distance-bottom:0;mso-position-horizontal:absolute;mso-position-horizontal-relative:text;mso-position-vertical:absolute;mso-position-vertical-relative:text;mso-width-percent:0;mso-height-percent:0;mso-width-relative:margin;mso-height-relative:margin;v-text-anchor:middle" o:gfxdata="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" fillcolor="#156082 [3204]" strokecolor="#030e13 [484]" strokeweight="1.5pt"/>
             </w:pict>
           </mc:Fallback>
         </mc:AlternateContent>
@@ -6180,7 +6180,7 @@
           </mc:Choice>
           <mc:Fallback>
             <w:pict>
-              <v:line w14:anchorId="626644C9" id="Straight Connector 34" o:spid="_x0000_s1026" style="position:absolute;z-index:251677184;visibility:visible;mso-wrap-style:square;mso-width-percent:0;mso-height-percent:0;mso-wrap-distance-left:9pt;mso-wrap-distance-top:0;mso-wrap-distance-right:9pt;mso-wrap-distance-bottom:0;mso-position-horizontal:absolute;mso-position-horizontal-relative:text;mso-position-vertical:absolute;mso-position-vertical-relative:text;mso-width-percent:0;mso-height-percent:0;mso-width-relative:margin;mso-height-relative:margin" from="229pt,5.25pt" to="230pt,35.75pt" o:gfxdata="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" strokecolor="#156082 [3204]" strokeweight="1.5pt">
+              <v:line w14:anchorId="6E95489C" id="Straight Connector 34" o:spid="_x0000_s1026" style="position:absolute;z-index:251677184;visibility:visible;mso-wrap-style:square;mso-width-percent:0;mso-height-percent:0;mso-wrap-distance-left:9pt;mso-wrap-distance-top:0;mso-wrap-distance-right:9pt;mso-wrap-distance-bottom:0;mso-position-horizontal:absolute;mso-position-horizontal-relative:text;mso-position-vertical:absolute;mso-position-vertical-relative:text;mso-width-percent:0;mso-height-percent:0;mso-width-relative:margin;mso-height-relative:margin" from="229pt,5.25pt" to="230pt,35.75pt" o:gfxdata="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" strokecolor="#156082 [3204]" strokeweight="1.5pt">
                 <v:stroke joinstyle="miter"/>
               </v:line>
             </w:pict>
@@ -6261,7 +6261,7 @@
           </mc:Choice>
           <mc:Fallback>
             <w:pict>
-              <v:shape w14:anchorId="1CDF0F1C" id="Diamond 35" o:spid="_x0000_s1026" type="#_x0000_t4" style="position:absolute;margin-left:125pt;margin-top:10.1pt;width:211pt;height:60pt;z-index:251678208;visibility:visible;mso-wrap-style:square;mso-width-percent:0;mso-height-percent:0;mso-wrap-distance-left:9pt;mso-wrap-distance-top:0;mso-wrap-distance-right:9pt;mso-wrap-distance-bottom:0;mso-position-horizontal:absolute;mso-position-horizontal-relative:text;mso-position-vertical:absolute;mso-position-vertical-relative:text;mso-width-percent:0;mso-height-percent:0;mso-width-relative:margin;mso-height-relative:margin;v-text-anchor:middle" o:gfxdata="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" fillcolor="#156082 [3204]" strokecolor="#030e13 [484]" strokeweight="1.5pt"/>
+              <v:shape w14:anchorId="42DD3BCC" id="Diamond 35" o:spid="_x0000_s1026" type="#_x0000_t4" style="position:absolute;margin-left:125pt;margin-top:10.1pt;width:211pt;height:60pt;z-index:251678208;visibility:visible;mso-wrap-style:square;mso-width-percent:0;mso-height-percent:0;mso-wrap-distance-left:9pt;mso-wrap-distance-top:0;mso-wrap-distance-right:9pt;mso-wrap-distance-bottom:0;mso-position-horizontal:absolute;mso-position-horizontal-relative:text;mso-position-vertical:absolute;mso-position-vertical-relative:text;mso-width-percent:0;mso-height-percent:0;mso-width-relative:margin;mso-height-relative:margin;v-text-anchor:middle" o:gfxdata="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" fillcolor="#156082 [3204]" strokecolor="#030e13 [484]" strokeweight="1.5pt"/>
             </w:pict>
           </mc:Fallback>
         </mc:AlternateContent>
@@ -6425,7 +6425,7 @@
           </mc:Choice>
           <mc:Fallback>
             <w:pict>
-              <v:line w14:anchorId="3F79B0AB" id="Straight Connector 40" o:spid="_x0000_s1026" style="position:absolute;z-index:251680256;visibility:visible;mso-wrap-style:square;mso-wrap-distance-left:9pt;mso-wrap-distance-top:0;mso-wrap-distance-right:9pt;mso-wrap-distance-bottom:0;mso-position-horizontal:absolute;mso-position-horizontal-relative:text;mso-position-vertical:absolute;mso-position-vertical-relative:text" from="230pt,1.15pt" to="230.5pt,25.65pt" o:gfxdata="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" strokecolor="#156082 [3204]" strokeweight="1.5pt">
+              <v:line w14:anchorId="414CE575" id="Straight Connector 40" o:spid="_x0000_s1026" style="position:absolute;z-index:251680256;visibility:visible;mso-wrap-style:square;mso-wrap-distance-left:9pt;mso-wrap-distance-top:0;mso-wrap-distance-right:9pt;mso-wrap-distance-bottom:0;mso-position-horizontal:absolute;mso-position-horizontal-relative:text;mso-position-vertical:absolute;mso-position-vertical-relative:text" from="230pt,1.15pt" to="230.5pt,25.65pt" o:gfxdata="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" strokecolor="#156082 [3204]" strokeweight="1.5pt">
                 <v:stroke joinstyle="miter"/>
               </v:line>
             </w:pict>
@@ -6591,7 +6591,7 @@
           </mc:Choice>
           <mc:Fallback>
             <w:pict>
-              <v:rect w14:anchorId="58CAEE9D" id="Rectangle 41" o:spid="_x0000_s1026" style="position:absolute;margin-left:156pt;margin-top:3.5pt;width:151pt;height:32.5pt;z-index:251681280;visibility:visible;mso-wrap-style:square;mso-width-percent:0;mso-height-percent:0;mso-wrap-distance-left:9pt;mso-wrap-distance-top:0;mso-wrap-distance-right:9pt;mso-wrap-distance-bottom:0;mso-position-horizontal:absolute;mso-position-horizontal-relative:text;mso-position-vertical:absolute;mso-position-vertical-relative:text;mso-width-percent:0;mso-height-percent:0;mso-width-relative:margin;mso-height-relative:margin;v-text-anchor:middle" o:gfxdata="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" fillcolor="#156082 [3204]" strokecolor="#030e13 [484]" strokeweight="1.5pt"/>
+              <v:rect w14:anchorId="63B53A19" id="Rectangle 41" o:spid="_x0000_s1026" style="position:absolute;margin-left:156pt;margin-top:3.5pt;width:151pt;height:32.5pt;z-index:251681280;visibility:visible;mso-wrap-style:square;mso-width-percent:0;mso-height-percent:0;mso-wrap-distance-left:9pt;mso-wrap-distance-top:0;mso-wrap-distance-right:9pt;mso-wrap-distance-bottom:0;mso-position-horizontal:absolute;mso-position-horizontal-relative:text;mso-position-vertical:absolute;mso-position-vertical-relative:text;mso-width-percent:0;mso-height-percent:0;mso-width-relative:margin;mso-height-relative:margin;v-text-anchor:middle" o:gfxdata="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" fillcolor="#156082 [3204]" strokecolor="#030e13 [484]" strokeweight="1.5pt"/>
             </w:pict>
           </mc:Fallback>
         </mc:AlternateContent>
@@ -6657,7 +6657,7 @@
           </mc:Choice>
           <mc:Fallback>
             <w:pict>
-              <v:line w14:anchorId="2BF7F615" id="Straight Connector 43" o:spid="_x0000_s1026" style="position:absolute;z-index:251683328;visibility:visible;mso-wrap-style:square;mso-wrap-distance-left:9pt;mso-wrap-distance-top:0;mso-wrap-distance-right:9pt;mso-wrap-distance-bottom:0;mso-position-horizontal:absolute;mso-position-horizontal-relative:text;mso-position-vertical:absolute;mso-position-vertical-relative:text" from="229.5pt,13.85pt" to="230pt,36.85pt" o:gfxdata="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" strokecolor="#156082 [3204]" strokeweight="1.5pt">
+              <v:line w14:anchorId="29CCB970" id="Straight Connector 43" o:spid="_x0000_s1026" style="position:absolute;z-index:251683328;visibility:visible;mso-wrap-style:square;mso-wrap-distance-left:9pt;mso-wrap-distance-top:0;mso-wrap-distance-right:9pt;mso-wrap-distance-bottom:0;mso-position-horizontal:absolute;mso-position-horizontal-relative:text;mso-position-vertical:absolute;mso-position-vertical-relative:text" from="229.5pt,13.85pt" to="230pt,36.85pt" o:gfxdata="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" strokecolor="#156082 [3204]" strokeweight="1.5pt">
                 <v:stroke joinstyle="miter"/>
               </v:line>
             </w:pict>
@@ -6738,7 +6738,7 @@
           </mc:Choice>
           <mc:Fallback>
             <w:pict>
-              <v:rect w14:anchorId="3BD24945" id="Rectangle 44" o:spid="_x0000_s1026" style="position:absolute;margin-left:157.5pt;margin-top:14.7pt;width:154pt;height:31.5pt;z-index:251684352;visibility:visible;mso-wrap-style:square;mso-width-percent:0;mso-height-percent:0;mso-wrap-distance-left:9pt;mso-wrap-distance-top:0;mso-wrap-distance-right:9pt;mso-wrap-distance-bottom:0;mso-position-horizontal:absolute;mso-position-horizontal-relative:text;mso-position-vertical:absolute;mso-position-vertical-relative:text;mso-width-percent:0;mso-height-percent:0;mso-width-relative:margin;mso-height-relative:margin;v-text-anchor:middle" o:gfxdata="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" fillcolor="#156082 [3204]" strokecolor="#030e13 [484]" strokeweight="1.5pt"/>
+              <v:rect w14:anchorId="3E42CC5B" id="Rectangle 44" o:spid="_x0000_s1026" style="position:absolute;margin-left:157.5pt;margin-top:14.7pt;width:154pt;height:31.5pt;z-index:251684352;visibility:visible;mso-wrap-style:square;mso-width-percent:0;mso-height-percent:0;mso-wrap-distance-left:9pt;mso-wrap-distance-top:0;mso-wrap-distance-right:9pt;mso-wrap-distance-bottom:0;mso-position-horizontal:absolute;mso-position-horizontal-relative:text;mso-position-vertical:absolute;mso-position-vertical-relative:text;mso-width-percent:0;mso-height-percent:0;mso-width-relative:margin;mso-height-relative:margin;v-text-anchor:middle" o:gfxdata="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" fillcolor="#156082 [3204]" strokecolor="#030e13 [484]" strokeweight="1.5pt"/>
             </w:pict>
           </mc:Fallback>
         </mc:AlternateContent>
@@ -6912,7 +6912,7 @@
           </mc:Choice>
           <mc:Fallback>
             <w:pict>
-              <v:line w14:anchorId="4F37C858" id="Straight Connector 46" o:spid="_x0000_s1026" style="position:absolute;z-index:251686400;visibility:visible;mso-wrap-style:square;mso-wrap-distance-left:9pt;mso-wrap-distance-top:0;mso-wrap-distance-right:9pt;mso-wrap-distance-bottom:0;mso-position-horizontal:absolute;mso-position-horizontal-relative:text;mso-position-vertical:absolute;mso-position-vertical-relative:text" from="230.5pt,1.4pt" to="231pt,30.4pt" o:gfxdata="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" strokecolor="#156082 [3204]" strokeweight="1.5pt">
+              <v:line w14:anchorId="7E54D2B0" id="Straight Connector 46" o:spid="_x0000_s1026" style="position:absolute;z-index:251686400;visibility:visible;mso-wrap-style:square;mso-wrap-distance-left:9pt;mso-wrap-distance-top:0;mso-wrap-distance-right:9pt;mso-wrap-distance-bottom:0;mso-position-horizontal:absolute;mso-position-horizontal-relative:text;mso-position-vertical:absolute;mso-position-vertical-relative:text" from="230.5pt,1.4pt" to="231pt,30.4pt" o:gfxdata="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" strokecolor="#156082 [3204]" strokeweight="1.5pt">
                 <v:stroke joinstyle="miter"/>
               </v:line>
             </w:pict>
@@ -6990,7 +6990,7 @@
           </mc:Choice>
           <mc:Fallback>
             <w:pict>
-              <v:oval w14:anchorId="44312FF6" id="Oval 47" o:spid="_x0000_s1026" style="position:absolute;margin-left:175.5pt;margin-top:6.25pt;width:111.5pt;height:40.5pt;z-index:251687424;visibility:visible;mso-wrap-style:square;mso-width-percent:0;mso-wrap-distance-left:9pt;mso-wrap-distance-top:0;mso-wrap-distance-right:9pt;mso-wrap-distance-bottom:0;mso-position-horizontal:absolute;mso-position-horizontal-relative:text;mso-position-vertical:absolute;mso-position-vertical-relative:text;mso-width-percent:0;mso-width-relative:margin;v-text-anchor:middle" o:gfxdata="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" fillcolor="#156082 [3204]" strokecolor="#030e13 [484]" strokeweight="1.5pt">
+              <v:oval w14:anchorId="16A82072" id="Oval 47" o:spid="_x0000_s1026" style="position:absolute;margin-left:175.5pt;margin-top:6.25pt;width:111.5pt;height:40.5pt;z-index:251687424;visibility:visible;mso-wrap-style:square;mso-width-percent:0;mso-wrap-distance-left:9pt;mso-wrap-distance-top:0;mso-wrap-distance-right:9pt;mso-wrap-distance-bottom:0;mso-position-horizontal:absolute;mso-position-horizontal-relative:text;mso-position-vertical:absolute;mso-position-vertical-relative:text;mso-width-percent:0;mso-width-relative:margin;v-text-anchor:middle" o:gfxdata="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" fillcolor="#156082 [3204]" strokecolor="#030e13 [484]" strokeweight="1.5pt">
                 <v:stroke joinstyle="miter"/>
               </v:oval>
             </w:pict>
@@ -7278,7 +7278,7 @@
           </mc:Choice>
           <mc:Fallback>
             <w:pict>
-              <v:oval w14:anchorId="7F0BBF8A" id="Oval 49" o:spid="_x0000_s1026" style="position:absolute;margin-left:183.5pt;margin-top:1.55pt;width:87.5pt;height:41.5pt;z-index:251689472;visibility:visible;mso-wrap-style:square;mso-width-percent:0;mso-wrap-distance-left:9pt;mso-wrap-distance-top:0;mso-wrap-distance-right:9pt;mso-wrap-distance-bottom:0;mso-position-horizontal:absolute;mso-position-horizontal-relative:text;mso-position-vertical:absolute;mso-position-vertical-relative:text;mso-width-percent:0;mso-width-relative:margin;v-text-anchor:middle" o:gfxdata="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" fillcolor="#156082 [3204]" strokecolor="#030e13 [484]" strokeweight="1.5pt">
+              <v:oval w14:anchorId="6DF655B0" id="Oval 49" o:spid="_x0000_s1026" style="position:absolute;margin-left:183.5pt;margin-top:1.55pt;width:87.5pt;height:41.5pt;z-index:251689472;visibility:visible;mso-wrap-style:square;mso-width-percent:0;mso-wrap-distance-left:9pt;mso-wrap-distance-top:0;mso-wrap-distance-right:9pt;mso-wrap-distance-bottom:0;mso-position-horizontal:absolute;mso-position-horizontal-relative:text;mso-position-vertical:absolute;mso-position-vertical-relative:text;mso-width-percent:0;mso-width-relative:margin;v-text-anchor:middle" o:gfxdata="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" fillcolor="#156082 [3204]" strokecolor="#030e13 [484]" strokeweight="1.5pt">
                 <v:stroke joinstyle="miter"/>
               </v:oval>
             </w:pict>
@@ -7346,7 +7346,7 @@
           </mc:Choice>
           <mc:Fallback>
             <w:pict>
-              <v:line w14:anchorId="1B7CCB12" id="Straight Connector 51" o:spid="_x0000_s1026" style="position:absolute;z-index:251691520;visibility:visible;mso-wrap-style:square;mso-wrap-distance-left:9pt;mso-wrap-distance-top:0;mso-wrap-distance-right:9pt;mso-wrap-distance-bottom:0;mso-position-horizontal:absolute;mso-position-horizontal-relative:text;mso-position-vertical:absolute;mso-position-vertical-relative:text" from="227pt,20.9pt" to="227.5pt,40.9pt" o:gfxdata="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" strokecolor="#156082 [3204]" strokeweight="1.5pt">
+              <v:line w14:anchorId="476E8B96" id="Straight Connector 51" o:spid="_x0000_s1026" style="position:absolute;z-index:251691520;visibility:visible;mso-wrap-style:square;mso-wrap-distance-left:9pt;mso-wrap-distance-top:0;mso-wrap-distance-right:9pt;mso-wrap-distance-bottom:0;mso-position-horizontal:absolute;mso-position-horizontal-relative:text;mso-position-vertical:absolute;mso-position-vertical-relative:text" from="227pt,20.9pt" to="227.5pt,40.9pt" o:gfxdata="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" strokecolor="#156082 [3204]" strokeweight="1.5pt">
                 <v:stroke joinstyle="miter"/>
               </v:line>
             </w:pict>
@@ -7427,7 +7427,7 @@
           </mc:Choice>
           <mc:Fallback>
             <w:pict>
-              <v:shape w14:anchorId="44A2A991" id="Diamond 52" o:spid="_x0000_s1026" type="#_x0000_t4" style="position:absolute;margin-left:133.5pt;margin-top:17.75pt;width:190.5pt;height:51.5pt;z-index:251692544;visibility:visible;mso-wrap-style:square;mso-width-percent:0;mso-height-percent:0;mso-wrap-distance-left:9pt;mso-wrap-distance-top:0;mso-wrap-distance-right:9pt;mso-wrap-distance-bottom:0;mso-position-horizontal:absolute;mso-position-horizontal-relative:text;mso-position-vertical:absolute;mso-position-vertical-relative:text;mso-width-percent:0;mso-height-percent:0;mso-width-relative:margin;mso-height-relative:margin;v-text-anchor:middle" o:gfxdata="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" fillcolor="#156082 [3204]" strokecolor="#030e13 [484]" strokeweight="1.5pt"/>
+              <v:shape w14:anchorId="0A3AAB0D" id="Diamond 52" o:spid="_x0000_s1026" type="#_x0000_t4" style="position:absolute;margin-left:133.5pt;margin-top:17.75pt;width:190.5pt;height:51.5pt;z-index:251692544;visibility:visible;mso-wrap-style:square;mso-width-percent:0;mso-height-percent:0;mso-wrap-distance-left:9pt;mso-wrap-distance-top:0;mso-wrap-distance-right:9pt;mso-wrap-distance-bottom:0;mso-position-horizontal:absolute;mso-position-horizontal-relative:text;mso-position-vertical:absolute;mso-position-vertical-relative:text;mso-width-percent:0;mso-height-percent:0;mso-width-relative:margin;mso-height-relative:margin;v-text-anchor:middle" o:gfxdata="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" fillcolor="#156082 [3204]" strokecolor="#030e13 [484]" strokeweight="1.5pt"/>
             </w:pict>
           </mc:Fallback>
         </mc:AlternateContent>
@@ -7547,7 +7547,7 @@
         <mc:AlternateContent>
           <mc:Choice Requires="wps">
             <w:drawing>
-              <wp:anchor distT="0" distB="0" distL="114300" distR="114300" simplePos="0" relativeHeight="251694592" behindDoc="0" locked="0" layoutInCell="1" allowOverlap="1" wp14:anchorId="71F176C2" wp14:editId="02D82BC2">
+              <wp:anchor distT="0" distB="0" distL="114300" distR="114300" simplePos="0" relativeHeight="251694592" behindDoc="0" locked="0" layoutInCell="1" allowOverlap="1" wp14:anchorId="71F176C2" wp14:editId="49064CE7">
                 <wp:simplePos x="0" y="0"/>
                 <wp:positionH relativeFrom="column">
                   <wp:posOffset>2895600</wp:posOffset>
@@ -7555,8 +7555,8 @@
                 <wp:positionV relativeFrom="paragraph">
                   <wp:posOffset>105410</wp:posOffset>
                 </wp:positionV>
-                <wp:extent cx="6350" cy="355600"/>
-                <wp:effectExtent l="0" t="0" r="31750" b="25400"/>
+                <wp:extent cx="6350" cy="273050"/>
+                <wp:effectExtent l="0" t="0" r="31750" b="31750"/>
                 <wp:wrapNone/>
                 <wp:docPr id="1136757613" name="Straight Connector 54"/>
                 <wp:cNvGraphicFramePr/>
@@ -7567,7 +7567,7 @@
                       <wps:spPr>
                         <a:xfrm>
                           <a:off x="0" y="0"/>
-                          <a:ext cx="6350" cy="355600"/>
+                          <a:ext cx="6350" cy="273050"/>
                         </a:xfrm>
                         <a:prstGeom prst="line">
                           <a:avLst/>
@@ -7591,12 +7591,18 @@
                     </wps:wsp>
                   </a:graphicData>
                 </a:graphic>
+                <wp14:sizeRelH relativeFrom="margin">
+                  <wp14:pctWidth>0</wp14:pctWidth>
+                </wp14:sizeRelH>
+                <wp14:sizeRelV relativeFrom="margin">
+                  <wp14:pctHeight>0</wp14:pctHeight>
+                </wp14:sizeRelV>
               </wp:anchor>
             </w:drawing>
           </mc:Choice>
           <mc:Fallback>
             <w:pict>
-              <v:line w14:anchorId="3238D835" id="Straight Connector 54" o:spid="_x0000_s1026" style="position:absolute;z-index:251694592;visibility:visible;mso-wrap-style:square;mso-wrap-distance-left:9pt;mso-wrap-distance-top:0;mso-wrap-distance-right:9pt;mso-wrap-distance-bottom:0;mso-position-horizontal:absolute;mso-position-horizontal-relative:text;mso-position-vertical:absolute;mso-position-vertical-relative:text" from="228pt,8.3pt" to="228.5pt,36.3pt" o:gfxdata="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" strokecolor="#156082 [3204]" strokeweight="1.5pt">
+              <v:line w14:anchorId="50B87054" id="Straight Connector 54" o:spid="_x0000_s1026" style="position:absolute;z-index:251694592;visibility:visible;mso-wrap-style:square;mso-width-percent:0;mso-height-percent:0;mso-wrap-distance-left:9pt;mso-wrap-distance-top:0;mso-wrap-distance-right:9pt;mso-wrap-distance-bottom:0;mso-position-horizontal:absolute;mso-position-horizontal-relative:text;mso-position-vertical:absolute;mso-position-vertical-relative:text;mso-width-percent:0;mso-height-percent:0;mso-width-relative:margin;mso-height-relative:margin" from="228pt,8.3pt" to="228.5pt,29.8pt" o:gfxdata="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" strokecolor="#156082 [3204]" strokeweight="1.5pt">
                 <v:stroke joinstyle="miter"/>
               </v:line>
             </w:pict>
@@ -7615,16 +7621,16 @@
         <mc:AlternateContent>
           <mc:Choice Requires="wps">
             <w:drawing>
-              <wp:anchor distT="0" distB="0" distL="114300" distR="114300" simplePos="0" relativeHeight="251695616" behindDoc="0" locked="0" layoutInCell="1" allowOverlap="1" wp14:anchorId="4D31962E" wp14:editId="52413180">
+              <wp:anchor distT="0" distB="0" distL="114300" distR="114300" simplePos="0" relativeHeight="251695616" behindDoc="0" locked="0" layoutInCell="1" allowOverlap="1" wp14:anchorId="4D31962E" wp14:editId="3AAB4FA5">
                 <wp:simplePos x="0" y="0"/>
                 <wp:positionH relativeFrom="column">
                   <wp:posOffset>2139950</wp:posOffset>
                 </wp:positionH>
                 <wp:positionV relativeFrom="paragraph">
-                  <wp:posOffset>179705</wp:posOffset>
+                  <wp:posOffset>97155</wp:posOffset>
                 </wp:positionV>
-                <wp:extent cx="1549400" cy="438150"/>
-                <wp:effectExtent l="0" t="0" r="12700" b="19050"/>
+                <wp:extent cx="1549400" cy="425450"/>
+                <wp:effectExtent l="0" t="0" r="12700" b="12700"/>
                 <wp:wrapNone/>
                 <wp:docPr id="2097733511" name="Rectangle 55"/>
                 <wp:cNvGraphicFramePr/>
@@ -7635,7 +7641,7 @@
                       <wps:spPr>
                         <a:xfrm>
                           <a:off x="0" y="0"/>
-                          <a:ext cx="1549400" cy="438150"/>
+                          <a:ext cx="1549400" cy="425450"/>
                         </a:xfrm>
                         <a:prstGeom prst="rect">
                           <a:avLst/>
@@ -7677,7 +7683,7 @@
           </mc:Choice>
           <mc:Fallback>
             <w:pict>
-              <v:rect w14:anchorId="369803B2" id="Rectangle 55" o:spid="_x0000_s1026" style="position:absolute;margin-left:168.5pt;margin-top:14.15pt;width:122pt;height:34.5pt;z-index:251695616;visibility:visible;mso-wrap-style:square;mso-width-percent:0;mso-height-percent:0;mso-wrap-distance-left:9pt;mso-wrap-distance-top:0;mso-wrap-distance-right:9pt;mso-wrap-distance-bottom:0;mso-position-horizontal:absolute;mso-position-horizontal-relative:text;mso-position-vertical:absolute;mso-position-vertical-relative:text;mso-width-percent:0;mso-height-percent:0;mso-width-relative:margin;mso-height-relative:margin;v-text-anchor:middle" o:gfxdata="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" fillcolor="#156082 [3204]" strokecolor="#030e13 [484]" strokeweight="1.5pt"/>
+              <v:rect w14:anchorId="0A1D2CAF" id="Rectangle 55" o:spid="_x0000_s1026" style="position:absolute;margin-left:168.5pt;margin-top:7.65pt;width:122pt;height:33.5pt;z-index:251695616;visibility:visible;mso-wrap-style:square;mso-width-percent:0;mso-height-percent:0;mso-wrap-distance-left:9pt;mso-wrap-distance-top:0;mso-wrap-distance-right:9pt;mso-wrap-distance-bottom:0;mso-position-horizontal:absolute;mso-position-horizontal-relative:text;mso-position-vertical:absolute;mso-position-vertical-relative:text;mso-width-percent:0;mso-height-percent:0;mso-width-relative:margin;mso-height-relative:margin;v-text-anchor:middle" o:gfxdata="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" fillcolor="#156082 [3204]" strokecolor="#030e13 [484]" strokeweight="1.5pt"/>
             </w:pict>
           </mc:Fallback>
         </mc:AlternateContent>
@@ -7689,16 +7695,16 @@
         <mc:AlternateContent>
           <mc:Choice Requires="wps">
             <w:drawing>
-              <wp:anchor distT="0" distB="0" distL="114300" distR="114300" simplePos="0" relativeHeight="251696640" behindDoc="0" locked="0" layoutInCell="1" allowOverlap="1" wp14:anchorId="0A116C71" wp14:editId="3A6011C7">
+              <wp:anchor distT="0" distB="0" distL="114300" distR="114300" simplePos="0" relativeHeight="251696640" behindDoc="0" locked="0" layoutInCell="1" allowOverlap="1" wp14:anchorId="0A116C71" wp14:editId="31526F08">
                 <wp:simplePos x="0" y="0"/>
                 <wp:positionH relativeFrom="column">
                   <wp:posOffset>2362200</wp:posOffset>
                 </wp:positionH>
                 <wp:positionV relativeFrom="paragraph">
-                  <wp:posOffset>249555</wp:posOffset>
+                  <wp:posOffset>186055</wp:posOffset>
                 </wp:positionV>
-                <wp:extent cx="1143000" cy="279400"/>
-                <wp:effectExtent l="0" t="0" r="19050" b="25400"/>
+                <wp:extent cx="1143000" cy="266700"/>
+                <wp:effectExtent l="0" t="0" r="19050" b="19050"/>
                 <wp:wrapNone/>
                 <wp:docPr id="674413529" name="Text Box 56"/>
                 <wp:cNvGraphicFramePr/>
@@ -7709,7 +7715,7 @@
                       <wps:spPr>
                         <a:xfrm>
                           <a:off x="0" y="0"/>
-                          <a:ext cx="1143000" cy="279400"/>
+                          <a:ext cx="1143000" cy="266700"/>
                         </a:xfrm>
                         <a:prstGeom prst="rect">
                           <a:avLst/>
@@ -7744,12 +7750,15 @@
                 <wp14:sizeRelH relativeFrom="margin">
                   <wp14:pctWidth>0</wp14:pctWidth>
                 </wp14:sizeRelH>
+                <wp14:sizeRelV relativeFrom="margin">
+                  <wp14:pctHeight>0</wp14:pctHeight>
+                </wp14:sizeRelV>
               </wp:anchor>
             </w:drawing>
           </mc:Choice>
           <mc:Fallback>
             <w:pict>
-              <v:shape w14:anchorId="0A116C71" id="Text Box 56" o:spid="_x0000_s1042" type="#_x0000_t202" style="position:absolute;margin-left:186pt;margin-top:19.65pt;width:90pt;height:22pt;z-index:251696640;visibility:visible;mso-wrap-style:square;mso-width-percent:0;mso-wrap-distance-left:9pt;mso-wrap-distance-top:0;mso-wrap-distance-right:9pt;mso-wrap-distance-bottom:0;mso-position-horizontal:absolute;mso-position-horizontal-relative:text;mso-position-vertical:absolute;mso-position-vertical-relative:text;mso-width-percent:0;mso-width-relative:margin;v-text-anchor:top" o:gfxdata="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" fillcolor="white [3201]" strokeweight=".5pt">
+              <v:shape w14:anchorId="0A116C71" id="Text Box 56" o:spid="_x0000_s1042" type="#_x0000_t202" style="position:absolute;margin-left:186pt;margin-top:14.65pt;width:90pt;height:21pt;z-index:251696640;visibility:visible;mso-wrap-style:square;mso-width-percent:0;mso-height-percent:0;mso-wrap-distance-left:9pt;mso-wrap-distance-top:0;mso-wrap-distance-right:9pt;mso-wrap-distance-bottom:0;mso-position-horizontal:absolute;mso-position-horizontal-relative:text;mso-position-vertical:absolute;mso-position-vertical-relative:text;mso-width-percent:0;mso-height-percent:0;mso-width-relative:margin;mso-height-relative:margin;v-text-anchor:top" o:gfxdata="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" fillcolor="white [3201]" strokeweight=".5pt">
                 <v:textbox>
                   <w:txbxContent>
                     <w:p>
@@ -7765,10 +7774,473 @@
         </mc:AlternateContent>
       </w:r>
     </w:p>
-    <w:p/>
-    <w:p/>
-    <w:p/>
-    <w:p/>
+    <w:p>
+      <w:r>
+        <w:rPr>
+          <w:noProof/>
+        </w:rPr>
+        <mc:AlternateContent>
+          <mc:Choice Requires="wps">
+            <w:drawing>
+              <wp:anchor distT="0" distB="0" distL="114300" distR="114300" simplePos="0" relativeHeight="251697664" behindDoc="0" locked="0" layoutInCell="1" allowOverlap="1" wp14:anchorId="2937308F" wp14:editId="617CCDE1">
+                <wp:simplePos x="0" y="0"/>
+                <wp:positionH relativeFrom="column">
+                  <wp:posOffset>2889250</wp:posOffset>
+                </wp:positionH>
+                <wp:positionV relativeFrom="paragraph">
+                  <wp:posOffset>247650</wp:posOffset>
+                </wp:positionV>
+                <wp:extent cx="0" cy="260350"/>
+                <wp:effectExtent l="0" t="0" r="38100" b="25400"/>
+                <wp:wrapNone/>
+                <wp:docPr id="329354591" name="Straight Connector 57"/>
+                <wp:cNvGraphicFramePr/>
+                <a:graphic xmlns:a="http://schemas.openxmlformats.org/drawingml/2006/main">
+                  <a:graphicData uri="http://schemas.microsoft.com/office/word/2010/wordprocessingShape">
+                    <wps:wsp>
+                      <wps:cNvCnPr/>
+                      <wps:spPr>
+                        <a:xfrm flipH="1">
+                          <a:off x="0" y="0"/>
+                          <a:ext cx="0" cy="260350"/>
+                        </a:xfrm>
+                        <a:prstGeom prst="line">
+                          <a:avLst/>
+                        </a:prstGeom>
+                      </wps:spPr>
+                      <wps:style>
+                        <a:lnRef idx="2">
+                          <a:schemeClr val="accent1"/>
+                        </a:lnRef>
+                        <a:fillRef idx="0">
+                          <a:schemeClr val="accent1"/>
+                        </a:fillRef>
+                        <a:effectRef idx="1">
+                          <a:schemeClr val="accent1"/>
+                        </a:effectRef>
+                        <a:fontRef idx="minor">
+                          <a:schemeClr val="tx1"/>
+                        </a:fontRef>
+                      </wps:style>
+                      <wps:bodyPr/>
+                    </wps:wsp>
+                  </a:graphicData>
+                </a:graphic>
+                <wp14:sizeRelH relativeFrom="margin">
+                  <wp14:pctWidth>0</wp14:pctWidth>
+                </wp14:sizeRelH>
+                <wp14:sizeRelV relativeFrom="margin">
+                  <wp14:pctHeight>0</wp14:pctHeight>
+                </wp14:sizeRelV>
+              </wp:anchor>
+            </w:drawing>
+          </mc:Choice>
+          <mc:Fallback>
+            <w:pict>
+              <v:line w14:anchorId="0F5F182E" id="Straight Connector 57" o:spid="_x0000_s1026" style="position:absolute;flip:x;z-index:251697664;visibility:visible;mso-wrap-style:square;mso-width-percent:0;mso-height-percent:0;mso-wrap-distance-left:9pt;mso-wrap-distance-top:0;mso-wrap-distance-right:9pt;mso-wrap-distance-bottom:0;mso-position-horizontal:absolute;mso-position-horizontal-relative:text;mso-position-vertical:absolute;mso-position-vertical-relative:text;mso-width-percent:0;mso-height-percent:0;mso-width-relative:margin;mso-height-relative:margin" from="227.5pt,19.5pt" to="227.5pt,40pt" o:gfxdata="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" strokecolor="#156082 [3204]" strokeweight="1.5pt">
+                <v:stroke joinstyle="miter"/>
+              </v:line>
+            </w:pict>
+          </mc:Fallback>
+        </mc:AlternateContent>
+      </w:r>
+    </w:p>
+    <w:p>
+      <w:r>
+        <w:rPr>
+          <w:noProof/>
+        </w:rPr>
+        <mc:AlternateContent>
+          <mc:Choice Requires="wps">
+            <w:drawing>
+              <wp:anchor distT="0" distB="0" distL="114300" distR="114300" simplePos="0" relativeHeight="251698688" behindDoc="0" locked="0" layoutInCell="1" allowOverlap="1" wp14:anchorId="3E10B3F4" wp14:editId="36D4C500">
+                <wp:simplePos x="0" y="0"/>
+                <wp:positionH relativeFrom="column">
+                  <wp:posOffset>1803400</wp:posOffset>
+                </wp:positionH>
+                <wp:positionV relativeFrom="paragraph">
+                  <wp:posOffset>171450</wp:posOffset>
+                </wp:positionV>
+                <wp:extent cx="2152650" cy="406400"/>
+                <wp:effectExtent l="0" t="0" r="19050" b="12700"/>
+                <wp:wrapNone/>
+                <wp:docPr id="368332931" name="Rectangle 58"/>
+                <wp:cNvGraphicFramePr/>
+                <a:graphic xmlns:a="http://schemas.openxmlformats.org/drawingml/2006/main">
+                  <a:graphicData uri="http://schemas.microsoft.com/office/word/2010/wordprocessingShape">
+                    <wps:wsp>
+                      <wps:cNvSpPr/>
+                      <wps:spPr>
+                        <a:xfrm>
+                          <a:off x="0" y="0"/>
+                          <a:ext cx="2152650" cy="406400"/>
+                        </a:xfrm>
+                        <a:prstGeom prst="rect">
+                          <a:avLst/>
+                        </a:prstGeom>
+                      </wps:spPr>
+                      <wps:style>
+                        <a:lnRef idx="2">
+                          <a:schemeClr val="accent1">
+                            <a:shade val="15000"/>
+                          </a:schemeClr>
+                        </a:lnRef>
+                        <a:fillRef idx="1">
+                          <a:schemeClr val="accent1"/>
+                        </a:fillRef>
+                        <a:effectRef idx="0">
+                          <a:schemeClr val="accent1"/>
+                        </a:effectRef>
+                        <a:fontRef idx="minor">
+                          <a:schemeClr val="lt1"/>
+                        </a:fontRef>
+                      </wps:style>
+                      <wps:bodyPr rot="0" spcFirstLastPara="0" vertOverflow="overflow" horzOverflow="overflow" vert="horz" wrap="square" lIns="91440" tIns="45720" rIns="91440" bIns="45720" numCol="1" spcCol="0" rtlCol="0" fromWordArt="0" anchor="ctr" anchorCtr="0" forceAA="0" compatLnSpc="1">
+                        <a:prstTxWarp prst="textNoShape">
+                          <a:avLst/>
+                        </a:prstTxWarp>
+                        <a:noAutofit/>
+                      </wps:bodyPr>
+                    </wps:wsp>
+                  </a:graphicData>
+                </a:graphic>
+                <wp14:sizeRelH relativeFrom="margin">
+                  <wp14:pctWidth>0</wp14:pctWidth>
+                </wp14:sizeRelH>
+                <wp14:sizeRelV relativeFrom="margin">
+                  <wp14:pctHeight>0</wp14:pctHeight>
+                </wp14:sizeRelV>
+              </wp:anchor>
+            </w:drawing>
+          </mc:Choice>
+          <mc:Fallback>
+            <w:pict>
+              <v:rect w14:anchorId="63837869" id="Rectangle 58" o:spid="_x0000_s1026" style="position:absolute;margin-left:142pt;margin-top:13.5pt;width:169.5pt;height:32pt;z-index:251698688;visibility:visible;mso-wrap-style:square;mso-width-percent:0;mso-height-percent:0;mso-wrap-distance-left:9pt;mso-wrap-distance-top:0;mso-wrap-distance-right:9pt;mso-wrap-distance-bottom:0;mso-position-horizontal:absolute;mso-position-horizontal-relative:text;mso-position-vertical:absolute;mso-position-vertical-relative:text;mso-width-percent:0;mso-height-percent:0;mso-width-relative:margin;mso-height-relative:margin;v-text-anchor:middle" o:gfxdata="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" fillcolor="#156082 [3204]" strokecolor="#030e13 [484]" strokeweight="1.5pt"/>
+            </w:pict>
+          </mc:Fallback>
+        </mc:AlternateContent>
+      </w:r>
+      <w:r>
+        <w:rPr>
+          <w:noProof/>
+        </w:rPr>
+        <mc:AlternateContent>
+          <mc:Choice Requires="wps">
+            <w:drawing>
+              <wp:anchor distT="0" distB="0" distL="114300" distR="114300" simplePos="0" relativeHeight="251699712" behindDoc="0" locked="0" layoutInCell="1" allowOverlap="1" wp14:anchorId="3F732D6F" wp14:editId="3DB8D5D3">
+                <wp:simplePos x="0" y="0"/>
+                <wp:positionH relativeFrom="column">
+                  <wp:posOffset>1962150</wp:posOffset>
+                </wp:positionH>
+                <wp:positionV relativeFrom="paragraph">
+                  <wp:posOffset>234950</wp:posOffset>
+                </wp:positionV>
+                <wp:extent cx="1917700" cy="266700"/>
+                <wp:effectExtent l="0" t="0" r="25400" b="19050"/>
+                <wp:wrapNone/>
+                <wp:docPr id="1757630364" name="Text Box 59"/>
+                <wp:cNvGraphicFramePr/>
+                <a:graphic xmlns:a="http://schemas.openxmlformats.org/drawingml/2006/main">
+                  <a:graphicData uri="http://schemas.microsoft.com/office/word/2010/wordprocessingShape">
+                    <wps:wsp>
+                      <wps:cNvSpPr txBox="1"/>
+                      <wps:spPr>
+                        <a:xfrm>
+                          <a:off x="0" y="0"/>
+                          <a:ext cx="1917700" cy="266700"/>
+                        </a:xfrm>
+                        <a:prstGeom prst="rect">
+                          <a:avLst/>
+                        </a:prstGeom>
+                        <a:solidFill>
+                          <a:schemeClr val="lt1"/>
+                        </a:solidFill>
+                        <a:ln w="6350">
+                          <a:solidFill>
+                            <a:prstClr val="black"/>
+                          </a:solidFill>
+                        </a:ln>
+                      </wps:spPr>
+                      <wps:txbx>
+                        <w:txbxContent>
+                          <w:p>
+                            <w:r>
+                              <w:t xml:space="preserve">MOVE AWAY </w:t>
+                            </w:r>
+                            <w:r>
+                              <w:t>FOR 3 Sec</w:t>
+                            </w:r>
+                          </w:p>
+                        </w:txbxContent>
+                      </wps:txbx>
+                      <wps:bodyPr rot="0" spcFirstLastPara="0" vertOverflow="overflow" horzOverflow="overflow" vert="horz" wrap="square" lIns="91440" tIns="45720" rIns="91440" bIns="45720" numCol="1" spcCol="0" rtlCol="0" fromWordArt="0" anchor="t" anchorCtr="0" forceAA="0" compatLnSpc="1">
+                        <a:prstTxWarp prst="textNoShape">
+                          <a:avLst/>
+                        </a:prstTxWarp>
+                        <a:noAutofit/>
+                      </wps:bodyPr>
+                    </wps:wsp>
+                  </a:graphicData>
+                </a:graphic>
+                <wp14:sizeRelV relativeFrom="margin">
+                  <wp14:pctHeight>0</wp14:pctHeight>
+                </wp14:sizeRelV>
+              </wp:anchor>
+            </w:drawing>
+          </mc:Choice>
+          <mc:Fallback>
+            <w:pict>
+              <v:shape w14:anchorId="3F732D6F" id="Text Box 59" o:spid="_x0000_s1043" type="#_x0000_t202" style="position:absolute;margin-left:154.5pt;margin-top:18.5pt;width:151pt;height:21pt;z-index:251699712;visibility:visible;mso-wrap-style:square;mso-height-percent:0;mso-wrap-distance-left:9pt;mso-wrap-distance-top:0;mso-wrap-distance-right:9pt;mso-wrap-distance-bottom:0;mso-position-horizontal:absolute;mso-position-horizontal-relative:text;mso-position-vertical:absolute;mso-position-vertical-relative:text;mso-height-percent:0;mso-height-relative:margin;v-text-anchor:top" o:gfxdata="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" fillcolor="white [3201]" strokeweight=".5pt">
+                <v:textbox>
+                  <w:txbxContent>
+                    <w:p>
+                      <w:r>
+                        <w:t xml:space="preserve">MOVE AWAY </w:t>
+                      </w:r>
+                      <w:r>
+                        <w:t>FOR 3 Sec</w:t>
+                      </w:r>
+                    </w:p>
+                  </w:txbxContent>
+                </v:textbox>
+              </v:shape>
+            </w:pict>
+          </mc:Fallback>
+        </mc:AlternateContent>
+      </w:r>
+    </w:p>
+    <w:p>
+      <w:r>
+        <w:rPr>
+          <w:noProof/>
+        </w:rPr>
+        <mc:AlternateContent>
+          <mc:Choice Requires="wps">
+            <w:drawing>
+              <wp:anchor distT="0" distB="0" distL="114300" distR="114300" simplePos="0" relativeHeight="251700736" behindDoc="0" locked="0" layoutInCell="1" allowOverlap="1" wp14:anchorId="395C6BD3" wp14:editId="5357A7AE">
+                <wp:simplePos x="0" y="0"/>
+                <wp:positionH relativeFrom="margin">
+                  <wp:posOffset>2882900</wp:posOffset>
+                </wp:positionH>
+                <wp:positionV relativeFrom="paragraph">
+                  <wp:posOffset>241935</wp:posOffset>
+                </wp:positionV>
+                <wp:extent cx="0" cy="279400"/>
+                <wp:effectExtent l="0" t="0" r="38100" b="25400"/>
+                <wp:wrapNone/>
+                <wp:docPr id="321894046" name="Straight Connector 60"/>
+                <wp:cNvGraphicFramePr/>
+                <a:graphic xmlns:a="http://schemas.openxmlformats.org/drawingml/2006/main">
+                  <a:graphicData uri="http://schemas.microsoft.com/office/word/2010/wordprocessingShape">
+                    <wps:wsp>
+                      <wps:cNvCnPr/>
+                      <wps:spPr>
+                        <a:xfrm>
+                          <a:off x="0" y="0"/>
+                          <a:ext cx="0" cy="279400"/>
+                        </a:xfrm>
+                        <a:prstGeom prst="line">
+                          <a:avLst/>
+                        </a:prstGeom>
+                      </wps:spPr>
+                      <wps:style>
+                        <a:lnRef idx="2">
+                          <a:schemeClr val="accent1"/>
+                        </a:lnRef>
+                        <a:fillRef idx="0">
+                          <a:schemeClr val="accent1"/>
+                        </a:fillRef>
+                        <a:effectRef idx="1">
+                          <a:schemeClr val="accent1"/>
+                        </a:effectRef>
+                        <a:fontRef idx="minor">
+                          <a:schemeClr val="tx1"/>
+                        </a:fontRef>
+                      </wps:style>
+                      <wps:bodyPr/>
+                    </wps:wsp>
+                  </a:graphicData>
+                </a:graphic>
+                <wp14:sizeRelH relativeFrom="margin">
+                  <wp14:pctWidth>0</wp14:pctWidth>
+                </wp14:sizeRelH>
+                <wp14:sizeRelV relativeFrom="margin">
+                  <wp14:pctHeight>0</wp14:pctHeight>
+                </wp14:sizeRelV>
+              </wp:anchor>
+            </w:drawing>
+          </mc:Choice>
+          <mc:Fallback>
+            <w:pict>
+              <v:line w14:anchorId="0BEEC4E5" id="Straight Connector 60" o:spid="_x0000_s1026" style="position:absolute;z-index:251700736;visibility:visible;mso-wrap-style:square;mso-width-percent:0;mso-height-percent:0;mso-wrap-distance-left:9pt;mso-wrap-distance-top:0;mso-wrap-distance-right:9pt;mso-wrap-distance-bottom:0;mso-position-horizontal:absolute;mso-position-horizontal-relative:margin;mso-position-vertical:absolute;mso-position-vertical-relative:text;mso-width-percent:0;mso-height-percent:0;mso-width-relative:margin;mso-height-relative:margin" from="227pt,19.05pt" to="227pt,41.05pt" o:gfxdata="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" strokecolor="#156082 [3204]" strokeweight="1.5pt">
+                <v:stroke joinstyle="miter"/>
+                <w10:wrap anchorx="margin"/>
+              </v:line>
+            </w:pict>
+          </mc:Fallback>
+        </mc:AlternateContent>
+      </w:r>
+    </w:p>
+    <w:p>
+      <w:r>
+        <w:rPr>
+          <w:noProof/>
+        </w:rPr>
+        <mc:AlternateContent>
+          <mc:Choice Requires="wps">
+            <w:drawing>
+              <wp:anchor distT="0" distB="0" distL="114300" distR="114300" simplePos="0" relativeHeight="251701760" behindDoc="0" locked="0" layoutInCell="1" allowOverlap="1" wp14:anchorId="02E14BB0" wp14:editId="2DFA279F">
+                <wp:simplePos x="0" y="0"/>
+                <wp:positionH relativeFrom="column">
+                  <wp:posOffset>2260600</wp:posOffset>
+                </wp:positionH>
+                <wp:positionV relativeFrom="paragraph">
+                  <wp:posOffset>217170</wp:posOffset>
+                </wp:positionV>
+                <wp:extent cx="1295400" cy="438150"/>
+                <wp:effectExtent l="0" t="0" r="19050" b="19050"/>
+                <wp:wrapNone/>
+                <wp:docPr id="746891806" name="Oval 61"/>
+                <wp:cNvGraphicFramePr/>
+                <a:graphic xmlns:a="http://schemas.openxmlformats.org/drawingml/2006/main">
+                  <a:graphicData uri="http://schemas.microsoft.com/office/word/2010/wordprocessingShape">
+                    <wps:wsp>
+                      <wps:cNvSpPr/>
+                      <wps:spPr>
+                        <a:xfrm>
+                          <a:off x="0" y="0"/>
+                          <a:ext cx="1295400" cy="438150"/>
+                        </a:xfrm>
+                        <a:prstGeom prst="ellipse">
+                          <a:avLst/>
+                        </a:prstGeom>
+                      </wps:spPr>
+                      <wps:style>
+                        <a:lnRef idx="2">
+                          <a:schemeClr val="accent1">
+                            <a:shade val="15000"/>
+                          </a:schemeClr>
+                        </a:lnRef>
+                        <a:fillRef idx="1">
+                          <a:schemeClr val="accent1"/>
+                        </a:fillRef>
+                        <a:effectRef idx="0">
+                          <a:schemeClr val="accent1"/>
+                        </a:effectRef>
+                        <a:fontRef idx="minor">
+                          <a:schemeClr val="lt1"/>
+                        </a:fontRef>
+                      </wps:style>
+                      <wps:bodyPr rot="0" spcFirstLastPara="0" vertOverflow="overflow" horzOverflow="overflow" vert="horz" wrap="square" lIns="91440" tIns="45720" rIns="91440" bIns="45720" numCol="1" spcCol="0" rtlCol="0" fromWordArt="0" anchor="ctr" anchorCtr="0" forceAA="0" compatLnSpc="1">
+                        <a:prstTxWarp prst="textNoShape">
+                          <a:avLst/>
+                        </a:prstTxWarp>
+                        <a:noAutofit/>
+                      </wps:bodyPr>
+                    </wps:wsp>
+                  </a:graphicData>
+                </a:graphic>
+                <wp14:sizeRelH relativeFrom="margin">
+                  <wp14:pctWidth>0</wp14:pctWidth>
+                </wp14:sizeRelH>
+                <wp14:sizeRelV relativeFrom="margin">
+                  <wp14:pctHeight>0</wp14:pctHeight>
+                </wp14:sizeRelV>
+              </wp:anchor>
+            </w:drawing>
+          </mc:Choice>
+          <mc:Fallback>
+            <w:pict>
+              <v:oval w14:anchorId="25D74B7A" id="Oval 61" o:spid="_x0000_s1026" style="position:absolute;margin-left:178pt;margin-top:17.1pt;width:102pt;height:34.5pt;z-index:251701760;visibility:visible;mso-wrap-style:square;mso-width-percent:0;mso-height-percent:0;mso-wrap-distance-left:9pt;mso-wrap-distance-top:0;mso-wrap-distance-right:9pt;mso-wrap-distance-bottom:0;mso-position-horizontal:absolute;mso-position-horizontal-relative:text;mso-position-vertical:absolute;mso-position-vertical-relative:text;mso-width-percent:0;mso-height-percent:0;mso-width-relative:margin;mso-height-relative:margin;v-text-anchor:middle" o:gfxdata="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" fillcolor="#156082 [3204]" strokecolor="#030e13 [484]" strokeweight="1.5pt">
+                <v:stroke joinstyle="miter"/>
+              </v:oval>
+            </w:pict>
+          </mc:Fallback>
+        </mc:AlternateContent>
+      </w:r>
+      <w:r>
+        <w:rPr>
+          <w:noProof/>
+        </w:rPr>
+        <mc:AlternateContent>
+          <mc:Choice Requires="wps">
+            <w:drawing>
+              <wp:anchor distT="0" distB="0" distL="114300" distR="114300" simplePos="0" relativeHeight="251702784" behindDoc="0" locked="0" layoutInCell="1" allowOverlap="1" wp14:anchorId="3C48ED7E" wp14:editId="4CC2230B">
+                <wp:simplePos x="0" y="0"/>
+                <wp:positionH relativeFrom="column">
+                  <wp:posOffset>2508250</wp:posOffset>
+                </wp:positionH>
+                <wp:positionV relativeFrom="paragraph">
+                  <wp:posOffset>287020</wp:posOffset>
+                </wp:positionV>
+                <wp:extent cx="812800" cy="298450"/>
+                <wp:effectExtent l="0" t="0" r="25400" b="25400"/>
+                <wp:wrapNone/>
+                <wp:docPr id="2094054861" name="Text Box 62"/>
+                <wp:cNvGraphicFramePr/>
+                <a:graphic xmlns:a="http://schemas.openxmlformats.org/drawingml/2006/main">
+                  <a:graphicData uri="http://schemas.microsoft.com/office/word/2010/wordprocessingShape">
+                    <wps:wsp>
+                      <wps:cNvSpPr txBox="1"/>
+                      <wps:spPr>
+                        <a:xfrm>
+                          <a:off x="0" y="0"/>
+                          <a:ext cx="812800" cy="298450"/>
+                        </a:xfrm>
+                        <a:prstGeom prst="rect">
+                          <a:avLst/>
+                        </a:prstGeom>
+                        <a:solidFill>
+                          <a:schemeClr val="lt1"/>
+                        </a:solidFill>
+                        <a:ln w="6350">
+                          <a:solidFill>
+                            <a:prstClr val="black"/>
+                          </a:solidFill>
+                        </a:ln>
+                      </wps:spPr>
+                      <wps:txbx>
+                        <w:txbxContent>
+                          <w:p>
+                            <w:r>
+                              <w:t xml:space="preserve">  RETURN</w:t>
+                            </w:r>
+                          </w:p>
+                        </w:txbxContent>
+                      </wps:txbx>
+                      <wps:bodyPr rot="0" spcFirstLastPara="0" vertOverflow="overflow" horzOverflow="overflow" vert="horz" wrap="square" lIns="91440" tIns="45720" rIns="91440" bIns="45720" numCol="1" spcCol="0" rtlCol="0" fromWordArt="0" anchor="t" anchorCtr="0" forceAA="0" compatLnSpc="1">
+                        <a:prstTxWarp prst="textNoShape">
+                          <a:avLst/>
+                        </a:prstTxWarp>
+                        <a:noAutofit/>
+                      </wps:bodyPr>
+                    </wps:wsp>
+                  </a:graphicData>
+                </a:graphic>
+                <wp14:sizeRelH relativeFrom="margin">
+                  <wp14:pctWidth>0</wp14:pctWidth>
+                </wp14:sizeRelH>
+              </wp:anchor>
+            </w:drawing>
+          </mc:Choice>
+          <mc:Fallback>
+            <w:pict>
+              <v:shape w14:anchorId="3C48ED7E" id="Text Box 62" o:spid="_x0000_s1044" type="#_x0000_t202" style="position:absolute;margin-left:197.5pt;margin-top:22.6pt;width:64pt;height:23.5pt;z-index:251702784;visibility:visible;mso-wrap-style:square;mso-width-percent:0;mso-wrap-distance-left:9pt;mso-wrap-distance-top:0;mso-wrap-distance-right:9pt;mso-wrap-distance-bottom:0;mso-position-horizontal:absolute;mso-position-horizontal-relative:text;mso-position-vertical:absolute;mso-position-vertical-relative:text;mso-width-percent:0;mso-width-relative:margin;v-text-anchor:top" o:gfxdata="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" fillcolor="white [3201]" strokeweight=".5pt">
+                <v:textbox>
+                  <w:txbxContent>
+                    <w:p>
+                      <w:r>
+                        <w:t xml:space="preserve">  RETURN</w:t>
+                      </w:r>
+                    </w:p>
+                  </w:txbxContent>
+                </v:textbox>
+              </v:shape>
+            </w:pict>
+          </mc:Fallback>
+        </mc:AlternateContent>
+      </w:r>
+    </w:p>
     <w:p/>
     <w:p/>
     <w:p/>

</xml_diff>

<commit_message>
Gantt Chart For Assessment
</commit_message>
<xml_diff>
--- a/Documents/SwiftBot Task10 - Requirements (1).docx
+++ b/Documents/SwiftBot Task10 - Requirements (1).docx
@@ -668,15 +668,7 @@
         <w:t>If object is exac</w:t>
       </w:r>
       <w:r>
-        <w:t xml:space="preserve">tly at buffer distance, remain </w:t>
-      </w:r>
-      <w:proofErr w:type="gramStart"/>
-      <w:r>
-        <w:t>stationary</w:t>
-      </w:r>
-      <w:proofErr w:type="gramEnd"/>
-      <w:r>
-        <w:t xml:space="preserve"> and</w:t>
+        <w:t>tly at buffer distance, remain stationary and</w:t>
       </w:r>
       <w:r>
         <w:t xml:space="preserve"> blink green</w:t>
@@ -1596,7 +1588,7 @@
                 </mc:Choice>
                 <mc:Fallback>
                   <w:pict>
-                    <v:shapetype w14:anchorId="5EA6D2EA" id="_x0000_t32" coordsize="21600,21600" o:spt="32" o:oned="t" path="m,l21600,21600e" filled="f">
+                    <v:shapetype w14:anchorId="318685EB" id="_x0000_t32" coordsize="21600,21600" o:spt="32" o:oned="t" path="m,l21600,21600e" filled="f">
                       <v:path arrowok="t" fillok="f" o:connecttype="none"/>
                       <o:lock v:ext="edit" shapetype="t"/>
                     </v:shapetype>
@@ -1678,7 +1670,7 @@
                 </mc:Choice>
                 <mc:Fallback>
                   <w:pict>
-                    <v:shape w14:anchorId="0D616FAF" id="Straight Arrow Connector 2" o:spid="_x0000_s1026" type="#_x0000_t32" style="position:absolute;margin-left:36.85pt;margin-top:8.25pt;width:29.5pt;height:0;z-index:251650560;visibility:visible;mso-wrap-style:square;mso-wrap-distance-left:9pt;mso-wrap-distance-top:0;mso-wrap-distance-right:9pt;mso-wrap-distance-bottom:0;mso-position-horizontal:absolute;mso-position-horizontal-relative:text;mso-position-vertical:absolute;mso-position-vertical-relative:text" o:gfxdata="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" strokecolor="#156082 [3204]" strokeweight="1.5pt">
+                    <v:shape w14:anchorId="2593CC73" id="Straight Arrow Connector 2" o:spid="_x0000_s1026" type="#_x0000_t32" style="position:absolute;margin-left:36.85pt;margin-top:8.25pt;width:29.5pt;height:0;z-index:251650560;visibility:visible;mso-wrap-style:square;mso-wrap-distance-left:9pt;mso-wrap-distance-top:0;mso-wrap-distance-right:9pt;mso-wrap-distance-bottom:0;mso-position-horizontal:absolute;mso-position-horizontal-relative:text;mso-position-vertical:absolute;mso-position-vertical-relative:text" o:gfxdata="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" strokecolor="#156082 [3204]" strokeweight="1.5pt">
                       <v:stroke endarrow="block" joinstyle="miter"/>
                     </v:shape>
                   </w:pict>
@@ -1835,7 +1827,7 @@
                 </mc:Choice>
                 <mc:Fallback>
                   <w:pict>
-                    <v:shape w14:anchorId="6D514219" id="Straight Arrow Connector 3" o:spid="_x0000_s1026" type="#_x0000_t32" style="position:absolute;margin-left:46.35pt;margin-top:7.9pt;width:29pt;height:0;z-index:251651584;visibility:visible;mso-wrap-style:square;mso-wrap-distance-left:9pt;mso-wrap-distance-top:0;mso-wrap-distance-right:9pt;mso-wrap-distance-bottom:0;mso-position-horizontal:absolute;mso-position-horizontal-relative:text;mso-position-vertical:absolute;mso-position-vertical-relative:text" o:gfxdata="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" strokecolor="#156082 [3204]" strokeweight="1.5pt">
+                    <v:shape w14:anchorId="3AAFBD9B" id="Straight Arrow Connector 3" o:spid="_x0000_s1026" type="#_x0000_t32" style="position:absolute;margin-left:46.35pt;margin-top:7.9pt;width:29pt;height:0;z-index:251651584;visibility:visible;mso-wrap-style:square;mso-wrap-distance-left:9pt;mso-wrap-distance-top:0;mso-wrap-distance-right:9pt;mso-wrap-distance-bottom:0;mso-position-horizontal:absolute;mso-position-horizontal-relative:text;mso-position-vertical:absolute;mso-position-vertical-relative:text" o:gfxdata="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" strokecolor="#156082 [3204]" strokeweight="1.5pt">
                       <v:stroke endarrow="block" joinstyle="miter"/>
                     </v:shape>
                   </w:pict>
@@ -1922,7 +1914,7 @@
                 </mc:Choice>
                 <mc:Fallback>
                   <w:pict>
-                    <v:shape w14:anchorId="3523D488" id="Straight Arrow Connector 4" o:spid="_x0000_s1026" type="#_x0000_t32" style="position:absolute;margin-left:46.85pt;margin-top:5.75pt;width:30.5pt;height:.5pt;z-index:251653632;visibility:visible;mso-wrap-style:square;mso-wrap-distance-left:9pt;mso-wrap-distance-top:0;mso-wrap-distance-right:9pt;mso-wrap-distance-bottom:0;mso-position-horizontal:absolute;mso-position-horizontal-relative:text;mso-position-vertical:absolute;mso-position-vertical-relative:text" o:gfxdata="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" strokecolor="#156082 [3204]" strokeweight="1.5pt">
+                    <v:shape w14:anchorId="0796226B" id="Straight Arrow Connector 4" o:spid="_x0000_s1026" type="#_x0000_t32" style="position:absolute;margin-left:46.85pt;margin-top:5.75pt;width:30.5pt;height:.5pt;z-index:251653632;visibility:visible;mso-wrap-style:square;mso-wrap-distance-left:9pt;mso-wrap-distance-top:0;mso-wrap-distance-right:9pt;mso-wrap-distance-bottom:0;mso-position-horizontal:absolute;mso-position-horizontal-relative:text;mso-position-vertical:absolute;mso-position-vertical-relative:text" o:gfxdata="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" strokecolor="#156082 [3204]" strokeweight="1.5pt">
                       <v:stroke endarrow="block" joinstyle="miter"/>
                     </v:shape>
                   </w:pict>
@@ -3488,29 +3480,8 @@
       </w:r>
       <w:r>
         <w:br/>
-        <w:t xml:space="preserve">  Curious </w:t>
-      </w:r>
-      <w:proofErr w:type="spellStart"/>
-      <w:r>
-        <w:t>SwiftBot</w:t>
-      </w:r>
-      <w:proofErr w:type="spellEnd"/>
-      <w:r>
-        <w:t xml:space="preserve"> | Scaredy </w:t>
-      </w:r>
-      <w:proofErr w:type="spellStart"/>
-      <w:r>
-        <w:t>SwiftBot</w:t>
-      </w:r>
-      <w:proofErr w:type="spellEnd"/>
-      <w:r>
-        <w:t xml:space="preserve"> | Dubious </w:t>
-      </w:r>
-      <w:proofErr w:type="spellStart"/>
-      <w:r>
-        <w:t>SwiftBot</w:t>
-      </w:r>
-      <w:proofErr w:type="spellEnd"/>
+        <w:t xml:space="preserve">  Curious SwiftBot | Scaredy SwiftBot | Dubious SwiftBot</w:t>
+      </w:r>
       <w:r>
         <w:br/>
         <w:t>Received:</w:t>
@@ -3840,7 +3811,7 @@
           </mc:Choice>
           <mc:Fallback>
             <w:pict>
-              <v:oval w14:anchorId="0607128C" id="Oval 1" o:spid="_x0000_s1026" style="position:absolute;margin-left:158.95pt;margin-top:2.1pt;width:138.55pt;height:52.95pt;z-index:251655680;visibility:visible;mso-wrap-style:square;mso-width-percent:0;mso-wrap-distance-left:9pt;mso-wrap-distance-top:0;mso-wrap-distance-right:9pt;mso-wrap-distance-bottom:0;mso-position-horizontal:absolute;mso-position-horizontal-relative:text;mso-position-vertical:absolute;mso-position-vertical-relative:text;mso-width-percent:0;mso-width-relative:margin;v-text-anchor:middle" o:gfxdata="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" fillcolor="#156082 [3204]" strokecolor="#030e13 [484]" strokeweight="1.5pt">
+              <v:oval w14:anchorId="56508ABF" id="Oval 1" o:spid="_x0000_s1026" style="position:absolute;margin-left:158.95pt;margin-top:2.1pt;width:138.55pt;height:52.95pt;z-index:251655680;visibility:visible;mso-wrap-style:square;mso-width-percent:0;mso-wrap-distance-left:9pt;mso-wrap-distance-top:0;mso-wrap-distance-right:9pt;mso-wrap-distance-bottom:0;mso-position-horizontal:absolute;mso-position-horizontal-relative:text;mso-position-vertical:absolute;mso-position-vertical-relative:text;mso-width-percent:0;mso-width-relative:margin;v-text-anchor:middle" o:gfxdata="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" fillcolor="#156082 [3204]" strokecolor="#030e13 [484]" strokeweight="1.5pt">
                 <v:stroke joinstyle="miter"/>
               </v:oval>
             </w:pict>
@@ -4021,7 +3992,7 @@
           </mc:Choice>
           <mc:Fallback>
             <w:pict>
-              <v:line w14:anchorId="22E848D5" id="Straight Connector 3" o:spid="_x0000_s1026" style="position:absolute;z-index:251658752;visibility:visible;mso-wrap-style:square;mso-wrap-distance-left:9pt;mso-wrap-distance-top:0;mso-wrap-distance-right:9pt;mso-wrap-distance-bottom:0;mso-position-horizontal:absolute;mso-position-horizontal-relative:text;mso-position-vertical:absolute;mso-position-vertical-relative:text" from="227.55pt,9.7pt" to="227.55pt,51.8pt" o:gfxdata="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" strokecolor="#156082 [3204]" strokeweight="1.5pt">
+              <v:line w14:anchorId="61ABBF60" id="Straight Connector 3" o:spid="_x0000_s1026" style="position:absolute;z-index:251658752;visibility:visible;mso-wrap-style:square;mso-wrap-distance-left:9pt;mso-wrap-distance-top:0;mso-wrap-distance-right:9pt;mso-wrap-distance-bottom:0;mso-position-horizontal:absolute;mso-position-horizontal-relative:text;mso-position-vertical:absolute;mso-position-vertical-relative:text" from="227.55pt,9.7pt" to="227.55pt,51.8pt" o:gfxdata="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" strokecolor="#156082 [3204]" strokeweight="1.5pt">
                 <v:stroke joinstyle="miter"/>
               </v:line>
             </w:pict>
@@ -4107,7 +4078,7 @@
           </mc:Choice>
           <mc:Fallback>
             <w:pict>
-              <v:rect w14:anchorId="2F38A717" id="Rectangle 8" o:spid="_x0000_s1026" style="position:absolute;margin-left:118.5pt;margin-top:5.1pt;width:221pt;height:35.5pt;z-index:251649024;visibility:visible;mso-wrap-style:square;mso-width-percent:0;mso-height-percent:0;mso-wrap-distance-left:9pt;mso-wrap-distance-top:0;mso-wrap-distance-right:9pt;mso-wrap-distance-bottom:0;mso-position-horizontal:absolute;mso-position-horizontal-relative:text;mso-position-vertical:absolute;mso-position-vertical-relative:text;mso-width-percent:0;mso-height-percent:0;mso-width-relative:margin;mso-height-relative:margin;v-text-anchor:middle" o:gfxdata="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" fillcolor="#156082 [3204]" strokecolor="#030e13 [484]" strokeweight="1.5pt"/>
+              <v:rect w14:anchorId="2800836D" id="Rectangle 8" o:spid="_x0000_s1026" style="position:absolute;margin-left:118.5pt;margin-top:5.1pt;width:221pt;height:35.5pt;z-index:251649024;visibility:visible;mso-wrap-style:square;mso-width-percent:0;mso-height-percent:0;mso-wrap-distance-left:9pt;mso-wrap-distance-top:0;mso-wrap-distance-right:9pt;mso-wrap-distance-bottom:0;mso-position-horizontal:absolute;mso-position-horizontal-relative:text;mso-position-vertical:absolute;mso-position-vertical-relative:text;mso-width-percent:0;mso-height-percent:0;mso-width-relative:margin;mso-height-relative:margin;v-text-anchor:middle" o:gfxdata="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" fillcolor="#156082 [3204]" strokecolor="#030e13 [484]" strokeweight="1.5pt"/>
             </w:pict>
           </mc:Fallback>
         </mc:AlternateContent>
@@ -4261,7 +4232,7 @@
           </mc:Choice>
           <mc:Fallback>
             <w:pict>
-              <v:line w14:anchorId="427C4624" id="Straight Connector 10" o:spid="_x0000_s1026" style="position:absolute;z-index:251659776;visibility:visible;mso-wrap-style:square;mso-width-percent:0;mso-height-percent:0;mso-wrap-distance-left:9pt;mso-wrap-distance-top:0;mso-wrap-distance-right:9pt;mso-wrap-distance-bottom:0;mso-position-horizontal:absolute;mso-position-horizontal-relative:text;mso-position-vertical:absolute;mso-position-vertical-relative:text;mso-width-percent:0;mso-height-percent:0;mso-width-relative:margin;mso-height-relative:margin" from="226pt,16.95pt" to="227pt,53.95pt" o:gfxdata="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" strokecolor="#156082 [3204]" strokeweight="1.5pt">
+              <v:line w14:anchorId="496B9AF4" id="Straight Connector 10" o:spid="_x0000_s1026" style="position:absolute;z-index:251659776;visibility:visible;mso-wrap-style:square;mso-width-percent:0;mso-height-percent:0;mso-wrap-distance-left:9pt;mso-wrap-distance-top:0;mso-wrap-distance-right:9pt;mso-wrap-distance-bottom:0;mso-position-horizontal:absolute;mso-position-horizontal-relative:text;mso-position-vertical:absolute;mso-position-vertical-relative:text;mso-width-percent:0;mso-height-percent:0;mso-width-relative:margin;mso-height-relative:margin" from="226pt,16.95pt" to="227pt,53.95pt" o:gfxdata="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" strokecolor="#156082 [3204]" strokeweight="1.5pt">
                 <v:stroke joinstyle="miter"/>
               </v:line>
             </w:pict>
@@ -4347,7 +4318,7 @@
           </mc:Choice>
           <mc:Fallback>
             <w:pict>
-              <v:rect w14:anchorId="25260ADC" id="Rectangle 11" o:spid="_x0000_s1026" style="position:absolute;margin-left:118pt;margin-top:9.65pt;width:224pt;height:37.5pt;z-index:251653120;visibility:visible;mso-wrap-style:square;mso-width-percent:0;mso-height-percent:0;mso-wrap-distance-left:9pt;mso-wrap-distance-top:0;mso-wrap-distance-right:9pt;mso-wrap-distance-bottom:0;mso-position-horizontal:absolute;mso-position-horizontal-relative:text;mso-position-vertical:absolute;mso-position-vertical-relative:text;mso-width-percent:0;mso-height-percent:0;mso-width-relative:margin;mso-height-relative:margin;v-text-anchor:middle" o:gfxdata="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" fillcolor="#156082 [3204]" strokecolor="#030e13 [484]" strokeweight="1.5pt"/>
+              <v:rect w14:anchorId="3A25556D" id="Rectangle 11" o:spid="_x0000_s1026" style="position:absolute;margin-left:118pt;margin-top:9.65pt;width:224pt;height:37.5pt;z-index:251653120;visibility:visible;mso-wrap-style:square;mso-width-percent:0;mso-height-percent:0;mso-wrap-distance-left:9pt;mso-wrap-distance-top:0;mso-wrap-distance-right:9pt;mso-wrap-distance-bottom:0;mso-position-horizontal:absolute;mso-position-horizontal-relative:text;mso-position-vertical:absolute;mso-position-vertical-relative:text;mso-width-percent:0;mso-height-percent:0;mso-width-relative:margin;mso-height-relative:margin;v-text-anchor:middle" o:gfxdata="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" fillcolor="#156082 [3204]" strokecolor="#030e13 [484]" strokeweight="1.5pt"/>
             </w:pict>
           </mc:Fallback>
         </mc:AlternateContent>
@@ -4518,7 +4489,7 @@
           </mc:Choice>
           <mc:Fallback>
             <w:pict>
-              <v:line w14:anchorId="2D5CDD82" id="Straight Connector 13" o:spid="_x0000_s1026" style="position:absolute;z-index:251660800;visibility:visible;mso-wrap-style:square;mso-wrap-distance-left:9pt;mso-wrap-distance-top:0;mso-wrap-distance-right:9pt;mso-wrap-distance-bottom:0;mso-position-horizontal:absolute;mso-position-horizontal-relative:text;mso-position-vertical:absolute;mso-position-vertical-relative:text" from="226.5pt,.35pt" to="226.5pt,42.35pt" o:gfxdata="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" strokecolor="#156082 [3204]" strokeweight="1.5pt">
+              <v:line w14:anchorId="4E464D3D" id="Straight Connector 13" o:spid="_x0000_s1026" style="position:absolute;z-index:251660800;visibility:visible;mso-wrap-style:square;mso-wrap-distance-left:9pt;mso-wrap-distance-top:0;mso-wrap-distance-right:9pt;mso-wrap-distance-bottom:0;mso-position-horizontal:absolute;mso-position-horizontal-relative:text;mso-position-vertical:absolute;mso-position-vertical-relative:text" from="226.5pt,.35pt" to="226.5pt,42.35pt" o:gfxdata="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" strokecolor="#156082 [3204]" strokeweight="1.5pt">
                 <v:stroke joinstyle="miter"/>
               </v:line>
             </w:pict>
@@ -4599,7 +4570,7 @@
           </mc:Choice>
           <mc:Fallback>
             <w:pict>
-              <v:shapetype w14:anchorId="6F093B08" id="_x0000_t4" coordsize="21600,21600" o:spt="4" path="m10800,l,10800,10800,21600,21600,10800xe">
+              <v:shapetype w14:anchorId="2F773FB0" id="_x0000_t4" coordsize="21600,21600" o:spt="4" path="m10800,l,10800,10800,21600,21600,10800xe">
                 <v:stroke joinstyle="miter"/>
                 <v:path gradientshapeok="t" o:connecttype="rect" textboxrect="5400,5400,16200,16200"/>
               </v:shapetype>
@@ -4776,7 +4747,7 @@
           </mc:Choice>
           <mc:Fallback>
             <w:pict>
-              <v:line w14:anchorId="29EFDBFB" id="Straight Connector 16" o:spid="_x0000_s1026" style="position:absolute;z-index:251663872;visibility:visible;mso-wrap-style:square;mso-wrap-distance-left:9pt;mso-wrap-distance-top:0;mso-wrap-distance-right:9pt;mso-wrap-distance-bottom:0;mso-position-horizontal:absolute;mso-position-horizontal-relative:text;mso-position-vertical:absolute;mso-position-vertical-relative:text" from="228.5pt,9.75pt" to="228.5pt,39.25pt" o:gfxdata="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" strokecolor="#156082 [3204]" strokeweight="1.5pt">
+              <v:line w14:anchorId="3FEEC640" id="Straight Connector 16" o:spid="_x0000_s1026" style="position:absolute;z-index:251663872;visibility:visible;mso-wrap-style:square;mso-wrap-distance-left:9pt;mso-wrap-distance-top:0;mso-wrap-distance-right:9pt;mso-wrap-distance-bottom:0;mso-position-horizontal:absolute;mso-position-horizontal-relative:text;mso-position-vertical:absolute;mso-position-vertical-relative:text" from="228.5pt,9.75pt" to="228.5pt,39.25pt" o:gfxdata="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" strokecolor="#156082 [3204]" strokeweight="1.5pt">
                 <v:stroke joinstyle="miter"/>
               </v:line>
             </w:pict>
@@ -4936,7 +4907,7 @@
           </mc:Choice>
           <mc:Fallback>
             <w:pict>
-              <v:rect w14:anchorId="737D9673" id="Rectangle 17" o:spid="_x0000_s1026" style="position:absolute;margin-left:114.5pt;margin-top:16.1pt;width:230pt;height:38.5pt;z-index:251664896;visibility:visible;mso-wrap-style:square;mso-width-percent:0;mso-wrap-distance-left:9pt;mso-wrap-distance-top:0;mso-wrap-distance-right:9pt;mso-wrap-distance-bottom:0;mso-position-horizontal:absolute;mso-position-horizontal-relative:text;mso-position-vertical:absolute;mso-position-vertical-relative:text;mso-width-percent:0;mso-width-relative:margin;v-text-anchor:middle" o:gfxdata="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" fillcolor="#156082 [3204]" strokecolor="#030e13 [484]" strokeweight="1.5pt"/>
+              <v:rect w14:anchorId="6E4622A6" id="Rectangle 17" o:spid="_x0000_s1026" style="position:absolute;margin-left:114.5pt;margin-top:16.1pt;width:230pt;height:38.5pt;z-index:251664896;visibility:visible;mso-wrap-style:square;mso-width-percent:0;mso-wrap-distance-left:9pt;mso-wrap-distance-top:0;mso-wrap-distance-right:9pt;mso-wrap-distance-bottom:0;mso-position-horizontal:absolute;mso-position-horizontal-relative:text;mso-position-vertical:absolute;mso-position-vertical-relative:text;mso-width-percent:0;mso-width-relative:margin;v-text-anchor:middle" o:gfxdata="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" fillcolor="#156082 [3204]" strokecolor="#030e13 [484]" strokeweight="1.5pt"/>
             </w:pict>
           </mc:Fallback>
         </mc:AlternateContent>
@@ -5007,7 +4978,7 @@
           </mc:Choice>
           <mc:Fallback>
             <w:pict>
-              <v:line w14:anchorId="146F110A" id="Straight Connector 19" o:spid="_x0000_s1026" style="position:absolute;z-index:251666944;visibility:visible;mso-wrap-style:square;mso-wrap-distance-left:9pt;mso-wrap-distance-top:0;mso-wrap-distance-right:9pt;mso-wrap-distance-bottom:0;mso-position-horizontal:absolute;mso-position-horizontal-relative:text;mso-position-vertical:absolute;mso-position-vertical-relative:text" from="228pt,9.3pt" to="228pt,39.3pt" o:gfxdata="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" strokecolor="#156082 [3204]" strokeweight="1.5pt">
+              <v:line w14:anchorId="0E750A2B" id="Straight Connector 19" o:spid="_x0000_s1026" style="position:absolute;z-index:251666944;visibility:visible;mso-wrap-style:square;mso-wrap-distance-left:9pt;mso-wrap-distance-top:0;mso-wrap-distance-right:9pt;mso-wrap-distance-bottom:0;mso-position-horizontal:absolute;mso-position-horizontal-relative:text;mso-position-vertical:absolute;mso-position-vertical-relative:text" from="228pt,9.3pt" to="228pt,39.3pt" o:gfxdata="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" strokecolor="#156082 [3204]" strokeweight="1.5pt">
                 <v:stroke joinstyle="miter"/>
               </v:line>
             </w:pict>
@@ -5088,7 +5059,7 @@
           </mc:Choice>
           <mc:Fallback>
             <w:pict>
-              <v:shape w14:anchorId="35758F5C" id="Diamond 20" o:spid="_x0000_s1026" type="#_x0000_t4" style="position:absolute;margin-left:105.5pt;margin-top:15.15pt;width:247.5pt;height:55.5pt;z-index:251667968;visibility:visible;mso-wrap-style:square;mso-width-percent:0;mso-height-percent:0;mso-wrap-distance-left:9pt;mso-wrap-distance-top:0;mso-wrap-distance-right:9pt;mso-wrap-distance-bottom:0;mso-position-horizontal:absolute;mso-position-horizontal-relative:text;mso-position-vertical:absolute;mso-position-vertical-relative:text;mso-width-percent:0;mso-height-percent:0;mso-width-relative:margin;mso-height-relative:margin;v-text-anchor:middle" o:gfxdata="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" fillcolor="#156082 [3204]" strokecolor="#030e13 [484]" strokeweight="1.5pt"/>
+              <v:shape w14:anchorId="10E801A2" id="Diamond 20" o:spid="_x0000_s1026" type="#_x0000_t4" style="position:absolute;margin-left:105.5pt;margin-top:15.15pt;width:247.5pt;height:55.5pt;z-index:251667968;visibility:visible;mso-wrap-style:square;mso-width-percent:0;mso-height-percent:0;mso-wrap-distance-left:9pt;mso-wrap-distance-top:0;mso-wrap-distance-right:9pt;mso-wrap-distance-bottom:0;mso-position-horizontal:absolute;mso-position-horizontal-relative:text;mso-position-vertical:absolute;mso-position-vertical-relative:text;mso-width-percent:0;mso-height-percent:0;mso-width-relative:margin;mso-height-relative:margin;v-text-anchor:middle" o:gfxdata="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" fillcolor="#156082 [3204]" strokecolor="#030e13 [484]" strokeweight="1.5pt"/>
             </w:pict>
           </mc:Fallback>
         </mc:AlternateContent>
@@ -5246,7 +5217,7 @@
           </mc:Choice>
           <mc:Fallback>
             <w:pict>
-              <v:line w14:anchorId="386CBE6E" id="Straight Connector 22" o:spid="_x0000_s1026" style="position:absolute;z-index:251670016;visibility:visible;mso-wrap-style:square;mso-wrap-distance-left:9pt;mso-wrap-distance-top:0;mso-wrap-distance-right:9pt;mso-wrap-distance-bottom:0;mso-position-horizontal:absolute;mso-position-horizontal-relative:text;mso-position-vertical:absolute;mso-position-vertical-relative:text" from="228.5pt,3.7pt" to="229pt,35.7pt" o:gfxdata="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" strokecolor="#156082 [3204]" strokeweight="1.5pt">
+              <v:line w14:anchorId="474EAA48" id="Straight Connector 22" o:spid="_x0000_s1026" style="position:absolute;z-index:251670016;visibility:visible;mso-wrap-style:square;mso-wrap-distance-left:9pt;mso-wrap-distance-top:0;mso-wrap-distance-right:9pt;mso-wrap-distance-bottom:0;mso-position-horizontal:absolute;mso-position-horizontal-relative:text;mso-position-vertical:absolute;mso-position-vertical-relative:text" from="228.5pt,3.7pt" to="229pt,35.7pt" o:gfxdata="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" strokecolor="#156082 [3204]" strokeweight="1.5pt">
                 <v:stroke joinstyle="miter"/>
               </v:line>
             </w:pict>
@@ -5409,7 +5380,7 @@
           </mc:Choice>
           <mc:Fallback>
             <w:pict>
-              <v:rect w14:anchorId="6D971072" id="Rectangle 23" o:spid="_x0000_s1026" style="position:absolute;margin-left:149.5pt;margin-top:12.55pt;width:164.5pt;height:36.5pt;z-index:251659264;visibility:visible;mso-wrap-style:square;mso-width-percent:0;mso-height-percent:0;mso-wrap-distance-left:9pt;mso-wrap-distance-top:0;mso-wrap-distance-right:9pt;mso-wrap-distance-bottom:0;mso-position-horizontal:absolute;mso-position-horizontal-relative:text;mso-position-vertical:absolute;mso-position-vertical-relative:text;mso-width-percent:0;mso-height-percent:0;mso-width-relative:margin;mso-height-relative:margin;v-text-anchor:middle" o:gfxdata="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" fillcolor="#156082 [3204]" strokecolor="#030e13 [484]" strokeweight="1.5pt"/>
+              <v:rect w14:anchorId="1B99E319" id="Rectangle 23" o:spid="_x0000_s1026" style="position:absolute;margin-left:149.5pt;margin-top:12.55pt;width:164.5pt;height:36.5pt;z-index:251659264;visibility:visible;mso-wrap-style:square;mso-width-percent:0;mso-height-percent:0;mso-wrap-distance-left:9pt;mso-wrap-distance-top:0;mso-wrap-distance-right:9pt;mso-wrap-distance-bottom:0;mso-position-horizontal:absolute;mso-position-horizontal-relative:text;mso-position-vertical:absolute;mso-position-vertical-relative:text;mso-width-percent:0;mso-height-percent:0;mso-width-relative:margin;mso-height-relative:margin;v-text-anchor:middle" o:gfxdata="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" fillcolor="#156082 [3204]" strokecolor="#030e13 [484]" strokeweight="1.5pt"/>
             </w:pict>
           </mc:Fallback>
         </mc:AlternateContent>
@@ -5486,7 +5457,7 @@
           </mc:Choice>
           <mc:Fallback>
             <w:pict>
-              <v:line w14:anchorId="6CCCF558" id="Straight Connector 25" o:spid="_x0000_s1026" style="position:absolute;z-index:251671040;visibility:visible;mso-wrap-style:square;mso-width-percent:0;mso-height-percent:0;mso-wrap-distance-left:9pt;mso-wrap-distance-top:0;mso-wrap-distance-right:9pt;mso-wrap-distance-bottom:0;mso-position-horizontal:absolute;mso-position-horizontal-relative:text;mso-position-vertical:absolute;mso-position-vertical-relative:text;mso-width-percent:0;mso-height-percent:0;mso-width-relative:margin;mso-height-relative:margin" from="229.5pt,4.25pt" to="230pt,35.25pt" o:gfxdata="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" strokecolor="#156082 [3204]" strokeweight="1.5pt">
+              <v:line w14:anchorId="6C2A105C" id="Straight Connector 25" o:spid="_x0000_s1026" style="position:absolute;z-index:251671040;visibility:visible;mso-wrap-style:square;mso-width-percent:0;mso-height-percent:0;mso-wrap-distance-left:9pt;mso-wrap-distance-top:0;mso-wrap-distance-right:9pt;mso-wrap-distance-bottom:0;mso-position-horizontal:absolute;mso-position-horizontal-relative:text;mso-position-vertical:absolute;mso-position-vertical-relative:text;mso-width-percent:0;mso-height-percent:0;mso-width-relative:margin;mso-height-relative:margin" from="229.5pt,4.25pt" to="230pt,35.25pt" o:gfxdata="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" strokecolor="#156082 [3204]" strokeweight="1.5pt">
                 <v:stroke joinstyle="miter"/>
               </v:line>
             </w:pict>
@@ -5564,7 +5535,7 @@
           </mc:Choice>
           <mc:Fallback>
             <w:pict>
-              <v:oval w14:anchorId="0AE7492B" id="Oval 26" o:spid="_x0000_s1026" style="position:absolute;margin-left:176.5pt;margin-top:10.1pt;width:106.5pt;height:37.5pt;z-index:251665408;visibility:visible;mso-wrap-style:square;mso-width-percent:0;mso-wrap-distance-left:9pt;mso-wrap-distance-top:0;mso-wrap-distance-right:9pt;mso-wrap-distance-bottom:0;mso-position-horizontal:absolute;mso-position-horizontal-relative:text;mso-position-vertical:absolute;mso-position-vertical-relative:text;mso-width-percent:0;mso-width-relative:margin;v-text-anchor:middle" o:gfxdata="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" fillcolor="#156082 [3204]" strokecolor="#030e13 [484]" strokeweight="1.5pt">
+              <v:oval w14:anchorId="0F68E547" id="Oval 26" o:spid="_x0000_s1026" style="position:absolute;margin-left:176.5pt;margin-top:10.1pt;width:106.5pt;height:37.5pt;z-index:251665408;visibility:visible;mso-wrap-style:square;mso-width-percent:0;mso-wrap-distance-left:9pt;mso-wrap-distance-top:0;mso-wrap-distance-right:9pt;mso-wrap-distance-bottom:0;mso-position-horizontal:absolute;mso-position-horizontal-relative:text;mso-position-vertical:absolute;mso-position-vertical-relative:text;mso-width-percent:0;mso-width-relative:margin;v-text-anchor:middle" o:gfxdata="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" fillcolor="#156082 [3204]" strokecolor="#030e13 [484]" strokeweight="1.5pt">
                 <v:stroke joinstyle="miter"/>
               </v:oval>
             </w:pict>
@@ -5856,7 +5827,7 @@
           </mc:Choice>
           <mc:Fallback>
             <w:pict>
-              <v:oval w14:anchorId="0C74F1AF" id="Oval 28" o:spid="_x0000_s1026" style="position:absolute;margin-left:177.5pt;margin-top:4.85pt;width:103.5pt;height:37.5pt;z-index:251672064;visibility:visible;mso-wrap-style:square;mso-width-percent:0;mso-wrap-distance-left:9pt;mso-wrap-distance-top:0;mso-wrap-distance-right:9pt;mso-wrap-distance-bottom:0;mso-position-horizontal:absolute;mso-position-horizontal-relative:text;mso-position-vertical:absolute;mso-position-vertical-relative:text;mso-width-percent:0;mso-width-relative:margin;v-text-anchor:middle" o:gfxdata="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" fillcolor="#156082 [3204]" strokecolor="#030e13 [484]" strokeweight="1.5pt">
+              <v:oval w14:anchorId="24BA4CAF" id="Oval 28" o:spid="_x0000_s1026" style="position:absolute;margin-left:177.5pt;margin-top:4.85pt;width:103.5pt;height:37.5pt;z-index:251672064;visibility:visible;mso-wrap-style:square;mso-width-percent:0;mso-wrap-distance-left:9pt;mso-wrap-distance-top:0;mso-wrap-distance-right:9pt;mso-wrap-distance-bottom:0;mso-position-horizontal:absolute;mso-position-horizontal-relative:text;mso-position-vertical:absolute;mso-position-vertical-relative:text;mso-width-percent:0;mso-width-relative:margin;v-text-anchor:middle" o:gfxdata="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" fillcolor="#156082 [3204]" strokecolor="#030e13 [484]" strokeweight="1.5pt">
                 <v:stroke joinstyle="miter"/>
               </v:oval>
             </w:pict>
@@ -5932,7 +5903,7 @@
           </mc:Choice>
           <mc:Fallback>
             <w:pict>
-              <v:line w14:anchorId="7C064A79" id="Straight Connector 30" o:spid="_x0000_s1026" style="position:absolute;z-index:251674112;visibility:visible;mso-wrap-style:square;mso-wrap-distance-left:9pt;mso-wrap-distance-top:0;mso-wrap-distance-right:9pt;mso-wrap-distance-bottom:0;mso-position-horizontal:absolute;mso-position-horizontal-relative:text;mso-position-vertical:absolute;mso-position-vertical-relative:text" from="228.5pt,19.2pt" to="229pt,41.7pt" o:gfxdata="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" strokecolor="#156082 [3204]" strokeweight="1.5pt">
+              <v:line w14:anchorId="03264E1A" id="Straight Connector 30" o:spid="_x0000_s1026" style="position:absolute;z-index:251674112;visibility:visible;mso-wrap-style:square;mso-wrap-distance-left:9pt;mso-wrap-distance-top:0;mso-wrap-distance-right:9pt;mso-wrap-distance-bottom:0;mso-position-horizontal:absolute;mso-position-horizontal-relative:text;mso-position-vertical:absolute;mso-position-vertical-relative:text" from="228.5pt,19.2pt" to="229pt,41.7pt" o:gfxdata="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" strokecolor="#156082 [3204]" strokeweight="1.5pt">
                 <v:stroke joinstyle="miter"/>
               </v:line>
             </w:pict>
@@ -6021,7 +5992,7 @@
           </mc:Choice>
           <mc:Fallback>
             <w:pict>
-              <v:rect w14:anchorId="70C63BD1" id="Rectangle 31" o:spid="_x0000_s1026" style="position:absolute;margin-left:142.5pt;margin-top:18.55pt;width:173pt;height:32.5pt;z-index:251675136;visibility:visible;mso-wrap-style:square;mso-width-percent:0;mso-height-percent:0;mso-wrap-distance-left:9pt;mso-wrap-distance-top:0;mso-wrap-distance-right:9pt;mso-wrap-distance-bottom:0;mso-position-horizontal:absolute;mso-position-horizontal-relative:text;mso-position-vertical:absolute;mso-position-vertical-relative:text;mso-width-percent:0;mso-height-percent:0;mso-width-relative:margin;mso-height-relative:margin;v-text-anchor:middle" o:gfxdata="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" fillcolor="#156082 [3204]" strokecolor="#030e13 [484]" strokeweight="1.5pt"/>
+              <v:rect w14:anchorId="5CACD7CF" id="Rectangle 31" o:spid="_x0000_s1026" style="position:absolute;margin-left:142.5pt;margin-top:18.55pt;width:173pt;height:32.5pt;z-index:251675136;visibility:visible;mso-wrap-style:square;mso-width-percent:0;mso-height-percent:0;mso-wrap-distance-left:9pt;mso-wrap-distance-top:0;mso-wrap-distance-right:9pt;mso-wrap-distance-bottom:0;mso-position-horizontal:absolute;mso-position-horizontal-relative:text;mso-position-vertical:absolute;mso-position-vertical-relative:text;mso-width-percent:0;mso-height-percent:0;mso-width-relative:margin;mso-height-relative:margin;v-text-anchor:middle" o:gfxdata="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" fillcolor="#156082 [3204]" strokecolor="#030e13 [484]" strokeweight="1.5pt"/>
             </w:pict>
           </mc:Fallback>
         </mc:AlternateContent>
@@ -6180,7 +6151,7 @@
           </mc:Choice>
           <mc:Fallback>
             <w:pict>
-              <v:line w14:anchorId="6E95489C" id="Straight Connector 34" o:spid="_x0000_s1026" style="position:absolute;z-index:251677184;visibility:visible;mso-wrap-style:square;mso-width-percent:0;mso-height-percent:0;mso-wrap-distance-left:9pt;mso-wrap-distance-top:0;mso-wrap-distance-right:9pt;mso-wrap-distance-bottom:0;mso-position-horizontal:absolute;mso-position-horizontal-relative:text;mso-position-vertical:absolute;mso-position-vertical-relative:text;mso-width-percent:0;mso-height-percent:0;mso-width-relative:margin;mso-height-relative:margin" from="229pt,5.25pt" to="230pt,35.75pt" o:gfxdata="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" strokecolor="#156082 [3204]" strokeweight="1.5pt">
+              <v:line w14:anchorId="6E4AF248" id="Straight Connector 34" o:spid="_x0000_s1026" style="position:absolute;z-index:251677184;visibility:visible;mso-wrap-style:square;mso-width-percent:0;mso-height-percent:0;mso-wrap-distance-left:9pt;mso-wrap-distance-top:0;mso-wrap-distance-right:9pt;mso-wrap-distance-bottom:0;mso-position-horizontal:absolute;mso-position-horizontal-relative:text;mso-position-vertical:absolute;mso-position-vertical-relative:text;mso-width-percent:0;mso-height-percent:0;mso-width-relative:margin;mso-height-relative:margin" from="229pt,5.25pt" to="230pt,35.75pt" o:gfxdata="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" strokecolor="#156082 [3204]" strokeweight="1.5pt">
                 <v:stroke joinstyle="miter"/>
               </v:line>
             </w:pict>
@@ -6261,7 +6232,7 @@
           </mc:Choice>
           <mc:Fallback>
             <w:pict>
-              <v:shape w14:anchorId="42DD3BCC" id="Diamond 35" o:spid="_x0000_s1026" type="#_x0000_t4" style="position:absolute;margin-left:125pt;margin-top:10.1pt;width:211pt;height:60pt;z-index:251678208;visibility:visible;mso-wrap-style:square;mso-width-percent:0;mso-height-percent:0;mso-wrap-distance-left:9pt;mso-wrap-distance-top:0;mso-wrap-distance-right:9pt;mso-wrap-distance-bottom:0;mso-position-horizontal:absolute;mso-position-horizontal-relative:text;mso-position-vertical:absolute;mso-position-vertical-relative:text;mso-width-percent:0;mso-height-percent:0;mso-width-relative:margin;mso-height-relative:margin;v-text-anchor:middle" o:gfxdata="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" fillcolor="#156082 [3204]" strokecolor="#030e13 [484]" strokeweight="1.5pt"/>
+              <v:shape w14:anchorId="4AD841DD" id="Diamond 35" o:spid="_x0000_s1026" type="#_x0000_t4" style="position:absolute;margin-left:125pt;margin-top:10.1pt;width:211pt;height:60pt;z-index:251678208;visibility:visible;mso-wrap-style:square;mso-width-percent:0;mso-height-percent:0;mso-wrap-distance-left:9pt;mso-wrap-distance-top:0;mso-wrap-distance-right:9pt;mso-wrap-distance-bottom:0;mso-position-horizontal:absolute;mso-position-horizontal-relative:text;mso-position-vertical:absolute;mso-position-vertical-relative:text;mso-width-percent:0;mso-height-percent:0;mso-width-relative:margin;mso-height-relative:margin;v-text-anchor:middle" o:gfxdata="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" fillcolor="#156082 [3204]" strokecolor="#030e13 [484]" strokeweight="1.5pt"/>
             </w:pict>
           </mc:Fallback>
         </mc:AlternateContent>
@@ -6425,7 +6396,7 @@
           </mc:Choice>
           <mc:Fallback>
             <w:pict>
-              <v:line w14:anchorId="414CE575" id="Straight Connector 40" o:spid="_x0000_s1026" style="position:absolute;z-index:251680256;visibility:visible;mso-wrap-style:square;mso-wrap-distance-left:9pt;mso-wrap-distance-top:0;mso-wrap-distance-right:9pt;mso-wrap-distance-bottom:0;mso-position-horizontal:absolute;mso-position-horizontal-relative:text;mso-position-vertical:absolute;mso-position-vertical-relative:text" from="230pt,1.15pt" to="230.5pt,25.65pt" o:gfxdata="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" strokecolor="#156082 [3204]" strokeweight="1.5pt">
+              <v:line w14:anchorId="15B7F128" id="Straight Connector 40" o:spid="_x0000_s1026" style="position:absolute;z-index:251680256;visibility:visible;mso-wrap-style:square;mso-wrap-distance-left:9pt;mso-wrap-distance-top:0;mso-wrap-distance-right:9pt;mso-wrap-distance-bottom:0;mso-position-horizontal:absolute;mso-position-horizontal-relative:text;mso-position-vertical:absolute;mso-position-vertical-relative:text" from="230pt,1.15pt" to="230.5pt,25.65pt" o:gfxdata="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" strokecolor="#156082 [3204]" strokeweight="1.5pt">
                 <v:stroke joinstyle="miter"/>
               </v:line>
             </w:pict>
@@ -6591,7 +6562,7 @@
           </mc:Choice>
           <mc:Fallback>
             <w:pict>
-              <v:rect w14:anchorId="63B53A19" id="Rectangle 41" o:spid="_x0000_s1026" style="position:absolute;margin-left:156pt;margin-top:3.5pt;width:151pt;height:32.5pt;z-index:251681280;visibility:visible;mso-wrap-style:square;mso-width-percent:0;mso-height-percent:0;mso-wrap-distance-left:9pt;mso-wrap-distance-top:0;mso-wrap-distance-right:9pt;mso-wrap-distance-bottom:0;mso-position-horizontal:absolute;mso-position-horizontal-relative:text;mso-position-vertical:absolute;mso-position-vertical-relative:text;mso-width-percent:0;mso-height-percent:0;mso-width-relative:margin;mso-height-relative:margin;v-text-anchor:middle" o:gfxdata="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" fillcolor="#156082 [3204]" strokecolor="#030e13 [484]" strokeweight="1.5pt"/>
+              <v:rect w14:anchorId="1B84086B" id="Rectangle 41" o:spid="_x0000_s1026" style="position:absolute;margin-left:156pt;margin-top:3.5pt;width:151pt;height:32.5pt;z-index:251681280;visibility:visible;mso-wrap-style:square;mso-width-percent:0;mso-height-percent:0;mso-wrap-distance-left:9pt;mso-wrap-distance-top:0;mso-wrap-distance-right:9pt;mso-wrap-distance-bottom:0;mso-position-horizontal:absolute;mso-position-horizontal-relative:text;mso-position-vertical:absolute;mso-position-vertical-relative:text;mso-width-percent:0;mso-height-percent:0;mso-width-relative:margin;mso-height-relative:margin;v-text-anchor:middle" o:gfxdata="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" fillcolor="#156082 [3204]" strokecolor="#030e13 [484]" strokeweight="1.5pt"/>
             </w:pict>
           </mc:Fallback>
         </mc:AlternateContent>
@@ -6657,7 +6628,7 @@
           </mc:Choice>
           <mc:Fallback>
             <w:pict>
-              <v:line w14:anchorId="29CCB970" id="Straight Connector 43" o:spid="_x0000_s1026" style="position:absolute;z-index:251683328;visibility:visible;mso-wrap-style:square;mso-wrap-distance-left:9pt;mso-wrap-distance-top:0;mso-wrap-distance-right:9pt;mso-wrap-distance-bottom:0;mso-position-horizontal:absolute;mso-position-horizontal-relative:text;mso-position-vertical:absolute;mso-position-vertical-relative:text" from="229.5pt,13.85pt" to="230pt,36.85pt" o:gfxdata="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" strokecolor="#156082 [3204]" strokeweight="1.5pt">
+              <v:line w14:anchorId="011CD86E" id="Straight Connector 43" o:spid="_x0000_s1026" style="position:absolute;z-index:251683328;visibility:visible;mso-wrap-style:square;mso-wrap-distance-left:9pt;mso-wrap-distance-top:0;mso-wrap-distance-right:9pt;mso-wrap-distance-bottom:0;mso-position-horizontal:absolute;mso-position-horizontal-relative:text;mso-position-vertical:absolute;mso-position-vertical-relative:text" from="229.5pt,13.85pt" to="230pt,36.85pt" o:gfxdata="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" strokecolor="#156082 [3204]" strokeweight="1.5pt">
                 <v:stroke joinstyle="miter"/>
               </v:line>
             </w:pict>
@@ -6738,7 +6709,7 @@
           </mc:Choice>
           <mc:Fallback>
             <w:pict>
-              <v:rect w14:anchorId="3E42CC5B" id="Rectangle 44" o:spid="_x0000_s1026" style="position:absolute;margin-left:157.5pt;margin-top:14.7pt;width:154pt;height:31.5pt;z-index:251684352;visibility:visible;mso-wrap-style:square;mso-width-percent:0;mso-height-percent:0;mso-wrap-distance-left:9pt;mso-wrap-distance-top:0;mso-wrap-distance-right:9pt;mso-wrap-distance-bottom:0;mso-position-horizontal:absolute;mso-position-horizontal-relative:text;mso-position-vertical:absolute;mso-position-vertical-relative:text;mso-width-percent:0;mso-height-percent:0;mso-width-relative:margin;mso-height-relative:margin;v-text-anchor:middle" o:gfxdata="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" fillcolor="#156082 [3204]" strokecolor="#030e13 [484]" strokeweight="1.5pt"/>
+              <v:rect w14:anchorId="19BBA085" id="Rectangle 44" o:spid="_x0000_s1026" style="position:absolute;margin-left:157.5pt;margin-top:14.7pt;width:154pt;height:31.5pt;z-index:251684352;visibility:visible;mso-wrap-style:square;mso-width-percent:0;mso-height-percent:0;mso-wrap-distance-left:9pt;mso-wrap-distance-top:0;mso-wrap-distance-right:9pt;mso-wrap-distance-bottom:0;mso-position-horizontal:absolute;mso-position-horizontal-relative:text;mso-position-vertical:absolute;mso-position-vertical-relative:text;mso-width-percent:0;mso-height-percent:0;mso-width-relative:margin;mso-height-relative:margin;v-text-anchor:middle" o:gfxdata="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" fillcolor="#156082 [3204]" strokecolor="#030e13 [484]" strokeweight="1.5pt"/>
             </w:pict>
           </mc:Fallback>
         </mc:AlternateContent>
@@ -6912,7 +6883,7 @@
           </mc:Choice>
           <mc:Fallback>
             <w:pict>
-              <v:line w14:anchorId="7E54D2B0" id="Straight Connector 46" o:spid="_x0000_s1026" style="position:absolute;z-index:251686400;visibility:visible;mso-wrap-style:square;mso-wrap-distance-left:9pt;mso-wrap-distance-top:0;mso-wrap-distance-right:9pt;mso-wrap-distance-bottom:0;mso-position-horizontal:absolute;mso-position-horizontal-relative:text;mso-position-vertical:absolute;mso-position-vertical-relative:text" from="230.5pt,1.4pt" to="231pt,30.4pt" o:gfxdata="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" strokecolor="#156082 [3204]" strokeweight="1.5pt">
+              <v:line w14:anchorId="46BA488D" id="Straight Connector 46" o:spid="_x0000_s1026" style="position:absolute;z-index:251686400;visibility:visible;mso-wrap-style:square;mso-wrap-distance-left:9pt;mso-wrap-distance-top:0;mso-wrap-distance-right:9pt;mso-wrap-distance-bottom:0;mso-position-horizontal:absolute;mso-position-horizontal-relative:text;mso-position-vertical:absolute;mso-position-vertical-relative:text" from="230.5pt,1.4pt" to="231pt,30.4pt" o:gfxdata="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" strokecolor="#156082 [3204]" strokeweight="1.5pt">
                 <v:stroke joinstyle="miter"/>
               </v:line>
             </w:pict>
@@ -6990,7 +6961,7 @@
           </mc:Choice>
           <mc:Fallback>
             <w:pict>
-              <v:oval w14:anchorId="16A82072" id="Oval 47" o:spid="_x0000_s1026" style="position:absolute;margin-left:175.5pt;margin-top:6.25pt;width:111.5pt;height:40.5pt;z-index:251687424;visibility:visible;mso-wrap-style:square;mso-width-percent:0;mso-wrap-distance-left:9pt;mso-wrap-distance-top:0;mso-wrap-distance-right:9pt;mso-wrap-distance-bottom:0;mso-position-horizontal:absolute;mso-position-horizontal-relative:text;mso-position-vertical:absolute;mso-position-vertical-relative:text;mso-width-percent:0;mso-width-relative:margin;v-text-anchor:middle" o:gfxdata="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" fillcolor="#156082 [3204]" strokecolor="#030e13 [484]" strokeweight="1.5pt">
+              <v:oval w14:anchorId="3258DBA1" id="Oval 47" o:spid="_x0000_s1026" style="position:absolute;margin-left:175.5pt;margin-top:6.25pt;width:111.5pt;height:40.5pt;z-index:251687424;visibility:visible;mso-wrap-style:square;mso-width-percent:0;mso-wrap-distance-left:9pt;mso-wrap-distance-top:0;mso-wrap-distance-right:9pt;mso-wrap-distance-bottom:0;mso-position-horizontal:absolute;mso-position-horizontal-relative:text;mso-position-vertical:absolute;mso-position-vertical-relative:text;mso-width-percent:0;mso-width-relative:margin;v-text-anchor:middle" o:gfxdata="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" fillcolor="#156082 [3204]" strokecolor="#030e13 [484]" strokeweight="1.5pt">
                 <v:stroke joinstyle="miter"/>
               </v:oval>
             </w:pict>
@@ -7278,7 +7249,7 @@
           </mc:Choice>
           <mc:Fallback>
             <w:pict>
-              <v:oval w14:anchorId="6DF655B0" id="Oval 49" o:spid="_x0000_s1026" style="position:absolute;margin-left:183.5pt;margin-top:1.55pt;width:87.5pt;height:41.5pt;z-index:251689472;visibility:visible;mso-wrap-style:square;mso-width-percent:0;mso-wrap-distance-left:9pt;mso-wrap-distance-top:0;mso-wrap-distance-right:9pt;mso-wrap-distance-bottom:0;mso-position-horizontal:absolute;mso-position-horizontal-relative:text;mso-position-vertical:absolute;mso-position-vertical-relative:text;mso-width-percent:0;mso-width-relative:margin;v-text-anchor:middle" o:gfxdata="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" fillcolor="#156082 [3204]" strokecolor="#030e13 [484]" strokeweight="1.5pt">
+              <v:oval w14:anchorId="33B225D6" id="Oval 49" o:spid="_x0000_s1026" style="position:absolute;margin-left:183.5pt;margin-top:1.55pt;width:87.5pt;height:41.5pt;z-index:251689472;visibility:visible;mso-wrap-style:square;mso-width-percent:0;mso-wrap-distance-left:9pt;mso-wrap-distance-top:0;mso-wrap-distance-right:9pt;mso-wrap-distance-bottom:0;mso-position-horizontal:absolute;mso-position-horizontal-relative:text;mso-position-vertical:absolute;mso-position-vertical-relative:text;mso-width-percent:0;mso-width-relative:margin;v-text-anchor:middle" o:gfxdata="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" fillcolor="#156082 [3204]" strokecolor="#030e13 [484]" strokeweight="1.5pt">
                 <v:stroke joinstyle="miter"/>
               </v:oval>
             </w:pict>
@@ -7346,7 +7317,7 @@
           </mc:Choice>
           <mc:Fallback>
             <w:pict>
-              <v:line w14:anchorId="476E8B96" id="Straight Connector 51" o:spid="_x0000_s1026" style="position:absolute;z-index:251691520;visibility:visible;mso-wrap-style:square;mso-wrap-distance-left:9pt;mso-wrap-distance-top:0;mso-wrap-distance-right:9pt;mso-wrap-distance-bottom:0;mso-position-horizontal:absolute;mso-position-horizontal-relative:text;mso-position-vertical:absolute;mso-position-vertical-relative:text" from="227pt,20.9pt" to="227.5pt,40.9pt" o:gfxdata="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" strokecolor="#156082 [3204]" strokeweight="1.5pt">
+              <v:line w14:anchorId="2882D1B4" id="Straight Connector 51" o:spid="_x0000_s1026" style="position:absolute;z-index:251691520;visibility:visible;mso-wrap-style:square;mso-wrap-distance-left:9pt;mso-wrap-distance-top:0;mso-wrap-distance-right:9pt;mso-wrap-distance-bottom:0;mso-position-horizontal:absolute;mso-position-horizontal-relative:text;mso-position-vertical:absolute;mso-position-vertical-relative:text" from="227pt,20.9pt" to="227.5pt,40.9pt" o:gfxdata="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" strokecolor="#156082 [3204]" strokeweight="1.5pt">
                 <v:stroke joinstyle="miter"/>
               </v:line>
             </w:pict>
@@ -7427,7 +7398,7 @@
           </mc:Choice>
           <mc:Fallback>
             <w:pict>
-              <v:shape w14:anchorId="0A3AAB0D" id="Diamond 52" o:spid="_x0000_s1026" type="#_x0000_t4" style="position:absolute;margin-left:133.5pt;margin-top:17.75pt;width:190.5pt;height:51.5pt;z-index:251692544;visibility:visible;mso-wrap-style:square;mso-width-percent:0;mso-height-percent:0;mso-wrap-distance-left:9pt;mso-wrap-distance-top:0;mso-wrap-distance-right:9pt;mso-wrap-distance-bottom:0;mso-position-horizontal:absolute;mso-position-horizontal-relative:text;mso-position-vertical:absolute;mso-position-vertical-relative:text;mso-width-percent:0;mso-height-percent:0;mso-width-relative:margin;mso-height-relative:margin;v-text-anchor:middle" o:gfxdata="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" fillcolor="#156082 [3204]" strokecolor="#030e13 [484]" strokeweight="1.5pt"/>
+              <v:shape w14:anchorId="16F91628" id="Diamond 52" o:spid="_x0000_s1026" type="#_x0000_t4" style="position:absolute;margin-left:133.5pt;margin-top:17.75pt;width:190.5pt;height:51.5pt;z-index:251692544;visibility:visible;mso-wrap-style:square;mso-width-percent:0;mso-height-percent:0;mso-wrap-distance-left:9pt;mso-wrap-distance-top:0;mso-wrap-distance-right:9pt;mso-wrap-distance-bottom:0;mso-position-horizontal:absolute;mso-position-horizontal-relative:text;mso-position-vertical:absolute;mso-position-vertical-relative:text;mso-width-percent:0;mso-height-percent:0;mso-width-relative:margin;mso-height-relative:margin;v-text-anchor:middle" o:gfxdata="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" fillcolor="#156082 [3204]" strokecolor="#030e13 [484]" strokeweight="1.5pt"/>
             </w:pict>
           </mc:Fallback>
         </mc:AlternateContent>
@@ -7602,7 +7573,7 @@
           </mc:Choice>
           <mc:Fallback>
             <w:pict>
-              <v:line w14:anchorId="50B87054" id="Straight Connector 54" o:spid="_x0000_s1026" style="position:absolute;z-index:251694592;visibility:visible;mso-wrap-style:square;mso-width-percent:0;mso-height-percent:0;mso-wrap-distance-left:9pt;mso-wrap-distance-top:0;mso-wrap-distance-right:9pt;mso-wrap-distance-bottom:0;mso-position-horizontal:absolute;mso-position-horizontal-relative:text;mso-position-vertical:absolute;mso-position-vertical-relative:text;mso-width-percent:0;mso-height-percent:0;mso-width-relative:margin;mso-height-relative:margin" from="228pt,8.3pt" to="228.5pt,29.8pt" o:gfxdata="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" strokecolor="#156082 [3204]" strokeweight="1.5pt">
+              <v:line w14:anchorId="624C3F32" id="Straight Connector 54" o:spid="_x0000_s1026" style="position:absolute;z-index:251694592;visibility:visible;mso-wrap-style:square;mso-width-percent:0;mso-height-percent:0;mso-wrap-distance-left:9pt;mso-wrap-distance-top:0;mso-wrap-distance-right:9pt;mso-wrap-distance-bottom:0;mso-position-horizontal:absolute;mso-position-horizontal-relative:text;mso-position-vertical:absolute;mso-position-vertical-relative:text;mso-width-percent:0;mso-height-percent:0;mso-width-relative:margin;mso-height-relative:margin" from="228pt,8.3pt" to="228.5pt,29.8pt" o:gfxdata="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" strokecolor="#156082 [3204]" strokeweight="1.5pt">
                 <v:stroke joinstyle="miter"/>
               </v:line>
             </w:pict>
@@ -7683,7 +7654,7 @@
           </mc:Choice>
           <mc:Fallback>
             <w:pict>
-              <v:rect w14:anchorId="0A1D2CAF" id="Rectangle 55" o:spid="_x0000_s1026" style="position:absolute;margin-left:168.5pt;margin-top:7.65pt;width:122pt;height:33.5pt;z-index:251695616;visibility:visible;mso-wrap-style:square;mso-width-percent:0;mso-height-percent:0;mso-wrap-distance-left:9pt;mso-wrap-distance-top:0;mso-wrap-distance-right:9pt;mso-wrap-distance-bottom:0;mso-position-horizontal:absolute;mso-position-horizontal-relative:text;mso-position-vertical:absolute;mso-position-vertical-relative:text;mso-width-percent:0;mso-height-percent:0;mso-width-relative:margin;mso-height-relative:margin;v-text-anchor:middle" o:gfxdata="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" fillcolor="#156082 [3204]" strokecolor="#030e13 [484]" strokeweight="1.5pt"/>
+              <v:rect w14:anchorId="3054C5B9" id="Rectangle 55" o:spid="_x0000_s1026" style="position:absolute;margin-left:168.5pt;margin-top:7.65pt;width:122pt;height:33.5pt;z-index:251695616;visibility:visible;mso-wrap-style:square;mso-width-percent:0;mso-height-percent:0;mso-wrap-distance-left:9pt;mso-wrap-distance-top:0;mso-wrap-distance-right:9pt;mso-wrap-distance-bottom:0;mso-position-horizontal:absolute;mso-position-horizontal-relative:text;mso-position-vertical:absolute;mso-position-vertical-relative:text;mso-width-percent:0;mso-height-percent:0;mso-width-relative:margin;mso-height-relative:margin;v-text-anchor:middle" o:gfxdata="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" fillcolor="#156082 [3204]" strokecolor="#030e13 [484]" strokeweight="1.5pt"/>
             </w:pict>
           </mc:Fallback>
         </mc:AlternateContent>
@@ -7837,7 +7808,7 @@
           </mc:Choice>
           <mc:Fallback>
             <w:pict>
-              <v:line w14:anchorId="0F5F182E" id="Straight Connector 57" o:spid="_x0000_s1026" style="position:absolute;flip:x;z-index:251697664;visibility:visible;mso-wrap-style:square;mso-width-percent:0;mso-height-percent:0;mso-wrap-distance-left:9pt;mso-wrap-distance-top:0;mso-wrap-distance-right:9pt;mso-wrap-distance-bottom:0;mso-position-horizontal:absolute;mso-position-horizontal-relative:text;mso-position-vertical:absolute;mso-position-vertical-relative:text;mso-width-percent:0;mso-height-percent:0;mso-width-relative:margin;mso-height-relative:margin" from="227.5pt,19.5pt" to="227.5pt,40pt" o:gfxdata="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" strokecolor="#156082 [3204]" strokeweight="1.5pt">
+              <v:line w14:anchorId="796D49DD" id="Straight Connector 57" o:spid="_x0000_s1026" style="position:absolute;flip:x;z-index:251697664;visibility:visible;mso-wrap-style:square;mso-width-percent:0;mso-height-percent:0;mso-wrap-distance-left:9pt;mso-wrap-distance-top:0;mso-wrap-distance-right:9pt;mso-wrap-distance-bottom:0;mso-position-horizontal:absolute;mso-position-horizontal-relative:text;mso-position-vertical:absolute;mso-position-vertical-relative:text;mso-width-percent:0;mso-height-percent:0;mso-width-relative:margin;mso-height-relative:margin" from="227.5pt,19.5pt" to="227.5pt,40pt" o:gfxdata="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" strokecolor="#156082 [3204]" strokeweight="1.5pt">
                 <v:stroke joinstyle="miter"/>
               </v:line>
             </w:pict>
@@ -7915,7 +7886,7 @@
           </mc:Choice>
           <mc:Fallback>
             <w:pict>
-              <v:rect w14:anchorId="63837869" id="Rectangle 58" o:spid="_x0000_s1026" style="position:absolute;margin-left:142pt;margin-top:13.5pt;width:169.5pt;height:32pt;z-index:251698688;visibility:visible;mso-wrap-style:square;mso-width-percent:0;mso-height-percent:0;mso-wrap-distance-left:9pt;mso-wrap-distance-top:0;mso-wrap-distance-right:9pt;mso-wrap-distance-bottom:0;mso-position-horizontal:absolute;mso-position-horizontal-relative:text;mso-position-vertical:absolute;mso-position-vertical-relative:text;mso-width-percent:0;mso-height-percent:0;mso-width-relative:margin;mso-height-relative:margin;v-text-anchor:middle" o:gfxdata="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" fillcolor="#156082 [3204]" strokecolor="#030e13 [484]" strokeweight="1.5pt"/>
+              <v:rect w14:anchorId="69C9F434" id="Rectangle 58" o:spid="_x0000_s1026" style="position:absolute;margin-left:142pt;margin-top:13.5pt;width:169.5pt;height:32pt;z-index:251698688;visibility:visible;mso-wrap-style:square;mso-width-percent:0;mso-height-percent:0;mso-wrap-distance-left:9pt;mso-wrap-distance-top:0;mso-wrap-distance-right:9pt;mso-wrap-distance-bottom:0;mso-position-horizontal:absolute;mso-position-horizontal-relative:text;mso-position-vertical:absolute;mso-position-vertical-relative:text;mso-width-percent:0;mso-height-percent:0;mso-width-relative:margin;mso-height-relative:margin;v-text-anchor:middle" o:gfxdata="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" fillcolor="#156082 [3204]" strokecolor="#030e13 [484]" strokeweight="1.5pt"/>
             </w:pict>
           </mc:Fallback>
         </mc:AlternateContent>
@@ -8072,7 +8043,7 @@
           </mc:Choice>
           <mc:Fallback>
             <w:pict>
-              <v:line w14:anchorId="0BEEC4E5" id="Straight Connector 60" o:spid="_x0000_s1026" style="position:absolute;z-index:251700736;visibility:visible;mso-wrap-style:square;mso-width-percent:0;mso-height-percent:0;mso-wrap-distance-left:9pt;mso-wrap-distance-top:0;mso-wrap-distance-right:9pt;mso-wrap-distance-bottom:0;mso-position-horizontal:absolute;mso-position-horizontal-relative:margin;mso-position-vertical:absolute;mso-position-vertical-relative:text;mso-width-percent:0;mso-height-percent:0;mso-width-relative:margin;mso-height-relative:margin" from="227pt,19.05pt" to="227pt,41.05pt" o:gfxdata="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" strokecolor="#156082 [3204]" strokeweight="1.5pt">
+              <v:line w14:anchorId="529B7FED" id="Straight Connector 60" o:spid="_x0000_s1026" style="position:absolute;z-index:251700736;visibility:visible;mso-wrap-style:square;mso-width-percent:0;mso-height-percent:0;mso-wrap-distance-left:9pt;mso-wrap-distance-top:0;mso-wrap-distance-right:9pt;mso-wrap-distance-bottom:0;mso-position-horizontal:absolute;mso-position-horizontal-relative:margin;mso-position-vertical:absolute;mso-position-vertical-relative:text;mso-width-percent:0;mso-height-percent:0;mso-width-relative:margin;mso-height-relative:margin" from="227pt,19.05pt" to="227pt,41.05pt" o:gfxdata="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" strokecolor="#156082 [3204]" strokeweight="1.5pt">
                 <v:stroke joinstyle="miter"/>
                 <w10:wrap anchorx="margin"/>
               </v:line>
@@ -8089,13 +8060,13 @@
         <mc:AlternateContent>
           <mc:Choice Requires="wps">
             <w:drawing>
-              <wp:anchor distT="0" distB="0" distL="114300" distR="114300" simplePos="0" relativeHeight="251701760" behindDoc="0" locked="0" layoutInCell="1" allowOverlap="1" wp14:anchorId="02E14BB0" wp14:editId="2DFA279F">
+              <wp:anchor distT="0" distB="0" distL="114300" distR="114300" simplePos="0" relativeHeight="251701760" behindDoc="0" locked="0" layoutInCell="1" allowOverlap="1" wp14:anchorId="02E14BB0" wp14:editId="2ED85953">
                 <wp:simplePos x="0" y="0"/>
                 <wp:positionH relativeFrom="column">
                   <wp:posOffset>2260600</wp:posOffset>
                 </wp:positionH>
-                <wp:positionV relativeFrom="paragraph">
-                  <wp:posOffset>217170</wp:posOffset>
+                <wp:positionV relativeFrom="page">
+                  <wp:posOffset>9747250</wp:posOffset>
                 </wp:positionV>
                 <wp:extent cx="1295400" cy="438150"/>
                 <wp:effectExtent l="0" t="0" r="19050" b="19050"/>
@@ -8151,8 +8122,9 @@
           </mc:Choice>
           <mc:Fallback>
             <w:pict>
-              <v:oval w14:anchorId="25D74B7A" id="Oval 61" o:spid="_x0000_s1026" style="position:absolute;margin-left:178pt;margin-top:17.1pt;width:102pt;height:34.5pt;z-index:251701760;visibility:visible;mso-wrap-style:square;mso-width-percent:0;mso-height-percent:0;mso-wrap-distance-left:9pt;mso-wrap-distance-top:0;mso-wrap-distance-right:9pt;mso-wrap-distance-bottom:0;mso-position-horizontal:absolute;mso-position-horizontal-relative:text;mso-position-vertical:absolute;mso-position-vertical-relative:text;mso-width-percent:0;mso-height-percent:0;mso-width-relative:margin;mso-height-relative:margin;v-text-anchor:middle" o:gfxdata="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" fillcolor="#156082 [3204]" strokecolor="#030e13 [484]" strokeweight="1.5pt">
+              <v:oval w14:anchorId="1ABEF9A1" id="Oval 61" o:spid="_x0000_s1026" style="position:absolute;margin-left:178pt;margin-top:767.5pt;width:102pt;height:34.5pt;z-index:251701760;visibility:visible;mso-wrap-style:square;mso-width-percent:0;mso-height-percent:0;mso-wrap-distance-left:9pt;mso-wrap-distance-top:0;mso-wrap-distance-right:9pt;mso-wrap-distance-bottom:0;mso-position-horizontal:absolute;mso-position-horizontal-relative:text;mso-position-vertical:absolute;mso-position-vertical-relative:page;mso-width-percent:0;mso-height-percent:0;mso-width-relative:margin;mso-height-relative:margin;v-text-anchor:middle" o:gfxdata="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" fillcolor="#156082 [3204]" strokecolor="#030e13 [484]" strokeweight="1.5pt">
                 <v:stroke joinstyle="miter"/>
+                <w10:wrap anchory="page"/>
               </v:oval>
             </w:pict>
           </mc:Fallback>
@@ -8165,13 +8137,13 @@
         <mc:AlternateContent>
           <mc:Choice Requires="wps">
             <w:drawing>
-              <wp:anchor distT="0" distB="0" distL="114300" distR="114300" simplePos="0" relativeHeight="251702784" behindDoc="0" locked="0" layoutInCell="1" allowOverlap="1" wp14:anchorId="3C48ED7E" wp14:editId="4CC2230B">
+              <wp:anchor distT="0" distB="0" distL="114300" distR="114300" simplePos="0" relativeHeight="251702784" behindDoc="0" locked="0" layoutInCell="1" allowOverlap="1" wp14:anchorId="3C48ED7E" wp14:editId="181ABAEB">
                 <wp:simplePos x="0" y="0"/>
                 <wp:positionH relativeFrom="column">
                   <wp:posOffset>2508250</wp:posOffset>
                 </wp:positionH>
-                <wp:positionV relativeFrom="paragraph">
-                  <wp:posOffset>287020</wp:posOffset>
+                <wp:positionV relativeFrom="page">
+                  <wp:posOffset>9817100</wp:posOffset>
                 </wp:positionV>
                 <wp:extent cx="812800" cy="298450"/>
                 <wp:effectExtent l="0" t="0" r="25400" b="25400"/>
@@ -8225,7 +8197,7 @@
           </mc:Choice>
           <mc:Fallback>
             <w:pict>
-              <v:shape w14:anchorId="3C48ED7E" id="Text Box 62" o:spid="_x0000_s1044" type="#_x0000_t202" style="position:absolute;margin-left:197.5pt;margin-top:22.6pt;width:64pt;height:23.5pt;z-index:251702784;visibility:visible;mso-wrap-style:square;mso-width-percent:0;mso-wrap-distance-left:9pt;mso-wrap-distance-top:0;mso-wrap-distance-right:9pt;mso-wrap-distance-bottom:0;mso-position-horizontal:absolute;mso-position-horizontal-relative:text;mso-position-vertical:absolute;mso-position-vertical-relative:text;mso-width-percent:0;mso-width-relative:margin;v-text-anchor:top" o:gfxdata="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" fillcolor="white [3201]" strokeweight=".5pt">
+              <v:shape w14:anchorId="3C48ED7E" id="Text Box 62" o:spid="_x0000_s1044" type="#_x0000_t202" style="position:absolute;margin-left:197.5pt;margin-top:773pt;width:64pt;height:23.5pt;z-index:251702784;visibility:visible;mso-wrap-style:square;mso-width-percent:0;mso-wrap-distance-left:9pt;mso-wrap-distance-top:0;mso-wrap-distance-right:9pt;mso-wrap-distance-bottom:0;mso-position-horizontal:absolute;mso-position-horizontal-relative:text;mso-position-vertical:absolute;mso-position-vertical-relative:page;mso-width-percent:0;mso-width-relative:margin;v-text-anchor:top" o:gfxdata="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" fillcolor="white [3201]" strokeweight=".5pt">
                 <v:textbox>
                   <w:txbxContent>
                     <w:p>
@@ -8235,13 +8207,4427 @@
                     </w:p>
                   </w:txbxContent>
                 </v:textbox>
+                <w10:wrap anchory="page"/>
               </v:shape>
             </w:pict>
           </mc:Fallback>
         </mc:AlternateContent>
       </w:r>
     </w:p>
-    <w:p/>
+    <w:tbl>
+      <w:tblPr>
+        <w:tblStyle w:val="PlainTable1"/>
+        <w:tblW w:w="12617" w:type="dxa"/>
+        <w:tblInd w:w="-572" w:type="dxa"/>
+        <w:tblLook w:val="04A0" w:firstRow="1" w:lastRow="0" w:firstColumn="1" w:lastColumn="0" w:noHBand="0" w:noVBand="1"/>
+      </w:tblPr>
+      <w:tblGrid>
+        <w:gridCol w:w="709"/>
+        <w:gridCol w:w="1659"/>
+        <w:gridCol w:w="1659"/>
+        <w:gridCol w:w="2352"/>
+        <w:gridCol w:w="851"/>
+        <w:gridCol w:w="992"/>
+        <w:gridCol w:w="1134"/>
+        <w:gridCol w:w="3261"/>
+      </w:tblGrid>
+      <w:tr>
+        <w:trPr>
+          <w:cnfStyle w:val="100000000000" w:firstRow="1" w:lastRow="0" w:firstColumn="0" w:lastColumn="0" w:oddVBand="0" w:evenVBand="0" w:oddHBand="0" w:evenHBand="0" w:firstRowFirstColumn="0" w:firstRowLastColumn="0" w:lastRowFirstColumn="0" w:lastRowLastColumn="0"/>
+          <w:trHeight w:val="290"/>
+        </w:trPr>
+        <w:tc>
+          <w:tcPr>
+            <w:cnfStyle w:val="001000000000" w:firstRow="0" w:lastRow="0" w:firstColumn="1" w:lastColumn="0" w:oddVBand="0" w:evenVBand="0" w:oddHBand="0" w:evenHBand="0" w:firstRowFirstColumn="0" w:firstRowLastColumn="0" w:lastRowFirstColumn="0" w:lastRowLastColumn="0"/>
+            <w:tcW w:w="709" w:type="dxa"/>
+            <w:noWrap/>
+            <w:hideMark/>
+          </w:tcPr>
+          <w:p>
+            <w:pPr>
+              <w:rPr>
+                <w:rFonts w:ascii="Calibri" w:eastAsia="Times New Roman" w:hAnsi="Calibri" w:cs="Calibri"/>
+                <w:color w:val="000000"/>
+                <w:kern w:val="0"/>
+                <w:sz w:val="22"/>
+                <w:szCs w:val="22"/>
+                <w:lang w:eastAsia="en-GB"/>
+                <w14:ligatures w14:val="none"/>
+              </w:rPr>
+            </w:pPr>
+            <w:r>
+              <w:rPr>
+                <w:rFonts w:ascii="Calibri" w:eastAsia="Times New Roman" w:hAnsi="Calibri" w:cs="Calibri"/>
+                <w:color w:val="000000"/>
+                <w:kern w:val="0"/>
+                <w:sz w:val="22"/>
+                <w:szCs w:val="22"/>
+                <w:lang w:eastAsia="en-GB"/>
+                <w14:ligatures w14:val="none"/>
+              </w:rPr>
+              <w:t>Ta</w:t>
+            </w:r>
+            <w:r>
+              <w:rPr>
+                <w:rFonts w:ascii="Calibri" w:eastAsia="Times New Roman" w:hAnsi="Calibri" w:cs="Calibri"/>
+                <w:color w:val="000000"/>
+                <w:kern w:val="0"/>
+                <w:sz w:val="22"/>
+                <w:szCs w:val="22"/>
+                <w:lang w:eastAsia="en-GB"/>
+                <w14:ligatures w14:val="none"/>
+              </w:rPr>
+              <w:t>s</w:t>
+            </w:r>
+            <w:r>
+              <w:rPr>
+                <w:rFonts w:ascii="Calibri" w:eastAsia="Times New Roman" w:hAnsi="Calibri" w:cs="Calibri"/>
+                <w:color w:val="000000"/>
+                <w:kern w:val="0"/>
+                <w:sz w:val="22"/>
+                <w:szCs w:val="22"/>
+                <w:lang w:eastAsia="en-GB"/>
+                <w14:ligatures w14:val="none"/>
+              </w:rPr>
+              <w:t>k ID</w:t>
+            </w:r>
+          </w:p>
+        </w:tc>
+        <w:tc>
+          <w:tcPr>
+            <w:tcW w:w="1659" w:type="dxa"/>
+            <w:noWrap/>
+            <w:hideMark/>
+          </w:tcPr>
+          <w:p>
+            <w:pPr>
+              <w:cnfStyle w:val="100000000000" w:firstRow="1" w:lastRow="0" w:firstColumn="0" w:lastColumn="0" w:oddVBand="0" w:evenVBand="0" w:oddHBand="0" w:evenHBand="0" w:firstRowFirstColumn="0" w:firstRowLastColumn="0" w:lastRowFirstColumn="0" w:lastRowLastColumn="0"/>
+              <w:rPr>
+                <w:rFonts w:ascii="Calibri" w:eastAsia="Times New Roman" w:hAnsi="Calibri" w:cs="Calibri"/>
+                <w:color w:val="000000"/>
+                <w:kern w:val="0"/>
+                <w:sz w:val="22"/>
+                <w:szCs w:val="22"/>
+                <w:lang w:eastAsia="en-GB"/>
+                <w14:ligatures w14:val="none"/>
+              </w:rPr>
+            </w:pPr>
+            <w:r>
+              <w:rPr>
+                <w:rFonts w:ascii="Calibri" w:eastAsia="Times New Roman" w:hAnsi="Calibri" w:cs="Calibri"/>
+                <w:color w:val="000000"/>
+                <w:kern w:val="0"/>
+                <w:sz w:val="22"/>
+                <w:szCs w:val="22"/>
+                <w:lang w:eastAsia="en-GB"/>
+                <w14:ligatures w14:val="none"/>
+              </w:rPr>
+              <w:t>Task Name</w:t>
+            </w:r>
+          </w:p>
+        </w:tc>
+        <w:tc>
+          <w:tcPr>
+            <w:tcW w:w="1659" w:type="dxa"/>
+            <w:noWrap/>
+            <w:hideMark/>
+          </w:tcPr>
+          <w:p>
+            <w:pPr>
+              <w:cnfStyle w:val="100000000000" w:firstRow="1" w:lastRow="0" w:firstColumn="0" w:lastColumn="0" w:oddVBand="0" w:evenVBand="0" w:oddHBand="0" w:evenHBand="0" w:firstRowFirstColumn="0" w:firstRowLastColumn="0" w:lastRowFirstColumn="0" w:lastRowLastColumn="0"/>
+              <w:rPr>
+                <w:rFonts w:ascii="Calibri" w:eastAsia="Times New Roman" w:hAnsi="Calibri" w:cs="Calibri"/>
+                <w:color w:val="000000"/>
+                <w:kern w:val="0"/>
+                <w:sz w:val="22"/>
+                <w:szCs w:val="22"/>
+                <w:lang w:eastAsia="en-GB"/>
+                <w14:ligatures w14:val="none"/>
+              </w:rPr>
+            </w:pPr>
+            <w:r>
+              <w:rPr>
+                <w:rFonts w:ascii="Calibri" w:eastAsia="Times New Roman" w:hAnsi="Calibri" w:cs="Calibri"/>
+                <w:color w:val="000000"/>
+                <w:kern w:val="0"/>
+                <w:sz w:val="22"/>
+                <w:szCs w:val="22"/>
+                <w:lang w:eastAsia="en-GB"/>
+                <w14:ligatures w14:val="none"/>
+              </w:rPr>
+              <w:t>Task Category</w:t>
+            </w:r>
+          </w:p>
+        </w:tc>
+        <w:tc>
+          <w:tcPr>
+            <w:tcW w:w="2352" w:type="dxa"/>
+            <w:noWrap/>
+            <w:hideMark/>
+          </w:tcPr>
+          <w:p>
+            <w:pPr>
+              <w:cnfStyle w:val="100000000000" w:firstRow="1" w:lastRow="0" w:firstColumn="0" w:lastColumn="0" w:oddVBand="0" w:evenVBand="0" w:oddHBand="0" w:evenHBand="0" w:firstRowFirstColumn="0" w:firstRowLastColumn="0" w:lastRowFirstColumn="0" w:lastRowLastColumn="0"/>
+              <w:rPr>
+                <w:rFonts w:ascii="Calibri" w:eastAsia="Times New Roman" w:hAnsi="Calibri" w:cs="Calibri"/>
+                <w:color w:val="000000"/>
+                <w:kern w:val="0"/>
+                <w:sz w:val="22"/>
+                <w:szCs w:val="22"/>
+                <w:lang w:eastAsia="en-GB"/>
+                <w14:ligatures w14:val="none"/>
+              </w:rPr>
+            </w:pPr>
+            <w:r>
+              <w:rPr>
+                <w:rFonts w:ascii="Calibri" w:eastAsia="Times New Roman" w:hAnsi="Calibri" w:cs="Calibri"/>
+                <w:color w:val="000000"/>
+                <w:kern w:val="0"/>
+                <w:sz w:val="22"/>
+                <w:szCs w:val="22"/>
+                <w:lang w:eastAsia="en-GB"/>
+                <w14:ligatures w14:val="none"/>
+              </w:rPr>
+              <w:t>Deliverable</w:t>
+            </w:r>
+          </w:p>
+        </w:tc>
+        <w:tc>
+          <w:tcPr>
+            <w:tcW w:w="851" w:type="dxa"/>
+            <w:noWrap/>
+            <w:hideMark/>
+          </w:tcPr>
+          <w:p>
+            <w:pPr>
+              <w:cnfStyle w:val="100000000000" w:firstRow="1" w:lastRow="0" w:firstColumn="0" w:lastColumn="0" w:oddVBand="0" w:evenVBand="0" w:oddHBand="0" w:evenHBand="0" w:firstRowFirstColumn="0" w:firstRowLastColumn="0" w:lastRowFirstColumn="0" w:lastRowLastColumn="0"/>
+              <w:rPr>
+                <w:rFonts w:ascii="Calibri" w:eastAsia="Times New Roman" w:hAnsi="Calibri" w:cs="Calibri"/>
+                <w:color w:val="000000"/>
+                <w:kern w:val="0"/>
+                <w:sz w:val="22"/>
+                <w:szCs w:val="22"/>
+                <w:lang w:eastAsia="en-GB"/>
+                <w14:ligatures w14:val="none"/>
+              </w:rPr>
+            </w:pPr>
+            <w:r>
+              <w:rPr>
+                <w:rFonts w:ascii="Calibri" w:eastAsia="Times New Roman" w:hAnsi="Calibri" w:cs="Calibri"/>
+                <w:color w:val="000000"/>
+                <w:kern w:val="0"/>
+                <w:sz w:val="22"/>
+                <w:szCs w:val="22"/>
+                <w:lang w:eastAsia="en-GB"/>
+                <w14:ligatures w14:val="none"/>
+              </w:rPr>
+              <w:t>We</w:t>
+            </w:r>
+            <w:r>
+              <w:rPr>
+                <w:rFonts w:ascii="Calibri" w:eastAsia="Times New Roman" w:hAnsi="Calibri" w:cs="Calibri"/>
+                <w:color w:val="000000"/>
+                <w:kern w:val="0"/>
+                <w:sz w:val="22"/>
+                <w:szCs w:val="22"/>
+                <w:lang w:eastAsia="en-GB"/>
+                <w14:ligatures w14:val="none"/>
+              </w:rPr>
+              <w:t>e</w:t>
+            </w:r>
+            <w:r>
+              <w:rPr>
+                <w:rFonts w:ascii="Calibri" w:eastAsia="Times New Roman" w:hAnsi="Calibri" w:cs="Calibri"/>
+                <w:color w:val="000000"/>
+                <w:kern w:val="0"/>
+                <w:sz w:val="22"/>
+                <w:szCs w:val="22"/>
+                <w:lang w:eastAsia="en-GB"/>
+                <w14:ligatures w14:val="none"/>
+              </w:rPr>
+              <w:t>k Start</w:t>
+            </w:r>
+          </w:p>
+        </w:tc>
+        <w:tc>
+          <w:tcPr>
+            <w:tcW w:w="992" w:type="dxa"/>
+            <w:noWrap/>
+            <w:hideMark/>
+          </w:tcPr>
+          <w:p>
+            <w:pPr>
+              <w:cnfStyle w:val="100000000000" w:firstRow="1" w:lastRow="0" w:firstColumn="0" w:lastColumn="0" w:oddVBand="0" w:evenVBand="0" w:oddHBand="0" w:evenHBand="0" w:firstRowFirstColumn="0" w:firstRowLastColumn="0" w:lastRowFirstColumn="0" w:lastRowLastColumn="0"/>
+              <w:rPr>
+                <w:rFonts w:ascii="Calibri" w:eastAsia="Times New Roman" w:hAnsi="Calibri" w:cs="Calibri"/>
+                <w:color w:val="000000"/>
+                <w:kern w:val="0"/>
+                <w:sz w:val="22"/>
+                <w:szCs w:val="22"/>
+                <w:lang w:eastAsia="en-GB"/>
+                <w14:ligatures w14:val="none"/>
+              </w:rPr>
+            </w:pPr>
+            <w:r>
+              <w:rPr>
+                <w:rFonts w:ascii="Calibri" w:eastAsia="Times New Roman" w:hAnsi="Calibri" w:cs="Calibri"/>
+                <w:color w:val="000000"/>
+                <w:kern w:val="0"/>
+                <w:sz w:val="22"/>
+                <w:szCs w:val="22"/>
+                <w:lang w:eastAsia="en-GB"/>
+                <w14:ligatures w14:val="none"/>
+              </w:rPr>
+              <w:t>Week End</w:t>
+            </w:r>
+          </w:p>
+        </w:tc>
+        <w:tc>
+          <w:tcPr>
+            <w:tcW w:w="1134" w:type="dxa"/>
+            <w:noWrap/>
+            <w:hideMark/>
+          </w:tcPr>
+          <w:p>
+            <w:pPr>
+              <w:cnfStyle w:val="100000000000" w:firstRow="1" w:lastRow="0" w:firstColumn="0" w:lastColumn="0" w:oddVBand="0" w:evenVBand="0" w:oddHBand="0" w:evenHBand="0" w:firstRowFirstColumn="0" w:firstRowLastColumn="0" w:lastRowFirstColumn="0" w:lastRowLastColumn="0"/>
+              <w:rPr>
+                <w:rFonts w:ascii="Calibri" w:eastAsia="Times New Roman" w:hAnsi="Calibri" w:cs="Calibri"/>
+                <w:color w:val="000000"/>
+                <w:kern w:val="0"/>
+                <w:sz w:val="22"/>
+                <w:szCs w:val="22"/>
+                <w:lang w:eastAsia="en-GB"/>
+                <w14:ligatures w14:val="none"/>
+              </w:rPr>
+            </w:pPr>
+            <w:r>
+              <w:rPr>
+                <w:rFonts w:ascii="Calibri" w:eastAsia="Times New Roman" w:hAnsi="Calibri" w:cs="Calibri"/>
+                <w:color w:val="000000"/>
+                <w:kern w:val="0"/>
+                <w:sz w:val="22"/>
+                <w:szCs w:val="22"/>
+                <w:lang w:eastAsia="en-GB"/>
+                <w14:ligatures w14:val="none"/>
+              </w:rPr>
+              <w:t>Tutorial / Feedback</w:t>
+            </w:r>
+          </w:p>
+        </w:tc>
+        <w:tc>
+          <w:tcPr>
+            <w:tcW w:w="3261" w:type="dxa"/>
+            <w:noWrap/>
+            <w:hideMark/>
+          </w:tcPr>
+          <w:p>
+            <w:pPr>
+              <w:cnfStyle w:val="100000000000" w:firstRow="1" w:lastRow="0" w:firstColumn="0" w:lastColumn="0" w:oddVBand="0" w:evenVBand="0" w:oddHBand="0" w:evenHBand="0" w:firstRowFirstColumn="0" w:firstRowLastColumn="0" w:lastRowFirstColumn="0" w:lastRowLastColumn="0"/>
+              <w:rPr>
+                <w:rFonts w:ascii="Calibri" w:eastAsia="Times New Roman" w:hAnsi="Calibri" w:cs="Calibri"/>
+                <w:color w:val="000000"/>
+                <w:kern w:val="0"/>
+                <w:sz w:val="22"/>
+                <w:szCs w:val="22"/>
+                <w:lang w:eastAsia="en-GB"/>
+                <w14:ligatures w14:val="none"/>
+              </w:rPr>
+            </w:pPr>
+            <w:r>
+              <w:rPr>
+                <w:rFonts w:ascii="Calibri" w:eastAsia="Times New Roman" w:hAnsi="Calibri" w:cs="Calibri"/>
+                <w:color w:val="000000"/>
+                <w:kern w:val="0"/>
+                <w:sz w:val="22"/>
+                <w:szCs w:val="22"/>
+                <w:lang w:eastAsia="en-GB"/>
+                <w14:ligatures w14:val="none"/>
+              </w:rPr>
+              <w:t>Status</w:t>
+            </w:r>
+          </w:p>
+        </w:tc>
+      </w:tr>
+      <w:tr>
+        <w:trPr>
+          <w:cnfStyle w:val="000000100000" w:firstRow="0" w:lastRow="0" w:firstColumn="0" w:lastColumn="0" w:oddVBand="0" w:evenVBand="0" w:oddHBand="1" w:evenHBand="0" w:firstRowFirstColumn="0" w:firstRowLastColumn="0" w:lastRowFirstColumn="0" w:lastRowLastColumn="0"/>
+          <w:trHeight w:val="290"/>
+        </w:trPr>
+        <w:tc>
+          <w:tcPr>
+            <w:cnfStyle w:val="001000000000" w:firstRow="0" w:lastRow="0" w:firstColumn="1" w:lastColumn="0" w:oddVBand="0" w:evenVBand="0" w:oddHBand="0" w:evenHBand="0" w:firstRowFirstColumn="0" w:firstRowLastColumn="0" w:lastRowFirstColumn="0" w:lastRowLastColumn="0"/>
+            <w:tcW w:w="709" w:type="dxa"/>
+            <w:noWrap/>
+            <w:hideMark/>
+          </w:tcPr>
+          <w:p>
+            <w:pPr>
+              <w:jc w:val="right"/>
+              <w:rPr>
+                <w:rFonts w:ascii="Calibri" w:eastAsia="Times New Roman" w:hAnsi="Calibri" w:cs="Calibri"/>
+                <w:color w:val="000000"/>
+                <w:kern w:val="0"/>
+                <w:sz w:val="22"/>
+                <w:szCs w:val="22"/>
+                <w:lang w:eastAsia="en-GB"/>
+                <w14:ligatures w14:val="none"/>
+              </w:rPr>
+            </w:pPr>
+            <w:r>
+              <w:rPr>
+                <w:rFonts w:ascii="Calibri" w:eastAsia="Times New Roman" w:hAnsi="Calibri" w:cs="Calibri"/>
+                <w:color w:val="000000"/>
+                <w:kern w:val="0"/>
+                <w:sz w:val="22"/>
+                <w:szCs w:val="22"/>
+                <w:lang w:eastAsia="en-GB"/>
+                <w14:ligatures w14:val="none"/>
+              </w:rPr>
+              <w:t>1</w:t>
+            </w:r>
+          </w:p>
+        </w:tc>
+        <w:tc>
+          <w:tcPr>
+            <w:tcW w:w="1659" w:type="dxa"/>
+            <w:noWrap/>
+            <w:hideMark/>
+          </w:tcPr>
+          <w:p>
+            <w:pPr>
+              <w:cnfStyle w:val="000000100000" w:firstRow="0" w:lastRow="0" w:firstColumn="0" w:lastColumn="0" w:oddVBand="0" w:evenVBand="0" w:oddHBand="1" w:evenHBand="0" w:firstRowFirstColumn="0" w:firstRowLastColumn="0" w:lastRowFirstColumn="0" w:lastRowLastColumn="0"/>
+              <w:rPr>
+                <w:rFonts w:ascii="Calibri" w:eastAsia="Times New Roman" w:hAnsi="Calibri" w:cs="Calibri"/>
+                <w:color w:val="000000"/>
+                <w:kern w:val="0"/>
+                <w:sz w:val="22"/>
+                <w:szCs w:val="22"/>
+                <w:lang w:eastAsia="en-GB"/>
+                <w14:ligatures w14:val="none"/>
+              </w:rPr>
+            </w:pPr>
+            <w:r>
+              <w:rPr>
+                <w:rFonts w:ascii="Calibri" w:eastAsia="Times New Roman" w:hAnsi="Calibri" w:cs="Calibri"/>
+                <w:color w:val="000000"/>
+                <w:kern w:val="0"/>
+                <w:sz w:val="22"/>
+                <w:szCs w:val="22"/>
+                <w:lang w:eastAsia="en-GB"/>
+                <w14:ligatures w14:val="none"/>
+              </w:rPr>
+              <w:t>Review Design Assignment Brief</w:t>
+            </w:r>
+          </w:p>
+        </w:tc>
+        <w:tc>
+          <w:tcPr>
+            <w:tcW w:w="1659" w:type="dxa"/>
+            <w:noWrap/>
+            <w:hideMark/>
+          </w:tcPr>
+          <w:p>
+            <w:pPr>
+              <w:cnfStyle w:val="000000100000" w:firstRow="0" w:lastRow="0" w:firstColumn="0" w:lastColumn="0" w:oddVBand="0" w:evenVBand="0" w:oddHBand="1" w:evenHBand="0" w:firstRowFirstColumn="0" w:firstRowLastColumn="0" w:lastRowFirstColumn="0" w:lastRowLastColumn="0"/>
+              <w:rPr>
+                <w:rFonts w:ascii="Calibri" w:eastAsia="Times New Roman" w:hAnsi="Calibri" w:cs="Calibri"/>
+                <w:color w:val="000000"/>
+                <w:kern w:val="0"/>
+                <w:sz w:val="22"/>
+                <w:szCs w:val="22"/>
+                <w:lang w:eastAsia="en-GB"/>
+                <w14:ligatures w14:val="none"/>
+              </w:rPr>
+            </w:pPr>
+            <w:r>
+              <w:rPr>
+                <w:rFonts w:ascii="Calibri" w:eastAsia="Times New Roman" w:hAnsi="Calibri" w:cs="Calibri"/>
+                <w:color w:val="000000"/>
+                <w:kern w:val="0"/>
+                <w:sz w:val="22"/>
+                <w:szCs w:val="22"/>
+                <w:lang w:eastAsia="en-GB"/>
+                <w14:ligatures w14:val="none"/>
+              </w:rPr>
+              <w:t>Design</w:t>
+            </w:r>
+          </w:p>
+        </w:tc>
+        <w:tc>
+          <w:tcPr>
+            <w:tcW w:w="2352" w:type="dxa"/>
+            <w:noWrap/>
+            <w:hideMark/>
+          </w:tcPr>
+          <w:p>
+            <w:pPr>
+              <w:cnfStyle w:val="000000100000" w:firstRow="0" w:lastRow="0" w:firstColumn="0" w:lastColumn="0" w:oddVBand="0" w:evenVBand="0" w:oddHBand="1" w:evenHBand="0" w:firstRowFirstColumn="0" w:firstRowLastColumn="0" w:lastRowFirstColumn="0" w:lastRowLastColumn="0"/>
+              <w:rPr>
+                <w:rFonts w:ascii="Calibri" w:eastAsia="Times New Roman" w:hAnsi="Calibri" w:cs="Calibri"/>
+                <w:color w:val="000000"/>
+                <w:kern w:val="0"/>
+                <w:sz w:val="22"/>
+                <w:szCs w:val="22"/>
+                <w:lang w:eastAsia="en-GB"/>
+                <w14:ligatures w14:val="none"/>
+              </w:rPr>
+            </w:pPr>
+            <w:r>
+              <w:rPr>
+                <w:rFonts w:ascii="Calibri" w:eastAsia="Times New Roman" w:hAnsi="Calibri" w:cs="Calibri"/>
+                <w:color w:val="000000"/>
+                <w:kern w:val="0"/>
+                <w:sz w:val="22"/>
+                <w:szCs w:val="22"/>
+                <w:lang w:eastAsia="en-GB"/>
+                <w14:ligatures w14:val="none"/>
+              </w:rPr>
+              <w:t>Notes on requirements</w:t>
+            </w:r>
+          </w:p>
+        </w:tc>
+        <w:tc>
+          <w:tcPr>
+            <w:tcW w:w="851" w:type="dxa"/>
+            <w:noWrap/>
+            <w:hideMark/>
+          </w:tcPr>
+          <w:p>
+            <w:pPr>
+              <w:cnfStyle w:val="000000100000" w:firstRow="0" w:lastRow="0" w:firstColumn="0" w:lastColumn="0" w:oddVBand="0" w:evenVBand="0" w:oddHBand="1" w:evenHBand="0" w:firstRowFirstColumn="0" w:firstRowLastColumn="0" w:lastRowFirstColumn="0" w:lastRowLastColumn="0"/>
+              <w:rPr>
+                <w:rFonts w:ascii="Calibri" w:eastAsia="Times New Roman" w:hAnsi="Calibri" w:cs="Calibri"/>
+                <w:color w:val="000000"/>
+                <w:kern w:val="0"/>
+                <w:sz w:val="22"/>
+                <w:szCs w:val="22"/>
+                <w:lang w:eastAsia="en-GB"/>
+                <w14:ligatures w14:val="none"/>
+              </w:rPr>
+            </w:pPr>
+            <w:r>
+              <w:rPr>
+                <w:rFonts w:ascii="Calibri" w:eastAsia="Times New Roman" w:hAnsi="Calibri" w:cs="Calibri"/>
+                <w:color w:val="000000"/>
+                <w:kern w:val="0"/>
+                <w:sz w:val="22"/>
+                <w:szCs w:val="22"/>
+                <w:lang w:eastAsia="en-GB"/>
+                <w14:ligatures w14:val="none"/>
+              </w:rPr>
+              <w:t>01-Jan-2026</w:t>
+            </w:r>
+          </w:p>
+        </w:tc>
+        <w:tc>
+          <w:tcPr>
+            <w:tcW w:w="992" w:type="dxa"/>
+            <w:noWrap/>
+            <w:hideMark/>
+          </w:tcPr>
+          <w:p>
+            <w:pPr>
+              <w:cnfStyle w:val="000000100000" w:firstRow="0" w:lastRow="0" w:firstColumn="0" w:lastColumn="0" w:oddVBand="0" w:evenVBand="0" w:oddHBand="1" w:evenHBand="0" w:firstRowFirstColumn="0" w:firstRowLastColumn="0" w:lastRowFirstColumn="0" w:lastRowLastColumn="0"/>
+              <w:rPr>
+                <w:rFonts w:ascii="Calibri" w:eastAsia="Times New Roman" w:hAnsi="Calibri" w:cs="Calibri"/>
+                <w:color w:val="000000"/>
+                <w:kern w:val="0"/>
+                <w:sz w:val="22"/>
+                <w:szCs w:val="22"/>
+                <w:lang w:eastAsia="en-GB"/>
+                <w14:ligatures w14:val="none"/>
+              </w:rPr>
+            </w:pPr>
+            <w:r>
+              <w:rPr>
+                <w:rFonts w:ascii="Calibri" w:eastAsia="Times New Roman" w:hAnsi="Calibri" w:cs="Calibri"/>
+                <w:color w:val="000000"/>
+                <w:kern w:val="0"/>
+                <w:sz w:val="22"/>
+                <w:szCs w:val="22"/>
+                <w:lang w:eastAsia="en-GB"/>
+                <w14:ligatures w14:val="none"/>
+              </w:rPr>
+              <w:t>04-Jan-2026</w:t>
+            </w:r>
+          </w:p>
+        </w:tc>
+        <w:tc>
+          <w:tcPr>
+            <w:tcW w:w="1134" w:type="dxa"/>
+            <w:noWrap/>
+            <w:hideMark/>
+          </w:tcPr>
+          <w:p>
+            <w:pPr>
+              <w:cnfStyle w:val="000000100000" w:firstRow="0" w:lastRow="0" w:firstColumn="0" w:lastColumn="0" w:oddVBand="0" w:evenVBand="0" w:oddHBand="1" w:evenHBand="0" w:firstRowFirstColumn="0" w:firstRowLastColumn="0" w:lastRowFirstColumn="0" w:lastRowLastColumn="0"/>
+              <w:rPr>
+                <w:rFonts w:ascii="Calibri" w:eastAsia="Times New Roman" w:hAnsi="Calibri" w:cs="Calibri"/>
+                <w:color w:val="000000"/>
+                <w:kern w:val="0"/>
+                <w:sz w:val="22"/>
+                <w:szCs w:val="22"/>
+                <w:lang w:eastAsia="en-GB"/>
+                <w14:ligatures w14:val="none"/>
+              </w:rPr>
+            </w:pPr>
+            <w:r>
+              <w:rPr>
+                <w:rFonts w:ascii="Calibri" w:eastAsia="Times New Roman" w:hAnsi="Calibri" w:cs="Calibri"/>
+                <w:color w:val="000000"/>
+                <w:kern w:val="0"/>
+                <w:sz w:val="22"/>
+                <w:szCs w:val="22"/>
+                <w:lang w:eastAsia="en-GB"/>
+                <w14:ligatures w14:val="none"/>
+              </w:rPr>
+              <w:t>—</w:t>
+            </w:r>
+          </w:p>
+        </w:tc>
+        <w:tc>
+          <w:tcPr>
+            <w:tcW w:w="3261" w:type="dxa"/>
+            <w:noWrap/>
+            <w:hideMark/>
+          </w:tcPr>
+          <w:p>
+            <w:pPr>
+              <w:cnfStyle w:val="000000100000" w:firstRow="0" w:lastRow="0" w:firstColumn="0" w:lastColumn="0" w:oddVBand="0" w:evenVBand="0" w:oddHBand="1" w:evenHBand="0" w:firstRowFirstColumn="0" w:firstRowLastColumn="0" w:lastRowFirstColumn="0" w:lastRowLastColumn="0"/>
+              <w:rPr>
+                <w:rFonts w:ascii="Calibri" w:eastAsia="Times New Roman" w:hAnsi="Calibri" w:cs="Calibri"/>
+                <w:color w:val="000000"/>
+                <w:kern w:val="0"/>
+                <w:sz w:val="22"/>
+                <w:szCs w:val="22"/>
+                <w:lang w:eastAsia="en-GB"/>
+                <w14:ligatures w14:val="none"/>
+              </w:rPr>
+            </w:pPr>
+            <w:r>
+              <w:rPr>
+                <w:rFonts w:ascii="Calibri" w:eastAsia="Times New Roman" w:hAnsi="Calibri" w:cs="Calibri"/>
+                <w:color w:val="000000"/>
+                <w:kern w:val="0"/>
+                <w:sz w:val="22"/>
+                <w:szCs w:val="22"/>
+                <w:lang w:eastAsia="en-GB"/>
+                <w14:ligatures w14:val="none"/>
+              </w:rPr>
+              <w:t>Completed</w:t>
+            </w:r>
+          </w:p>
+        </w:tc>
+      </w:tr>
+      <w:tr>
+        <w:trPr>
+          <w:trHeight w:val="290"/>
+        </w:trPr>
+        <w:tc>
+          <w:tcPr>
+            <w:cnfStyle w:val="001000000000" w:firstRow="0" w:lastRow="0" w:firstColumn="1" w:lastColumn="0" w:oddVBand="0" w:evenVBand="0" w:oddHBand="0" w:evenHBand="0" w:firstRowFirstColumn="0" w:firstRowLastColumn="0" w:lastRowFirstColumn="0" w:lastRowLastColumn="0"/>
+            <w:tcW w:w="709" w:type="dxa"/>
+            <w:noWrap/>
+            <w:hideMark/>
+          </w:tcPr>
+          <w:p>
+            <w:pPr>
+              <w:jc w:val="right"/>
+              <w:rPr>
+                <w:rFonts w:ascii="Calibri" w:eastAsia="Times New Roman" w:hAnsi="Calibri" w:cs="Calibri"/>
+                <w:color w:val="000000"/>
+                <w:kern w:val="0"/>
+                <w:sz w:val="22"/>
+                <w:szCs w:val="22"/>
+                <w:lang w:eastAsia="en-GB"/>
+                <w14:ligatures w14:val="none"/>
+              </w:rPr>
+            </w:pPr>
+            <w:r>
+              <w:rPr>
+                <w:rFonts w:ascii="Calibri" w:eastAsia="Times New Roman" w:hAnsi="Calibri" w:cs="Calibri"/>
+                <w:color w:val="000000"/>
+                <w:kern w:val="0"/>
+                <w:sz w:val="22"/>
+                <w:szCs w:val="22"/>
+                <w:lang w:eastAsia="en-GB"/>
+                <w14:ligatures w14:val="none"/>
+              </w:rPr>
+              <w:t>2</w:t>
+            </w:r>
+          </w:p>
+        </w:tc>
+        <w:tc>
+          <w:tcPr>
+            <w:tcW w:w="1659" w:type="dxa"/>
+            <w:noWrap/>
+            <w:hideMark/>
+          </w:tcPr>
+          <w:p>
+            <w:pPr>
+              <w:cnfStyle w:val="000000000000" w:firstRow="0" w:lastRow="0" w:firstColumn="0" w:lastColumn="0" w:oddVBand="0" w:evenVBand="0" w:oddHBand="0" w:evenHBand="0" w:firstRowFirstColumn="0" w:firstRowLastColumn="0" w:lastRowFirstColumn="0" w:lastRowLastColumn="0"/>
+              <w:rPr>
+                <w:rFonts w:ascii="Calibri" w:eastAsia="Times New Roman" w:hAnsi="Calibri" w:cs="Calibri"/>
+                <w:color w:val="000000"/>
+                <w:kern w:val="0"/>
+                <w:sz w:val="22"/>
+                <w:szCs w:val="22"/>
+                <w:lang w:eastAsia="en-GB"/>
+                <w14:ligatures w14:val="none"/>
+              </w:rPr>
+            </w:pPr>
+            <w:r>
+              <w:rPr>
+                <w:rFonts w:ascii="Calibri" w:eastAsia="Times New Roman" w:hAnsi="Calibri" w:cs="Calibri"/>
+                <w:color w:val="000000"/>
+                <w:kern w:val="0"/>
+                <w:sz w:val="22"/>
+                <w:szCs w:val="22"/>
+                <w:lang w:eastAsia="en-GB"/>
+                <w14:ligatures w14:val="none"/>
+              </w:rPr>
+              <w:t>Review Implementation Assignment Brief</w:t>
+            </w:r>
+          </w:p>
+        </w:tc>
+        <w:tc>
+          <w:tcPr>
+            <w:tcW w:w="1659" w:type="dxa"/>
+            <w:noWrap/>
+            <w:hideMark/>
+          </w:tcPr>
+          <w:p>
+            <w:pPr>
+              <w:cnfStyle w:val="000000000000" w:firstRow="0" w:lastRow="0" w:firstColumn="0" w:lastColumn="0" w:oddVBand="0" w:evenVBand="0" w:oddHBand="0" w:evenHBand="0" w:firstRowFirstColumn="0" w:firstRowLastColumn="0" w:lastRowFirstColumn="0" w:lastRowLastColumn="0"/>
+              <w:rPr>
+                <w:rFonts w:ascii="Calibri" w:eastAsia="Times New Roman" w:hAnsi="Calibri" w:cs="Calibri"/>
+                <w:color w:val="000000"/>
+                <w:kern w:val="0"/>
+                <w:sz w:val="22"/>
+                <w:szCs w:val="22"/>
+                <w:lang w:eastAsia="en-GB"/>
+                <w14:ligatures w14:val="none"/>
+              </w:rPr>
+            </w:pPr>
+            <w:r>
+              <w:rPr>
+                <w:rFonts w:ascii="Calibri" w:eastAsia="Times New Roman" w:hAnsi="Calibri" w:cs="Calibri"/>
+                <w:color w:val="000000"/>
+                <w:kern w:val="0"/>
+                <w:sz w:val="22"/>
+                <w:szCs w:val="22"/>
+                <w:lang w:eastAsia="en-GB"/>
+                <w14:ligatures w14:val="none"/>
+              </w:rPr>
+              <w:t>Design</w:t>
+            </w:r>
+          </w:p>
+        </w:tc>
+        <w:tc>
+          <w:tcPr>
+            <w:tcW w:w="2352" w:type="dxa"/>
+            <w:noWrap/>
+            <w:hideMark/>
+          </w:tcPr>
+          <w:p>
+            <w:pPr>
+              <w:cnfStyle w:val="000000000000" w:firstRow="0" w:lastRow="0" w:firstColumn="0" w:lastColumn="0" w:oddVBand="0" w:evenVBand="0" w:oddHBand="0" w:evenHBand="0" w:firstRowFirstColumn="0" w:firstRowLastColumn="0" w:lastRowFirstColumn="0" w:lastRowLastColumn="0"/>
+              <w:rPr>
+                <w:rFonts w:ascii="Calibri" w:eastAsia="Times New Roman" w:hAnsi="Calibri" w:cs="Calibri"/>
+                <w:color w:val="000000"/>
+                <w:kern w:val="0"/>
+                <w:sz w:val="22"/>
+                <w:szCs w:val="22"/>
+                <w:lang w:eastAsia="en-GB"/>
+                <w14:ligatures w14:val="none"/>
+              </w:rPr>
+            </w:pPr>
+            <w:r>
+              <w:rPr>
+                <w:rFonts w:ascii="Calibri" w:eastAsia="Times New Roman" w:hAnsi="Calibri" w:cs="Calibri"/>
+                <w:color w:val="000000"/>
+                <w:kern w:val="0"/>
+                <w:sz w:val="22"/>
+                <w:szCs w:val="22"/>
+                <w:lang w:eastAsia="en-GB"/>
+                <w14:ligatures w14:val="none"/>
+              </w:rPr>
+              <w:t>Implementation constraints summary</w:t>
+            </w:r>
+          </w:p>
+        </w:tc>
+        <w:tc>
+          <w:tcPr>
+            <w:tcW w:w="851" w:type="dxa"/>
+            <w:noWrap/>
+            <w:hideMark/>
+          </w:tcPr>
+          <w:p>
+            <w:pPr>
+              <w:cnfStyle w:val="000000000000" w:firstRow="0" w:lastRow="0" w:firstColumn="0" w:lastColumn="0" w:oddVBand="0" w:evenVBand="0" w:oddHBand="0" w:evenHBand="0" w:firstRowFirstColumn="0" w:firstRowLastColumn="0" w:lastRowFirstColumn="0" w:lastRowLastColumn="0"/>
+              <w:rPr>
+                <w:rFonts w:ascii="Calibri" w:eastAsia="Times New Roman" w:hAnsi="Calibri" w:cs="Calibri"/>
+                <w:color w:val="000000"/>
+                <w:kern w:val="0"/>
+                <w:sz w:val="22"/>
+                <w:szCs w:val="22"/>
+                <w:lang w:eastAsia="en-GB"/>
+                <w14:ligatures w14:val="none"/>
+              </w:rPr>
+            </w:pPr>
+            <w:r>
+              <w:rPr>
+                <w:rFonts w:ascii="Calibri" w:eastAsia="Times New Roman" w:hAnsi="Calibri" w:cs="Calibri"/>
+                <w:color w:val="000000"/>
+                <w:kern w:val="0"/>
+                <w:sz w:val="22"/>
+                <w:szCs w:val="22"/>
+                <w:lang w:eastAsia="en-GB"/>
+                <w14:ligatures w14:val="none"/>
+              </w:rPr>
+              <w:t>02-Jan-2026</w:t>
+            </w:r>
+          </w:p>
+        </w:tc>
+        <w:tc>
+          <w:tcPr>
+            <w:tcW w:w="992" w:type="dxa"/>
+            <w:noWrap/>
+            <w:hideMark/>
+          </w:tcPr>
+          <w:p>
+            <w:pPr>
+              <w:cnfStyle w:val="000000000000" w:firstRow="0" w:lastRow="0" w:firstColumn="0" w:lastColumn="0" w:oddVBand="0" w:evenVBand="0" w:oddHBand="0" w:evenHBand="0" w:firstRowFirstColumn="0" w:firstRowLastColumn="0" w:lastRowFirstColumn="0" w:lastRowLastColumn="0"/>
+              <w:rPr>
+                <w:rFonts w:ascii="Calibri" w:eastAsia="Times New Roman" w:hAnsi="Calibri" w:cs="Calibri"/>
+                <w:color w:val="000000"/>
+                <w:kern w:val="0"/>
+                <w:sz w:val="22"/>
+                <w:szCs w:val="22"/>
+                <w:lang w:eastAsia="en-GB"/>
+                <w14:ligatures w14:val="none"/>
+              </w:rPr>
+            </w:pPr>
+            <w:r>
+              <w:rPr>
+                <w:rFonts w:ascii="Calibri" w:eastAsia="Times New Roman" w:hAnsi="Calibri" w:cs="Calibri"/>
+                <w:color w:val="000000"/>
+                <w:kern w:val="0"/>
+                <w:sz w:val="22"/>
+                <w:szCs w:val="22"/>
+                <w:lang w:eastAsia="en-GB"/>
+                <w14:ligatures w14:val="none"/>
+              </w:rPr>
+              <w:t>05-Jan-2026</w:t>
+            </w:r>
+          </w:p>
+        </w:tc>
+        <w:tc>
+          <w:tcPr>
+            <w:tcW w:w="1134" w:type="dxa"/>
+            <w:noWrap/>
+            <w:hideMark/>
+          </w:tcPr>
+          <w:p>
+            <w:pPr>
+              <w:cnfStyle w:val="000000000000" w:firstRow="0" w:lastRow="0" w:firstColumn="0" w:lastColumn="0" w:oddVBand="0" w:evenVBand="0" w:oddHBand="0" w:evenHBand="0" w:firstRowFirstColumn="0" w:firstRowLastColumn="0" w:lastRowFirstColumn="0" w:lastRowLastColumn="0"/>
+              <w:rPr>
+                <w:rFonts w:ascii="Calibri" w:eastAsia="Times New Roman" w:hAnsi="Calibri" w:cs="Calibri"/>
+                <w:color w:val="000000"/>
+                <w:kern w:val="0"/>
+                <w:sz w:val="22"/>
+                <w:szCs w:val="22"/>
+                <w:lang w:eastAsia="en-GB"/>
+                <w14:ligatures w14:val="none"/>
+              </w:rPr>
+            </w:pPr>
+            <w:r>
+              <w:rPr>
+                <w:rFonts w:ascii="Calibri" w:eastAsia="Times New Roman" w:hAnsi="Calibri" w:cs="Calibri"/>
+                <w:color w:val="000000"/>
+                <w:kern w:val="0"/>
+                <w:sz w:val="22"/>
+                <w:szCs w:val="22"/>
+                <w:lang w:eastAsia="en-GB"/>
+                <w14:ligatures w14:val="none"/>
+              </w:rPr>
+              <w:t>—</w:t>
+            </w:r>
+          </w:p>
+        </w:tc>
+        <w:tc>
+          <w:tcPr>
+            <w:tcW w:w="3261" w:type="dxa"/>
+            <w:noWrap/>
+            <w:hideMark/>
+          </w:tcPr>
+          <w:p>
+            <w:pPr>
+              <w:cnfStyle w:val="000000000000" w:firstRow="0" w:lastRow="0" w:firstColumn="0" w:lastColumn="0" w:oddVBand="0" w:evenVBand="0" w:oddHBand="0" w:evenHBand="0" w:firstRowFirstColumn="0" w:firstRowLastColumn="0" w:lastRowFirstColumn="0" w:lastRowLastColumn="0"/>
+              <w:rPr>
+                <w:rFonts w:ascii="Calibri" w:eastAsia="Times New Roman" w:hAnsi="Calibri" w:cs="Calibri"/>
+                <w:color w:val="000000"/>
+                <w:kern w:val="0"/>
+                <w:sz w:val="22"/>
+                <w:szCs w:val="22"/>
+                <w:lang w:eastAsia="en-GB"/>
+                <w14:ligatures w14:val="none"/>
+              </w:rPr>
+            </w:pPr>
+            <w:r>
+              <w:rPr>
+                <w:rFonts w:ascii="Calibri" w:eastAsia="Times New Roman" w:hAnsi="Calibri" w:cs="Calibri"/>
+                <w:color w:val="000000"/>
+                <w:kern w:val="0"/>
+                <w:sz w:val="22"/>
+                <w:szCs w:val="22"/>
+                <w:lang w:eastAsia="en-GB"/>
+                <w14:ligatures w14:val="none"/>
+              </w:rPr>
+              <w:t>Completed</w:t>
+            </w:r>
+          </w:p>
+        </w:tc>
+      </w:tr>
+      <w:tr>
+        <w:trPr>
+          <w:cnfStyle w:val="000000100000" w:firstRow="0" w:lastRow="0" w:firstColumn="0" w:lastColumn="0" w:oddVBand="0" w:evenVBand="0" w:oddHBand="1" w:evenHBand="0" w:firstRowFirstColumn="0" w:firstRowLastColumn="0" w:lastRowFirstColumn="0" w:lastRowLastColumn="0"/>
+          <w:trHeight w:val="290"/>
+        </w:trPr>
+        <w:tc>
+          <w:tcPr>
+            <w:cnfStyle w:val="001000000000" w:firstRow="0" w:lastRow="0" w:firstColumn="1" w:lastColumn="0" w:oddVBand="0" w:evenVBand="0" w:oddHBand="0" w:evenHBand="0" w:firstRowFirstColumn="0" w:firstRowLastColumn="0" w:lastRowFirstColumn="0" w:lastRowLastColumn="0"/>
+            <w:tcW w:w="709" w:type="dxa"/>
+            <w:noWrap/>
+            <w:hideMark/>
+          </w:tcPr>
+          <w:p>
+            <w:pPr>
+              <w:jc w:val="right"/>
+              <w:rPr>
+                <w:rFonts w:ascii="Calibri" w:eastAsia="Times New Roman" w:hAnsi="Calibri" w:cs="Calibri"/>
+                <w:color w:val="000000"/>
+                <w:kern w:val="0"/>
+                <w:sz w:val="22"/>
+                <w:szCs w:val="22"/>
+                <w:lang w:eastAsia="en-GB"/>
+                <w14:ligatures w14:val="none"/>
+              </w:rPr>
+            </w:pPr>
+            <w:r>
+              <w:rPr>
+                <w:rFonts w:ascii="Calibri" w:eastAsia="Times New Roman" w:hAnsi="Calibri" w:cs="Calibri"/>
+                <w:color w:val="000000"/>
+                <w:kern w:val="0"/>
+                <w:sz w:val="22"/>
+                <w:szCs w:val="22"/>
+                <w:lang w:eastAsia="en-GB"/>
+                <w14:ligatures w14:val="none"/>
+              </w:rPr>
+              <w:t>3</w:t>
+            </w:r>
+          </w:p>
+        </w:tc>
+        <w:tc>
+          <w:tcPr>
+            <w:tcW w:w="1659" w:type="dxa"/>
+            <w:noWrap/>
+            <w:hideMark/>
+          </w:tcPr>
+          <w:p>
+            <w:pPr>
+              <w:cnfStyle w:val="000000100000" w:firstRow="0" w:lastRow="0" w:firstColumn="0" w:lastColumn="0" w:oddVBand="0" w:evenVBand="0" w:oddHBand="1" w:evenHBand="0" w:firstRowFirstColumn="0" w:firstRowLastColumn="0" w:lastRowFirstColumn="0" w:lastRowLastColumn="0"/>
+              <w:rPr>
+                <w:rFonts w:ascii="Calibri" w:eastAsia="Times New Roman" w:hAnsi="Calibri" w:cs="Calibri"/>
+                <w:color w:val="000000"/>
+                <w:kern w:val="0"/>
+                <w:sz w:val="22"/>
+                <w:szCs w:val="22"/>
+                <w:lang w:eastAsia="en-GB"/>
+                <w14:ligatures w14:val="none"/>
+              </w:rPr>
+            </w:pPr>
+            <w:r>
+              <w:rPr>
+                <w:rFonts w:ascii="Calibri" w:eastAsia="Times New Roman" w:hAnsi="Calibri" w:cs="Calibri"/>
+                <w:color w:val="000000"/>
+                <w:kern w:val="0"/>
+                <w:sz w:val="22"/>
+                <w:szCs w:val="22"/>
+                <w:lang w:eastAsia="en-GB"/>
+                <w14:ligatures w14:val="none"/>
+              </w:rPr>
+              <w:t>Initial System Analysis (SwiftBot task)</w:t>
+            </w:r>
+          </w:p>
+        </w:tc>
+        <w:tc>
+          <w:tcPr>
+            <w:tcW w:w="1659" w:type="dxa"/>
+            <w:noWrap/>
+            <w:hideMark/>
+          </w:tcPr>
+          <w:p>
+            <w:pPr>
+              <w:cnfStyle w:val="000000100000" w:firstRow="0" w:lastRow="0" w:firstColumn="0" w:lastColumn="0" w:oddVBand="0" w:evenVBand="0" w:oddHBand="1" w:evenHBand="0" w:firstRowFirstColumn="0" w:firstRowLastColumn="0" w:lastRowFirstColumn="0" w:lastRowLastColumn="0"/>
+              <w:rPr>
+                <w:rFonts w:ascii="Calibri" w:eastAsia="Times New Roman" w:hAnsi="Calibri" w:cs="Calibri"/>
+                <w:color w:val="000000"/>
+                <w:kern w:val="0"/>
+                <w:sz w:val="22"/>
+                <w:szCs w:val="22"/>
+                <w:lang w:eastAsia="en-GB"/>
+                <w14:ligatures w14:val="none"/>
+              </w:rPr>
+            </w:pPr>
+            <w:r>
+              <w:rPr>
+                <w:rFonts w:ascii="Calibri" w:eastAsia="Times New Roman" w:hAnsi="Calibri" w:cs="Calibri"/>
+                <w:color w:val="000000"/>
+                <w:kern w:val="0"/>
+                <w:sz w:val="22"/>
+                <w:szCs w:val="22"/>
+                <w:lang w:eastAsia="en-GB"/>
+                <w14:ligatures w14:val="none"/>
+              </w:rPr>
+              <w:t>Design</w:t>
+            </w:r>
+          </w:p>
+        </w:tc>
+        <w:tc>
+          <w:tcPr>
+            <w:tcW w:w="2352" w:type="dxa"/>
+            <w:noWrap/>
+            <w:hideMark/>
+          </w:tcPr>
+          <w:p>
+            <w:pPr>
+              <w:cnfStyle w:val="000000100000" w:firstRow="0" w:lastRow="0" w:firstColumn="0" w:lastColumn="0" w:oddVBand="0" w:evenVBand="0" w:oddHBand="1" w:evenHBand="0" w:firstRowFirstColumn="0" w:firstRowLastColumn="0" w:lastRowFirstColumn="0" w:lastRowLastColumn="0"/>
+              <w:rPr>
+                <w:rFonts w:ascii="Calibri" w:eastAsia="Times New Roman" w:hAnsi="Calibri" w:cs="Calibri"/>
+                <w:color w:val="000000"/>
+                <w:kern w:val="0"/>
+                <w:sz w:val="22"/>
+                <w:szCs w:val="22"/>
+                <w:lang w:eastAsia="en-GB"/>
+                <w14:ligatures w14:val="none"/>
+              </w:rPr>
+            </w:pPr>
+            <w:r>
+              <w:rPr>
+                <w:rFonts w:ascii="Calibri" w:eastAsia="Times New Roman" w:hAnsi="Calibri" w:cs="Calibri"/>
+                <w:color w:val="000000"/>
+                <w:kern w:val="0"/>
+                <w:sz w:val="22"/>
+                <w:szCs w:val="22"/>
+                <w:lang w:eastAsia="en-GB"/>
+                <w14:ligatures w14:val="none"/>
+              </w:rPr>
+              <w:t>Problem definition draft v1</w:t>
+            </w:r>
+          </w:p>
+        </w:tc>
+        <w:tc>
+          <w:tcPr>
+            <w:tcW w:w="851" w:type="dxa"/>
+            <w:noWrap/>
+            <w:hideMark/>
+          </w:tcPr>
+          <w:p>
+            <w:pPr>
+              <w:cnfStyle w:val="000000100000" w:firstRow="0" w:lastRow="0" w:firstColumn="0" w:lastColumn="0" w:oddVBand="0" w:evenVBand="0" w:oddHBand="1" w:evenHBand="0" w:firstRowFirstColumn="0" w:firstRowLastColumn="0" w:lastRowFirstColumn="0" w:lastRowLastColumn="0"/>
+              <w:rPr>
+                <w:rFonts w:ascii="Calibri" w:eastAsia="Times New Roman" w:hAnsi="Calibri" w:cs="Calibri"/>
+                <w:color w:val="000000"/>
+                <w:kern w:val="0"/>
+                <w:sz w:val="22"/>
+                <w:szCs w:val="22"/>
+                <w:lang w:eastAsia="en-GB"/>
+                <w14:ligatures w14:val="none"/>
+              </w:rPr>
+            </w:pPr>
+            <w:r>
+              <w:rPr>
+                <w:rFonts w:ascii="Calibri" w:eastAsia="Times New Roman" w:hAnsi="Calibri" w:cs="Calibri"/>
+                <w:color w:val="000000"/>
+                <w:kern w:val="0"/>
+                <w:sz w:val="22"/>
+                <w:szCs w:val="22"/>
+                <w:lang w:eastAsia="en-GB"/>
+                <w14:ligatures w14:val="none"/>
+              </w:rPr>
+              <w:t>03-Jan-2026</w:t>
+            </w:r>
+          </w:p>
+        </w:tc>
+        <w:tc>
+          <w:tcPr>
+            <w:tcW w:w="992" w:type="dxa"/>
+            <w:noWrap/>
+            <w:hideMark/>
+          </w:tcPr>
+          <w:p>
+            <w:pPr>
+              <w:cnfStyle w:val="000000100000" w:firstRow="0" w:lastRow="0" w:firstColumn="0" w:lastColumn="0" w:oddVBand="0" w:evenVBand="0" w:oddHBand="1" w:evenHBand="0" w:firstRowFirstColumn="0" w:firstRowLastColumn="0" w:lastRowFirstColumn="0" w:lastRowLastColumn="0"/>
+              <w:rPr>
+                <w:rFonts w:ascii="Calibri" w:eastAsia="Times New Roman" w:hAnsi="Calibri" w:cs="Calibri"/>
+                <w:color w:val="000000"/>
+                <w:kern w:val="0"/>
+                <w:sz w:val="22"/>
+                <w:szCs w:val="22"/>
+                <w:lang w:eastAsia="en-GB"/>
+                <w14:ligatures w14:val="none"/>
+              </w:rPr>
+            </w:pPr>
+            <w:r>
+              <w:rPr>
+                <w:rFonts w:ascii="Calibri" w:eastAsia="Times New Roman" w:hAnsi="Calibri" w:cs="Calibri"/>
+                <w:color w:val="000000"/>
+                <w:kern w:val="0"/>
+                <w:sz w:val="22"/>
+                <w:szCs w:val="22"/>
+                <w:lang w:eastAsia="en-GB"/>
+                <w14:ligatures w14:val="none"/>
+              </w:rPr>
+              <w:t>07-Jan-2026</w:t>
+            </w:r>
+          </w:p>
+        </w:tc>
+        <w:tc>
+          <w:tcPr>
+            <w:tcW w:w="1134" w:type="dxa"/>
+            <w:noWrap/>
+            <w:hideMark/>
+          </w:tcPr>
+          <w:p>
+            <w:pPr>
+              <w:cnfStyle w:val="000000100000" w:firstRow="0" w:lastRow="0" w:firstColumn="0" w:lastColumn="0" w:oddVBand="0" w:evenVBand="0" w:oddHBand="1" w:evenHBand="0" w:firstRowFirstColumn="0" w:firstRowLastColumn="0" w:lastRowFirstColumn="0" w:lastRowLastColumn="0"/>
+              <w:rPr>
+                <w:rFonts w:ascii="Calibri" w:eastAsia="Times New Roman" w:hAnsi="Calibri" w:cs="Calibri"/>
+                <w:color w:val="000000"/>
+                <w:kern w:val="0"/>
+                <w:sz w:val="22"/>
+                <w:szCs w:val="22"/>
+                <w:lang w:eastAsia="en-GB"/>
+                <w14:ligatures w14:val="none"/>
+              </w:rPr>
+            </w:pPr>
+            <w:r>
+              <w:rPr>
+                <w:rFonts w:ascii="Calibri" w:eastAsia="Times New Roman" w:hAnsi="Calibri" w:cs="Calibri"/>
+                <w:color w:val="000000"/>
+                <w:kern w:val="0"/>
+                <w:sz w:val="22"/>
+                <w:szCs w:val="22"/>
+                <w:lang w:eastAsia="en-GB"/>
+                <w14:ligatures w14:val="none"/>
+              </w:rPr>
+              <w:t>Tutorial 1</w:t>
+            </w:r>
+          </w:p>
+        </w:tc>
+        <w:tc>
+          <w:tcPr>
+            <w:tcW w:w="3261" w:type="dxa"/>
+            <w:noWrap/>
+            <w:hideMark/>
+          </w:tcPr>
+          <w:p>
+            <w:pPr>
+              <w:cnfStyle w:val="000000100000" w:firstRow="0" w:lastRow="0" w:firstColumn="0" w:lastColumn="0" w:oddVBand="0" w:evenVBand="0" w:oddHBand="1" w:evenHBand="0" w:firstRowFirstColumn="0" w:firstRowLastColumn="0" w:lastRowFirstColumn="0" w:lastRowLastColumn="0"/>
+              <w:rPr>
+                <w:rFonts w:ascii="Calibri" w:eastAsia="Times New Roman" w:hAnsi="Calibri" w:cs="Calibri"/>
+                <w:color w:val="000000"/>
+                <w:kern w:val="0"/>
+                <w:sz w:val="22"/>
+                <w:szCs w:val="22"/>
+                <w:lang w:eastAsia="en-GB"/>
+                <w14:ligatures w14:val="none"/>
+              </w:rPr>
+            </w:pPr>
+            <w:r>
+              <w:rPr>
+                <w:rFonts w:ascii="Calibri" w:eastAsia="Times New Roman" w:hAnsi="Calibri" w:cs="Calibri"/>
+                <w:color w:val="000000"/>
+                <w:kern w:val="0"/>
+                <w:sz w:val="22"/>
+                <w:szCs w:val="22"/>
+                <w:lang w:eastAsia="en-GB"/>
+                <w14:ligatures w14:val="none"/>
+              </w:rPr>
+              <w:t>Completed</w:t>
+            </w:r>
+          </w:p>
+        </w:tc>
+      </w:tr>
+      <w:tr>
+        <w:trPr>
+          <w:trHeight w:val="290"/>
+        </w:trPr>
+        <w:tc>
+          <w:tcPr>
+            <w:cnfStyle w:val="001000000000" w:firstRow="0" w:lastRow="0" w:firstColumn="1" w:lastColumn="0" w:oddVBand="0" w:evenVBand="0" w:oddHBand="0" w:evenHBand="0" w:firstRowFirstColumn="0" w:firstRowLastColumn="0" w:lastRowFirstColumn="0" w:lastRowLastColumn="0"/>
+            <w:tcW w:w="709" w:type="dxa"/>
+            <w:noWrap/>
+            <w:hideMark/>
+          </w:tcPr>
+          <w:p>
+            <w:pPr>
+              <w:jc w:val="right"/>
+              <w:rPr>
+                <w:rFonts w:ascii="Calibri" w:eastAsia="Times New Roman" w:hAnsi="Calibri" w:cs="Calibri"/>
+                <w:color w:val="000000"/>
+                <w:kern w:val="0"/>
+                <w:sz w:val="22"/>
+                <w:szCs w:val="22"/>
+                <w:lang w:eastAsia="en-GB"/>
+                <w14:ligatures w14:val="none"/>
+              </w:rPr>
+            </w:pPr>
+            <w:r>
+              <w:rPr>
+                <w:rFonts w:ascii="Calibri" w:eastAsia="Times New Roman" w:hAnsi="Calibri" w:cs="Calibri"/>
+                <w:color w:val="000000"/>
+                <w:kern w:val="0"/>
+                <w:sz w:val="22"/>
+                <w:szCs w:val="22"/>
+                <w:lang w:eastAsia="en-GB"/>
+                <w14:ligatures w14:val="none"/>
+              </w:rPr>
+              <w:t>4</w:t>
+            </w:r>
+          </w:p>
+        </w:tc>
+        <w:tc>
+          <w:tcPr>
+            <w:tcW w:w="1659" w:type="dxa"/>
+            <w:noWrap/>
+            <w:hideMark/>
+          </w:tcPr>
+          <w:p>
+            <w:pPr>
+              <w:cnfStyle w:val="000000000000" w:firstRow="0" w:lastRow="0" w:firstColumn="0" w:lastColumn="0" w:oddVBand="0" w:evenVBand="0" w:oddHBand="0" w:evenHBand="0" w:firstRowFirstColumn="0" w:firstRowLastColumn="0" w:lastRowFirstColumn="0" w:lastRowLastColumn="0"/>
+              <w:rPr>
+                <w:rFonts w:ascii="Calibri" w:eastAsia="Times New Roman" w:hAnsi="Calibri" w:cs="Calibri"/>
+                <w:color w:val="000000"/>
+                <w:kern w:val="0"/>
+                <w:sz w:val="22"/>
+                <w:szCs w:val="22"/>
+                <w:lang w:eastAsia="en-GB"/>
+                <w14:ligatures w14:val="none"/>
+              </w:rPr>
+            </w:pPr>
+            <w:r>
+              <w:rPr>
+                <w:rFonts w:ascii="Calibri" w:eastAsia="Times New Roman" w:hAnsi="Calibri" w:cs="Calibri"/>
+                <w:color w:val="000000"/>
+                <w:kern w:val="0"/>
+                <w:sz w:val="22"/>
+                <w:szCs w:val="22"/>
+                <w:lang w:eastAsia="en-GB"/>
+                <w14:ligatures w14:val="none"/>
+              </w:rPr>
+              <w:t>Algorithm &amp; Behaviour Design</w:t>
+            </w:r>
+          </w:p>
+        </w:tc>
+        <w:tc>
+          <w:tcPr>
+            <w:tcW w:w="1659" w:type="dxa"/>
+            <w:noWrap/>
+            <w:hideMark/>
+          </w:tcPr>
+          <w:p>
+            <w:pPr>
+              <w:cnfStyle w:val="000000000000" w:firstRow="0" w:lastRow="0" w:firstColumn="0" w:lastColumn="0" w:oddVBand="0" w:evenVBand="0" w:oddHBand="0" w:evenHBand="0" w:firstRowFirstColumn="0" w:firstRowLastColumn="0" w:lastRowFirstColumn="0" w:lastRowLastColumn="0"/>
+              <w:rPr>
+                <w:rFonts w:ascii="Calibri" w:eastAsia="Times New Roman" w:hAnsi="Calibri" w:cs="Calibri"/>
+                <w:color w:val="000000"/>
+                <w:kern w:val="0"/>
+                <w:sz w:val="22"/>
+                <w:szCs w:val="22"/>
+                <w:lang w:eastAsia="en-GB"/>
+                <w14:ligatures w14:val="none"/>
+              </w:rPr>
+            </w:pPr>
+            <w:r>
+              <w:rPr>
+                <w:rFonts w:ascii="Calibri" w:eastAsia="Times New Roman" w:hAnsi="Calibri" w:cs="Calibri"/>
+                <w:color w:val="000000"/>
+                <w:kern w:val="0"/>
+                <w:sz w:val="22"/>
+                <w:szCs w:val="22"/>
+                <w:lang w:eastAsia="en-GB"/>
+                <w14:ligatures w14:val="none"/>
+              </w:rPr>
+              <w:t>Design</w:t>
+            </w:r>
+          </w:p>
+        </w:tc>
+        <w:tc>
+          <w:tcPr>
+            <w:tcW w:w="2352" w:type="dxa"/>
+            <w:noWrap/>
+            <w:hideMark/>
+          </w:tcPr>
+          <w:p>
+            <w:pPr>
+              <w:cnfStyle w:val="000000000000" w:firstRow="0" w:lastRow="0" w:firstColumn="0" w:lastColumn="0" w:oddVBand="0" w:evenVBand="0" w:oddHBand="0" w:evenHBand="0" w:firstRowFirstColumn="0" w:firstRowLastColumn="0" w:lastRowFirstColumn="0" w:lastRowLastColumn="0"/>
+              <w:rPr>
+                <w:rFonts w:ascii="Calibri" w:eastAsia="Times New Roman" w:hAnsi="Calibri" w:cs="Calibri"/>
+                <w:color w:val="000000"/>
+                <w:kern w:val="0"/>
+                <w:sz w:val="22"/>
+                <w:szCs w:val="22"/>
+                <w:lang w:eastAsia="en-GB"/>
+                <w14:ligatures w14:val="none"/>
+              </w:rPr>
+            </w:pPr>
+            <w:r>
+              <w:rPr>
+                <w:rFonts w:ascii="Calibri" w:eastAsia="Times New Roman" w:hAnsi="Calibri" w:cs="Calibri"/>
+                <w:color w:val="000000"/>
+                <w:kern w:val="0"/>
+                <w:sz w:val="22"/>
+                <w:szCs w:val="22"/>
+                <w:lang w:eastAsia="en-GB"/>
+                <w14:ligatures w14:val="none"/>
+              </w:rPr>
+              <w:t>Design draft v2</w:t>
+            </w:r>
+          </w:p>
+        </w:tc>
+        <w:tc>
+          <w:tcPr>
+            <w:tcW w:w="851" w:type="dxa"/>
+            <w:noWrap/>
+            <w:hideMark/>
+          </w:tcPr>
+          <w:p>
+            <w:pPr>
+              <w:cnfStyle w:val="000000000000" w:firstRow="0" w:lastRow="0" w:firstColumn="0" w:lastColumn="0" w:oddVBand="0" w:evenVBand="0" w:oddHBand="0" w:evenHBand="0" w:firstRowFirstColumn="0" w:firstRowLastColumn="0" w:lastRowFirstColumn="0" w:lastRowLastColumn="0"/>
+              <w:rPr>
+                <w:rFonts w:ascii="Calibri" w:eastAsia="Times New Roman" w:hAnsi="Calibri" w:cs="Calibri"/>
+                <w:color w:val="000000"/>
+                <w:kern w:val="0"/>
+                <w:sz w:val="22"/>
+                <w:szCs w:val="22"/>
+                <w:lang w:eastAsia="en-GB"/>
+                <w14:ligatures w14:val="none"/>
+              </w:rPr>
+            </w:pPr>
+            <w:r>
+              <w:rPr>
+                <w:rFonts w:ascii="Calibri" w:eastAsia="Times New Roman" w:hAnsi="Calibri" w:cs="Calibri"/>
+                <w:color w:val="000000"/>
+                <w:kern w:val="0"/>
+                <w:sz w:val="22"/>
+                <w:szCs w:val="22"/>
+                <w:lang w:eastAsia="en-GB"/>
+                <w14:ligatures w14:val="none"/>
+              </w:rPr>
+              <w:t>06-Jan-2026</w:t>
+            </w:r>
+          </w:p>
+        </w:tc>
+        <w:tc>
+          <w:tcPr>
+            <w:tcW w:w="992" w:type="dxa"/>
+            <w:noWrap/>
+            <w:hideMark/>
+          </w:tcPr>
+          <w:p>
+            <w:pPr>
+              <w:cnfStyle w:val="000000000000" w:firstRow="0" w:lastRow="0" w:firstColumn="0" w:lastColumn="0" w:oddVBand="0" w:evenVBand="0" w:oddHBand="0" w:evenHBand="0" w:firstRowFirstColumn="0" w:firstRowLastColumn="0" w:lastRowFirstColumn="0" w:lastRowLastColumn="0"/>
+              <w:rPr>
+                <w:rFonts w:ascii="Calibri" w:eastAsia="Times New Roman" w:hAnsi="Calibri" w:cs="Calibri"/>
+                <w:color w:val="000000"/>
+                <w:kern w:val="0"/>
+                <w:sz w:val="22"/>
+                <w:szCs w:val="22"/>
+                <w:lang w:eastAsia="en-GB"/>
+                <w14:ligatures w14:val="none"/>
+              </w:rPr>
+            </w:pPr>
+            <w:r>
+              <w:rPr>
+                <w:rFonts w:ascii="Calibri" w:eastAsia="Times New Roman" w:hAnsi="Calibri" w:cs="Calibri"/>
+                <w:color w:val="000000"/>
+                <w:kern w:val="0"/>
+                <w:sz w:val="22"/>
+                <w:szCs w:val="22"/>
+                <w:lang w:eastAsia="en-GB"/>
+                <w14:ligatures w14:val="none"/>
+              </w:rPr>
+              <w:t>10-Jan-2026</w:t>
+            </w:r>
+          </w:p>
+        </w:tc>
+        <w:tc>
+          <w:tcPr>
+            <w:tcW w:w="1134" w:type="dxa"/>
+            <w:noWrap/>
+            <w:hideMark/>
+          </w:tcPr>
+          <w:p>
+            <w:pPr>
+              <w:cnfStyle w:val="000000000000" w:firstRow="0" w:lastRow="0" w:firstColumn="0" w:lastColumn="0" w:oddVBand="0" w:evenVBand="0" w:oddHBand="0" w:evenHBand="0" w:firstRowFirstColumn="0" w:firstRowLastColumn="0" w:lastRowFirstColumn="0" w:lastRowLastColumn="0"/>
+              <w:rPr>
+                <w:rFonts w:ascii="Calibri" w:eastAsia="Times New Roman" w:hAnsi="Calibri" w:cs="Calibri"/>
+                <w:color w:val="000000"/>
+                <w:kern w:val="0"/>
+                <w:sz w:val="22"/>
+                <w:szCs w:val="22"/>
+                <w:lang w:eastAsia="en-GB"/>
+                <w14:ligatures w14:val="none"/>
+              </w:rPr>
+            </w:pPr>
+            <w:r>
+              <w:rPr>
+                <w:rFonts w:ascii="Calibri" w:eastAsia="Times New Roman" w:hAnsi="Calibri" w:cs="Calibri"/>
+                <w:color w:val="000000"/>
+                <w:kern w:val="0"/>
+                <w:sz w:val="22"/>
+                <w:szCs w:val="22"/>
+                <w:lang w:eastAsia="en-GB"/>
+                <w14:ligatures w14:val="none"/>
+              </w:rPr>
+              <w:t>—</w:t>
+            </w:r>
+          </w:p>
+        </w:tc>
+        <w:tc>
+          <w:tcPr>
+            <w:tcW w:w="3261" w:type="dxa"/>
+            <w:noWrap/>
+            <w:hideMark/>
+          </w:tcPr>
+          <w:p>
+            <w:pPr>
+              <w:cnfStyle w:val="000000000000" w:firstRow="0" w:lastRow="0" w:firstColumn="0" w:lastColumn="0" w:oddVBand="0" w:evenVBand="0" w:oddHBand="0" w:evenHBand="0" w:firstRowFirstColumn="0" w:firstRowLastColumn="0" w:lastRowFirstColumn="0" w:lastRowLastColumn="0"/>
+              <w:rPr>
+                <w:rFonts w:ascii="Calibri" w:eastAsia="Times New Roman" w:hAnsi="Calibri" w:cs="Calibri"/>
+                <w:color w:val="000000"/>
+                <w:kern w:val="0"/>
+                <w:sz w:val="22"/>
+                <w:szCs w:val="22"/>
+                <w:lang w:eastAsia="en-GB"/>
+                <w14:ligatures w14:val="none"/>
+              </w:rPr>
+            </w:pPr>
+            <w:r>
+              <w:rPr>
+                <w:rFonts w:ascii="Calibri" w:eastAsia="Times New Roman" w:hAnsi="Calibri" w:cs="Calibri"/>
+                <w:color w:val="000000"/>
+                <w:kern w:val="0"/>
+                <w:sz w:val="22"/>
+                <w:szCs w:val="22"/>
+                <w:lang w:eastAsia="en-GB"/>
+                <w14:ligatures w14:val="none"/>
+              </w:rPr>
+              <w:t>Completed</w:t>
+            </w:r>
+          </w:p>
+        </w:tc>
+      </w:tr>
+      <w:tr>
+        <w:trPr>
+          <w:cnfStyle w:val="000000100000" w:firstRow="0" w:lastRow="0" w:firstColumn="0" w:lastColumn="0" w:oddVBand="0" w:evenVBand="0" w:oddHBand="1" w:evenHBand="0" w:firstRowFirstColumn="0" w:firstRowLastColumn="0" w:lastRowFirstColumn="0" w:lastRowLastColumn="0"/>
+          <w:trHeight w:val="290"/>
+        </w:trPr>
+        <w:tc>
+          <w:tcPr>
+            <w:cnfStyle w:val="001000000000" w:firstRow="0" w:lastRow="0" w:firstColumn="1" w:lastColumn="0" w:oddVBand="0" w:evenVBand="0" w:oddHBand="0" w:evenHBand="0" w:firstRowFirstColumn="0" w:firstRowLastColumn="0" w:lastRowFirstColumn="0" w:lastRowLastColumn="0"/>
+            <w:tcW w:w="709" w:type="dxa"/>
+            <w:noWrap/>
+            <w:hideMark/>
+          </w:tcPr>
+          <w:p>
+            <w:pPr>
+              <w:jc w:val="right"/>
+              <w:rPr>
+                <w:rFonts w:ascii="Calibri" w:eastAsia="Times New Roman" w:hAnsi="Calibri" w:cs="Calibri"/>
+                <w:color w:val="000000"/>
+                <w:kern w:val="0"/>
+                <w:sz w:val="22"/>
+                <w:szCs w:val="22"/>
+                <w:lang w:eastAsia="en-GB"/>
+                <w14:ligatures w14:val="none"/>
+              </w:rPr>
+            </w:pPr>
+            <w:r>
+              <w:rPr>
+                <w:rFonts w:ascii="Calibri" w:eastAsia="Times New Roman" w:hAnsi="Calibri" w:cs="Calibri"/>
+                <w:color w:val="000000"/>
+                <w:kern w:val="0"/>
+                <w:sz w:val="22"/>
+                <w:szCs w:val="22"/>
+                <w:lang w:eastAsia="en-GB"/>
+                <w14:ligatures w14:val="none"/>
+              </w:rPr>
+              <w:t>5</w:t>
+            </w:r>
+          </w:p>
+        </w:tc>
+        <w:tc>
+          <w:tcPr>
+            <w:tcW w:w="1659" w:type="dxa"/>
+            <w:noWrap/>
+            <w:hideMark/>
+          </w:tcPr>
+          <w:p>
+            <w:pPr>
+              <w:cnfStyle w:val="000000100000" w:firstRow="0" w:lastRow="0" w:firstColumn="0" w:lastColumn="0" w:oddVBand="0" w:evenVBand="0" w:oddHBand="1" w:evenHBand="0" w:firstRowFirstColumn="0" w:firstRowLastColumn="0" w:lastRowFirstColumn="0" w:lastRowLastColumn="0"/>
+              <w:rPr>
+                <w:rFonts w:ascii="Calibri" w:eastAsia="Times New Roman" w:hAnsi="Calibri" w:cs="Calibri"/>
+                <w:color w:val="000000"/>
+                <w:kern w:val="0"/>
+                <w:sz w:val="22"/>
+                <w:szCs w:val="22"/>
+                <w:lang w:eastAsia="en-GB"/>
+                <w14:ligatures w14:val="none"/>
+              </w:rPr>
+            </w:pPr>
+            <w:r>
+              <w:rPr>
+                <w:rFonts w:ascii="Calibri" w:eastAsia="Times New Roman" w:hAnsi="Calibri" w:cs="Calibri"/>
+                <w:color w:val="000000"/>
+                <w:kern w:val="0"/>
+                <w:sz w:val="22"/>
+                <w:szCs w:val="22"/>
+                <w:lang w:eastAsia="en-GB"/>
+                <w14:ligatures w14:val="none"/>
+              </w:rPr>
+              <w:t>Sensor &amp; Movement Planning</w:t>
+            </w:r>
+          </w:p>
+        </w:tc>
+        <w:tc>
+          <w:tcPr>
+            <w:tcW w:w="1659" w:type="dxa"/>
+            <w:noWrap/>
+            <w:hideMark/>
+          </w:tcPr>
+          <w:p>
+            <w:pPr>
+              <w:cnfStyle w:val="000000100000" w:firstRow="0" w:lastRow="0" w:firstColumn="0" w:lastColumn="0" w:oddVBand="0" w:evenVBand="0" w:oddHBand="1" w:evenHBand="0" w:firstRowFirstColumn="0" w:firstRowLastColumn="0" w:lastRowFirstColumn="0" w:lastRowLastColumn="0"/>
+              <w:rPr>
+                <w:rFonts w:ascii="Calibri" w:eastAsia="Times New Roman" w:hAnsi="Calibri" w:cs="Calibri"/>
+                <w:color w:val="000000"/>
+                <w:kern w:val="0"/>
+                <w:sz w:val="22"/>
+                <w:szCs w:val="22"/>
+                <w:lang w:eastAsia="en-GB"/>
+                <w14:ligatures w14:val="none"/>
+              </w:rPr>
+            </w:pPr>
+            <w:r>
+              <w:rPr>
+                <w:rFonts w:ascii="Calibri" w:eastAsia="Times New Roman" w:hAnsi="Calibri" w:cs="Calibri"/>
+                <w:color w:val="000000"/>
+                <w:kern w:val="0"/>
+                <w:sz w:val="22"/>
+                <w:szCs w:val="22"/>
+                <w:lang w:eastAsia="en-GB"/>
+                <w14:ligatures w14:val="none"/>
+              </w:rPr>
+              <w:t>Design</w:t>
+            </w:r>
+          </w:p>
+        </w:tc>
+        <w:tc>
+          <w:tcPr>
+            <w:tcW w:w="2352" w:type="dxa"/>
+            <w:noWrap/>
+            <w:hideMark/>
+          </w:tcPr>
+          <w:p>
+            <w:pPr>
+              <w:cnfStyle w:val="000000100000" w:firstRow="0" w:lastRow="0" w:firstColumn="0" w:lastColumn="0" w:oddVBand="0" w:evenVBand="0" w:oddHBand="1" w:evenHBand="0" w:firstRowFirstColumn="0" w:firstRowLastColumn="0" w:lastRowFirstColumn="0" w:lastRowLastColumn="0"/>
+              <w:rPr>
+                <w:rFonts w:ascii="Calibri" w:eastAsia="Times New Roman" w:hAnsi="Calibri" w:cs="Calibri"/>
+                <w:color w:val="000000"/>
+                <w:kern w:val="0"/>
+                <w:sz w:val="22"/>
+                <w:szCs w:val="22"/>
+                <w:lang w:eastAsia="en-GB"/>
+                <w14:ligatures w14:val="none"/>
+              </w:rPr>
+            </w:pPr>
+            <w:r>
+              <w:rPr>
+                <w:rFonts w:ascii="Calibri" w:eastAsia="Times New Roman" w:hAnsi="Calibri" w:cs="Calibri"/>
+                <w:color w:val="000000"/>
+                <w:kern w:val="0"/>
+                <w:sz w:val="22"/>
+                <w:szCs w:val="22"/>
+                <w:lang w:eastAsia="en-GB"/>
+                <w14:ligatures w14:val="none"/>
+              </w:rPr>
+              <w:t>Updated design diagrams</w:t>
+            </w:r>
+          </w:p>
+        </w:tc>
+        <w:tc>
+          <w:tcPr>
+            <w:tcW w:w="851" w:type="dxa"/>
+            <w:noWrap/>
+            <w:hideMark/>
+          </w:tcPr>
+          <w:p>
+            <w:pPr>
+              <w:cnfStyle w:val="000000100000" w:firstRow="0" w:lastRow="0" w:firstColumn="0" w:lastColumn="0" w:oddVBand="0" w:evenVBand="0" w:oddHBand="1" w:evenHBand="0" w:firstRowFirstColumn="0" w:firstRowLastColumn="0" w:lastRowFirstColumn="0" w:lastRowLastColumn="0"/>
+              <w:rPr>
+                <w:rFonts w:ascii="Calibri" w:eastAsia="Times New Roman" w:hAnsi="Calibri" w:cs="Calibri"/>
+                <w:color w:val="000000"/>
+                <w:kern w:val="0"/>
+                <w:sz w:val="22"/>
+                <w:szCs w:val="22"/>
+                <w:lang w:eastAsia="en-GB"/>
+                <w14:ligatures w14:val="none"/>
+              </w:rPr>
+            </w:pPr>
+            <w:r>
+              <w:rPr>
+                <w:rFonts w:ascii="Calibri" w:eastAsia="Times New Roman" w:hAnsi="Calibri" w:cs="Calibri"/>
+                <w:color w:val="000000"/>
+                <w:kern w:val="0"/>
+                <w:sz w:val="22"/>
+                <w:szCs w:val="22"/>
+                <w:lang w:eastAsia="en-GB"/>
+                <w14:ligatures w14:val="none"/>
+              </w:rPr>
+              <w:t>08-Jan-2026</w:t>
+            </w:r>
+          </w:p>
+        </w:tc>
+        <w:tc>
+          <w:tcPr>
+            <w:tcW w:w="992" w:type="dxa"/>
+            <w:noWrap/>
+            <w:hideMark/>
+          </w:tcPr>
+          <w:p>
+            <w:pPr>
+              <w:cnfStyle w:val="000000100000" w:firstRow="0" w:lastRow="0" w:firstColumn="0" w:lastColumn="0" w:oddVBand="0" w:evenVBand="0" w:oddHBand="1" w:evenHBand="0" w:firstRowFirstColumn="0" w:firstRowLastColumn="0" w:lastRowFirstColumn="0" w:lastRowLastColumn="0"/>
+              <w:rPr>
+                <w:rFonts w:ascii="Calibri" w:eastAsia="Times New Roman" w:hAnsi="Calibri" w:cs="Calibri"/>
+                <w:color w:val="000000"/>
+                <w:kern w:val="0"/>
+                <w:sz w:val="22"/>
+                <w:szCs w:val="22"/>
+                <w:lang w:eastAsia="en-GB"/>
+                <w14:ligatures w14:val="none"/>
+              </w:rPr>
+            </w:pPr>
+            <w:r>
+              <w:rPr>
+                <w:rFonts w:ascii="Calibri" w:eastAsia="Times New Roman" w:hAnsi="Calibri" w:cs="Calibri"/>
+                <w:color w:val="000000"/>
+                <w:kern w:val="0"/>
+                <w:sz w:val="22"/>
+                <w:szCs w:val="22"/>
+                <w:lang w:eastAsia="en-GB"/>
+                <w14:ligatures w14:val="none"/>
+              </w:rPr>
+              <w:t>12-Jan-2026</w:t>
+            </w:r>
+          </w:p>
+        </w:tc>
+        <w:tc>
+          <w:tcPr>
+            <w:tcW w:w="1134" w:type="dxa"/>
+            <w:noWrap/>
+            <w:hideMark/>
+          </w:tcPr>
+          <w:p>
+            <w:pPr>
+              <w:cnfStyle w:val="000000100000" w:firstRow="0" w:lastRow="0" w:firstColumn="0" w:lastColumn="0" w:oddVBand="0" w:evenVBand="0" w:oddHBand="1" w:evenHBand="0" w:firstRowFirstColumn="0" w:firstRowLastColumn="0" w:lastRowFirstColumn="0" w:lastRowLastColumn="0"/>
+              <w:rPr>
+                <w:rFonts w:ascii="Calibri" w:eastAsia="Times New Roman" w:hAnsi="Calibri" w:cs="Calibri"/>
+                <w:color w:val="000000"/>
+                <w:kern w:val="0"/>
+                <w:sz w:val="22"/>
+                <w:szCs w:val="22"/>
+                <w:lang w:eastAsia="en-GB"/>
+                <w14:ligatures w14:val="none"/>
+              </w:rPr>
+            </w:pPr>
+            <w:r>
+              <w:rPr>
+                <w:rFonts w:ascii="Calibri" w:eastAsia="Times New Roman" w:hAnsi="Calibri" w:cs="Calibri"/>
+                <w:color w:val="000000"/>
+                <w:kern w:val="0"/>
+                <w:sz w:val="22"/>
+                <w:szCs w:val="22"/>
+                <w:lang w:eastAsia="en-GB"/>
+                <w14:ligatures w14:val="none"/>
+              </w:rPr>
+              <w:t>—</w:t>
+            </w:r>
+          </w:p>
+        </w:tc>
+        <w:tc>
+          <w:tcPr>
+            <w:tcW w:w="3261" w:type="dxa"/>
+            <w:noWrap/>
+            <w:hideMark/>
+          </w:tcPr>
+          <w:p>
+            <w:pPr>
+              <w:cnfStyle w:val="000000100000" w:firstRow="0" w:lastRow="0" w:firstColumn="0" w:lastColumn="0" w:oddVBand="0" w:evenVBand="0" w:oddHBand="1" w:evenHBand="0" w:firstRowFirstColumn="0" w:firstRowLastColumn="0" w:lastRowFirstColumn="0" w:lastRowLastColumn="0"/>
+              <w:rPr>
+                <w:rFonts w:ascii="Calibri" w:eastAsia="Times New Roman" w:hAnsi="Calibri" w:cs="Calibri"/>
+                <w:color w:val="000000"/>
+                <w:kern w:val="0"/>
+                <w:sz w:val="22"/>
+                <w:szCs w:val="22"/>
+                <w:lang w:eastAsia="en-GB"/>
+                <w14:ligatures w14:val="none"/>
+              </w:rPr>
+            </w:pPr>
+            <w:r>
+              <w:rPr>
+                <w:rFonts w:ascii="Calibri" w:eastAsia="Times New Roman" w:hAnsi="Calibri" w:cs="Calibri"/>
+                <w:color w:val="000000"/>
+                <w:kern w:val="0"/>
+                <w:sz w:val="22"/>
+                <w:szCs w:val="22"/>
+                <w:lang w:eastAsia="en-GB"/>
+                <w14:ligatures w14:val="none"/>
+              </w:rPr>
+              <w:t>Completed</w:t>
+            </w:r>
+          </w:p>
+        </w:tc>
+      </w:tr>
+      <w:tr>
+        <w:trPr>
+          <w:trHeight w:val="290"/>
+        </w:trPr>
+        <w:tc>
+          <w:tcPr>
+            <w:cnfStyle w:val="001000000000" w:firstRow="0" w:lastRow="0" w:firstColumn="1" w:lastColumn="0" w:oddVBand="0" w:evenVBand="0" w:oddHBand="0" w:evenHBand="0" w:firstRowFirstColumn="0" w:firstRowLastColumn="0" w:lastRowFirstColumn="0" w:lastRowLastColumn="0"/>
+            <w:tcW w:w="709" w:type="dxa"/>
+            <w:noWrap/>
+            <w:hideMark/>
+          </w:tcPr>
+          <w:p>
+            <w:pPr>
+              <w:jc w:val="right"/>
+              <w:rPr>
+                <w:rFonts w:ascii="Calibri" w:eastAsia="Times New Roman" w:hAnsi="Calibri" w:cs="Calibri"/>
+                <w:color w:val="000000"/>
+                <w:kern w:val="0"/>
+                <w:sz w:val="22"/>
+                <w:szCs w:val="22"/>
+                <w:lang w:eastAsia="en-GB"/>
+                <w14:ligatures w14:val="none"/>
+              </w:rPr>
+            </w:pPr>
+            <w:r>
+              <w:rPr>
+                <w:rFonts w:ascii="Calibri" w:eastAsia="Times New Roman" w:hAnsi="Calibri" w:cs="Calibri"/>
+                <w:color w:val="000000"/>
+                <w:kern w:val="0"/>
+                <w:sz w:val="22"/>
+                <w:szCs w:val="22"/>
+                <w:lang w:eastAsia="en-GB"/>
+                <w14:ligatures w14:val="none"/>
+              </w:rPr>
+              <w:t>6</w:t>
+            </w:r>
+          </w:p>
+        </w:tc>
+        <w:tc>
+          <w:tcPr>
+            <w:tcW w:w="1659" w:type="dxa"/>
+            <w:noWrap/>
+            <w:hideMark/>
+          </w:tcPr>
+          <w:p>
+            <w:pPr>
+              <w:cnfStyle w:val="000000000000" w:firstRow="0" w:lastRow="0" w:firstColumn="0" w:lastColumn="0" w:oddVBand="0" w:evenVBand="0" w:oddHBand="0" w:evenHBand="0" w:firstRowFirstColumn="0" w:firstRowLastColumn="0" w:lastRowFirstColumn="0" w:lastRowLastColumn="0"/>
+              <w:rPr>
+                <w:rFonts w:ascii="Calibri" w:eastAsia="Times New Roman" w:hAnsi="Calibri" w:cs="Calibri"/>
+                <w:color w:val="000000"/>
+                <w:kern w:val="0"/>
+                <w:sz w:val="22"/>
+                <w:szCs w:val="22"/>
+                <w:lang w:eastAsia="en-GB"/>
+                <w14:ligatures w14:val="none"/>
+              </w:rPr>
+            </w:pPr>
+            <w:r>
+              <w:rPr>
+                <w:rFonts w:ascii="Calibri" w:eastAsia="Times New Roman" w:hAnsi="Calibri" w:cs="Calibri"/>
+                <w:color w:val="000000"/>
+                <w:kern w:val="0"/>
+                <w:sz w:val="22"/>
+                <w:szCs w:val="22"/>
+                <w:lang w:eastAsia="en-GB"/>
+                <w14:ligatures w14:val="none"/>
+              </w:rPr>
+              <w:t>Incremental Draft Refinement</w:t>
+            </w:r>
+          </w:p>
+        </w:tc>
+        <w:tc>
+          <w:tcPr>
+            <w:tcW w:w="1659" w:type="dxa"/>
+            <w:noWrap/>
+            <w:hideMark/>
+          </w:tcPr>
+          <w:p>
+            <w:pPr>
+              <w:cnfStyle w:val="000000000000" w:firstRow="0" w:lastRow="0" w:firstColumn="0" w:lastColumn="0" w:oddVBand="0" w:evenVBand="0" w:oddHBand="0" w:evenHBand="0" w:firstRowFirstColumn="0" w:firstRowLastColumn="0" w:lastRowFirstColumn="0" w:lastRowLastColumn="0"/>
+              <w:rPr>
+                <w:rFonts w:ascii="Calibri" w:eastAsia="Times New Roman" w:hAnsi="Calibri" w:cs="Calibri"/>
+                <w:color w:val="000000"/>
+                <w:kern w:val="0"/>
+                <w:sz w:val="22"/>
+                <w:szCs w:val="22"/>
+                <w:lang w:eastAsia="en-GB"/>
+                <w14:ligatures w14:val="none"/>
+              </w:rPr>
+            </w:pPr>
+            <w:r>
+              <w:rPr>
+                <w:rFonts w:ascii="Calibri" w:eastAsia="Times New Roman" w:hAnsi="Calibri" w:cs="Calibri"/>
+                <w:color w:val="000000"/>
+                <w:kern w:val="0"/>
+                <w:sz w:val="22"/>
+                <w:szCs w:val="22"/>
+                <w:lang w:eastAsia="en-GB"/>
+                <w14:ligatures w14:val="none"/>
+              </w:rPr>
+              <w:t>Design</w:t>
+            </w:r>
+          </w:p>
+        </w:tc>
+        <w:tc>
+          <w:tcPr>
+            <w:tcW w:w="2352" w:type="dxa"/>
+            <w:noWrap/>
+            <w:hideMark/>
+          </w:tcPr>
+          <w:p>
+            <w:pPr>
+              <w:cnfStyle w:val="000000000000" w:firstRow="0" w:lastRow="0" w:firstColumn="0" w:lastColumn="0" w:oddVBand="0" w:evenVBand="0" w:oddHBand="0" w:evenHBand="0" w:firstRowFirstColumn="0" w:firstRowLastColumn="0" w:lastRowFirstColumn="0" w:lastRowLastColumn="0"/>
+              <w:rPr>
+                <w:rFonts w:ascii="Calibri" w:eastAsia="Times New Roman" w:hAnsi="Calibri" w:cs="Calibri"/>
+                <w:color w:val="000000"/>
+                <w:kern w:val="0"/>
+                <w:sz w:val="22"/>
+                <w:szCs w:val="22"/>
+                <w:lang w:eastAsia="en-GB"/>
+                <w14:ligatures w14:val="none"/>
+              </w:rPr>
+            </w:pPr>
+            <w:r>
+              <w:rPr>
+                <w:rFonts w:ascii="Calibri" w:eastAsia="Times New Roman" w:hAnsi="Calibri" w:cs="Calibri"/>
+                <w:color w:val="000000"/>
+                <w:kern w:val="0"/>
+                <w:sz w:val="22"/>
+                <w:szCs w:val="22"/>
+                <w:lang w:eastAsia="en-GB"/>
+                <w14:ligatures w14:val="none"/>
+              </w:rPr>
+              <w:t>Draft v3</w:t>
+            </w:r>
+          </w:p>
+        </w:tc>
+        <w:tc>
+          <w:tcPr>
+            <w:tcW w:w="851" w:type="dxa"/>
+            <w:noWrap/>
+            <w:hideMark/>
+          </w:tcPr>
+          <w:p>
+            <w:pPr>
+              <w:cnfStyle w:val="000000000000" w:firstRow="0" w:lastRow="0" w:firstColumn="0" w:lastColumn="0" w:oddVBand="0" w:evenVBand="0" w:oddHBand="0" w:evenHBand="0" w:firstRowFirstColumn="0" w:firstRowLastColumn="0" w:lastRowFirstColumn="0" w:lastRowLastColumn="0"/>
+              <w:rPr>
+                <w:rFonts w:ascii="Calibri" w:eastAsia="Times New Roman" w:hAnsi="Calibri" w:cs="Calibri"/>
+                <w:color w:val="000000"/>
+                <w:kern w:val="0"/>
+                <w:sz w:val="22"/>
+                <w:szCs w:val="22"/>
+                <w:lang w:eastAsia="en-GB"/>
+                <w14:ligatures w14:val="none"/>
+              </w:rPr>
+            </w:pPr>
+            <w:r>
+              <w:rPr>
+                <w:rFonts w:ascii="Calibri" w:eastAsia="Times New Roman" w:hAnsi="Calibri" w:cs="Calibri"/>
+                <w:color w:val="000000"/>
+                <w:kern w:val="0"/>
+                <w:sz w:val="22"/>
+                <w:szCs w:val="22"/>
+                <w:lang w:eastAsia="en-GB"/>
+                <w14:ligatures w14:val="none"/>
+              </w:rPr>
+              <w:t>11-Jan-2026</w:t>
+            </w:r>
+          </w:p>
+        </w:tc>
+        <w:tc>
+          <w:tcPr>
+            <w:tcW w:w="992" w:type="dxa"/>
+            <w:noWrap/>
+            <w:hideMark/>
+          </w:tcPr>
+          <w:p>
+            <w:pPr>
+              <w:cnfStyle w:val="000000000000" w:firstRow="0" w:lastRow="0" w:firstColumn="0" w:lastColumn="0" w:oddVBand="0" w:evenVBand="0" w:oddHBand="0" w:evenHBand="0" w:firstRowFirstColumn="0" w:firstRowLastColumn="0" w:lastRowFirstColumn="0" w:lastRowLastColumn="0"/>
+              <w:rPr>
+                <w:rFonts w:ascii="Calibri" w:eastAsia="Times New Roman" w:hAnsi="Calibri" w:cs="Calibri"/>
+                <w:color w:val="000000"/>
+                <w:kern w:val="0"/>
+                <w:sz w:val="22"/>
+                <w:szCs w:val="22"/>
+                <w:lang w:eastAsia="en-GB"/>
+                <w14:ligatures w14:val="none"/>
+              </w:rPr>
+            </w:pPr>
+            <w:r>
+              <w:rPr>
+                <w:rFonts w:ascii="Calibri" w:eastAsia="Times New Roman" w:hAnsi="Calibri" w:cs="Calibri"/>
+                <w:color w:val="000000"/>
+                <w:kern w:val="0"/>
+                <w:sz w:val="22"/>
+                <w:szCs w:val="22"/>
+                <w:lang w:eastAsia="en-GB"/>
+                <w14:ligatures w14:val="none"/>
+              </w:rPr>
+              <w:t>15-Jan-2026</w:t>
+            </w:r>
+          </w:p>
+        </w:tc>
+        <w:tc>
+          <w:tcPr>
+            <w:tcW w:w="1134" w:type="dxa"/>
+            <w:noWrap/>
+            <w:hideMark/>
+          </w:tcPr>
+          <w:p>
+            <w:pPr>
+              <w:cnfStyle w:val="000000000000" w:firstRow="0" w:lastRow="0" w:firstColumn="0" w:lastColumn="0" w:oddVBand="0" w:evenVBand="0" w:oddHBand="0" w:evenHBand="0" w:firstRowFirstColumn="0" w:firstRowLastColumn="0" w:lastRowFirstColumn="0" w:lastRowLastColumn="0"/>
+              <w:rPr>
+                <w:rFonts w:ascii="Calibri" w:eastAsia="Times New Roman" w:hAnsi="Calibri" w:cs="Calibri"/>
+                <w:color w:val="000000"/>
+                <w:kern w:val="0"/>
+                <w:sz w:val="22"/>
+                <w:szCs w:val="22"/>
+                <w:lang w:eastAsia="en-GB"/>
+                <w14:ligatures w14:val="none"/>
+              </w:rPr>
+            </w:pPr>
+            <w:r>
+              <w:rPr>
+                <w:rFonts w:ascii="Calibri" w:eastAsia="Times New Roman" w:hAnsi="Calibri" w:cs="Calibri"/>
+                <w:color w:val="000000"/>
+                <w:kern w:val="0"/>
+                <w:sz w:val="22"/>
+                <w:szCs w:val="22"/>
+                <w:lang w:eastAsia="en-GB"/>
+                <w14:ligatures w14:val="none"/>
+              </w:rPr>
+              <w:t>Tutorial 2</w:t>
+            </w:r>
+          </w:p>
+        </w:tc>
+        <w:tc>
+          <w:tcPr>
+            <w:tcW w:w="3261" w:type="dxa"/>
+            <w:noWrap/>
+            <w:hideMark/>
+          </w:tcPr>
+          <w:p>
+            <w:pPr>
+              <w:cnfStyle w:val="000000000000" w:firstRow="0" w:lastRow="0" w:firstColumn="0" w:lastColumn="0" w:oddVBand="0" w:evenVBand="0" w:oddHBand="0" w:evenHBand="0" w:firstRowFirstColumn="0" w:firstRowLastColumn="0" w:lastRowFirstColumn="0" w:lastRowLastColumn="0"/>
+              <w:rPr>
+                <w:rFonts w:ascii="Calibri" w:eastAsia="Times New Roman" w:hAnsi="Calibri" w:cs="Calibri"/>
+                <w:color w:val="000000"/>
+                <w:kern w:val="0"/>
+                <w:sz w:val="22"/>
+                <w:szCs w:val="22"/>
+                <w:lang w:eastAsia="en-GB"/>
+                <w14:ligatures w14:val="none"/>
+              </w:rPr>
+            </w:pPr>
+            <w:r>
+              <w:rPr>
+                <w:rFonts w:ascii="Calibri" w:eastAsia="Times New Roman" w:hAnsi="Calibri" w:cs="Calibri"/>
+                <w:color w:val="000000"/>
+                <w:kern w:val="0"/>
+                <w:sz w:val="22"/>
+                <w:szCs w:val="22"/>
+                <w:lang w:eastAsia="en-GB"/>
+                <w14:ligatures w14:val="none"/>
+              </w:rPr>
+              <w:t>Completed</w:t>
+            </w:r>
+          </w:p>
+        </w:tc>
+      </w:tr>
+      <w:tr>
+        <w:trPr>
+          <w:cnfStyle w:val="000000100000" w:firstRow="0" w:lastRow="0" w:firstColumn="0" w:lastColumn="0" w:oddVBand="0" w:evenVBand="0" w:oddHBand="1" w:evenHBand="0" w:firstRowFirstColumn="0" w:firstRowLastColumn="0" w:lastRowFirstColumn="0" w:lastRowLastColumn="0"/>
+          <w:trHeight w:val="290"/>
+        </w:trPr>
+        <w:tc>
+          <w:tcPr>
+            <w:cnfStyle w:val="001000000000" w:firstRow="0" w:lastRow="0" w:firstColumn="1" w:lastColumn="0" w:oddVBand="0" w:evenVBand="0" w:oddHBand="0" w:evenHBand="0" w:firstRowFirstColumn="0" w:firstRowLastColumn="0" w:lastRowFirstColumn="0" w:lastRowLastColumn="0"/>
+            <w:tcW w:w="709" w:type="dxa"/>
+            <w:noWrap/>
+            <w:hideMark/>
+          </w:tcPr>
+          <w:p>
+            <w:pPr>
+              <w:jc w:val="right"/>
+              <w:rPr>
+                <w:rFonts w:ascii="Calibri" w:eastAsia="Times New Roman" w:hAnsi="Calibri" w:cs="Calibri"/>
+                <w:color w:val="000000"/>
+                <w:kern w:val="0"/>
+                <w:sz w:val="22"/>
+                <w:szCs w:val="22"/>
+                <w:lang w:eastAsia="en-GB"/>
+                <w14:ligatures w14:val="none"/>
+              </w:rPr>
+            </w:pPr>
+            <w:r>
+              <w:rPr>
+                <w:rFonts w:ascii="Calibri" w:eastAsia="Times New Roman" w:hAnsi="Calibri" w:cs="Calibri"/>
+                <w:color w:val="000000"/>
+                <w:kern w:val="0"/>
+                <w:sz w:val="22"/>
+                <w:szCs w:val="22"/>
+                <w:lang w:eastAsia="en-GB"/>
+                <w14:ligatures w14:val="none"/>
+              </w:rPr>
+              <w:t>7</w:t>
+            </w:r>
+          </w:p>
+        </w:tc>
+        <w:tc>
+          <w:tcPr>
+            <w:tcW w:w="1659" w:type="dxa"/>
+            <w:noWrap/>
+            <w:hideMark/>
+          </w:tcPr>
+          <w:p>
+            <w:pPr>
+              <w:cnfStyle w:val="000000100000" w:firstRow="0" w:lastRow="0" w:firstColumn="0" w:lastColumn="0" w:oddVBand="0" w:evenVBand="0" w:oddHBand="1" w:evenHBand="0" w:firstRowFirstColumn="0" w:firstRowLastColumn="0" w:lastRowFirstColumn="0" w:lastRowLastColumn="0"/>
+              <w:rPr>
+                <w:rFonts w:ascii="Calibri" w:eastAsia="Times New Roman" w:hAnsi="Calibri" w:cs="Calibri"/>
+                <w:color w:val="000000"/>
+                <w:kern w:val="0"/>
+                <w:sz w:val="22"/>
+                <w:szCs w:val="22"/>
+                <w:lang w:eastAsia="en-GB"/>
+                <w14:ligatures w14:val="none"/>
+              </w:rPr>
+            </w:pPr>
+            <w:r>
+              <w:rPr>
+                <w:rFonts w:ascii="Calibri" w:eastAsia="Times New Roman" w:hAnsi="Calibri" w:cs="Calibri"/>
+                <w:color w:val="000000"/>
+                <w:kern w:val="0"/>
+                <w:sz w:val="22"/>
+                <w:szCs w:val="22"/>
+                <w:lang w:eastAsia="en-GB"/>
+                <w14:ligatures w14:val="none"/>
+              </w:rPr>
+              <w:t>Tutor Feedback Integration</w:t>
+            </w:r>
+          </w:p>
+        </w:tc>
+        <w:tc>
+          <w:tcPr>
+            <w:tcW w:w="1659" w:type="dxa"/>
+            <w:noWrap/>
+            <w:hideMark/>
+          </w:tcPr>
+          <w:p>
+            <w:pPr>
+              <w:cnfStyle w:val="000000100000" w:firstRow="0" w:lastRow="0" w:firstColumn="0" w:lastColumn="0" w:oddVBand="0" w:evenVBand="0" w:oddHBand="1" w:evenHBand="0" w:firstRowFirstColumn="0" w:firstRowLastColumn="0" w:lastRowFirstColumn="0" w:lastRowLastColumn="0"/>
+              <w:rPr>
+                <w:rFonts w:ascii="Calibri" w:eastAsia="Times New Roman" w:hAnsi="Calibri" w:cs="Calibri"/>
+                <w:color w:val="000000"/>
+                <w:kern w:val="0"/>
+                <w:sz w:val="22"/>
+                <w:szCs w:val="22"/>
+                <w:lang w:eastAsia="en-GB"/>
+                <w14:ligatures w14:val="none"/>
+              </w:rPr>
+            </w:pPr>
+            <w:r>
+              <w:rPr>
+                <w:rFonts w:ascii="Calibri" w:eastAsia="Times New Roman" w:hAnsi="Calibri" w:cs="Calibri"/>
+                <w:color w:val="000000"/>
+                <w:kern w:val="0"/>
+                <w:sz w:val="22"/>
+                <w:szCs w:val="22"/>
+                <w:lang w:eastAsia="en-GB"/>
+                <w14:ligatures w14:val="none"/>
+              </w:rPr>
+              <w:t>Design</w:t>
+            </w:r>
+          </w:p>
+        </w:tc>
+        <w:tc>
+          <w:tcPr>
+            <w:tcW w:w="2352" w:type="dxa"/>
+            <w:noWrap/>
+            <w:hideMark/>
+          </w:tcPr>
+          <w:p>
+            <w:pPr>
+              <w:cnfStyle w:val="000000100000" w:firstRow="0" w:lastRow="0" w:firstColumn="0" w:lastColumn="0" w:oddVBand="0" w:evenVBand="0" w:oddHBand="1" w:evenHBand="0" w:firstRowFirstColumn="0" w:firstRowLastColumn="0" w:lastRowFirstColumn="0" w:lastRowLastColumn="0"/>
+              <w:rPr>
+                <w:rFonts w:ascii="Calibri" w:eastAsia="Times New Roman" w:hAnsi="Calibri" w:cs="Calibri"/>
+                <w:color w:val="000000"/>
+                <w:kern w:val="0"/>
+                <w:sz w:val="22"/>
+                <w:szCs w:val="22"/>
+                <w:lang w:eastAsia="en-GB"/>
+                <w14:ligatures w14:val="none"/>
+              </w:rPr>
+            </w:pPr>
+            <w:r>
+              <w:rPr>
+                <w:rFonts w:ascii="Calibri" w:eastAsia="Times New Roman" w:hAnsi="Calibri" w:cs="Calibri"/>
+                <w:color w:val="000000"/>
+                <w:kern w:val="0"/>
+                <w:sz w:val="22"/>
+                <w:szCs w:val="22"/>
+                <w:lang w:eastAsia="en-GB"/>
+                <w14:ligatures w14:val="none"/>
+              </w:rPr>
+              <w:t>Revised design draft v4</w:t>
+            </w:r>
+          </w:p>
+        </w:tc>
+        <w:tc>
+          <w:tcPr>
+            <w:tcW w:w="851" w:type="dxa"/>
+            <w:noWrap/>
+            <w:hideMark/>
+          </w:tcPr>
+          <w:p>
+            <w:pPr>
+              <w:cnfStyle w:val="000000100000" w:firstRow="0" w:lastRow="0" w:firstColumn="0" w:lastColumn="0" w:oddVBand="0" w:evenVBand="0" w:oddHBand="1" w:evenHBand="0" w:firstRowFirstColumn="0" w:firstRowLastColumn="0" w:lastRowFirstColumn="0" w:lastRowLastColumn="0"/>
+              <w:rPr>
+                <w:rFonts w:ascii="Calibri" w:eastAsia="Times New Roman" w:hAnsi="Calibri" w:cs="Calibri"/>
+                <w:color w:val="000000"/>
+                <w:kern w:val="0"/>
+                <w:sz w:val="22"/>
+                <w:szCs w:val="22"/>
+                <w:lang w:eastAsia="en-GB"/>
+                <w14:ligatures w14:val="none"/>
+              </w:rPr>
+            </w:pPr>
+            <w:r>
+              <w:rPr>
+                <w:rFonts w:ascii="Calibri" w:eastAsia="Times New Roman" w:hAnsi="Calibri" w:cs="Calibri"/>
+                <w:color w:val="000000"/>
+                <w:kern w:val="0"/>
+                <w:sz w:val="22"/>
+                <w:szCs w:val="22"/>
+                <w:lang w:eastAsia="en-GB"/>
+                <w14:ligatures w14:val="none"/>
+              </w:rPr>
+              <w:t>16-Jan-2026</w:t>
+            </w:r>
+          </w:p>
+        </w:tc>
+        <w:tc>
+          <w:tcPr>
+            <w:tcW w:w="992" w:type="dxa"/>
+            <w:noWrap/>
+            <w:hideMark/>
+          </w:tcPr>
+          <w:p>
+            <w:pPr>
+              <w:cnfStyle w:val="000000100000" w:firstRow="0" w:lastRow="0" w:firstColumn="0" w:lastColumn="0" w:oddVBand="0" w:evenVBand="0" w:oddHBand="1" w:evenHBand="0" w:firstRowFirstColumn="0" w:firstRowLastColumn="0" w:lastRowFirstColumn="0" w:lastRowLastColumn="0"/>
+              <w:rPr>
+                <w:rFonts w:ascii="Calibri" w:eastAsia="Times New Roman" w:hAnsi="Calibri" w:cs="Calibri"/>
+                <w:color w:val="000000"/>
+                <w:kern w:val="0"/>
+                <w:sz w:val="22"/>
+                <w:szCs w:val="22"/>
+                <w:lang w:eastAsia="en-GB"/>
+                <w14:ligatures w14:val="none"/>
+              </w:rPr>
+            </w:pPr>
+            <w:r>
+              <w:rPr>
+                <w:rFonts w:ascii="Calibri" w:eastAsia="Times New Roman" w:hAnsi="Calibri" w:cs="Calibri"/>
+                <w:color w:val="000000"/>
+                <w:kern w:val="0"/>
+                <w:sz w:val="22"/>
+                <w:szCs w:val="22"/>
+                <w:lang w:eastAsia="en-GB"/>
+                <w14:ligatures w14:val="none"/>
+              </w:rPr>
+              <w:t>18-Jan-2026</w:t>
+            </w:r>
+          </w:p>
+        </w:tc>
+        <w:tc>
+          <w:tcPr>
+            <w:tcW w:w="1134" w:type="dxa"/>
+            <w:noWrap/>
+            <w:hideMark/>
+          </w:tcPr>
+          <w:p>
+            <w:pPr>
+              <w:cnfStyle w:val="000000100000" w:firstRow="0" w:lastRow="0" w:firstColumn="0" w:lastColumn="0" w:oddVBand="0" w:evenVBand="0" w:oddHBand="1" w:evenHBand="0" w:firstRowFirstColumn="0" w:firstRowLastColumn="0" w:lastRowFirstColumn="0" w:lastRowLastColumn="0"/>
+              <w:rPr>
+                <w:rFonts w:ascii="Calibri" w:eastAsia="Times New Roman" w:hAnsi="Calibri" w:cs="Calibri"/>
+                <w:color w:val="000000"/>
+                <w:kern w:val="0"/>
+                <w:sz w:val="22"/>
+                <w:szCs w:val="22"/>
+                <w:lang w:eastAsia="en-GB"/>
+                <w14:ligatures w14:val="none"/>
+              </w:rPr>
+            </w:pPr>
+            <w:r>
+              <w:rPr>
+                <w:rFonts w:ascii="Calibri" w:eastAsia="Times New Roman" w:hAnsi="Calibri" w:cs="Calibri"/>
+                <w:color w:val="000000"/>
+                <w:kern w:val="0"/>
+                <w:sz w:val="22"/>
+                <w:szCs w:val="22"/>
+                <w:lang w:eastAsia="en-GB"/>
+                <w14:ligatures w14:val="none"/>
+              </w:rPr>
+              <w:t>—</w:t>
+            </w:r>
+          </w:p>
+        </w:tc>
+        <w:tc>
+          <w:tcPr>
+            <w:tcW w:w="3261" w:type="dxa"/>
+            <w:noWrap/>
+            <w:hideMark/>
+          </w:tcPr>
+          <w:p>
+            <w:pPr>
+              <w:cnfStyle w:val="000000100000" w:firstRow="0" w:lastRow="0" w:firstColumn="0" w:lastColumn="0" w:oddVBand="0" w:evenVBand="0" w:oddHBand="1" w:evenHBand="0" w:firstRowFirstColumn="0" w:firstRowLastColumn="0" w:lastRowFirstColumn="0" w:lastRowLastColumn="0"/>
+              <w:rPr>
+                <w:rFonts w:ascii="Calibri" w:eastAsia="Times New Roman" w:hAnsi="Calibri" w:cs="Calibri"/>
+                <w:color w:val="000000"/>
+                <w:kern w:val="0"/>
+                <w:sz w:val="22"/>
+                <w:szCs w:val="22"/>
+                <w:lang w:eastAsia="en-GB"/>
+                <w14:ligatures w14:val="none"/>
+              </w:rPr>
+            </w:pPr>
+            <w:r>
+              <w:rPr>
+                <w:rFonts w:ascii="Calibri" w:eastAsia="Times New Roman" w:hAnsi="Calibri" w:cs="Calibri"/>
+                <w:color w:val="000000"/>
+                <w:kern w:val="0"/>
+                <w:sz w:val="22"/>
+                <w:szCs w:val="22"/>
+                <w:lang w:eastAsia="en-GB"/>
+                <w14:ligatures w14:val="none"/>
+              </w:rPr>
+              <w:t>Completed</w:t>
+            </w:r>
+          </w:p>
+        </w:tc>
+      </w:tr>
+      <w:tr>
+        <w:trPr>
+          <w:trHeight w:val="290"/>
+        </w:trPr>
+        <w:tc>
+          <w:tcPr>
+            <w:cnfStyle w:val="001000000000" w:firstRow="0" w:lastRow="0" w:firstColumn="1" w:lastColumn="0" w:oddVBand="0" w:evenVBand="0" w:oddHBand="0" w:evenHBand="0" w:firstRowFirstColumn="0" w:firstRowLastColumn="0" w:lastRowFirstColumn="0" w:lastRowLastColumn="0"/>
+            <w:tcW w:w="709" w:type="dxa"/>
+            <w:noWrap/>
+            <w:hideMark/>
+          </w:tcPr>
+          <w:p>
+            <w:pPr>
+              <w:jc w:val="right"/>
+              <w:rPr>
+                <w:rFonts w:ascii="Calibri" w:eastAsia="Times New Roman" w:hAnsi="Calibri" w:cs="Calibri"/>
+                <w:color w:val="000000"/>
+                <w:kern w:val="0"/>
+                <w:sz w:val="22"/>
+                <w:szCs w:val="22"/>
+                <w:lang w:eastAsia="en-GB"/>
+                <w14:ligatures w14:val="none"/>
+              </w:rPr>
+            </w:pPr>
+            <w:r>
+              <w:rPr>
+                <w:rFonts w:ascii="Calibri" w:eastAsia="Times New Roman" w:hAnsi="Calibri" w:cs="Calibri"/>
+                <w:color w:val="000000"/>
+                <w:kern w:val="0"/>
+                <w:sz w:val="22"/>
+                <w:szCs w:val="22"/>
+                <w:lang w:eastAsia="en-GB"/>
+                <w14:ligatures w14:val="none"/>
+              </w:rPr>
+              <w:t>8</w:t>
+            </w:r>
+          </w:p>
+        </w:tc>
+        <w:tc>
+          <w:tcPr>
+            <w:tcW w:w="1659" w:type="dxa"/>
+            <w:noWrap/>
+            <w:hideMark/>
+          </w:tcPr>
+          <w:p>
+            <w:pPr>
+              <w:cnfStyle w:val="000000000000" w:firstRow="0" w:lastRow="0" w:firstColumn="0" w:lastColumn="0" w:oddVBand="0" w:evenVBand="0" w:oddHBand="0" w:evenHBand="0" w:firstRowFirstColumn="0" w:firstRowLastColumn="0" w:lastRowFirstColumn="0" w:lastRowLastColumn="0"/>
+              <w:rPr>
+                <w:rFonts w:ascii="Calibri" w:eastAsia="Times New Roman" w:hAnsi="Calibri" w:cs="Calibri"/>
+                <w:color w:val="000000"/>
+                <w:kern w:val="0"/>
+                <w:sz w:val="22"/>
+                <w:szCs w:val="22"/>
+                <w:lang w:eastAsia="en-GB"/>
+                <w14:ligatures w14:val="none"/>
+              </w:rPr>
+            </w:pPr>
+            <w:r>
+              <w:rPr>
+                <w:rFonts w:ascii="Calibri" w:eastAsia="Times New Roman" w:hAnsi="Calibri" w:cs="Calibri"/>
+                <w:color w:val="000000"/>
+                <w:kern w:val="0"/>
+                <w:sz w:val="22"/>
+                <w:szCs w:val="22"/>
+                <w:lang w:eastAsia="en-GB"/>
+                <w14:ligatures w14:val="none"/>
+              </w:rPr>
+              <w:t>Final Design Assignment Preparation</w:t>
+            </w:r>
+          </w:p>
+        </w:tc>
+        <w:tc>
+          <w:tcPr>
+            <w:tcW w:w="1659" w:type="dxa"/>
+            <w:noWrap/>
+            <w:hideMark/>
+          </w:tcPr>
+          <w:p>
+            <w:pPr>
+              <w:cnfStyle w:val="000000000000" w:firstRow="0" w:lastRow="0" w:firstColumn="0" w:lastColumn="0" w:oddVBand="0" w:evenVBand="0" w:oddHBand="0" w:evenHBand="0" w:firstRowFirstColumn="0" w:firstRowLastColumn="0" w:lastRowFirstColumn="0" w:lastRowLastColumn="0"/>
+              <w:rPr>
+                <w:rFonts w:ascii="Calibri" w:eastAsia="Times New Roman" w:hAnsi="Calibri" w:cs="Calibri"/>
+                <w:color w:val="000000"/>
+                <w:kern w:val="0"/>
+                <w:sz w:val="22"/>
+                <w:szCs w:val="22"/>
+                <w:lang w:eastAsia="en-GB"/>
+                <w14:ligatures w14:val="none"/>
+              </w:rPr>
+            </w:pPr>
+            <w:r>
+              <w:rPr>
+                <w:rFonts w:ascii="Calibri" w:eastAsia="Times New Roman" w:hAnsi="Calibri" w:cs="Calibri"/>
+                <w:color w:val="000000"/>
+                <w:kern w:val="0"/>
+                <w:sz w:val="22"/>
+                <w:szCs w:val="22"/>
+                <w:lang w:eastAsia="en-GB"/>
+                <w14:ligatures w14:val="none"/>
+              </w:rPr>
+              <w:t>Design</w:t>
+            </w:r>
+          </w:p>
+        </w:tc>
+        <w:tc>
+          <w:tcPr>
+            <w:tcW w:w="2352" w:type="dxa"/>
+            <w:noWrap/>
+            <w:hideMark/>
+          </w:tcPr>
+          <w:p>
+            <w:pPr>
+              <w:cnfStyle w:val="000000000000" w:firstRow="0" w:lastRow="0" w:firstColumn="0" w:lastColumn="0" w:oddVBand="0" w:evenVBand="0" w:oddHBand="0" w:evenHBand="0" w:firstRowFirstColumn="0" w:firstRowLastColumn="0" w:lastRowFirstColumn="0" w:lastRowLastColumn="0"/>
+              <w:rPr>
+                <w:rFonts w:ascii="Calibri" w:eastAsia="Times New Roman" w:hAnsi="Calibri" w:cs="Calibri"/>
+                <w:color w:val="000000"/>
+                <w:kern w:val="0"/>
+                <w:sz w:val="22"/>
+                <w:szCs w:val="22"/>
+                <w:lang w:eastAsia="en-GB"/>
+                <w14:ligatures w14:val="none"/>
+              </w:rPr>
+            </w:pPr>
+            <w:r>
+              <w:rPr>
+                <w:rFonts w:ascii="Calibri" w:eastAsia="Times New Roman" w:hAnsi="Calibri" w:cs="Calibri"/>
+                <w:color w:val="000000"/>
+                <w:kern w:val="0"/>
+                <w:sz w:val="22"/>
+                <w:szCs w:val="22"/>
+                <w:lang w:eastAsia="en-GB"/>
+                <w14:ligatures w14:val="none"/>
+              </w:rPr>
+              <w:t>Final design submission</w:t>
+            </w:r>
+          </w:p>
+        </w:tc>
+        <w:tc>
+          <w:tcPr>
+            <w:tcW w:w="851" w:type="dxa"/>
+            <w:noWrap/>
+            <w:hideMark/>
+          </w:tcPr>
+          <w:p>
+            <w:pPr>
+              <w:cnfStyle w:val="000000000000" w:firstRow="0" w:lastRow="0" w:firstColumn="0" w:lastColumn="0" w:oddVBand="0" w:evenVBand="0" w:oddHBand="0" w:evenHBand="0" w:firstRowFirstColumn="0" w:firstRowLastColumn="0" w:lastRowFirstColumn="0" w:lastRowLastColumn="0"/>
+              <w:rPr>
+                <w:rFonts w:ascii="Calibri" w:eastAsia="Times New Roman" w:hAnsi="Calibri" w:cs="Calibri"/>
+                <w:color w:val="000000"/>
+                <w:kern w:val="0"/>
+                <w:sz w:val="22"/>
+                <w:szCs w:val="22"/>
+                <w:lang w:eastAsia="en-GB"/>
+                <w14:ligatures w14:val="none"/>
+              </w:rPr>
+            </w:pPr>
+            <w:r>
+              <w:rPr>
+                <w:rFonts w:ascii="Calibri" w:eastAsia="Times New Roman" w:hAnsi="Calibri" w:cs="Calibri"/>
+                <w:color w:val="000000"/>
+                <w:kern w:val="0"/>
+                <w:sz w:val="22"/>
+                <w:szCs w:val="22"/>
+                <w:lang w:eastAsia="en-GB"/>
+                <w14:ligatures w14:val="none"/>
+              </w:rPr>
+              <w:t>19-Jan-2026</w:t>
+            </w:r>
+          </w:p>
+        </w:tc>
+        <w:tc>
+          <w:tcPr>
+            <w:tcW w:w="992" w:type="dxa"/>
+            <w:noWrap/>
+            <w:hideMark/>
+          </w:tcPr>
+          <w:p>
+            <w:pPr>
+              <w:cnfStyle w:val="000000000000" w:firstRow="0" w:lastRow="0" w:firstColumn="0" w:lastColumn="0" w:oddVBand="0" w:evenVBand="0" w:oddHBand="0" w:evenHBand="0" w:firstRowFirstColumn="0" w:firstRowLastColumn="0" w:lastRowFirstColumn="0" w:lastRowLastColumn="0"/>
+              <w:rPr>
+                <w:rFonts w:ascii="Calibri" w:eastAsia="Times New Roman" w:hAnsi="Calibri" w:cs="Calibri"/>
+                <w:color w:val="000000"/>
+                <w:kern w:val="0"/>
+                <w:sz w:val="22"/>
+                <w:szCs w:val="22"/>
+                <w:lang w:eastAsia="en-GB"/>
+                <w14:ligatures w14:val="none"/>
+              </w:rPr>
+            </w:pPr>
+            <w:r>
+              <w:rPr>
+                <w:rFonts w:ascii="Calibri" w:eastAsia="Times New Roman" w:hAnsi="Calibri" w:cs="Calibri"/>
+                <w:color w:val="000000"/>
+                <w:kern w:val="0"/>
+                <w:sz w:val="22"/>
+                <w:szCs w:val="22"/>
+                <w:lang w:eastAsia="en-GB"/>
+                <w14:ligatures w14:val="none"/>
+              </w:rPr>
+              <w:t>22-Jan-2026</w:t>
+            </w:r>
+          </w:p>
+        </w:tc>
+        <w:tc>
+          <w:tcPr>
+            <w:tcW w:w="1134" w:type="dxa"/>
+            <w:noWrap/>
+            <w:hideMark/>
+          </w:tcPr>
+          <w:p>
+            <w:pPr>
+              <w:cnfStyle w:val="000000000000" w:firstRow="0" w:lastRow="0" w:firstColumn="0" w:lastColumn="0" w:oddVBand="0" w:evenVBand="0" w:oddHBand="0" w:evenHBand="0" w:firstRowFirstColumn="0" w:firstRowLastColumn="0" w:lastRowFirstColumn="0" w:lastRowLastColumn="0"/>
+              <w:rPr>
+                <w:rFonts w:ascii="Calibri" w:eastAsia="Times New Roman" w:hAnsi="Calibri" w:cs="Calibri"/>
+                <w:color w:val="000000"/>
+                <w:kern w:val="0"/>
+                <w:sz w:val="22"/>
+                <w:szCs w:val="22"/>
+                <w:lang w:eastAsia="en-GB"/>
+                <w14:ligatures w14:val="none"/>
+              </w:rPr>
+            </w:pPr>
+            <w:r>
+              <w:rPr>
+                <w:rFonts w:ascii="Calibri" w:eastAsia="Times New Roman" w:hAnsi="Calibri" w:cs="Calibri"/>
+                <w:color w:val="000000"/>
+                <w:kern w:val="0"/>
+                <w:sz w:val="22"/>
+                <w:szCs w:val="22"/>
+                <w:lang w:eastAsia="en-GB"/>
+                <w14:ligatures w14:val="none"/>
+              </w:rPr>
+              <w:t>—</w:t>
+            </w:r>
+          </w:p>
+        </w:tc>
+        <w:tc>
+          <w:tcPr>
+            <w:tcW w:w="3261" w:type="dxa"/>
+            <w:noWrap/>
+            <w:hideMark/>
+          </w:tcPr>
+          <w:p>
+            <w:pPr>
+              <w:cnfStyle w:val="000000000000" w:firstRow="0" w:lastRow="0" w:firstColumn="0" w:lastColumn="0" w:oddVBand="0" w:evenVBand="0" w:oddHBand="0" w:evenHBand="0" w:firstRowFirstColumn="0" w:firstRowLastColumn="0" w:lastRowFirstColumn="0" w:lastRowLastColumn="0"/>
+              <w:rPr>
+                <w:rFonts w:ascii="Calibri" w:eastAsia="Times New Roman" w:hAnsi="Calibri" w:cs="Calibri"/>
+                <w:color w:val="000000"/>
+                <w:kern w:val="0"/>
+                <w:sz w:val="22"/>
+                <w:szCs w:val="22"/>
+                <w:lang w:eastAsia="en-GB"/>
+                <w14:ligatures w14:val="none"/>
+              </w:rPr>
+            </w:pPr>
+            <w:r>
+              <w:rPr>
+                <w:rFonts w:ascii="Calibri" w:eastAsia="Times New Roman" w:hAnsi="Calibri" w:cs="Calibri"/>
+                <w:color w:val="000000"/>
+                <w:kern w:val="0"/>
+                <w:sz w:val="22"/>
+                <w:szCs w:val="22"/>
+                <w:lang w:eastAsia="en-GB"/>
+                <w14:ligatures w14:val="none"/>
+              </w:rPr>
+              <w:t>Completed</w:t>
+            </w:r>
+          </w:p>
+        </w:tc>
+      </w:tr>
+      <w:tr>
+        <w:trPr>
+          <w:cnfStyle w:val="000000100000" w:firstRow="0" w:lastRow="0" w:firstColumn="0" w:lastColumn="0" w:oddVBand="0" w:evenVBand="0" w:oddHBand="1" w:evenHBand="0" w:firstRowFirstColumn="0" w:firstRowLastColumn="0" w:lastRowFirstColumn="0" w:lastRowLastColumn="0"/>
+          <w:trHeight w:val="290"/>
+        </w:trPr>
+        <w:tc>
+          <w:tcPr>
+            <w:cnfStyle w:val="001000000000" w:firstRow="0" w:lastRow="0" w:firstColumn="1" w:lastColumn="0" w:oddVBand="0" w:evenVBand="0" w:oddHBand="0" w:evenHBand="0" w:firstRowFirstColumn="0" w:firstRowLastColumn="0" w:lastRowFirstColumn="0" w:lastRowLastColumn="0"/>
+            <w:tcW w:w="709" w:type="dxa"/>
+            <w:noWrap/>
+            <w:hideMark/>
+          </w:tcPr>
+          <w:p>
+            <w:pPr>
+              <w:jc w:val="right"/>
+              <w:rPr>
+                <w:rFonts w:ascii="Calibri" w:eastAsia="Times New Roman" w:hAnsi="Calibri" w:cs="Calibri"/>
+                <w:color w:val="000000"/>
+                <w:kern w:val="0"/>
+                <w:sz w:val="22"/>
+                <w:szCs w:val="22"/>
+                <w:lang w:eastAsia="en-GB"/>
+                <w14:ligatures w14:val="none"/>
+              </w:rPr>
+            </w:pPr>
+            <w:r>
+              <w:rPr>
+                <w:rFonts w:ascii="Calibri" w:eastAsia="Times New Roman" w:hAnsi="Calibri" w:cs="Calibri"/>
+                <w:color w:val="000000"/>
+                <w:kern w:val="0"/>
+                <w:sz w:val="22"/>
+                <w:szCs w:val="22"/>
+                <w:lang w:eastAsia="en-GB"/>
+                <w14:ligatures w14:val="none"/>
+              </w:rPr>
+              <w:t>9</w:t>
+            </w:r>
+          </w:p>
+        </w:tc>
+        <w:tc>
+          <w:tcPr>
+            <w:tcW w:w="1659" w:type="dxa"/>
+            <w:noWrap/>
+            <w:hideMark/>
+          </w:tcPr>
+          <w:p>
+            <w:pPr>
+              <w:cnfStyle w:val="000000100000" w:firstRow="0" w:lastRow="0" w:firstColumn="0" w:lastColumn="0" w:oddVBand="0" w:evenVBand="0" w:oddHBand="1" w:evenHBand="0" w:firstRowFirstColumn="0" w:firstRowLastColumn="0" w:lastRowFirstColumn="0" w:lastRowLastColumn="0"/>
+              <w:rPr>
+                <w:rFonts w:ascii="Calibri" w:eastAsia="Times New Roman" w:hAnsi="Calibri" w:cs="Calibri"/>
+                <w:color w:val="000000"/>
+                <w:kern w:val="0"/>
+                <w:sz w:val="22"/>
+                <w:szCs w:val="22"/>
+                <w:lang w:eastAsia="en-GB"/>
+                <w14:ligatures w14:val="none"/>
+              </w:rPr>
+            </w:pPr>
+            <w:r>
+              <w:rPr>
+                <w:rFonts w:ascii="Calibri" w:eastAsia="Times New Roman" w:hAnsi="Calibri" w:cs="Calibri"/>
+                <w:color w:val="000000"/>
+                <w:kern w:val="0"/>
+                <w:sz w:val="22"/>
+                <w:szCs w:val="22"/>
+                <w:lang w:eastAsia="en-GB"/>
+                <w14:ligatures w14:val="none"/>
+              </w:rPr>
+              <w:t>Design Assignment Submission</w:t>
+            </w:r>
+          </w:p>
+        </w:tc>
+        <w:tc>
+          <w:tcPr>
+            <w:tcW w:w="1659" w:type="dxa"/>
+            <w:noWrap/>
+            <w:hideMark/>
+          </w:tcPr>
+          <w:p>
+            <w:pPr>
+              <w:cnfStyle w:val="000000100000" w:firstRow="0" w:lastRow="0" w:firstColumn="0" w:lastColumn="0" w:oddVBand="0" w:evenVBand="0" w:oddHBand="1" w:evenHBand="0" w:firstRowFirstColumn="0" w:firstRowLastColumn="0" w:lastRowFirstColumn="0" w:lastRowLastColumn="0"/>
+              <w:rPr>
+                <w:rFonts w:ascii="Calibri" w:eastAsia="Times New Roman" w:hAnsi="Calibri" w:cs="Calibri"/>
+                <w:color w:val="000000"/>
+                <w:kern w:val="0"/>
+                <w:sz w:val="22"/>
+                <w:szCs w:val="22"/>
+                <w:lang w:eastAsia="en-GB"/>
+                <w14:ligatures w14:val="none"/>
+              </w:rPr>
+            </w:pPr>
+            <w:r>
+              <w:rPr>
+                <w:rFonts w:ascii="Calibri" w:eastAsia="Times New Roman" w:hAnsi="Calibri" w:cs="Calibri"/>
+                <w:color w:val="000000"/>
+                <w:kern w:val="0"/>
+                <w:sz w:val="22"/>
+                <w:szCs w:val="22"/>
+                <w:lang w:eastAsia="en-GB"/>
+                <w14:ligatures w14:val="none"/>
+              </w:rPr>
+              <w:t>Design</w:t>
+            </w:r>
+          </w:p>
+        </w:tc>
+        <w:tc>
+          <w:tcPr>
+            <w:tcW w:w="2352" w:type="dxa"/>
+            <w:noWrap/>
+            <w:hideMark/>
+          </w:tcPr>
+          <w:p>
+            <w:pPr>
+              <w:cnfStyle w:val="000000100000" w:firstRow="0" w:lastRow="0" w:firstColumn="0" w:lastColumn="0" w:oddVBand="0" w:evenVBand="0" w:oddHBand="1" w:evenHBand="0" w:firstRowFirstColumn="0" w:firstRowLastColumn="0" w:lastRowFirstColumn="0" w:lastRowLastColumn="0"/>
+              <w:rPr>
+                <w:rFonts w:ascii="Calibri" w:eastAsia="Times New Roman" w:hAnsi="Calibri" w:cs="Calibri"/>
+                <w:color w:val="000000"/>
+                <w:kern w:val="0"/>
+                <w:sz w:val="22"/>
+                <w:szCs w:val="22"/>
+                <w:lang w:eastAsia="en-GB"/>
+                <w14:ligatures w14:val="none"/>
+              </w:rPr>
+            </w:pPr>
+            <w:r>
+              <w:rPr>
+                <w:rFonts w:ascii="Calibri" w:eastAsia="Times New Roman" w:hAnsi="Calibri" w:cs="Calibri"/>
+                <w:color w:val="000000"/>
+                <w:kern w:val="0"/>
+                <w:sz w:val="22"/>
+                <w:szCs w:val="22"/>
+                <w:lang w:eastAsia="en-GB"/>
+                <w14:ligatures w14:val="none"/>
+              </w:rPr>
+              <w:t>Submitted coursework</w:t>
+            </w:r>
+          </w:p>
+        </w:tc>
+        <w:tc>
+          <w:tcPr>
+            <w:tcW w:w="851" w:type="dxa"/>
+            <w:noWrap/>
+            <w:hideMark/>
+          </w:tcPr>
+          <w:p>
+            <w:pPr>
+              <w:cnfStyle w:val="000000100000" w:firstRow="0" w:lastRow="0" w:firstColumn="0" w:lastColumn="0" w:oddVBand="0" w:evenVBand="0" w:oddHBand="1" w:evenHBand="0" w:firstRowFirstColumn="0" w:firstRowLastColumn="0" w:lastRowFirstColumn="0" w:lastRowLastColumn="0"/>
+              <w:rPr>
+                <w:rFonts w:ascii="Calibri" w:eastAsia="Times New Roman" w:hAnsi="Calibri" w:cs="Calibri"/>
+                <w:color w:val="000000"/>
+                <w:kern w:val="0"/>
+                <w:sz w:val="22"/>
+                <w:szCs w:val="22"/>
+                <w:lang w:eastAsia="en-GB"/>
+                <w14:ligatures w14:val="none"/>
+              </w:rPr>
+            </w:pPr>
+            <w:r>
+              <w:rPr>
+                <w:rFonts w:ascii="Calibri" w:eastAsia="Times New Roman" w:hAnsi="Calibri" w:cs="Calibri"/>
+                <w:color w:val="000000"/>
+                <w:kern w:val="0"/>
+                <w:sz w:val="22"/>
+                <w:szCs w:val="22"/>
+                <w:lang w:eastAsia="en-GB"/>
+                <w14:ligatures w14:val="none"/>
+              </w:rPr>
+              <w:t>23-Jan-2026</w:t>
+            </w:r>
+          </w:p>
+        </w:tc>
+        <w:tc>
+          <w:tcPr>
+            <w:tcW w:w="992" w:type="dxa"/>
+            <w:noWrap/>
+            <w:hideMark/>
+          </w:tcPr>
+          <w:p>
+            <w:pPr>
+              <w:cnfStyle w:val="000000100000" w:firstRow="0" w:lastRow="0" w:firstColumn="0" w:lastColumn="0" w:oddVBand="0" w:evenVBand="0" w:oddHBand="1" w:evenHBand="0" w:firstRowFirstColumn="0" w:firstRowLastColumn="0" w:lastRowFirstColumn="0" w:lastRowLastColumn="0"/>
+              <w:rPr>
+                <w:rFonts w:ascii="Calibri" w:eastAsia="Times New Roman" w:hAnsi="Calibri" w:cs="Calibri"/>
+                <w:color w:val="000000"/>
+                <w:kern w:val="0"/>
+                <w:sz w:val="22"/>
+                <w:szCs w:val="22"/>
+                <w:lang w:eastAsia="en-GB"/>
+                <w14:ligatures w14:val="none"/>
+              </w:rPr>
+            </w:pPr>
+            <w:r>
+              <w:rPr>
+                <w:rFonts w:ascii="Calibri" w:eastAsia="Times New Roman" w:hAnsi="Calibri" w:cs="Calibri"/>
+                <w:color w:val="000000"/>
+                <w:kern w:val="0"/>
+                <w:sz w:val="22"/>
+                <w:szCs w:val="22"/>
+                <w:lang w:eastAsia="en-GB"/>
+                <w14:ligatures w14:val="none"/>
+              </w:rPr>
+              <w:t>23-Jan-2026</w:t>
+            </w:r>
+          </w:p>
+        </w:tc>
+        <w:tc>
+          <w:tcPr>
+            <w:tcW w:w="1134" w:type="dxa"/>
+            <w:noWrap/>
+            <w:hideMark/>
+          </w:tcPr>
+          <w:p>
+            <w:pPr>
+              <w:cnfStyle w:val="000000100000" w:firstRow="0" w:lastRow="0" w:firstColumn="0" w:lastColumn="0" w:oddVBand="0" w:evenVBand="0" w:oddHBand="1" w:evenHBand="0" w:firstRowFirstColumn="0" w:firstRowLastColumn="0" w:lastRowFirstColumn="0" w:lastRowLastColumn="0"/>
+              <w:rPr>
+                <w:rFonts w:ascii="Calibri" w:eastAsia="Times New Roman" w:hAnsi="Calibri" w:cs="Calibri"/>
+                <w:color w:val="000000"/>
+                <w:kern w:val="0"/>
+                <w:sz w:val="22"/>
+                <w:szCs w:val="22"/>
+                <w:lang w:eastAsia="en-GB"/>
+                <w14:ligatures w14:val="none"/>
+              </w:rPr>
+            </w:pPr>
+            <w:r>
+              <w:rPr>
+                <w:rFonts w:ascii="Calibri" w:eastAsia="Times New Roman" w:hAnsi="Calibri" w:cs="Calibri"/>
+                <w:color w:val="000000"/>
+                <w:kern w:val="0"/>
+                <w:sz w:val="22"/>
+                <w:szCs w:val="22"/>
+                <w:lang w:eastAsia="en-GB"/>
+                <w14:ligatures w14:val="none"/>
+              </w:rPr>
+              <w:t>—</w:t>
+            </w:r>
+          </w:p>
+        </w:tc>
+        <w:tc>
+          <w:tcPr>
+            <w:tcW w:w="3261" w:type="dxa"/>
+            <w:noWrap/>
+            <w:hideMark/>
+          </w:tcPr>
+          <w:p>
+            <w:pPr>
+              <w:cnfStyle w:val="000000100000" w:firstRow="0" w:lastRow="0" w:firstColumn="0" w:lastColumn="0" w:oddVBand="0" w:evenVBand="0" w:oddHBand="1" w:evenHBand="0" w:firstRowFirstColumn="0" w:firstRowLastColumn="0" w:lastRowFirstColumn="0" w:lastRowLastColumn="0"/>
+              <w:rPr>
+                <w:rFonts w:ascii="Calibri" w:eastAsia="Times New Roman" w:hAnsi="Calibri" w:cs="Calibri"/>
+                <w:color w:val="000000"/>
+                <w:kern w:val="0"/>
+                <w:sz w:val="22"/>
+                <w:szCs w:val="22"/>
+                <w:lang w:eastAsia="en-GB"/>
+                <w14:ligatures w14:val="none"/>
+              </w:rPr>
+            </w:pPr>
+            <w:r>
+              <w:rPr>
+                <w:rFonts w:ascii="Calibri" w:eastAsia="Times New Roman" w:hAnsi="Calibri" w:cs="Calibri"/>
+                <w:color w:val="000000"/>
+                <w:kern w:val="0"/>
+                <w:sz w:val="22"/>
+                <w:szCs w:val="22"/>
+                <w:lang w:eastAsia="en-GB"/>
+                <w14:ligatures w14:val="none"/>
+              </w:rPr>
+              <w:t>Completed</w:t>
+            </w:r>
+          </w:p>
+        </w:tc>
+      </w:tr>
+      <w:tr>
+        <w:trPr>
+          <w:trHeight w:val="290"/>
+        </w:trPr>
+        <w:tc>
+          <w:tcPr>
+            <w:cnfStyle w:val="001000000000" w:firstRow="0" w:lastRow="0" w:firstColumn="1" w:lastColumn="0" w:oddVBand="0" w:evenVBand="0" w:oddHBand="0" w:evenHBand="0" w:firstRowFirstColumn="0" w:firstRowLastColumn="0" w:lastRowFirstColumn="0" w:lastRowLastColumn="0"/>
+            <w:tcW w:w="709" w:type="dxa"/>
+            <w:noWrap/>
+            <w:hideMark/>
+          </w:tcPr>
+          <w:p>
+            <w:pPr>
+              <w:jc w:val="right"/>
+              <w:rPr>
+                <w:rFonts w:ascii="Calibri" w:eastAsia="Times New Roman" w:hAnsi="Calibri" w:cs="Calibri"/>
+                <w:color w:val="000000"/>
+                <w:kern w:val="0"/>
+                <w:sz w:val="22"/>
+                <w:szCs w:val="22"/>
+                <w:lang w:eastAsia="en-GB"/>
+                <w14:ligatures w14:val="none"/>
+              </w:rPr>
+            </w:pPr>
+            <w:r>
+              <w:rPr>
+                <w:rFonts w:ascii="Calibri" w:eastAsia="Times New Roman" w:hAnsi="Calibri" w:cs="Calibri"/>
+                <w:color w:val="000000"/>
+                <w:kern w:val="0"/>
+                <w:sz w:val="22"/>
+                <w:szCs w:val="22"/>
+                <w:lang w:eastAsia="en-GB"/>
+                <w14:ligatures w14:val="none"/>
+              </w:rPr>
+              <w:t>10</w:t>
+            </w:r>
+          </w:p>
+        </w:tc>
+        <w:tc>
+          <w:tcPr>
+            <w:tcW w:w="1659" w:type="dxa"/>
+            <w:noWrap/>
+            <w:hideMark/>
+          </w:tcPr>
+          <w:p>
+            <w:pPr>
+              <w:cnfStyle w:val="000000000000" w:firstRow="0" w:lastRow="0" w:firstColumn="0" w:lastColumn="0" w:oddVBand="0" w:evenVBand="0" w:oddHBand="0" w:evenHBand="0" w:firstRowFirstColumn="0" w:firstRowLastColumn="0" w:lastRowFirstColumn="0" w:lastRowLastColumn="0"/>
+              <w:rPr>
+                <w:rFonts w:ascii="Calibri" w:eastAsia="Times New Roman" w:hAnsi="Calibri" w:cs="Calibri"/>
+                <w:color w:val="000000"/>
+                <w:kern w:val="0"/>
+                <w:sz w:val="22"/>
+                <w:szCs w:val="22"/>
+                <w:lang w:eastAsia="en-GB"/>
+                <w14:ligatures w14:val="none"/>
+              </w:rPr>
+            </w:pPr>
+            <w:r>
+              <w:rPr>
+                <w:rFonts w:ascii="Calibri" w:eastAsia="Times New Roman" w:hAnsi="Calibri" w:cs="Calibri"/>
+                <w:color w:val="000000"/>
+                <w:kern w:val="0"/>
+                <w:sz w:val="22"/>
+                <w:szCs w:val="22"/>
+                <w:lang w:eastAsia="en-GB"/>
+                <w14:ligatures w14:val="none"/>
+              </w:rPr>
+              <w:t>Implementation Planning &amp; Scheduling</w:t>
+            </w:r>
+          </w:p>
+        </w:tc>
+        <w:tc>
+          <w:tcPr>
+            <w:tcW w:w="1659" w:type="dxa"/>
+            <w:noWrap/>
+            <w:hideMark/>
+          </w:tcPr>
+          <w:p>
+            <w:pPr>
+              <w:cnfStyle w:val="000000000000" w:firstRow="0" w:lastRow="0" w:firstColumn="0" w:lastColumn="0" w:oddVBand="0" w:evenVBand="0" w:oddHBand="0" w:evenHBand="0" w:firstRowFirstColumn="0" w:firstRowLastColumn="0" w:lastRowFirstColumn="0" w:lastRowLastColumn="0"/>
+              <w:rPr>
+                <w:rFonts w:ascii="Calibri" w:eastAsia="Times New Roman" w:hAnsi="Calibri" w:cs="Calibri"/>
+                <w:color w:val="000000"/>
+                <w:kern w:val="0"/>
+                <w:sz w:val="22"/>
+                <w:szCs w:val="22"/>
+                <w:lang w:eastAsia="en-GB"/>
+                <w14:ligatures w14:val="none"/>
+              </w:rPr>
+            </w:pPr>
+            <w:r>
+              <w:rPr>
+                <w:rFonts w:ascii="Calibri" w:eastAsia="Times New Roman" w:hAnsi="Calibri" w:cs="Calibri"/>
+                <w:color w:val="000000"/>
+                <w:kern w:val="0"/>
+                <w:sz w:val="22"/>
+                <w:szCs w:val="22"/>
+                <w:lang w:eastAsia="en-GB"/>
+                <w14:ligatures w14:val="none"/>
+              </w:rPr>
+              <w:t>Implementation</w:t>
+            </w:r>
+          </w:p>
+        </w:tc>
+        <w:tc>
+          <w:tcPr>
+            <w:tcW w:w="2352" w:type="dxa"/>
+            <w:noWrap/>
+            <w:hideMark/>
+          </w:tcPr>
+          <w:p>
+            <w:pPr>
+              <w:cnfStyle w:val="000000000000" w:firstRow="0" w:lastRow="0" w:firstColumn="0" w:lastColumn="0" w:oddVBand="0" w:evenVBand="0" w:oddHBand="0" w:evenHBand="0" w:firstRowFirstColumn="0" w:firstRowLastColumn="0" w:lastRowFirstColumn="0" w:lastRowLastColumn="0"/>
+              <w:rPr>
+                <w:rFonts w:ascii="Calibri" w:eastAsia="Times New Roman" w:hAnsi="Calibri" w:cs="Calibri"/>
+                <w:color w:val="000000"/>
+                <w:kern w:val="0"/>
+                <w:sz w:val="22"/>
+                <w:szCs w:val="22"/>
+                <w:lang w:eastAsia="en-GB"/>
+                <w14:ligatures w14:val="none"/>
+              </w:rPr>
+            </w:pPr>
+            <w:r>
+              <w:rPr>
+                <w:rFonts w:ascii="Calibri" w:eastAsia="Times New Roman" w:hAnsi="Calibri" w:cs="Calibri"/>
+                <w:color w:val="000000"/>
+                <w:kern w:val="0"/>
+                <w:sz w:val="22"/>
+                <w:szCs w:val="22"/>
+                <w:lang w:eastAsia="en-GB"/>
+                <w14:ligatures w14:val="none"/>
+              </w:rPr>
+              <w:t>Implementation plan</w:t>
+            </w:r>
+          </w:p>
+        </w:tc>
+        <w:tc>
+          <w:tcPr>
+            <w:tcW w:w="851" w:type="dxa"/>
+            <w:noWrap/>
+            <w:hideMark/>
+          </w:tcPr>
+          <w:p>
+            <w:pPr>
+              <w:cnfStyle w:val="000000000000" w:firstRow="0" w:lastRow="0" w:firstColumn="0" w:lastColumn="0" w:oddVBand="0" w:evenVBand="0" w:oddHBand="0" w:evenHBand="0" w:firstRowFirstColumn="0" w:firstRowLastColumn="0" w:lastRowFirstColumn="0" w:lastRowLastColumn="0"/>
+              <w:rPr>
+                <w:rFonts w:ascii="Calibri" w:eastAsia="Times New Roman" w:hAnsi="Calibri" w:cs="Calibri"/>
+                <w:color w:val="000000"/>
+                <w:kern w:val="0"/>
+                <w:sz w:val="22"/>
+                <w:szCs w:val="22"/>
+                <w:lang w:eastAsia="en-GB"/>
+                <w14:ligatures w14:val="none"/>
+              </w:rPr>
+            </w:pPr>
+            <w:r>
+              <w:rPr>
+                <w:rFonts w:ascii="Calibri" w:eastAsia="Times New Roman" w:hAnsi="Calibri" w:cs="Calibri"/>
+                <w:color w:val="000000"/>
+                <w:kern w:val="0"/>
+                <w:sz w:val="22"/>
+                <w:szCs w:val="22"/>
+                <w:lang w:eastAsia="en-GB"/>
+                <w14:ligatures w14:val="none"/>
+              </w:rPr>
+              <w:t>20-Jan-2026</w:t>
+            </w:r>
+          </w:p>
+        </w:tc>
+        <w:tc>
+          <w:tcPr>
+            <w:tcW w:w="992" w:type="dxa"/>
+            <w:noWrap/>
+            <w:hideMark/>
+          </w:tcPr>
+          <w:p>
+            <w:pPr>
+              <w:cnfStyle w:val="000000000000" w:firstRow="0" w:lastRow="0" w:firstColumn="0" w:lastColumn="0" w:oddVBand="0" w:evenVBand="0" w:oddHBand="0" w:evenHBand="0" w:firstRowFirstColumn="0" w:firstRowLastColumn="0" w:lastRowFirstColumn="0" w:lastRowLastColumn="0"/>
+              <w:rPr>
+                <w:rFonts w:ascii="Calibri" w:eastAsia="Times New Roman" w:hAnsi="Calibri" w:cs="Calibri"/>
+                <w:color w:val="000000"/>
+                <w:kern w:val="0"/>
+                <w:sz w:val="22"/>
+                <w:szCs w:val="22"/>
+                <w:lang w:eastAsia="en-GB"/>
+                <w14:ligatures w14:val="none"/>
+              </w:rPr>
+            </w:pPr>
+            <w:r>
+              <w:rPr>
+                <w:rFonts w:ascii="Calibri" w:eastAsia="Times New Roman" w:hAnsi="Calibri" w:cs="Calibri"/>
+                <w:color w:val="000000"/>
+                <w:kern w:val="0"/>
+                <w:sz w:val="22"/>
+                <w:szCs w:val="22"/>
+                <w:lang w:eastAsia="en-GB"/>
+                <w14:ligatures w14:val="none"/>
+              </w:rPr>
+              <w:t>24-Jan-2026</w:t>
+            </w:r>
+          </w:p>
+        </w:tc>
+        <w:tc>
+          <w:tcPr>
+            <w:tcW w:w="1134" w:type="dxa"/>
+            <w:noWrap/>
+            <w:hideMark/>
+          </w:tcPr>
+          <w:p>
+            <w:pPr>
+              <w:cnfStyle w:val="000000000000" w:firstRow="0" w:lastRow="0" w:firstColumn="0" w:lastColumn="0" w:oddVBand="0" w:evenVBand="0" w:oddHBand="0" w:evenHBand="0" w:firstRowFirstColumn="0" w:firstRowLastColumn="0" w:lastRowFirstColumn="0" w:lastRowLastColumn="0"/>
+              <w:rPr>
+                <w:rFonts w:ascii="Calibri" w:eastAsia="Times New Roman" w:hAnsi="Calibri" w:cs="Calibri"/>
+                <w:color w:val="000000"/>
+                <w:kern w:val="0"/>
+                <w:sz w:val="22"/>
+                <w:szCs w:val="22"/>
+                <w:lang w:eastAsia="en-GB"/>
+                <w14:ligatures w14:val="none"/>
+              </w:rPr>
+            </w:pPr>
+            <w:r>
+              <w:rPr>
+                <w:rFonts w:ascii="Calibri" w:eastAsia="Times New Roman" w:hAnsi="Calibri" w:cs="Calibri"/>
+                <w:color w:val="000000"/>
+                <w:kern w:val="0"/>
+                <w:sz w:val="22"/>
+                <w:szCs w:val="22"/>
+                <w:lang w:eastAsia="en-GB"/>
+                <w14:ligatures w14:val="none"/>
+              </w:rPr>
+              <w:t>—</w:t>
+            </w:r>
+          </w:p>
+        </w:tc>
+        <w:tc>
+          <w:tcPr>
+            <w:tcW w:w="3261" w:type="dxa"/>
+            <w:noWrap/>
+            <w:hideMark/>
+          </w:tcPr>
+          <w:p>
+            <w:pPr>
+              <w:cnfStyle w:val="000000000000" w:firstRow="0" w:lastRow="0" w:firstColumn="0" w:lastColumn="0" w:oddVBand="0" w:evenVBand="0" w:oddHBand="0" w:evenHBand="0" w:firstRowFirstColumn="0" w:firstRowLastColumn="0" w:lastRowFirstColumn="0" w:lastRowLastColumn="0"/>
+              <w:rPr>
+                <w:rFonts w:ascii="Calibri" w:eastAsia="Times New Roman" w:hAnsi="Calibri" w:cs="Calibri"/>
+                <w:color w:val="000000"/>
+                <w:kern w:val="0"/>
+                <w:sz w:val="22"/>
+                <w:szCs w:val="22"/>
+                <w:lang w:eastAsia="en-GB"/>
+                <w14:ligatures w14:val="none"/>
+              </w:rPr>
+            </w:pPr>
+            <w:r>
+              <w:rPr>
+                <w:rFonts w:ascii="Calibri" w:eastAsia="Times New Roman" w:hAnsi="Calibri" w:cs="Calibri"/>
+                <w:color w:val="000000"/>
+                <w:kern w:val="0"/>
+                <w:sz w:val="22"/>
+                <w:szCs w:val="22"/>
+                <w:lang w:eastAsia="en-GB"/>
+                <w14:ligatures w14:val="none"/>
+              </w:rPr>
+              <w:t>In Progress</w:t>
+            </w:r>
+          </w:p>
+        </w:tc>
+      </w:tr>
+      <w:tr>
+        <w:trPr>
+          <w:cnfStyle w:val="000000100000" w:firstRow="0" w:lastRow="0" w:firstColumn="0" w:lastColumn="0" w:oddVBand="0" w:evenVBand="0" w:oddHBand="1" w:evenHBand="0" w:firstRowFirstColumn="0" w:firstRowLastColumn="0" w:lastRowFirstColumn="0" w:lastRowLastColumn="0"/>
+          <w:trHeight w:val="290"/>
+        </w:trPr>
+        <w:tc>
+          <w:tcPr>
+            <w:cnfStyle w:val="001000000000" w:firstRow="0" w:lastRow="0" w:firstColumn="1" w:lastColumn="0" w:oddVBand="0" w:evenVBand="0" w:oddHBand="0" w:evenHBand="0" w:firstRowFirstColumn="0" w:firstRowLastColumn="0" w:lastRowFirstColumn="0" w:lastRowLastColumn="0"/>
+            <w:tcW w:w="709" w:type="dxa"/>
+            <w:noWrap/>
+            <w:hideMark/>
+          </w:tcPr>
+          <w:p>
+            <w:pPr>
+              <w:jc w:val="right"/>
+              <w:rPr>
+                <w:rFonts w:ascii="Calibri" w:eastAsia="Times New Roman" w:hAnsi="Calibri" w:cs="Calibri"/>
+                <w:color w:val="000000"/>
+                <w:kern w:val="0"/>
+                <w:sz w:val="22"/>
+                <w:szCs w:val="22"/>
+                <w:lang w:eastAsia="en-GB"/>
+                <w14:ligatures w14:val="none"/>
+              </w:rPr>
+            </w:pPr>
+            <w:r>
+              <w:rPr>
+                <w:rFonts w:ascii="Calibri" w:eastAsia="Times New Roman" w:hAnsi="Calibri" w:cs="Calibri"/>
+                <w:color w:val="000000"/>
+                <w:kern w:val="0"/>
+                <w:sz w:val="22"/>
+                <w:szCs w:val="22"/>
+                <w:lang w:eastAsia="en-GB"/>
+                <w14:ligatures w14:val="none"/>
+              </w:rPr>
+              <w:t>11</w:t>
+            </w:r>
+          </w:p>
+        </w:tc>
+        <w:tc>
+          <w:tcPr>
+            <w:tcW w:w="1659" w:type="dxa"/>
+            <w:noWrap/>
+            <w:hideMark/>
+          </w:tcPr>
+          <w:p>
+            <w:pPr>
+              <w:cnfStyle w:val="000000100000" w:firstRow="0" w:lastRow="0" w:firstColumn="0" w:lastColumn="0" w:oddVBand="0" w:evenVBand="0" w:oddHBand="1" w:evenHBand="0" w:firstRowFirstColumn="0" w:firstRowLastColumn="0" w:lastRowFirstColumn="0" w:lastRowLastColumn="0"/>
+              <w:rPr>
+                <w:rFonts w:ascii="Calibri" w:eastAsia="Times New Roman" w:hAnsi="Calibri" w:cs="Calibri"/>
+                <w:color w:val="000000"/>
+                <w:kern w:val="0"/>
+                <w:sz w:val="22"/>
+                <w:szCs w:val="22"/>
+                <w:lang w:eastAsia="en-GB"/>
+                <w14:ligatures w14:val="none"/>
+              </w:rPr>
+            </w:pPr>
+            <w:r>
+              <w:rPr>
+                <w:rFonts w:ascii="Calibri" w:eastAsia="Times New Roman" w:hAnsi="Calibri" w:cs="Calibri"/>
+                <w:color w:val="000000"/>
+                <w:kern w:val="0"/>
+                <w:sz w:val="22"/>
+                <w:szCs w:val="22"/>
+                <w:lang w:eastAsia="en-GB"/>
+                <w14:ligatures w14:val="none"/>
+              </w:rPr>
+              <w:t>Environment Setup &amp; SwiftBot Testing Plan</w:t>
+            </w:r>
+          </w:p>
+        </w:tc>
+        <w:tc>
+          <w:tcPr>
+            <w:tcW w:w="1659" w:type="dxa"/>
+            <w:noWrap/>
+            <w:hideMark/>
+          </w:tcPr>
+          <w:p>
+            <w:pPr>
+              <w:cnfStyle w:val="000000100000" w:firstRow="0" w:lastRow="0" w:firstColumn="0" w:lastColumn="0" w:oddVBand="0" w:evenVBand="0" w:oddHBand="1" w:evenHBand="0" w:firstRowFirstColumn="0" w:firstRowLastColumn="0" w:lastRowFirstColumn="0" w:lastRowLastColumn="0"/>
+              <w:rPr>
+                <w:rFonts w:ascii="Calibri" w:eastAsia="Times New Roman" w:hAnsi="Calibri" w:cs="Calibri"/>
+                <w:color w:val="000000"/>
+                <w:kern w:val="0"/>
+                <w:sz w:val="22"/>
+                <w:szCs w:val="22"/>
+                <w:lang w:eastAsia="en-GB"/>
+                <w14:ligatures w14:val="none"/>
+              </w:rPr>
+            </w:pPr>
+            <w:r>
+              <w:rPr>
+                <w:rFonts w:ascii="Calibri" w:eastAsia="Times New Roman" w:hAnsi="Calibri" w:cs="Calibri"/>
+                <w:color w:val="000000"/>
+                <w:kern w:val="0"/>
+                <w:sz w:val="22"/>
+                <w:szCs w:val="22"/>
+                <w:lang w:eastAsia="en-GB"/>
+                <w14:ligatures w14:val="none"/>
+              </w:rPr>
+              <w:t>Implementation</w:t>
+            </w:r>
+          </w:p>
+        </w:tc>
+        <w:tc>
+          <w:tcPr>
+            <w:tcW w:w="2352" w:type="dxa"/>
+            <w:noWrap/>
+            <w:hideMark/>
+          </w:tcPr>
+          <w:p>
+            <w:pPr>
+              <w:cnfStyle w:val="000000100000" w:firstRow="0" w:lastRow="0" w:firstColumn="0" w:lastColumn="0" w:oddVBand="0" w:evenVBand="0" w:oddHBand="1" w:evenHBand="0" w:firstRowFirstColumn="0" w:firstRowLastColumn="0" w:lastRowFirstColumn="0" w:lastRowLastColumn="0"/>
+              <w:rPr>
+                <w:rFonts w:ascii="Calibri" w:eastAsia="Times New Roman" w:hAnsi="Calibri" w:cs="Calibri"/>
+                <w:color w:val="000000"/>
+                <w:kern w:val="0"/>
+                <w:sz w:val="22"/>
+                <w:szCs w:val="22"/>
+                <w:lang w:eastAsia="en-GB"/>
+                <w14:ligatures w14:val="none"/>
+              </w:rPr>
+            </w:pPr>
+            <w:r>
+              <w:rPr>
+                <w:rFonts w:ascii="Calibri" w:eastAsia="Times New Roman" w:hAnsi="Calibri" w:cs="Calibri"/>
+                <w:color w:val="000000"/>
+                <w:kern w:val="0"/>
+                <w:sz w:val="22"/>
+                <w:szCs w:val="22"/>
+                <w:lang w:eastAsia="en-GB"/>
+                <w14:ligatures w14:val="none"/>
+              </w:rPr>
+              <w:t>Test plan document</w:t>
+            </w:r>
+          </w:p>
+        </w:tc>
+        <w:tc>
+          <w:tcPr>
+            <w:tcW w:w="851" w:type="dxa"/>
+            <w:noWrap/>
+            <w:hideMark/>
+          </w:tcPr>
+          <w:p>
+            <w:pPr>
+              <w:cnfStyle w:val="000000100000" w:firstRow="0" w:lastRow="0" w:firstColumn="0" w:lastColumn="0" w:oddVBand="0" w:evenVBand="0" w:oddHBand="1" w:evenHBand="0" w:firstRowFirstColumn="0" w:firstRowLastColumn="0" w:lastRowFirstColumn="0" w:lastRowLastColumn="0"/>
+              <w:rPr>
+                <w:rFonts w:ascii="Calibri" w:eastAsia="Times New Roman" w:hAnsi="Calibri" w:cs="Calibri"/>
+                <w:color w:val="000000"/>
+                <w:kern w:val="0"/>
+                <w:sz w:val="22"/>
+                <w:szCs w:val="22"/>
+                <w:lang w:eastAsia="en-GB"/>
+                <w14:ligatures w14:val="none"/>
+              </w:rPr>
+            </w:pPr>
+            <w:r>
+              <w:rPr>
+                <w:rFonts w:ascii="Calibri" w:eastAsia="Times New Roman" w:hAnsi="Calibri" w:cs="Calibri"/>
+                <w:color w:val="000000"/>
+                <w:kern w:val="0"/>
+                <w:sz w:val="22"/>
+                <w:szCs w:val="22"/>
+                <w:lang w:eastAsia="en-GB"/>
+                <w14:ligatures w14:val="none"/>
+              </w:rPr>
+              <w:t>22-Jan-2026</w:t>
+            </w:r>
+          </w:p>
+        </w:tc>
+        <w:tc>
+          <w:tcPr>
+            <w:tcW w:w="992" w:type="dxa"/>
+            <w:noWrap/>
+            <w:hideMark/>
+          </w:tcPr>
+          <w:p>
+            <w:pPr>
+              <w:cnfStyle w:val="000000100000" w:firstRow="0" w:lastRow="0" w:firstColumn="0" w:lastColumn="0" w:oddVBand="0" w:evenVBand="0" w:oddHBand="1" w:evenHBand="0" w:firstRowFirstColumn="0" w:firstRowLastColumn="0" w:lastRowFirstColumn="0" w:lastRowLastColumn="0"/>
+              <w:rPr>
+                <w:rFonts w:ascii="Calibri" w:eastAsia="Times New Roman" w:hAnsi="Calibri" w:cs="Calibri"/>
+                <w:color w:val="000000"/>
+                <w:kern w:val="0"/>
+                <w:sz w:val="22"/>
+                <w:szCs w:val="22"/>
+                <w:lang w:eastAsia="en-GB"/>
+                <w14:ligatures w14:val="none"/>
+              </w:rPr>
+            </w:pPr>
+            <w:r>
+              <w:rPr>
+                <w:rFonts w:ascii="Calibri" w:eastAsia="Times New Roman" w:hAnsi="Calibri" w:cs="Calibri"/>
+                <w:color w:val="000000"/>
+                <w:kern w:val="0"/>
+                <w:sz w:val="22"/>
+                <w:szCs w:val="22"/>
+                <w:lang w:eastAsia="en-GB"/>
+                <w14:ligatures w14:val="none"/>
+              </w:rPr>
+              <w:t>26-Jan-2026</w:t>
+            </w:r>
+          </w:p>
+        </w:tc>
+        <w:tc>
+          <w:tcPr>
+            <w:tcW w:w="1134" w:type="dxa"/>
+            <w:noWrap/>
+            <w:hideMark/>
+          </w:tcPr>
+          <w:p>
+            <w:pPr>
+              <w:cnfStyle w:val="000000100000" w:firstRow="0" w:lastRow="0" w:firstColumn="0" w:lastColumn="0" w:oddVBand="0" w:evenVBand="0" w:oddHBand="1" w:evenHBand="0" w:firstRowFirstColumn="0" w:firstRowLastColumn="0" w:lastRowFirstColumn="0" w:lastRowLastColumn="0"/>
+              <w:rPr>
+                <w:rFonts w:ascii="Calibri" w:eastAsia="Times New Roman" w:hAnsi="Calibri" w:cs="Calibri"/>
+                <w:color w:val="000000"/>
+                <w:kern w:val="0"/>
+                <w:sz w:val="22"/>
+                <w:szCs w:val="22"/>
+                <w:lang w:eastAsia="en-GB"/>
+                <w14:ligatures w14:val="none"/>
+              </w:rPr>
+            </w:pPr>
+            <w:r>
+              <w:rPr>
+                <w:rFonts w:ascii="Calibri" w:eastAsia="Times New Roman" w:hAnsi="Calibri" w:cs="Calibri"/>
+                <w:color w:val="000000"/>
+                <w:kern w:val="0"/>
+                <w:sz w:val="22"/>
+                <w:szCs w:val="22"/>
+                <w:lang w:eastAsia="en-GB"/>
+                <w14:ligatures w14:val="none"/>
+              </w:rPr>
+              <w:t>Tutorial 3</w:t>
+            </w:r>
+          </w:p>
+        </w:tc>
+        <w:tc>
+          <w:tcPr>
+            <w:tcW w:w="3261" w:type="dxa"/>
+            <w:noWrap/>
+            <w:hideMark/>
+          </w:tcPr>
+          <w:p>
+            <w:pPr>
+              <w:cnfStyle w:val="000000100000" w:firstRow="0" w:lastRow="0" w:firstColumn="0" w:lastColumn="0" w:oddVBand="0" w:evenVBand="0" w:oddHBand="1" w:evenHBand="0" w:firstRowFirstColumn="0" w:firstRowLastColumn="0" w:lastRowFirstColumn="0" w:lastRowLastColumn="0"/>
+              <w:rPr>
+                <w:rFonts w:ascii="Calibri" w:eastAsia="Times New Roman" w:hAnsi="Calibri" w:cs="Calibri"/>
+                <w:color w:val="000000"/>
+                <w:kern w:val="0"/>
+                <w:sz w:val="22"/>
+                <w:szCs w:val="22"/>
+                <w:lang w:eastAsia="en-GB"/>
+                <w14:ligatures w14:val="none"/>
+              </w:rPr>
+            </w:pPr>
+            <w:r>
+              <w:rPr>
+                <w:rFonts w:ascii="Calibri" w:eastAsia="Times New Roman" w:hAnsi="Calibri" w:cs="Calibri"/>
+                <w:color w:val="000000"/>
+                <w:kern w:val="0"/>
+                <w:sz w:val="22"/>
+                <w:szCs w:val="22"/>
+                <w:lang w:eastAsia="en-GB"/>
+                <w14:ligatures w14:val="none"/>
+              </w:rPr>
+              <w:t>In Progress</w:t>
+            </w:r>
+          </w:p>
+        </w:tc>
+      </w:tr>
+      <w:tr>
+        <w:trPr>
+          <w:trHeight w:val="290"/>
+        </w:trPr>
+        <w:tc>
+          <w:tcPr>
+            <w:cnfStyle w:val="001000000000" w:firstRow="0" w:lastRow="0" w:firstColumn="1" w:lastColumn="0" w:oddVBand="0" w:evenVBand="0" w:oddHBand="0" w:evenHBand="0" w:firstRowFirstColumn="0" w:firstRowLastColumn="0" w:lastRowFirstColumn="0" w:lastRowLastColumn="0"/>
+            <w:tcW w:w="709" w:type="dxa"/>
+            <w:noWrap/>
+            <w:hideMark/>
+          </w:tcPr>
+          <w:p>
+            <w:pPr>
+              <w:jc w:val="right"/>
+              <w:rPr>
+                <w:rFonts w:ascii="Calibri" w:eastAsia="Times New Roman" w:hAnsi="Calibri" w:cs="Calibri"/>
+                <w:color w:val="000000"/>
+                <w:kern w:val="0"/>
+                <w:sz w:val="22"/>
+                <w:szCs w:val="22"/>
+                <w:lang w:eastAsia="en-GB"/>
+                <w14:ligatures w14:val="none"/>
+              </w:rPr>
+            </w:pPr>
+            <w:r>
+              <w:rPr>
+                <w:rFonts w:ascii="Calibri" w:eastAsia="Times New Roman" w:hAnsi="Calibri" w:cs="Calibri"/>
+                <w:color w:val="000000"/>
+                <w:kern w:val="0"/>
+                <w:sz w:val="22"/>
+                <w:szCs w:val="22"/>
+                <w:lang w:eastAsia="en-GB"/>
+                <w14:ligatures w14:val="none"/>
+              </w:rPr>
+              <w:t>12</w:t>
+            </w:r>
+          </w:p>
+        </w:tc>
+        <w:tc>
+          <w:tcPr>
+            <w:tcW w:w="1659" w:type="dxa"/>
+            <w:noWrap/>
+            <w:hideMark/>
+          </w:tcPr>
+          <w:p>
+            <w:pPr>
+              <w:cnfStyle w:val="000000000000" w:firstRow="0" w:lastRow="0" w:firstColumn="0" w:lastColumn="0" w:oddVBand="0" w:evenVBand="0" w:oddHBand="0" w:evenHBand="0" w:firstRowFirstColumn="0" w:firstRowLastColumn="0" w:lastRowFirstColumn="0" w:lastRowLastColumn="0"/>
+              <w:rPr>
+                <w:rFonts w:ascii="Calibri" w:eastAsia="Times New Roman" w:hAnsi="Calibri" w:cs="Calibri"/>
+                <w:color w:val="000000"/>
+                <w:kern w:val="0"/>
+                <w:sz w:val="22"/>
+                <w:szCs w:val="22"/>
+                <w:lang w:eastAsia="en-GB"/>
+                <w14:ligatures w14:val="none"/>
+              </w:rPr>
+            </w:pPr>
+            <w:r>
+              <w:rPr>
+                <w:rFonts w:ascii="Calibri" w:eastAsia="Times New Roman" w:hAnsi="Calibri" w:cs="Calibri"/>
+                <w:color w:val="000000"/>
+                <w:kern w:val="0"/>
+                <w:sz w:val="22"/>
+                <w:szCs w:val="22"/>
+                <w:lang w:eastAsia="en-GB"/>
+                <w14:ligatures w14:val="none"/>
+              </w:rPr>
+              <w:t>Algorithm Translation to Code</w:t>
+            </w:r>
+          </w:p>
+        </w:tc>
+        <w:tc>
+          <w:tcPr>
+            <w:tcW w:w="1659" w:type="dxa"/>
+            <w:noWrap/>
+            <w:hideMark/>
+          </w:tcPr>
+          <w:p>
+            <w:pPr>
+              <w:cnfStyle w:val="000000000000" w:firstRow="0" w:lastRow="0" w:firstColumn="0" w:lastColumn="0" w:oddVBand="0" w:evenVBand="0" w:oddHBand="0" w:evenHBand="0" w:firstRowFirstColumn="0" w:firstRowLastColumn="0" w:lastRowFirstColumn="0" w:lastRowLastColumn="0"/>
+              <w:rPr>
+                <w:rFonts w:ascii="Calibri" w:eastAsia="Times New Roman" w:hAnsi="Calibri" w:cs="Calibri"/>
+                <w:color w:val="000000"/>
+                <w:kern w:val="0"/>
+                <w:sz w:val="22"/>
+                <w:szCs w:val="22"/>
+                <w:lang w:eastAsia="en-GB"/>
+                <w14:ligatures w14:val="none"/>
+              </w:rPr>
+            </w:pPr>
+            <w:r>
+              <w:rPr>
+                <w:rFonts w:ascii="Calibri" w:eastAsia="Times New Roman" w:hAnsi="Calibri" w:cs="Calibri"/>
+                <w:color w:val="000000"/>
+                <w:kern w:val="0"/>
+                <w:sz w:val="22"/>
+                <w:szCs w:val="22"/>
+                <w:lang w:eastAsia="en-GB"/>
+                <w14:ligatures w14:val="none"/>
+              </w:rPr>
+              <w:t>Implementation</w:t>
+            </w:r>
+          </w:p>
+        </w:tc>
+        <w:tc>
+          <w:tcPr>
+            <w:tcW w:w="2352" w:type="dxa"/>
+            <w:noWrap/>
+            <w:hideMark/>
+          </w:tcPr>
+          <w:p>
+            <w:pPr>
+              <w:cnfStyle w:val="000000000000" w:firstRow="0" w:lastRow="0" w:firstColumn="0" w:lastColumn="0" w:oddVBand="0" w:evenVBand="0" w:oddHBand="0" w:evenHBand="0" w:firstRowFirstColumn="0" w:firstRowLastColumn="0" w:lastRowFirstColumn="0" w:lastRowLastColumn="0"/>
+              <w:rPr>
+                <w:rFonts w:ascii="Calibri" w:eastAsia="Times New Roman" w:hAnsi="Calibri" w:cs="Calibri"/>
+                <w:color w:val="000000"/>
+                <w:kern w:val="0"/>
+                <w:sz w:val="22"/>
+                <w:szCs w:val="22"/>
+                <w:lang w:eastAsia="en-GB"/>
+                <w14:ligatures w14:val="none"/>
+              </w:rPr>
+            </w:pPr>
+            <w:r>
+              <w:rPr>
+                <w:rFonts w:ascii="Calibri" w:eastAsia="Times New Roman" w:hAnsi="Calibri" w:cs="Calibri"/>
+                <w:color w:val="000000"/>
+                <w:kern w:val="0"/>
+                <w:sz w:val="22"/>
+                <w:szCs w:val="22"/>
+                <w:lang w:eastAsia="en-GB"/>
+                <w14:ligatures w14:val="none"/>
+              </w:rPr>
+              <w:t>Initial code structure</w:t>
+            </w:r>
+          </w:p>
+        </w:tc>
+        <w:tc>
+          <w:tcPr>
+            <w:tcW w:w="851" w:type="dxa"/>
+            <w:noWrap/>
+            <w:hideMark/>
+          </w:tcPr>
+          <w:p>
+            <w:pPr>
+              <w:cnfStyle w:val="000000000000" w:firstRow="0" w:lastRow="0" w:firstColumn="0" w:lastColumn="0" w:oddVBand="0" w:evenVBand="0" w:oddHBand="0" w:evenHBand="0" w:firstRowFirstColumn="0" w:firstRowLastColumn="0" w:lastRowFirstColumn="0" w:lastRowLastColumn="0"/>
+              <w:rPr>
+                <w:rFonts w:ascii="Calibri" w:eastAsia="Times New Roman" w:hAnsi="Calibri" w:cs="Calibri"/>
+                <w:color w:val="000000"/>
+                <w:kern w:val="0"/>
+                <w:sz w:val="22"/>
+                <w:szCs w:val="22"/>
+                <w:lang w:eastAsia="en-GB"/>
+                <w14:ligatures w14:val="none"/>
+              </w:rPr>
+            </w:pPr>
+            <w:r>
+              <w:rPr>
+                <w:rFonts w:ascii="Calibri" w:eastAsia="Times New Roman" w:hAnsi="Calibri" w:cs="Calibri"/>
+                <w:color w:val="000000"/>
+                <w:kern w:val="0"/>
+                <w:sz w:val="22"/>
+                <w:szCs w:val="22"/>
+                <w:lang w:eastAsia="en-GB"/>
+                <w14:ligatures w14:val="none"/>
+              </w:rPr>
+              <w:t>27-Jan-2026</w:t>
+            </w:r>
+          </w:p>
+        </w:tc>
+        <w:tc>
+          <w:tcPr>
+            <w:tcW w:w="992" w:type="dxa"/>
+            <w:noWrap/>
+            <w:hideMark/>
+          </w:tcPr>
+          <w:p>
+            <w:pPr>
+              <w:cnfStyle w:val="000000000000" w:firstRow="0" w:lastRow="0" w:firstColumn="0" w:lastColumn="0" w:oddVBand="0" w:evenVBand="0" w:oddHBand="0" w:evenHBand="0" w:firstRowFirstColumn="0" w:firstRowLastColumn="0" w:lastRowFirstColumn="0" w:lastRowLastColumn="0"/>
+              <w:rPr>
+                <w:rFonts w:ascii="Calibri" w:eastAsia="Times New Roman" w:hAnsi="Calibri" w:cs="Calibri"/>
+                <w:color w:val="000000"/>
+                <w:kern w:val="0"/>
+                <w:sz w:val="22"/>
+                <w:szCs w:val="22"/>
+                <w:lang w:eastAsia="en-GB"/>
+                <w14:ligatures w14:val="none"/>
+              </w:rPr>
+            </w:pPr>
+            <w:r>
+              <w:rPr>
+                <w:rFonts w:ascii="Calibri" w:eastAsia="Times New Roman" w:hAnsi="Calibri" w:cs="Calibri"/>
+                <w:color w:val="000000"/>
+                <w:kern w:val="0"/>
+                <w:sz w:val="22"/>
+                <w:szCs w:val="22"/>
+                <w:lang w:eastAsia="en-GB"/>
+                <w14:ligatures w14:val="none"/>
+              </w:rPr>
+              <w:t>02-Feb-2026</w:t>
+            </w:r>
+          </w:p>
+        </w:tc>
+        <w:tc>
+          <w:tcPr>
+            <w:tcW w:w="1134" w:type="dxa"/>
+            <w:noWrap/>
+            <w:hideMark/>
+          </w:tcPr>
+          <w:p>
+            <w:pPr>
+              <w:cnfStyle w:val="000000000000" w:firstRow="0" w:lastRow="0" w:firstColumn="0" w:lastColumn="0" w:oddVBand="0" w:evenVBand="0" w:oddHBand="0" w:evenHBand="0" w:firstRowFirstColumn="0" w:firstRowLastColumn="0" w:lastRowFirstColumn="0" w:lastRowLastColumn="0"/>
+              <w:rPr>
+                <w:rFonts w:ascii="Calibri" w:eastAsia="Times New Roman" w:hAnsi="Calibri" w:cs="Calibri"/>
+                <w:color w:val="000000"/>
+                <w:kern w:val="0"/>
+                <w:sz w:val="22"/>
+                <w:szCs w:val="22"/>
+                <w:lang w:eastAsia="en-GB"/>
+                <w14:ligatures w14:val="none"/>
+              </w:rPr>
+            </w:pPr>
+            <w:r>
+              <w:rPr>
+                <w:rFonts w:ascii="Calibri" w:eastAsia="Times New Roman" w:hAnsi="Calibri" w:cs="Calibri"/>
+                <w:color w:val="000000"/>
+                <w:kern w:val="0"/>
+                <w:sz w:val="22"/>
+                <w:szCs w:val="22"/>
+                <w:lang w:eastAsia="en-GB"/>
+                <w14:ligatures w14:val="none"/>
+              </w:rPr>
+              <w:t>—</w:t>
+            </w:r>
+          </w:p>
+        </w:tc>
+        <w:tc>
+          <w:tcPr>
+            <w:tcW w:w="3261" w:type="dxa"/>
+            <w:noWrap/>
+            <w:hideMark/>
+          </w:tcPr>
+          <w:p>
+            <w:pPr>
+              <w:cnfStyle w:val="000000000000" w:firstRow="0" w:lastRow="0" w:firstColumn="0" w:lastColumn="0" w:oddVBand="0" w:evenVBand="0" w:oddHBand="0" w:evenHBand="0" w:firstRowFirstColumn="0" w:firstRowLastColumn="0" w:lastRowFirstColumn="0" w:lastRowLastColumn="0"/>
+              <w:rPr>
+                <w:rFonts w:ascii="Calibri" w:eastAsia="Times New Roman" w:hAnsi="Calibri" w:cs="Calibri"/>
+                <w:color w:val="000000"/>
+                <w:kern w:val="0"/>
+                <w:sz w:val="22"/>
+                <w:szCs w:val="22"/>
+                <w:lang w:eastAsia="en-GB"/>
+                <w14:ligatures w14:val="none"/>
+              </w:rPr>
+            </w:pPr>
+            <w:r>
+              <w:rPr>
+                <w:rFonts w:ascii="Calibri" w:eastAsia="Times New Roman" w:hAnsi="Calibri" w:cs="Calibri"/>
+                <w:color w:val="000000"/>
+                <w:kern w:val="0"/>
+                <w:sz w:val="22"/>
+                <w:szCs w:val="22"/>
+                <w:lang w:eastAsia="en-GB"/>
+                <w14:ligatures w14:val="none"/>
+              </w:rPr>
+              <w:t xml:space="preserve">Not Yet </w:t>
+            </w:r>
+          </w:p>
+        </w:tc>
+      </w:tr>
+      <w:tr>
+        <w:trPr>
+          <w:cnfStyle w:val="000000100000" w:firstRow="0" w:lastRow="0" w:firstColumn="0" w:lastColumn="0" w:oddVBand="0" w:evenVBand="0" w:oddHBand="1" w:evenHBand="0" w:firstRowFirstColumn="0" w:firstRowLastColumn="0" w:lastRowFirstColumn="0" w:lastRowLastColumn="0"/>
+          <w:trHeight w:val="290"/>
+        </w:trPr>
+        <w:tc>
+          <w:tcPr>
+            <w:cnfStyle w:val="001000000000" w:firstRow="0" w:lastRow="0" w:firstColumn="1" w:lastColumn="0" w:oddVBand="0" w:evenVBand="0" w:oddHBand="0" w:evenHBand="0" w:firstRowFirstColumn="0" w:firstRowLastColumn="0" w:lastRowFirstColumn="0" w:lastRowLastColumn="0"/>
+            <w:tcW w:w="709" w:type="dxa"/>
+            <w:noWrap/>
+            <w:hideMark/>
+          </w:tcPr>
+          <w:p>
+            <w:pPr>
+              <w:jc w:val="right"/>
+              <w:rPr>
+                <w:rFonts w:ascii="Calibri" w:eastAsia="Times New Roman" w:hAnsi="Calibri" w:cs="Calibri"/>
+                <w:color w:val="000000"/>
+                <w:kern w:val="0"/>
+                <w:sz w:val="22"/>
+                <w:szCs w:val="22"/>
+                <w:lang w:eastAsia="en-GB"/>
+                <w14:ligatures w14:val="none"/>
+              </w:rPr>
+            </w:pPr>
+            <w:r>
+              <w:rPr>
+                <w:rFonts w:ascii="Calibri" w:eastAsia="Times New Roman" w:hAnsi="Calibri" w:cs="Calibri"/>
+                <w:color w:val="000000"/>
+                <w:kern w:val="0"/>
+                <w:sz w:val="22"/>
+                <w:szCs w:val="22"/>
+                <w:lang w:eastAsia="en-GB"/>
+                <w14:ligatures w14:val="none"/>
+              </w:rPr>
+              <w:t>13</w:t>
+            </w:r>
+          </w:p>
+        </w:tc>
+        <w:tc>
+          <w:tcPr>
+            <w:tcW w:w="1659" w:type="dxa"/>
+            <w:noWrap/>
+            <w:hideMark/>
+          </w:tcPr>
+          <w:p>
+            <w:pPr>
+              <w:cnfStyle w:val="000000100000" w:firstRow="0" w:lastRow="0" w:firstColumn="0" w:lastColumn="0" w:oddVBand="0" w:evenVBand="0" w:oddHBand="1" w:evenHBand="0" w:firstRowFirstColumn="0" w:firstRowLastColumn="0" w:lastRowFirstColumn="0" w:lastRowLastColumn="0"/>
+              <w:rPr>
+                <w:rFonts w:ascii="Calibri" w:eastAsia="Times New Roman" w:hAnsi="Calibri" w:cs="Calibri"/>
+                <w:color w:val="000000"/>
+                <w:kern w:val="0"/>
+                <w:sz w:val="22"/>
+                <w:szCs w:val="22"/>
+                <w:lang w:eastAsia="en-GB"/>
+                <w14:ligatures w14:val="none"/>
+              </w:rPr>
+            </w:pPr>
+            <w:r>
+              <w:rPr>
+                <w:rFonts w:ascii="Calibri" w:eastAsia="Times New Roman" w:hAnsi="Calibri" w:cs="Calibri"/>
+                <w:color w:val="000000"/>
+                <w:kern w:val="0"/>
+                <w:sz w:val="22"/>
+                <w:szCs w:val="22"/>
+                <w:lang w:eastAsia="en-GB"/>
+                <w14:ligatures w14:val="none"/>
+              </w:rPr>
+              <w:t>Incremental Implementation &amp; Testing</w:t>
+            </w:r>
+          </w:p>
+        </w:tc>
+        <w:tc>
+          <w:tcPr>
+            <w:tcW w:w="1659" w:type="dxa"/>
+            <w:noWrap/>
+            <w:hideMark/>
+          </w:tcPr>
+          <w:p>
+            <w:pPr>
+              <w:cnfStyle w:val="000000100000" w:firstRow="0" w:lastRow="0" w:firstColumn="0" w:lastColumn="0" w:oddVBand="0" w:evenVBand="0" w:oddHBand="1" w:evenHBand="0" w:firstRowFirstColumn="0" w:firstRowLastColumn="0" w:lastRowFirstColumn="0" w:lastRowLastColumn="0"/>
+              <w:rPr>
+                <w:rFonts w:ascii="Calibri" w:eastAsia="Times New Roman" w:hAnsi="Calibri" w:cs="Calibri"/>
+                <w:color w:val="000000"/>
+                <w:kern w:val="0"/>
+                <w:sz w:val="22"/>
+                <w:szCs w:val="22"/>
+                <w:lang w:eastAsia="en-GB"/>
+                <w14:ligatures w14:val="none"/>
+              </w:rPr>
+            </w:pPr>
+            <w:r>
+              <w:rPr>
+                <w:rFonts w:ascii="Calibri" w:eastAsia="Times New Roman" w:hAnsi="Calibri" w:cs="Calibri"/>
+                <w:color w:val="000000"/>
+                <w:kern w:val="0"/>
+                <w:sz w:val="22"/>
+                <w:szCs w:val="22"/>
+                <w:lang w:eastAsia="en-GB"/>
+                <w14:ligatures w14:val="none"/>
+              </w:rPr>
+              <w:t>Implementation</w:t>
+            </w:r>
+          </w:p>
+        </w:tc>
+        <w:tc>
+          <w:tcPr>
+            <w:tcW w:w="2352" w:type="dxa"/>
+            <w:noWrap/>
+            <w:hideMark/>
+          </w:tcPr>
+          <w:p>
+            <w:pPr>
+              <w:cnfStyle w:val="000000100000" w:firstRow="0" w:lastRow="0" w:firstColumn="0" w:lastColumn="0" w:oddVBand="0" w:evenVBand="0" w:oddHBand="1" w:evenHBand="0" w:firstRowFirstColumn="0" w:firstRowLastColumn="0" w:lastRowFirstColumn="0" w:lastRowLastColumn="0"/>
+              <w:rPr>
+                <w:rFonts w:ascii="Calibri" w:eastAsia="Times New Roman" w:hAnsi="Calibri" w:cs="Calibri"/>
+                <w:color w:val="000000"/>
+                <w:kern w:val="0"/>
+                <w:sz w:val="22"/>
+                <w:szCs w:val="22"/>
+                <w:lang w:eastAsia="en-GB"/>
+                <w14:ligatures w14:val="none"/>
+              </w:rPr>
+            </w:pPr>
+            <w:r>
+              <w:rPr>
+                <w:rFonts w:ascii="Calibri" w:eastAsia="Times New Roman" w:hAnsi="Calibri" w:cs="Calibri"/>
+                <w:color w:val="000000"/>
+                <w:kern w:val="0"/>
+                <w:sz w:val="22"/>
+                <w:szCs w:val="22"/>
+                <w:lang w:eastAsia="en-GB"/>
+                <w14:ligatures w14:val="none"/>
+              </w:rPr>
+              <w:t>Working prototype</w:t>
+            </w:r>
+          </w:p>
+        </w:tc>
+        <w:tc>
+          <w:tcPr>
+            <w:tcW w:w="851" w:type="dxa"/>
+            <w:noWrap/>
+            <w:hideMark/>
+          </w:tcPr>
+          <w:p>
+            <w:pPr>
+              <w:cnfStyle w:val="000000100000" w:firstRow="0" w:lastRow="0" w:firstColumn="0" w:lastColumn="0" w:oddVBand="0" w:evenVBand="0" w:oddHBand="1" w:evenHBand="0" w:firstRowFirstColumn="0" w:firstRowLastColumn="0" w:lastRowFirstColumn="0" w:lastRowLastColumn="0"/>
+              <w:rPr>
+                <w:rFonts w:ascii="Calibri" w:eastAsia="Times New Roman" w:hAnsi="Calibri" w:cs="Calibri"/>
+                <w:color w:val="000000"/>
+                <w:kern w:val="0"/>
+                <w:sz w:val="22"/>
+                <w:szCs w:val="22"/>
+                <w:lang w:eastAsia="en-GB"/>
+                <w14:ligatures w14:val="none"/>
+              </w:rPr>
+            </w:pPr>
+            <w:r>
+              <w:rPr>
+                <w:rFonts w:ascii="Calibri" w:eastAsia="Times New Roman" w:hAnsi="Calibri" w:cs="Calibri"/>
+                <w:color w:val="000000"/>
+                <w:kern w:val="0"/>
+                <w:sz w:val="22"/>
+                <w:szCs w:val="22"/>
+                <w:lang w:eastAsia="en-GB"/>
+                <w14:ligatures w14:val="none"/>
+              </w:rPr>
+              <w:t>03-Feb-2026</w:t>
+            </w:r>
+          </w:p>
+        </w:tc>
+        <w:tc>
+          <w:tcPr>
+            <w:tcW w:w="992" w:type="dxa"/>
+            <w:noWrap/>
+            <w:hideMark/>
+          </w:tcPr>
+          <w:p>
+            <w:pPr>
+              <w:cnfStyle w:val="000000100000" w:firstRow="0" w:lastRow="0" w:firstColumn="0" w:lastColumn="0" w:oddVBand="0" w:evenVBand="0" w:oddHBand="1" w:evenHBand="0" w:firstRowFirstColumn="0" w:firstRowLastColumn="0" w:lastRowFirstColumn="0" w:lastRowLastColumn="0"/>
+              <w:rPr>
+                <w:rFonts w:ascii="Calibri" w:eastAsia="Times New Roman" w:hAnsi="Calibri" w:cs="Calibri"/>
+                <w:color w:val="000000"/>
+                <w:kern w:val="0"/>
+                <w:sz w:val="22"/>
+                <w:szCs w:val="22"/>
+                <w:lang w:eastAsia="en-GB"/>
+                <w14:ligatures w14:val="none"/>
+              </w:rPr>
+            </w:pPr>
+            <w:r>
+              <w:rPr>
+                <w:rFonts w:ascii="Calibri" w:eastAsia="Times New Roman" w:hAnsi="Calibri" w:cs="Calibri"/>
+                <w:color w:val="000000"/>
+                <w:kern w:val="0"/>
+                <w:sz w:val="22"/>
+                <w:szCs w:val="22"/>
+                <w:lang w:eastAsia="en-GB"/>
+                <w14:ligatures w14:val="none"/>
+              </w:rPr>
+              <w:t>16-Feb-2026</w:t>
+            </w:r>
+          </w:p>
+        </w:tc>
+        <w:tc>
+          <w:tcPr>
+            <w:tcW w:w="1134" w:type="dxa"/>
+            <w:noWrap/>
+            <w:hideMark/>
+          </w:tcPr>
+          <w:p>
+            <w:pPr>
+              <w:cnfStyle w:val="000000100000" w:firstRow="0" w:lastRow="0" w:firstColumn="0" w:lastColumn="0" w:oddVBand="0" w:evenVBand="0" w:oddHBand="1" w:evenHBand="0" w:firstRowFirstColumn="0" w:firstRowLastColumn="0" w:lastRowFirstColumn="0" w:lastRowLastColumn="0"/>
+              <w:rPr>
+                <w:rFonts w:ascii="Calibri" w:eastAsia="Times New Roman" w:hAnsi="Calibri" w:cs="Calibri"/>
+                <w:color w:val="000000"/>
+                <w:kern w:val="0"/>
+                <w:sz w:val="22"/>
+                <w:szCs w:val="22"/>
+                <w:lang w:eastAsia="en-GB"/>
+                <w14:ligatures w14:val="none"/>
+              </w:rPr>
+            </w:pPr>
+            <w:r>
+              <w:rPr>
+                <w:rFonts w:ascii="Calibri" w:eastAsia="Times New Roman" w:hAnsi="Calibri" w:cs="Calibri"/>
+                <w:color w:val="000000"/>
+                <w:kern w:val="0"/>
+                <w:sz w:val="22"/>
+                <w:szCs w:val="22"/>
+                <w:lang w:eastAsia="en-GB"/>
+                <w14:ligatures w14:val="none"/>
+              </w:rPr>
+              <w:t>Tutorial 4</w:t>
+            </w:r>
+          </w:p>
+        </w:tc>
+        <w:tc>
+          <w:tcPr>
+            <w:tcW w:w="3261" w:type="dxa"/>
+            <w:noWrap/>
+            <w:hideMark/>
+          </w:tcPr>
+          <w:p>
+            <w:pPr>
+              <w:cnfStyle w:val="000000100000" w:firstRow="0" w:lastRow="0" w:firstColumn="0" w:lastColumn="0" w:oddVBand="0" w:evenVBand="0" w:oddHBand="1" w:evenHBand="0" w:firstRowFirstColumn="0" w:firstRowLastColumn="0" w:lastRowFirstColumn="0" w:lastRowLastColumn="0"/>
+              <w:rPr>
+                <w:rFonts w:ascii="Calibri" w:eastAsia="Times New Roman" w:hAnsi="Calibri" w:cs="Calibri"/>
+                <w:color w:val="000000"/>
+                <w:kern w:val="0"/>
+                <w:sz w:val="22"/>
+                <w:szCs w:val="22"/>
+                <w:lang w:eastAsia="en-GB"/>
+                <w14:ligatures w14:val="none"/>
+              </w:rPr>
+            </w:pPr>
+            <w:r>
+              <w:rPr>
+                <w:rFonts w:ascii="Calibri" w:eastAsia="Times New Roman" w:hAnsi="Calibri" w:cs="Calibri"/>
+                <w:color w:val="000000"/>
+                <w:kern w:val="0"/>
+                <w:sz w:val="22"/>
+                <w:szCs w:val="22"/>
+                <w:lang w:eastAsia="en-GB"/>
+                <w14:ligatures w14:val="none"/>
+              </w:rPr>
+              <w:t xml:space="preserve">Not Yet </w:t>
+            </w:r>
+          </w:p>
+        </w:tc>
+      </w:tr>
+      <w:tr>
+        <w:trPr>
+          <w:trHeight w:val="290"/>
+        </w:trPr>
+        <w:tc>
+          <w:tcPr>
+            <w:cnfStyle w:val="001000000000" w:firstRow="0" w:lastRow="0" w:firstColumn="1" w:lastColumn="0" w:oddVBand="0" w:evenVBand="0" w:oddHBand="0" w:evenHBand="0" w:firstRowFirstColumn="0" w:firstRowLastColumn="0" w:lastRowFirstColumn="0" w:lastRowLastColumn="0"/>
+            <w:tcW w:w="709" w:type="dxa"/>
+            <w:noWrap/>
+            <w:hideMark/>
+          </w:tcPr>
+          <w:p>
+            <w:pPr>
+              <w:jc w:val="right"/>
+              <w:rPr>
+                <w:rFonts w:ascii="Calibri" w:eastAsia="Times New Roman" w:hAnsi="Calibri" w:cs="Calibri"/>
+                <w:color w:val="000000"/>
+                <w:kern w:val="0"/>
+                <w:sz w:val="22"/>
+                <w:szCs w:val="22"/>
+                <w:lang w:eastAsia="en-GB"/>
+                <w14:ligatures w14:val="none"/>
+              </w:rPr>
+            </w:pPr>
+            <w:r>
+              <w:rPr>
+                <w:rFonts w:ascii="Calibri" w:eastAsia="Times New Roman" w:hAnsi="Calibri" w:cs="Calibri"/>
+                <w:color w:val="000000"/>
+                <w:kern w:val="0"/>
+                <w:sz w:val="22"/>
+                <w:szCs w:val="22"/>
+                <w:lang w:eastAsia="en-GB"/>
+                <w14:ligatures w14:val="none"/>
+              </w:rPr>
+              <w:t>14</w:t>
+            </w:r>
+          </w:p>
+        </w:tc>
+        <w:tc>
+          <w:tcPr>
+            <w:tcW w:w="1659" w:type="dxa"/>
+            <w:noWrap/>
+            <w:hideMark/>
+          </w:tcPr>
+          <w:p>
+            <w:pPr>
+              <w:cnfStyle w:val="000000000000" w:firstRow="0" w:lastRow="0" w:firstColumn="0" w:lastColumn="0" w:oddVBand="0" w:evenVBand="0" w:oddHBand="0" w:evenHBand="0" w:firstRowFirstColumn="0" w:firstRowLastColumn="0" w:lastRowFirstColumn="0" w:lastRowLastColumn="0"/>
+              <w:rPr>
+                <w:rFonts w:ascii="Calibri" w:eastAsia="Times New Roman" w:hAnsi="Calibri" w:cs="Calibri"/>
+                <w:color w:val="000000"/>
+                <w:kern w:val="0"/>
+                <w:sz w:val="22"/>
+                <w:szCs w:val="22"/>
+                <w:lang w:eastAsia="en-GB"/>
+                <w14:ligatures w14:val="none"/>
+              </w:rPr>
+            </w:pPr>
+            <w:r>
+              <w:rPr>
+                <w:rFonts w:ascii="Calibri" w:eastAsia="Times New Roman" w:hAnsi="Calibri" w:cs="Calibri"/>
+                <w:color w:val="000000"/>
+                <w:kern w:val="0"/>
+                <w:sz w:val="22"/>
+                <w:szCs w:val="22"/>
+                <w:lang w:eastAsia="en-GB"/>
+                <w14:ligatures w14:val="none"/>
+              </w:rPr>
+              <w:t>Final Testing &amp; Debugging</w:t>
+            </w:r>
+          </w:p>
+        </w:tc>
+        <w:tc>
+          <w:tcPr>
+            <w:tcW w:w="1659" w:type="dxa"/>
+            <w:noWrap/>
+            <w:hideMark/>
+          </w:tcPr>
+          <w:p>
+            <w:pPr>
+              <w:cnfStyle w:val="000000000000" w:firstRow="0" w:lastRow="0" w:firstColumn="0" w:lastColumn="0" w:oddVBand="0" w:evenVBand="0" w:oddHBand="0" w:evenHBand="0" w:firstRowFirstColumn="0" w:firstRowLastColumn="0" w:lastRowFirstColumn="0" w:lastRowLastColumn="0"/>
+              <w:rPr>
+                <w:rFonts w:ascii="Calibri" w:eastAsia="Times New Roman" w:hAnsi="Calibri" w:cs="Calibri"/>
+                <w:color w:val="000000"/>
+                <w:kern w:val="0"/>
+                <w:sz w:val="22"/>
+                <w:szCs w:val="22"/>
+                <w:lang w:eastAsia="en-GB"/>
+                <w14:ligatures w14:val="none"/>
+              </w:rPr>
+            </w:pPr>
+            <w:r>
+              <w:rPr>
+                <w:rFonts w:ascii="Calibri" w:eastAsia="Times New Roman" w:hAnsi="Calibri" w:cs="Calibri"/>
+                <w:color w:val="000000"/>
+                <w:kern w:val="0"/>
+                <w:sz w:val="22"/>
+                <w:szCs w:val="22"/>
+                <w:lang w:eastAsia="en-GB"/>
+                <w14:ligatures w14:val="none"/>
+              </w:rPr>
+              <w:t>Implementation</w:t>
+            </w:r>
+          </w:p>
+        </w:tc>
+        <w:tc>
+          <w:tcPr>
+            <w:tcW w:w="2352" w:type="dxa"/>
+            <w:noWrap/>
+            <w:hideMark/>
+          </w:tcPr>
+          <w:p>
+            <w:pPr>
+              <w:cnfStyle w:val="000000000000" w:firstRow="0" w:lastRow="0" w:firstColumn="0" w:lastColumn="0" w:oddVBand="0" w:evenVBand="0" w:oddHBand="0" w:evenHBand="0" w:firstRowFirstColumn="0" w:firstRowLastColumn="0" w:lastRowFirstColumn="0" w:lastRowLastColumn="0"/>
+              <w:rPr>
+                <w:rFonts w:ascii="Calibri" w:eastAsia="Times New Roman" w:hAnsi="Calibri" w:cs="Calibri"/>
+                <w:color w:val="000000"/>
+                <w:kern w:val="0"/>
+                <w:sz w:val="22"/>
+                <w:szCs w:val="22"/>
+                <w:lang w:eastAsia="en-GB"/>
+                <w14:ligatures w14:val="none"/>
+              </w:rPr>
+            </w:pPr>
+            <w:r>
+              <w:rPr>
+                <w:rFonts w:ascii="Calibri" w:eastAsia="Times New Roman" w:hAnsi="Calibri" w:cs="Calibri"/>
+                <w:color w:val="000000"/>
+                <w:kern w:val="0"/>
+                <w:sz w:val="22"/>
+                <w:szCs w:val="22"/>
+                <w:lang w:eastAsia="en-GB"/>
+                <w14:ligatures w14:val="none"/>
+              </w:rPr>
+              <w:t>Tested final solution</w:t>
+            </w:r>
+          </w:p>
+        </w:tc>
+        <w:tc>
+          <w:tcPr>
+            <w:tcW w:w="851" w:type="dxa"/>
+            <w:noWrap/>
+            <w:hideMark/>
+          </w:tcPr>
+          <w:p>
+            <w:pPr>
+              <w:cnfStyle w:val="000000000000" w:firstRow="0" w:lastRow="0" w:firstColumn="0" w:lastColumn="0" w:oddVBand="0" w:evenVBand="0" w:oddHBand="0" w:evenHBand="0" w:firstRowFirstColumn="0" w:firstRowLastColumn="0" w:lastRowFirstColumn="0" w:lastRowLastColumn="0"/>
+              <w:rPr>
+                <w:rFonts w:ascii="Calibri" w:eastAsia="Times New Roman" w:hAnsi="Calibri" w:cs="Calibri"/>
+                <w:color w:val="000000"/>
+                <w:kern w:val="0"/>
+                <w:sz w:val="22"/>
+                <w:szCs w:val="22"/>
+                <w:lang w:eastAsia="en-GB"/>
+                <w14:ligatures w14:val="none"/>
+              </w:rPr>
+            </w:pPr>
+            <w:r>
+              <w:rPr>
+                <w:rFonts w:ascii="Calibri" w:eastAsia="Times New Roman" w:hAnsi="Calibri" w:cs="Calibri"/>
+                <w:color w:val="000000"/>
+                <w:kern w:val="0"/>
+                <w:sz w:val="22"/>
+                <w:szCs w:val="22"/>
+                <w:lang w:eastAsia="en-GB"/>
+                <w14:ligatures w14:val="none"/>
+              </w:rPr>
+              <w:t>17-Feb-2026</w:t>
+            </w:r>
+          </w:p>
+        </w:tc>
+        <w:tc>
+          <w:tcPr>
+            <w:tcW w:w="992" w:type="dxa"/>
+            <w:noWrap/>
+            <w:hideMark/>
+          </w:tcPr>
+          <w:p>
+            <w:pPr>
+              <w:cnfStyle w:val="000000000000" w:firstRow="0" w:lastRow="0" w:firstColumn="0" w:lastColumn="0" w:oddVBand="0" w:evenVBand="0" w:oddHBand="0" w:evenHBand="0" w:firstRowFirstColumn="0" w:firstRowLastColumn="0" w:lastRowFirstColumn="0" w:lastRowLastColumn="0"/>
+              <w:rPr>
+                <w:rFonts w:ascii="Calibri" w:eastAsia="Times New Roman" w:hAnsi="Calibri" w:cs="Calibri"/>
+                <w:color w:val="000000"/>
+                <w:kern w:val="0"/>
+                <w:sz w:val="22"/>
+                <w:szCs w:val="22"/>
+                <w:lang w:eastAsia="en-GB"/>
+                <w14:ligatures w14:val="none"/>
+              </w:rPr>
+            </w:pPr>
+            <w:r>
+              <w:rPr>
+                <w:rFonts w:ascii="Calibri" w:eastAsia="Times New Roman" w:hAnsi="Calibri" w:cs="Calibri"/>
+                <w:color w:val="000000"/>
+                <w:kern w:val="0"/>
+                <w:sz w:val="22"/>
+                <w:szCs w:val="22"/>
+                <w:lang w:eastAsia="en-GB"/>
+                <w14:ligatures w14:val="none"/>
+              </w:rPr>
+              <w:t>23-Feb-2026</w:t>
+            </w:r>
+          </w:p>
+        </w:tc>
+        <w:tc>
+          <w:tcPr>
+            <w:tcW w:w="1134" w:type="dxa"/>
+            <w:noWrap/>
+            <w:hideMark/>
+          </w:tcPr>
+          <w:p>
+            <w:pPr>
+              <w:cnfStyle w:val="000000000000" w:firstRow="0" w:lastRow="0" w:firstColumn="0" w:lastColumn="0" w:oddVBand="0" w:evenVBand="0" w:oddHBand="0" w:evenHBand="0" w:firstRowFirstColumn="0" w:firstRowLastColumn="0" w:lastRowFirstColumn="0" w:lastRowLastColumn="0"/>
+              <w:rPr>
+                <w:rFonts w:ascii="Calibri" w:eastAsia="Times New Roman" w:hAnsi="Calibri" w:cs="Calibri"/>
+                <w:color w:val="000000"/>
+                <w:kern w:val="0"/>
+                <w:sz w:val="22"/>
+                <w:szCs w:val="22"/>
+                <w:lang w:eastAsia="en-GB"/>
+                <w14:ligatures w14:val="none"/>
+              </w:rPr>
+            </w:pPr>
+            <w:r>
+              <w:rPr>
+                <w:rFonts w:ascii="Calibri" w:eastAsia="Times New Roman" w:hAnsi="Calibri" w:cs="Calibri"/>
+                <w:color w:val="000000"/>
+                <w:kern w:val="0"/>
+                <w:sz w:val="22"/>
+                <w:szCs w:val="22"/>
+                <w:lang w:eastAsia="en-GB"/>
+                <w14:ligatures w14:val="none"/>
+              </w:rPr>
+              <w:t>—</w:t>
+            </w:r>
+          </w:p>
+        </w:tc>
+        <w:tc>
+          <w:tcPr>
+            <w:tcW w:w="3261" w:type="dxa"/>
+            <w:noWrap/>
+            <w:hideMark/>
+          </w:tcPr>
+          <w:p>
+            <w:pPr>
+              <w:cnfStyle w:val="000000000000" w:firstRow="0" w:lastRow="0" w:firstColumn="0" w:lastColumn="0" w:oddVBand="0" w:evenVBand="0" w:oddHBand="0" w:evenHBand="0" w:firstRowFirstColumn="0" w:firstRowLastColumn="0" w:lastRowFirstColumn="0" w:lastRowLastColumn="0"/>
+              <w:rPr>
+                <w:rFonts w:ascii="Calibri" w:eastAsia="Times New Roman" w:hAnsi="Calibri" w:cs="Calibri"/>
+                <w:color w:val="000000"/>
+                <w:kern w:val="0"/>
+                <w:sz w:val="22"/>
+                <w:szCs w:val="22"/>
+                <w:lang w:eastAsia="en-GB"/>
+                <w14:ligatures w14:val="none"/>
+              </w:rPr>
+            </w:pPr>
+            <w:r>
+              <w:rPr>
+                <w:rFonts w:ascii="Calibri" w:eastAsia="Times New Roman" w:hAnsi="Calibri" w:cs="Calibri"/>
+                <w:color w:val="000000"/>
+                <w:kern w:val="0"/>
+                <w:sz w:val="22"/>
+                <w:szCs w:val="22"/>
+                <w:lang w:eastAsia="en-GB"/>
+                <w14:ligatures w14:val="none"/>
+              </w:rPr>
+              <w:t xml:space="preserve">Not Yet </w:t>
+            </w:r>
+          </w:p>
+        </w:tc>
+      </w:tr>
+      <w:tr>
+        <w:trPr>
+          <w:cnfStyle w:val="000000100000" w:firstRow="0" w:lastRow="0" w:firstColumn="0" w:lastColumn="0" w:oddVBand="0" w:evenVBand="0" w:oddHBand="1" w:evenHBand="0" w:firstRowFirstColumn="0" w:firstRowLastColumn="0" w:lastRowFirstColumn="0" w:lastRowLastColumn="0"/>
+          <w:trHeight w:val="290"/>
+        </w:trPr>
+        <w:tc>
+          <w:tcPr>
+            <w:cnfStyle w:val="001000000000" w:firstRow="0" w:lastRow="0" w:firstColumn="1" w:lastColumn="0" w:oddVBand="0" w:evenVBand="0" w:oddHBand="0" w:evenHBand="0" w:firstRowFirstColumn="0" w:firstRowLastColumn="0" w:lastRowFirstColumn="0" w:lastRowLastColumn="0"/>
+            <w:tcW w:w="709" w:type="dxa"/>
+            <w:noWrap/>
+            <w:hideMark/>
+          </w:tcPr>
+          <w:p>
+            <w:pPr>
+              <w:jc w:val="right"/>
+              <w:rPr>
+                <w:rFonts w:ascii="Calibri" w:eastAsia="Times New Roman" w:hAnsi="Calibri" w:cs="Calibri"/>
+                <w:color w:val="000000"/>
+                <w:kern w:val="0"/>
+                <w:sz w:val="22"/>
+                <w:szCs w:val="22"/>
+                <w:lang w:eastAsia="en-GB"/>
+                <w14:ligatures w14:val="none"/>
+              </w:rPr>
+            </w:pPr>
+            <w:r>
+              <w:rPr>
+                <w:rFonts w:ascii="Calibri" w:eastAsia="Times New Roman" w:hAnsi="Calibri" w:cs="Calibri"/>
+                <w:color w:val="000000"/>
+                <w:kern w:val="0"/>
+                <w:sz w:val="22"/>
+                <w:szCs w:val="22"/>
+                <w:lang w:eastAsia="en-GB"/>
+                <w14:ligatures w14:val="none"/>
+              </w:rPr>
+              <w:t>15</w:t>
+            </w:r>
+          </w:p>
+        </w:tc>
+        <w:tc>
+          <w:tcPr>
+            <w:tcW w:w="1659" w:type="dxa"/>
+            <w:noWrap/>
+            <w:hideMark/>
+          </w:tcPr>
+          <w:p>
+            <w:pPr>
+              <w:cnfStyle w:val="000000100000" w:firstRow="0" w:lastRow="0" w:firstColumn="0" w:lastColumn="0" w:oddVBand="0" w:evenVBand="0" w:oddHBand="1" w:evenHBand="0" w:firstRowFirstColumn="0" w:firstRowLastColumn="0" w:lastRowFirstColumn="0" w:lastRowLastColumn="0"/>
+              <w:rPr>
+                <w:rFonts w:ascii="Calibri" w:eastAsia="Times New Roman" w:hAnsi="Calibri" w:cs="Calibri"/>
+                <w:color w:val="000000"/>
+                <w:kern w:val="0"/>
+                <w:sz w:val="22"/>
+                <w:szCs w:val="22"/>
+                <w:lang w:eastAsia="en-GB"/>
+                <w14:ligatures w14:val="none"/>
+              </w:rPr>
+            </w:pPr>
+            <w:r>
+              <w:rPr>
+                <w:rFonts w:ascii="Calibri" w:eastAsia="Times New Roman" w:hAnsi="Calibri" w:cs="Calibri"/>
+                <w:color w:val="000000"/>
+                <w:kern w:val="0"/>
+                <w:sz w:val="22"/>
+                <w:szCs w:val="22"/>
+                <w:lang w:eastAsia="en-GB"/>
+                <w14:ligatures w14:val="none"/>
+              </w:rPr>
+              <w:t>Implementation Submission</w:t>
+            </w:r>
+          </w:p>
+        </w:tc>
+        <w:tc>
+          <w:tcPr>
+            <w:tcW w:w="1659" w:type="dxa"/>
+            <w:noWrap/>
+            <w:hideMark/>
+          </w:tcPr>
+          <w:p>
+            <w:pPr>
+              <w:cnfStyle w:val="000000100000" w:firstRow="0" w:lastRow="0" w:firstColumn="0" w:lastColumn="0" w:oddVBand="0" w:evenVBand="0" w:oddHBand="1" w:evenHBand="0" w:firstRowFirstColumn="0" w:firstRowLastColumn="0" w:lastRowFirstColumn="0" w:lastRowLastColumn="0"/>
+              <w:rPr>
+                <w:rFonts w:ascii="Calibri" w:eastAsia="Times New Roman" w:hAnsi="Calibri" w:cs="Calibri"/>
+                <w:color w:val="000000"/>
+                <w:kern w:val="0"/>
+                <w:sz w:val="22"/>
+                <w:szCs w:val="22"/>
+                <w:lang w:eastAsia="en-GB"/>
+                <w14:ligatures w14:val="none"/>
+              </w:rPr>
+            </w:pPr>
+            <w:r>
+              <w:rPr>
+                <w:rFonts w:ascii="Calibri" w:eastAsia="Times New Roman" w:hAnsi="Calibri" w:cs="Calibri"/>
+                <w:color w:val="000000"/>
+                <w:kern w:val="0"/>
+                <w:sz w:val="22"/>
+                <w:szCs w:val="22"/>
+                <w:lang w:eastAsia="en-GB"/>
+                <w14:ligatures w14:val="none"/>
+              </w:rPr>
+              <w:t>Implementation</w:t>
+            </w:r>
+          </w:p>
+        </w:tc>
+        <w:tc>
+          <w:tcPr>
+            <w:tcW w:w="2352" w:type="dxa"/>
+            <w:noWrap/>
+            <w:hideMark/>
+          </w:tcPr>
+          <w:p>
+            <w:pPr>
+              <w:cnfStyle w:val="000000100000" w:firstRow="0" w:lastRow="0" w:firstColumn="0" w:lastColumn="0" w:oddVBand="0" w:evenVBand="0" w:oddHBand="1" w:evenHBand="0" w:firstRowFirstColumn="0" w:firstRowLastColumn="0" w:lastRowFirstColumn="0" w:lastRowLastColumn="0"/>
+              <w:rPr>
+                <w:rFonts w:ascii="Calibri" w:eastAsia="Times New Roman" w:hAnsi="Calibri" w:cs="Calibri"/>
+                <w:color w:val="000000"/>
+                <w:kern w:val="0"/>
+                <w:sz w:val="22"/>
+                <w:szCs w:val="22"/>
+                <w:lang w:eastAsia="en-GB"/>
+                <w14:ligatures w14:val="none"/>
+              </w:rPr>
+            </w:pPr>
+            <w:r>
+              <w:rPr>
+                <w:rFonts w:ascii="Calibri" w:eastAsia="Times New Roman" w:hAnsi="Calibri" w:cs="Calibri"/>
+                <w:color w:val="000000"/>
+                <w:kern w:val="0"/>
+                <w:sz w:val="22"/>
+                <w:szCs w:val="22"/>
+                <w:lang w:eastAsia="en-GB"/>
+                <w14:ligatures w14:val="none"/>
+              </w:rPr>
+              <w:t>Final submission</w:t>
+            </w:r>
+          </w:p>
+        </w:tc>
+        <w:tc>
+          <w:tcPr>
+            <w:tcW w:w="851" w:type="dxa"/>
+            <w:noWrap/>
+            <w:hideMark/>
+          </w:tcPr>
+          <w:p>
+            <w:pPr>
+              <w:cnfStyle w:val="000000100000" w:firstRow="0" w:lastRow="0" w:firstColumn="0" w:lastColumn="0" w:oddVBand="0" w:evenVBand="0" w:oddHBand="1" w:evenHBand="0" w:firstRowFirstColumn="0" w:firstRowLastColumn="0" w:lastRowFirstColumn="0" w:lastRowLastColumn="0"/>
+              <w:rPr>
+                <w:rFonts w:ascii="Calibri" w:eastAsia="Times New Roman" w:hAnsi="Calibri" w:cs="Calibri"/>
+                <w:color w:val="000000"/>
+                <w:kern w:val="0"/>
+                <w:sz w:val="22"/>
+                <w:szCs w:val="22"/>
+                <w:lang w:eastAsia="en-GB"/>
+                <w14:ligatures w14:val="none"/>
+              </w:rPr>
+            </w:pPr>
+            <w:r>
+              <w:rPr>
+                <w:rFonts w:ascii="Calibri" w:eastAsia="Times New Roman" w:hAnsi="Calibri" w:cs="Calibri"/>
+                <w:color w:val="000000"/>
+                <w:kern w:val="0"/>
+                <w:sz w:val="22"/>
+                <w:szCs w:val="22"/>
+                <w:lang w:eastAsia="en-GB"/>
+                <w14:ligatures w14:val="none"/>
+              </w:rPr>
+              <w:t>24-Feb-2026</w:t>
+            </w:r>
+          </w:p>
+        </w:tc>
+        <w:tc>
+          <w:tcPr>
+            <w:tcW w:w="992" w:type="dxa"/>
+            <w:noWrap/>
+            <w:hideMark/>
+          </w:tcPr>
+          <w:p>
+            <w:pPr>
+              <w:cnfStyle w:val="000000100000" w:firstRow="0" w:lastRow="0" w:firstColumn="0" w:lastColumn="0" w:oddVBand="0" w:evenVBand="0" w:oddHBand="1" w:evenHBand="0" w:firstRowFirstColumn="0" w:firstRowLastColumn="0" w:lastRowFirstColumn="0" w:lastRowLastColumn="0"/>
+              <w:rPr>
+                <w:rFonts w:ascii="Calibri" w:eastAsia="Times New Roman" w:hAnsi="Calibri" w:cs="Calibri"/>
+                <w:color w:val="000000"/>
+                <w:kern w:val="0"/>
+                <w:sz w:val="22"/>
+                <w:szCs w:val="22"/>
+                <w:lang w:eastAsia="en-GB"/>
+                <w14:ligatures w14:val="none"/>
+              </w:rPr>
+            </w:pPr>
+            <w:r>
+              <w:rPr>
+                <w:rFonts w:ascii="Calibri" w:eastAsia="Times New Roman" w:hAnsi="Calibri" w:cs="Calibri"/>
+                <w:color w:val="000000"/>
+                <w:kern w:val="0"/>
+                <w:sz w:val="22"/>
+                <w:szCs w:val="22"/>
+                <w:lang w:eastAsia="en-GB"/>
+                <w14:ligatures w14:val="none"/>
+              </w:rPr>
+              <w:t>24-Feb-2026</w:t>
+            </w:r>
+          </w:p>
+        </w:tc>
+        <w:tc>
+          <w:tcPr>
+            <w:tcW w:w="1134" w:type="dxa"/>
+            <w:noWrap/>
+            <w:hideMark/>
+          </w:tcPr>
+          <w:p>
+            <w:pPr>
+              <w:cnfStyle w:val="000000100000" w:firstRow="0" w:lastRow="0" w:firstColumn="0" w:lastColumn="0" w:oddVBand="0" w:evenVBand="0" w:oddHBand="1" w:evenHBand="0" w:firstRowFirstColumn="0" w:firstRowLastColumn="0" w:lastRowFirstColumn="0" w:lastRowLastColumn="0"/>
+              <w:rPr>
+                <w:rFonts w:ascii="Calibri" w:eastAsia="Times New Roman" w:hAnsi="Calibri" w:cs="Calibri"/>
+                <w:color w:val="000000"/>
+                <w:kern w:val="0"/>
+                <w:sz w:val="22"/>
+                <w:szCs w:val="22"/>
+                <w:lang w:eastAsia="en-GB"/>
+                <w14:ligatures w14:val="none"/>
+              </w:rPr>
+            </w:pPr>
+            <w:r>
+              <w:rPr>
+                <w:rFonts w:ascii="Calibri" w:eastAsia="Times New Roman" w:hAnsi="Calibri" w:cs="Calibri"/>
+                <w:color w:val="000000"/>
+                <w:kern w:val="0"/>
+                <w:sz w:val="22"/>
+                <w:szCs w:val="22"/>
+                <w:lang w:eastAsia="en-GB"/>
+                <w14:ligatures w14:val="none"/>
+              </w:rPr>
+              <w:t>—</w:t>
+            </w:r>
+          </w:p>
+        </w:tc>
+        <w:tc>
+          <w:tcPr>
+            <w:tcW w:w="3261" w:type="dxa"/>
+            <w:noWrap/>
+            <w:hideMark/>
+          </w:tcPr>
+          <w:p>
+            <w:pPr>
+              <w:cnfStyle w:val="000000100000" w:firstRow="0" w:lastRow="0" w:firstColumn="0" w:lastColumn="0" w:oddVBand="0" w:evenVBand="0" w:oddHBand="1" w:evenHBand="0" w:firstRowFirstColumn="0" w:firstRowLastColumn="0" w:lastRowFirstColumn="0" w:lastRowLastColumn="0"/>
+              <w:rPr>
+                <w:rFonts w:ascii="Calibri" w:eastAsia="Times New Roman" w:hAnsi="Calibri" w:cs="Calibri"/>
+                <w:color w:val="000000"/>
+                <w:kern w:val="0"/>
+                <w:sz w:val="22"/>
+                <w:szCs w:val="22"/>
+                <w:lang w:eastAsia="en-GB"/>
+                <w14:ligatures w14:val="none"/>
+              </w:rPr>
+            </w:pPr>
+            <w:r>
+              <w:rPr>
+                <w:rFonts w:ascii="Calibri" w:eastAsia="Times New Roman" w:hAnsi="Calibri" w:cs="Calibri"/>
+                <w:color w:val="000000"/>
+                <w:kern w:val="0"/>
+                <w:sz w:val="22"/>
+                <w:szCs w:val="22"/>
+                <w:lang w:eastAsia="en-GB"/>
+                <w14:ligatures w14:val="none"/>
+              </w:rPr>
+              <w:t xml:space="preserve">Not Yet </w:t>
+            </w:r>
+          </w:p>
+        </w:tc>
+      </w:tr>
+    </w:tbl>
+    <w:p>
+      <w:pPr>
+        <w:rPr>
+          <w:b/>
+          <w:bCs/>
+          <w:u w:val="single"/>
+        </w:rPr>
+      </w:pPr>
+      <w:r>
+        <w:t xml:space="preserve">                                                                </w:t>
+      </w:r>
+      <w:r>
+        <w:rPr>
+          <w:b/>
+          <w:bCs/>
+          <w:u w:val="single"/>
+        </w:rPr>
+        <w:t xml:space="preserve">GANTT CHART </w:t>
+      </w:r>
+    </w:p>
     <w:p/>
     <w:p/>
     <w:p/>
@@ -10297,6 +14683,69 @@
       </w:tblCellMar>
     </w:tblPr>
   </w:style>
+  <w:style w:type="table" w:styleId="PlainTable1">
+    <w:name w:val="Plain Table 1"/>
+    <w:basedOn w:val="TableNormal"/>
+    <w:uiPriority w:val="41"/>
+    <w:rsid w:val="00791197"/>
+    <w:pPr>
+      <w:spacing w:after="0" w:line="240" w:lineRule="auto"/>
+    </w:pPr>
+    <w:tblPr>
+      <w:tblStyleRowBandSize w:val="1"/>
+      <w:tblStyleColBandSize w:val="1"/>
+      <w:tblBorders>
+        <w:top w:val="single" w:sz="4" w:space="0" w:color="BFBFBF" w:themeColor="background1" w:themeShade="BF"/>
+        <w:left w:val="single" w:sz="4" w:space="0" w:color="BFBFBF" w:themeColor="background1" w:themeShade="BF"/>
+        <w:bottom w:val="single" w:sz="4" w:space="0" w:color="BFBFBF" w:themeColor="background1" w:themeShade="BF"/>
+        <w:right w:val="single" w:sz="4" w:space="0" w:color="BFBFBF" w:themeColor="background1" w:themeShade="BF"/>
+        <w:insideH w:val="single" w:sz="4" w:space="0" w:color="BFBFBF" w:themeColor="background1" w:themeShade="BF"/>
+        <w:insideV w:val="single" w:sz="4" w:space="0" w:color="BFBFBF" w:themeColor="background1" w:themeShade="BF"/>
+      </w:tblBorders>
+    </w:tblPr>
+    <w:tblStylePr w:type="firstRow">
+      <w:rPr>
+        <w:b/>
+        <w:bCs/>
+      </w:rPr>
+    </w:tblStylePr>
+    <w:tblStylePr w:type="lastRow">
+      <w:rPr>
+        <w:b/>
+        <w:bCs/>
+      </w:rPr>
+      <w:tblPr/>
+      <w:tcPr>
+        <w:tcBorders>
+          <w:top w:val="double" w:sz="4" w:space="0" w:color="BFBFBF" w:themeColor="background1" w:themeShade="BF"/>
+        </w:tcBorders>
+      </w:tcPr>
+    </w:tblStylePr>
+    <w:tblStylePr w:type="firstCol">
+      <w:rPr>
+        <w:b/>
+        <w:bCs/>
+      </w:rPr>
+    </w:tblStylePr>
+    <w:tblStylePr w:type="lastCol">
+      <w:rPr>
+        <w:b/>
+        <w:bCs/>
+      </w:rPr>
+    </w:tblStylePr>
+    <w:tblStylePr w:type="band1Vert">
+      <w:tblPr/>
+      <w:tcPr>
+        <w:shd w:val="clear" w:color="auto" w:fill="F2F2F2" w:themeFill="background1" w:themeFillShade="F2"/>
+      </w:tcPr>
+    </w:tblStylePr>
+    <w:tblStylePr w:type="band1Horz">
+      <w:tblPr/>
+      <w:tcPr>
+        <w:shd w:val="clear" w:color="auto" w:fill="F2F2F2" w:themeFill="background1" w:themeFillShade="F2"/>
+      </w:tcPr>
+    </w:tblStylePr>
+  </w:style>
 </w:styles>
 </file>
 

</xml_diff>

<commit_message>
References to Completed  CS1813 Software Design
</commit_message>
<xml_diff>
--- a/Documents/SwiftBot Task10 - Requirements (1).docx
+++ b/Documents/SwiftBot Task10 - Requirements (1).docx
@@ -1588,7 +1588,7 @@
                 </mc:Choice>
                 <mc:Fallback>
                   <w:pict>
-                    <v:shapetype w14:anchorId="318685EB" id="_x0000_t32" coordsize="21600,21600" o:spt="32" o:oned="t" path="m,l21600,21600e" filled="f">
+                    <v:shapetype w14:anchorId="47664208" id="_x0000_t32" coordsize="21600,21600" o:spt="32" o:oned="t" path="m,l21600,21600e" filled="f">
                       <v:path arrowok="t" fillok="f" o:connecttype="none"/>
                       <o:lock v:ext="edit" shapetype="t"/>
                     </v:shapetype>
@@ -1670,7 +1670,7 @@
                 </mc:Choice>
                 <mc:Fallback>
                   <w:pict>
-                    <v:shape w14:anchorId="2593CC73" id="Straight Arrow Connector 2" o:spid="_x0000_s1026" type="#_x0000_t32" style="position:absolute;margin-left:36.85pt;margin-top:8.25pt;width:29.5pt;height:0;z-index:251650560;visibility:visible;mso-wrap-style:square;mso-wrap-distance-left:9pt;mso-wrap-distance-top:0;mso-wrap-distance-right:9pt;mso-wrap-distance-bottom:0;mso-position-horizontal:absolute;mso-position-horizontal-relative:text;mso-position-vertical:absolute;mso-position-vertical-relative:text" o:gfxdata="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" strokecolor="#156082 [3204]" strokeweight="1.5pt">
+                    <v:shape w14:anchorId="3D0166A7" id="Straight Arrow Connector 2" o:spid="_x0000_s1026" type="#_x0000_t32" style="position:absolute;margin-left:36.85pt;margin-top:8.25pt;width:29.5pt;height:0;z-index:251650560;visibility:visible;mso-wrap-style:square;mso-wrap-distance-left:9pt;mso-wrap-distance-top:0;mso-wrap-distance-right:9pt;mso-wrap-distance-bottom:0;mso-position-horizontal:absolute;mso-position-horizontal-relative:text;mso-position-vertical:absolute;mso-position-vertical-relative:text" o:gfxdata="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" strokecolor="#156082 [3204]" strokeweight="1.5pt">
                       <v:stroke endarrow="block" joinstyle="miter"/>
                     </v:shape>
                   </w:pict>
@@ -1827,7 +1827,7 @@
                 </mc:Choice>
                 <mc:Fallback>
                   <w:pict>
-                    <v:shape w14:anchorId="3AAFBD9B" id="Straight Arrow Connector 3" o:spid="_x0000_s1026" type="#_x0000_t32" style="position:absolute;margin-left:46.35pt;margin-top:7.9pt;width:29pt;height:0;z-index:251651584;visibility:visible;mso-wrap-style:square;mso-wrap-distance-left:9pt;mso-wrap-distance-top:0;mso-wrap-distance-right:9pt;mso-wrap-distance-bottom:0;mso-position-horizontal:absolute;mso-position-horizontal-relative:text;mso-position-vertical:absolute;mso-position-vertical-relative:text" o:gfxdata="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" strokecolor="#156082 [3204]" strokeweight="1.5pt">
+                    <v:shape w14:anchorId="1C213C27" id="Straight Arrow Connector 3" o:spid="_x0000_s1026" type="#_x0000_t32" style="position:absolute;margin-left:46.35pt;margin-top:7.9pt;width:29pt;height:0;z-index:251651584;visibility:visible;mso-wrap-style:square;mso-wrap-distance-left:9pt;mso-wrap-distance-top:0;mso-wrap-distance-right:9pt;mso-wrap-distance-bottom:0;mso-position-horizontal:absolute;mso-position-horizontal-relative:text;mso-position-vertical:absolute;mso-position-vertical-relative:text" o:gfxdata="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" strokecolor="#156082 [3204]" strokeweight="1.5pt">
                       <v:stroke endarrow="block" joinstyle="miter"/>
                     </v:shape>
                   </w:pict>
@@ -1914,7 +1914,7 @@
                 </mc:Choice>
                 <mc:Fallback>
                   <w:pict>
-                    <v:shape w14:anchorId="0796226B" id="Straight Arrow Connector 4" o:spid="_x0000_s1026" type="#_x0000_t32" style="position:absolute;margin-left:46.85pt;margin-top:5.75pt;width:30.5pt;height:.5pt;z-index:251653632;visibility:visible;mso-wrap-style:square;mso-wrap-distance-left:9pt;mso-wrap-distance-top:0;mso-wrap-distance-right:9pt;mso-wrap-distance-bottom:0;mso-position-horizontal:absolute;mso-position-horizontal-relative:text;mso-position-vertical:absolute;mso-position-vertical-relative:text" o:gfxdata="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" strokecolor="#156082 [3204]" strokeweight="1.5pt">
+                    <v:shape w14:anchorId="09D8E5A2" id="Straight Arrow Connector 4" o:spid="_x0000_s1026" type="#_x0000_t32" style="position:absolute;margin-left:46.85pt;margin-top:5.75pt;width:30.5pt;height:.5pt;z-index:251653632;visibility:visible;mso-wrap-style:square;mso-wrap-distance-left:9pt;mso-wrap-distance-top:0;mso-wrap-distance-right:9pt;mso-wrap-distance-bottom:0;mso-position-horizontal:absolute;mso-position-horizontal-relative:text;mso-position-vertical:absolute;mso-position-vertical-relative:text" o:gfxdata="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" strokecolor="#156082 [3204]" strokeweight="1.5pt">
                       <v:stroke endarrow="block" joinstyle="miter"/>
                     </v:shape>
                   </w:pict>
@@ -3811,7 +3811,7 @@
           </mc:Choice>
           <mc:Fallback>
             <w:pict>
-              <v:oval w14:anchorId="56508ABF" id="Oval 1" o:spid="_x0000_s1026" style="position:absolute;margin-left:158.95pt;margin-top:2.1pt;width:138.55pt;height:52.95pt;z-index:251655680;visibility:visible;mso-wrap-style:square;mso-width-percent:0;mso-wrap-distance-left:9pt;mso-wrap-distance-top:0;mso-wrap-distance-right:9pt;mso-wrap-distance-bottom:0;mso-position-horizontal:absolute;mso-position-horizontal-relative:text;mso-position-vertical:absolute;mso-position-vertical-relative:text;mso-width-percent:0;mso-width-relative:margin;v-text-anchor:middle" o:gfxdata="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" fillcolor="#156082 [3204]" strokecolor="#030e13 [484]" strokeweight="1.5pt">
+              <v:oval w14:anchorId="67130828" id="Oval 1" o:spid="_x0000_s1026" style="position:absolute;margin-left:158.95pt;margin-top:2.1pt;width:138.55pt;height:52.95pt;z-index:251655680;visibility:visible;mso-wrap-style:square;mso-width-percent:0;mso-wrap-distance-left:9pt;mso-wrap-distance-top:0;mso-wrap-distance-right:9pt;mso-wrap-distance-bottom:0;mso-position-horizontal:absolute;mso-position-horizontal-relative:text;mso-position-vertical:absolute;mso-position-vertical-relative:text;mso-width-percent:0;mso-width-relative:margin;v-text-anchor:middle" o:gfxdata="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" fillcolor="#156082 [3204]" strokecolor="#030e13 [484]" strokeweight="1.5pt">
                 <v:stroke joinstyle="miter"/>
               </v:oval>
             </w:pict>
@@ -3992,7 +3992,7 @@
           </mc:Choice>
           <mc:Fallback>
             <w:pict>
-              <v:line w14:anchorId="61ABBF60" id="Straight Connector 3" o:spid="_x0000_s1026" style="position:absolute;z-index:251658752;visibility:visible;mso-wrap-style:square;mso-wrap-distance-left:9pt;mso-wrap-distance-top:0;mso-wrap-distance-right:9pt;mso-wrap-distance-bottom:0;mso-position-horizontal:absolute;mso-position-horizontal-relative:text;mso-position-vertical:absolute;mso-position-vertical-relative:text" from="227.55pt,9.7pt" to="227.55pt,51.8pt" o:gfxdata="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" strokecolor="#156082 [3204]" strokeweight="1.5pt">
+              <v:line w14:anchorId="77BF415C" id="Straight Connector 3" o:spid="_x0000_s1026" style="position:absolute;z-index:251658752;visibility:visible;mso-wrap-style:square;mso-wrap-distance-left:9pt;mso-wrap-distance-top:0;mso-wrap-distance-right:9pt;mso-wrap-distance-bottom:0;mso-position-horizontal:absolute;mso-position-horizontal-relative:text;mso-position-vertical:absolute;mso-position-vertical-relative:text" from="227.55pt,9.7pt" to="227.55pt,51.8pt" o:gfxdata="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" strokecolor="#156082 [3204]" strokeweight="1.5pt">
                 <v:stroke joinstyle="miter"/>
               </v:line>
             </w:pict>
@@ -4078,7 +4078,7 @@
           </mc:Choice>
           <mc:Fallback>
             <w:pict>
-              <v:rect w14:anchorId="2800836D" id="Rectangle 8" o:spid="_x0000_s1026" style="position:absolute;margin-left:118.5pt;margin-top:5.1pt;width:221pt;height:35.5pt;z-index:251649024;visibility:visible;mso-wrap-style:square;mso-width-percent:0;mso-height-percent:0;mso-wrap-distance-left:9pt;mso-wrap-distance-top:0;mso-wrap-distance-right:9pt;mso-wrap-distance-bottom:0;mso-position-horizontal:absolute;mso-position-horizontal-relative:text;mso-position-vertical:absolute;mso-position-vertical-relative:text;mso-width-percent:0;mso-height-percent:0;mso-width-relative:margin;mso-height-relative:margin;v-text-anchor:middle" o:gfxdata="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" fillcolor="#156082 [3204]" strokecolor="#030e13 [484]" strokeweight="1.5pt"/>
+              <v:rect w14:anchorId="65C96162" id="Rectangle 8" o:spid="_x0000_s1026" style="position:absolute;margin-left:118.5pt;margin-top:5.1pt;width:221pt;height:35.5pt;z-index:251649024;visibility:visible;mso-wrap-style:square;mso-width-percent:0;mso-height-percent:0;mso-wrap-distance-left:9pt;mso-wrap-distance-top:0;mso-wrap-distance-right:9pt;mso-wrap-distance-bottom:0;mso-position-horizontal:absolute;mso-position-horizontal-relative:text;mso-position-vertical:absolute;mso-position-vertical-relative:text;mso-width-percent:0;mso-height-percent:0;mso-width-relative:margin;mso-height-relative:margin;v-text-anchor:middle" o:gfxdata="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" fillcolor="#156082 [3204]" strokecolor="#030e13 [484]" strokeweight="1.5pt"/>
             </w:pict>
           </mc:Fallback>
         </mc:AlternateContent>
@@ -4232,7 +4232,7 @@
           </mc:Choice>
           <mc:Fallback>
             <w:pict>
-              <v:line w14:anchorId="496B9AF4" id="Straight Connector 10" o:spid="_x0000_s1026" style="position:absolute;z-index:251659776;visibility:visible;mso-wrap-style:square;mso-width-percent:0;mso-height-percent:0;mso-wrap-distance-left:9pt;mso-wrap-distance-top:0;mso-wrap-distance-right:9pt;mso-wrap-distance-bottom:0;mso-position-horizontal:absolute;mso-position-horizontal-relative:text;mso-position-vertical:absolute;mso-position-vertical-relative:text;mso-width-percent:0;mso-height-percent:0;mso-width-relative:margin;mso-height-relative:margin" from="226pt,16.95pt" to="227pt,53.95pt" o:gfxdata="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" strokecolor="#156082 [3204]" strokeweight="1.5pt">
+              <v:line w14:anchorId="4C2A8A49" id="Straight Connector 10" o:spid="_x0000_s1026" style="position:absolute;z-index:251659776;visibility:visible;mso-wrap-style:square;mso-width-percent:0;mso-height-percent:0;mso-wrap-distance-left:9pt;mso-wrap-distance-top:0;mso-wrap-distance-right:9pt;mso-wrap-distance-bottom:0;mso-position-horizontal:absolute;mso-position-horizontal-relative:text;mso-position-vertical:absolute;mso-position-vertical-relative:text;mso-width-percent:0;mso-height-percent:0;mso-width-relative:margin;mso-height-relative:margin" from="226pt,16.95pt" to="227pt,53.95pt" o:gfxdata="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" strokecolor="#156082 [3204]" strokeweight="1.5pt">
                 <v:stroke joinstyle="miter"/>
               </v:line>
             </w:pict>
@@ -4318,7 +4318,7 @@
           </mc:Choice>
           <mc:Fallback>
             <w:pict>
-              <v:rect w14:anchorId="3A25556D" id="Rectangle 11" o:spid="_x0000_s1026" style="position:absolute;margin-left:118pt;margin-top:9.65pt;width:224pt;height:37.5pt;z-index:251653120;visibility:visible;mso-wrap-style:square;mso-width-percent:0;mso-height-percent:0;mso-wrap-distance-left:9pt;mso-wrap-distance-top:0;mso-wrap-distance-right:9pt;mso-wrap-distance-bottom:0;mso-position-horizontal:absolute;mso-position-horizontal-relative:text;mso-position-vertical:absolute;mso-position-vertical-relative:text;mso-width-percent:0;mso-height-percent:0;mso-width-relative:margin;mso-height-relative:margin;v-text-anchor:middle" o:gfxdata="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" fillcolor="#156082 [3204]" strokecolor="#030e13 [484]" strokeweight="1.5pt"/>
+              <v:rect w14:anchorId="4836D1C4" id="Rectangle 11" o:spid="_x0000_s1026" style="position:absolute;margin-left:118pt;margin-top:9.65pt;width:224pt;height:37.5pt;z-index:251653120;visibility:visible;mso-wrap-style:square;mso-width-percent:0;mso-height-percent:0;mso-wrap-distance-left:9pt;mso-wrap-distance-top:0;mso-wrap-distance-right:9pt;mso-wrap-distance-bottom:0;mso-position-horizontal:absolute;mso-position-horizontal-relative:text;mso-position-vertical:absolute;mso-position-vertical-relative:text;mso-width-percent:0;mso-height-percent:0;mso-width-relative:margin;mso-height-relative:margin;v-text-anchor:middle" o:gfxdata="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" fillcolor="#156082 [3204]" strokecolor="#030e13 [484]" strokeweight="1.5pt"/>
             </w:pict>
           </mc:Fallback>
         </mc:AlternateContent>
@@ -4489,7 +4489,7 @@
           </mc:Choice>
           <mc:Fallback>
             <w:pict>
-              <v:line w14:anchorId="4E464D3D" id="Straight Connector 13" o:spid="_x0000_s1026" style="position:absolute;z-index:251660800;visibility:visible;mso-wrap-style:square;mso-wrap-distance-left:9pt;mso-wrap-distance-top:0;mso-wrap-distance-right:9pt;mso-wrap-distance-bottom:0;mso-position-horizontal:absolute;mso-position-horizontal-relative:text;mso-position-vertical:absolute;mso-position-vertical-relative:text" from="226.5pt,.35pt" to="226.5pt,42.35pt" o:gfxdata="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" strokecolor="#156082 [3204]" strokeweight="1.5pt">
+              <v:line w14:anchorId="31DF6D87" id="Straight Connector 13" o:spid="_x0000_s1026" style="position:absolute;z-index:251660800;visibility:visible;mso-wrap-style:square;mso-wrap-distance-left:9pt;mso-wrap-distance-top:0;mso-wrap-distance-right:9pt;mso-wrap-distance-bottom:0;mso-position-horizontal:absolute;mso-position-horizontal-relative:text;mso-position-vertical:absolute;mso-position-vertical-relative:text" from="226.5pt,.35pt" to="226.5pt,42.35pt" o:gfxdata="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" strokecolor="#156082 [3204]" strokeweight="1.5pt">
                 <v:stroke joinstyle="miter"/>
               </v:line>
             </w:pict>
@@ -4570,7 +4570,7 @@
           </mc:Choice>
           <mc:Fallback>
             <w:pict>
-              <v:shapetype w14:anchorId="2F773FB0" id="_x0000_t4" coordsize="21600,21600" o:spt="4" path="m10800,l,10800,10800,21600,21600,10800xe">
+              <v:shapetype w14:anchorId="4F9F8679" id="_x0000_t4" coordsize="21600,21600" o:spt="4" path="m10800,l,10800,10800,21600,21600,10800xe">
                 <v:stroke joinstyle="miter"/>
                 <v:path gradientshapeok="t" o:connecttype="rect" textboxrect="5400,5400,16200,16200"/>
               </v:shapetype>
@@ -4747,7 +4747,7 @@
           </mc:Choice>
           <mc:Fallback>
             <w:pict>
-              <v:line w14:anchorId="3FEEC640" id="Straight Connector 16" o:spid="_x0000_s1026" style="position:absolute;z-index:251663872;visibility:visible;mso-wrap-style:square;mso-wrap-distance-left:9pt;mso-wrap-distance-top:0;mso-wrap-distance-right:9pt;mso-wrap-distance-bottom:0;mso-position-horizontal:absolute;mso-position-horizontal-relative:text;mso-position-vertical:absolute;mso-position-vertical-relative:text" from="228.5pt,9.75pt" to="228.5pt,39.25pt" o:gfxdata="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" strokecolor="#156082 [3204]" strokeweight="1.5pt">
+              <v:line w14:anchorId="292D3D9B" id="Straight Connector 16" o:spid="_x0000_s1026" style="position:absolute;z-index:251663872;visibility:visible;mso-wrap-style:square;mso-wrap-distance-left:9pt;mso-wrap-distance-top:0;mso-wrap-distance-right:9pt;mso-wrap-distance-bottom:0;mso-position-horizontal:absolute;mso-position-horizontal-relative:text;mso-position-vertical:absolute;mso-position-vertical-relative:text" from="228.5pt,9.75pt" to="228.5pt,39.25pt" o:gfxdata="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" strokecolor="#156082 [3204]" strokeweight="1.5pt">
                 <v:stroke joinstyle="miter"/>
               </v:line>
             </w:pict>
@@ -4907,7 +4907,7 @@
           </mc:Choice>
           <mc:Fallback>
             <w:pict>
-              <v:rect w14:anchorId="6E4622A6" id="Rectangle 17" o:spid="_x0000_s1026" style="position:absolute;margin-left:114.5pt;margin-top:16.1pt;width:230pt;height:38.5pt;z-index:251664896;visibility:visible;mso-wrap-style:square;mso-width-percent:0;mso-wrap-distance-left:9pt;mso-wrap-distance-top:0;mso-wrap-distance-right:9pt;mso-wrap-distance-bottom:0;mso-position-horizontal:absolute;mso-position-horizontal-relative:text;mso-position-vertical:absolute;mso-position-vertical-relative:text;mso-width-percent:0;mso-width-relative:margin;v-text-anchor:middle" o:gfxdata="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" fillcolor="#156082 [3204]" strokecolor="#030e13 [484]" strokeweight="1.5pt"/>
+              <v:rect w14:anchorId="0E5A7427" id="Rectangle 17" o:spid="_x0000_s1026" style="position:absolute;margin-left:114.5pt;margin-top:16.1pt;width:230pt;height:38.5pt;z-index:251664896;visibility:visible;mso-wrap-style:square;mso-width-percent:0;mso-wrap-distance-left:9pt;mso-wrap-distance-top:0;mso-wrap-distance-right:9pt;mso-wrap-distance-bottom:0;mso-position-horizontal:absolute;mso-position-horizontal-relative:text;mso-position-vertical:absolute;mso-position-vertical-relative:text;mso-width-percent:0;mso-width-relative:margin;v-text-anchor:middle" o:gfxdata="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" fillcolor="#156082 [3204]" strokecolor="#030e13 [484]" strokeweight="1.5pt"/>
             </w:pict>
           </mc:Fallback>
         </mc:AlternateContent>
@@ -4978,7 +4978,7 @@
           </mc:Choice>
           <mc:Fallback>
             <w:pict>
-              <v:line w14:anchorId="0E750A2B" id="Straight Connector 19" o:spid="_x0000_s1026" style="position:absolute;z-index:251666944;visibility:visible;mso-wrap-style:square;mso-wrap-distance-left:9pt;mso-wrap-distance-top:0;mso-wrap-distance-right:9pt;mso-wrap-distance-bottom:0;mso-position-horizontal:absolute;mso-position-horizontal-relative:text;mso-position-vertical:absolute;mso-position-vertical-relative:text" from="228pt,9.3pt" to="228pt,39.3pt" o:gfxdata="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" strokecolor="#156082 [3204]" strokeweight="1.5pt">
+              <v:line w14:anchorId="2F26628F" id="Straight Connector 19" o:spid="_x0000_s1026" style="position:absolute;z-index:251666944;visibility:visible;mso-wrap-style:square;mso-wrap-distance-left:9pt;mso-wrap-distance-top:0;mso-wrap-distance-right:9pt;mso-wrap-distance-bottom:0;mso-position-horizontal:absolute;mso-position-horizontal-relative:text;mso-position-vertical:absolute;mso-position-vertical-relative:text" from="228pt,9.3pt" to="228pt,39.3pt" o:gfxdata="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" strokecolor="#156082 [3204]" strokeweight="1.5pt">
                 <v:stroke joinstyle="miter"/>
               </v:line>
             </w:pict>
@@ -5059,7 +5059,7 @@
           </mc:Choice>
           <mc:Fallback>
             <w:pict>
-              <v:shape w14:anchorId="10E801A2" id="Diamond 20" o:spid="_x0000_s1026" type="#_x0000_t4" style="position:absolute;margin-left:105.5pt;margin-top:15.15pt;width:247.5pt;height:55.5pt;z-index:251667968;visibility:visible;mso-wrap-style:square;mso-width-percent:0;mso-height-percent:0;mso-wrap-distance-left:9pt;mso-wrap-distance-top:0;mso-wrap-distance-right:9pt;mso-wrap-distance-bottom:0;mso-position-horizontal:absolute;mso-position-horizontal-relative:text;mso-position-vertical:absolute;mso-position-vertical-relative:text;mso-width-percent:0;mso-height-percent:0;mso-width-relative:margin;mso-height-relative:margin;v-text-anchor:middle" o:gfxdata="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" fillcolor="#156082 [3204]" strokecolor="#030e13 [484]" strokeweight="1.5pt"/>
+              <v:shape w14:anchorId="601EAF06" id="Diamond 20" o:spid="_x0000_s1026" type="#_x0000_t4" style="position:absolute;margin-left:105.5pt;margin-top:15.15pt;width:247.5pt;height:55.5pt;z-index:251667968;visibility:visible;mso-wrap-style:square;mso-width-percent:0;mso-height-percent:0;mso-wrap-distance-left:9pt;mso-wrap-distance-top:0;mso-wrap-distance-right:9pt;mso-wrap-distance-bottom:0;mso-position-horizontal:absolute;mso-position-horizontal-relative:text;mso-position-vertical:absolute;mso-position-vertical-relative:text;mso-width-percent:0;mso-height-percent:0;mso-width-relative:margin;mso-height-relative:margin;v-text-anchor:middle" o:gfxdata="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" fillcolor="#156082 [3204]" strokecolor="#030e13 [484]" strokeweight="1.5pt"/>
             </w:pict>
           </mc:Fallback>
         </mc:AlternateContent>
@@ -5217,7 +5217,7 @@
           </mc:Choice>
           <mc:Fallback>
             <w:pict>
-              <v:line w14:anchorId="474EAA48" id="Straight Connector 22" o:spid="_x0000_s1026" style="position:absolute;z-index:251670016;visibility:visible;mso-wrap-style:square;mso-wrap-distance-left:9pt;mso-wrap-distance-top:0;mso-wrap-distance-right:9pt;mso-wrap-distance-bottom:0;mso-position-horizontal:absolute;mso-position-horizontal-relative:text;mso-position-vertical:absolute;mso-position-vertical-relative:text" from="228.5pt,3.7pt" to="229pt,35.7pt" o:gfxdata="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" strokecolor="#156082 [3204]" strokeweight="1.5pt">
+              <v:line w14:anchorId="7A038FCC" id="Straight Connector 22" o:spid="_x0000_s1026" style="position:absolute;z-index:251670016;visibility:visible;mso-wrap-style:square;mso-wrap-distance-left:9pt;mso-wrap-distance-top:0;mso-wrap-distance-right:9pt;mso-wrap-distance-bottom:0;mso-position-horizontal:absolute;mso-position-horizontal-relative:text;mso-position-vertical:absolute;mso-position-vertical-relative:text" from="228.5pt,3.7pt" to="229pt,35.7pt" o:gfxdata="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" strokecolor="#156082 [3204]" strokeweight="1.5pt">
                 <v:stroke joinstyle="miter"/>
               </v:line>
             </w:pict>
@@ -5380,7 +5380,7 @@
           </mc:Choice>
           <mc:Fallback>
             <w:pict>
-              <v:rect w14:anchorId="1B99E319" id="Rectangle 23" o:spid="_x0000_s1026" style="position:absolute;margin-left:149.5pt;margin-top:12.55pt;width:164.5pt;height:36.5pt;z-index:251659264;visibility:visible;mso-wrap-style:square;mso-width-percent:0;mso-height-percent:0;mso-wrap-distance-left:9pt;mso-wrap-distance-top:0;mso-wrap-distance-right:9pt;mso-wrap-distance-bottom:0;mso-position-horizontal:absolute;mso-position-horizontal-relative:text;mso-position-vertical:absolute;mso-position-vertical-relative:text;mso-width-percent:0;mso-height-percent:0;mso-width-relative:margin;mso-height-relative:margin;v-text-anchor:middle" o:gfxdata="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" fillcolor="#156082 [3204]" strokecolor="#030e13 [484]" strokeweight="1.5pt"/>
+              <v:rect w14:anchorId="3F5A29C2" id="Rectangle 23" o:spid="_x0000_s1026" style="position:absolute;margin-left:149.5pt;margin-top:12.55pt;width:164.5pt;height:36.5pt;z-index:251659264;visibility:visible;mso-wrap-style:square;mso-width-percent:0;mso-height-percent:0;mso-wrap-distance-left:9pt;mso-wrap-distance-top:0;mso-wrap-distance-right:9pt;mso-wrap-distance-bottom:0;mso-position-horizontal:absolute;mso-position-horizontal-relative:text;mso-position-vertical:absolute;mso-position-vertical-relative:text;mso-width-percent:0;mso-height-percent:0;mso-width-relative:margin;mso-height-relative:margin;v-text-anchor:middle" o:gfxdata="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" fillcolor="#156082 [3204]" strokecolor="#030e13 [484]" strokeweight="1.5pt"/>
             </w:pict>
           </mc:Fallback>
         </mc:AlternateContent>
@@ -5457,7 +5457,7 @@
           </mc:Choice>
           <mc:Fallback>
             <w:pict>
-              <v:line w14:anchorId="6C2A105C" id="Straight Connector 25" o:spid="_x0000_s1026" style="position:absolute;z-index:251671040;visibility:visible;mso-wrap-style:square;mso-width-percent:0;mso-height-percent:0;mso-wrap-distance-left:9pt;mso-wrap-distance-top:0;mso-wrap-distance-right:9pt;mso-wrap-distance-bottom:0;mso-position-horizontal:absolute;mso-position-horizontal-relative:text;mso-position-vertical:absolute;mso-position-vertical-relative:text;mso-width-percent:0;mso-height-percent:0;mso-width-relative:margin;mso-height-relative:margin" from="229.5pt,4.25pt" to="230pt,35.25pt" o:gfxdata="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" strokecolor="#156082 [3204]" strokeweight="1.5pt">
+              <v:line w14:anchorId="517A0B7E" id="Straight Connector 25" o:spid="_x0000_s1026" style="position:absolute;z-index:251671040;visibility:visible;mso-wrap-style:square;mso-width-percent:0;mso-height-percent:0;mso-wrap-distance-left:9pt;mso-wrap-distance-top:0;mso-wrap-distance-right:9pt;mso-wrap-distance-bottom:0;mso-position-horizontal:absolute;mso-position-horizontal-relative:text;mso-position-vertical:absolute;mso-position-vertical-relative:text;mso-width-percent:0;mso-height-percent:0;mso-width-relative:margin;mso-height-relative:margin" from="229.5pt,4.25pt" to="230pt,35.25pt" o:gfxdata="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" strokecolor="#156082 [3204]" strokeweight="1.5pt">
                 <v:stroke joinstyle="miter"/>
               </v:line>
             </w:pict>
@@ -5535,7 +5535,7 @@
           </mc:Choice>
           <mc:Fallback>
             <w:pict>
-              <v:oval w14:anchorId="0F68E547" id="Oval 26" o:spid="_x0000_s1026" style="position:absolute;margin-left:176.5pt;margin-top:10.1pt;width:106.5pt;height:37.5pt;z-index:251665408;visibility:visible;mso-wrap-style:square;mso-width-percent:0;mso-wrap-distance-left:9pt;mso-wrap-distance-top:0;mso-wrap-distance-right:9pt;mso-wrap-distance-bottom:0;mso-position-horizontal:absolute;mso-position-horizontal-relative:text;mso-position-vertical:absolute;mso-position-vertical-relative:text;mso-width-percent:0;mso-width-relative:margin;v-text-anchor:middle" o:gfxdata="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" fillcolor="#156082 [3204]" strokecolor="#030e13 [484]" strokeweight="1.5pt">
+              <v:oval w14:anchorId="73342469" id="Oval 26" o:spid="_x0000_s1026" style="position:absolute;margin-left:176.5pt;margin-top:10.1pt;width:106.5pt;height:37.5pt;z-index:251665408;visibility:visible;mso-wrap-style:square;mso-width-percent:0;mso-wrap-distance-left:9pt;mso-wrap-distance-top:0;mso-wrap-distance-right:9pt;mso-wrap-distance-bottom:0;mso-position-horizontal:absolute;mso-position-horizontal-relative:text;mso-position-vertical:absolute;mso-position-vertical-relative:text;mso-width-percent:0;mso-width-relative:margin;v-text-anchor:middle" o:gfxdata="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" fillcolor="#156082 [3204]" strokecolor="#030e13 [484]" strokeweight="1.5pt">
                 <v:stroke joinstyle="miter"/>
               </v:oval>
             </w:pict>
@@ -5827,7 +5827,7 @@
           </mc:Choice>
           <mc:Fallback>
             <w:pict>
-              <v:oval w14:anchorId="24BA4CAF" id="Oval 28" o:spid="_x0000_s1026" style="position:absolute;margin-left:177.5pt;margin-top:4.85pt;width:103.5pt;height:37.5pt;z-index:251672064;visibility:visible;mso-wrap-style:square;mso-width-percent:0;mso-wrap-distance-left:9pt;mso-wrap-distance-top:0;mso-wrap-distance-right:9pt;mso-wrap-distance-bottom:0;mso-position-horizontal:absolute;mso-position-horizontal-relative:text;mso-position-vertical:absolute;mso-position-vertical-relative:text;mso-width-percent:0;mso-width-relative:margin;v-text-anchor:middle" o:gfxdata="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" fillcolor="#156082 [3204]" strokecolor="#030e13 [484]" strokeweight="1.5pt">
+              <v:oval w14:anchorId="370D2032" id="Oval 28" o:spid="_x0000_s1026" style="position:absolute;margin-left:177.5pt;margin-top:4.85pt;width:103.5pt;height:37.5pt;z-index:251672064;visibility:visible;mso-wrap-style:square;mso-width-percent:0;mso-wrap-distance-left:9pt;mso-wrap-distance-top:0;mso-wrap-distance-right:9pt;mso-wrap-distance-bottom:0;mso-position-horizontal:absolute;mso-position-horizontal-relative:text;mso-position-vertical:absolute;mso-position-vertical-relative:text;mso-width-percent:0;mso-width-relative:margin;v-text-anchor:middle" o:gfxdata="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" fillcolor="#156082 [3204]" strokecolor="#030e13 [484]" strokeweight="1.5pt">
                 <v:stroke joinstyle="miter"/>
               </v:oval>
             </w:pict>
@@ -5903,7 +5903,7 @@
           </mc:Choice>
           <mc:Fallback>
             <w:pict>
-              <v:line w14:anchorId="03264E1A" id="Straight Connector 30" o:spid="_x0000_s1026" style="position:absolute;z-index:251674112;visibility:visible;mso-wrap-style:square;mso-wrap-distance-left:9pt;mso-wrap-distance-top:0;mso-wrap-distance-right:9pt;mso-wrap-distance-bottom:0;mso-position-horizontal:absolute;mso-position-horizontal-relative:text;mso-position-vertical:absolute;mso-position-vertical-relative:text" from="228.5pt,19.2pt" to="229pt,41.7pt" o:gfxdata="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" strokecolor="#156082 [3204]" strokeweight="1.5pt">
+              <v:line w14:anchorId="41CF3162" id="Straight Connector 30" o:spid="_x0000_s1026" style="position:absolute;z-index:251674112;visibility:visible;mso-wrap-style:square;mso-wrap-distance-left:9pt;mso-wrap-distance-top:0;mso-wrap-distance-right:9pt;mso-wrap-distance-bottom:0;mso-position-horizontal:absolute;mso-position-horizontal-relative:text;mso-position-vertical:absolute;mso-position-vertical-relative:text" from="228.5pt,19.2pt" to="229pt,41.7pt" o:gfxdata="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" strokecolor="#156082 [3204]" strokeweight="1.5pt">
                 <v:stroke joinstyle="miter"/>
               </v:line>
             </w:pict>
@@ -5992,7 +5992,7 @@
           </mc:Choice>
           <mc:Fallback>
             <w:pict>
-              <v:rect w14:anchorId="5CACD7CF" id="Rectangle 31" o:spid="_x0000_s1026" style="position:absolute;margin-left:142.5pt;margin-top:18.55pt;width:173pt;height:32.5pt;z-index:251675136;visibility:visible;mso-wrap-style:square;mso-width-percent:0;mso-height-percent:0;mso-wrap-distance-left:9pt;mso-wrap-distance-top:0;mso-wrap-distance-right:9pt;mso-wrap-distance-bottom:0;mso-position-horizontal:absolute;mso-position-horizontal-relative:text;mso-position-vertical:absolute;mso-position-vertical-relative:text;mso-width-percent:0;mso-height-percent:0;mso-width-relative:margin;mso-height-relative:margin;v-text-anchor:middle" o:gfxdata="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" fillcolor="#156082 [3204]" strokecolor="#030e13 [484]" strokeweight="1.5pt"/>
+              <v:rect w14:anchorId="31A6E21E" id="Rectangle 31" o:spid="_x0000_s1026" style="position:absolute;margin-left:142.5pt;margin-top:18.55pt;width:173pt;height:32.5pt;z-index:251675136;visibility:visible;mso-wrap-style:square;mso-width-percent:0;mso-height-percent:0;mso-wrap-distance-left:9pt;mso-wrap-distance-top:0;mso-wrap-distance-right:9pt;mso-wrap-distance-bottom:0;mso-position-horizontal:absolute;mso-position-horizontal-relative:text;mso-position-vertical:absolute;mso-position-vertical-relative:text;mso-width-percent:0;mso-height-percent:0;mso-width-relative:margin;mso-height-relative:margin;v-text-anchor:middle" o:gfxdata="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" fillcolor="#156082 [3204]" strokecolor="#030e13 [484]" strokeweight="1.5pt"/>
             </w:pict>
           </mc:Fallback>
         </mc:AlternateContent>
@@ -6151,7 +6151,7 @@
           </mc:Choice>
           <mc:Fallback>
             <w:pict>
-              <v:line w14:anchorId="6E4AF248" id="Straight Connector 34" o:spid="_x0000_s1026" style="position:absolute;z-index:251677184;visibility:visible;mso-wrap-style:square;mso-width-percent:0;mso-height-percent:0;mso-wrap-distance-left:9pt;mso-wrap-distance-top:0;mso-wrap-distance-right:9pt;mso-wrap-distance-bottom:0;mso-position-horizontal:absolute;mso-position-horizontal-relative:text;mso-position-vertical:absolute;mso-position-vertical-relative:text;mso-width-percent:0;mso-height-percent:0;mso-width-relative:margin;mso-height-relative:margin" from="229pt,5.25pt" to="230pt,35.75pt" o:gfxdata="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" strokecolor="#156082 [3204]" strokeweight="1.5pt">
+              <v:line w14:anchorId="2F19AAF6" id="Straight Connector 34" o:spid="_x0000_s1026" style="position:absolute;z-index:251677184;visibility:visible;mso-wrap-style:square;mso-width-percent:0;mso-height-percent:0;mso-wrap-distance-left:9pt;mso-wrap-distance-top:0;mso-wrap-distance-right:9pt;mso-wrap-distance-bottom:0;mso-position-horizontal:absolute;mso-position-horizontal-relative:text;mso-position-vertical:absolute;mso-position-vertical-relative:text;mso-width-percent:0;mso-height-percent:0;mso-width-relative:margin;mso-height-relative:margin" from="229pt,5.25pt" to="230pt,35.75pt" o:gfxdata="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" strokecolor="#156082 [3204]" strokeweight="1.5pt">
                 <v:stroke joinstyle="miter"/>
               </v:line>
             </w:pict>
@@ -6232,7 +6232,7 @@
           </mc:Choice>
           <mc:Fallback>
             <w:pict>
-              <v:shape w14:anchorId="4AD841DD" id="Diamond 35" o:spid="_x0000_s1026" type="#_x0000_t4" style="position:absolute;margin-left:125pt;margin-top:10.1pt;width:211pt;height:60pt;z-index:251678208;visibility:visible;mso-wrap-style:square;mso-width-percent:0;mso-height-percent:0;mso-wrap-distance-left:9pt;mso-wrap-distance-top:0;mso-wrap-distance-right:9pt;mso-wrap-distance-bottom:0;mso-position-horizontal:absolute;mso-position-horizontal-relative:text;mso-position-vertical:absolute;mso-position-vertical-relative:text;mso-width-percent:0;mso-height-percent:0;mso-width-relative:margin;mso-height-relative:margin;v-text-anchor:middle" o:gfxdata="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" fillcolor="#156082 [3204]" strokecolor="#030e13 [484]" strokeweight="1.5pt"/>
+              <v:shape w14:anchorId="75B48C90" id="Diamond 35" o:spid="_x0000_s1026" type="#_x0000_t4" style="position:absolute;margin-left:125pt;margin-top:10.1pt;width:211pt;height:60pt;z-index:251678208;visibility:visible;mso-wrap-style:square;mso-width-percent:0;mso-height-percent:0;mso-wrap-distance-left:9pt;mso-wrap-distance-top:0;mso-wrap-distance-right:9pt;mso-wrap-distance-bottom:0;mso-position-horizontal:absolute;mso-position-horizontal-relative:text;mso-position-vertical:absolute;mso-position-vertical-relative:text;mso-width-percent:0;mso-height-percent:0;mso-width-relative:margin;mso-height-relative:margin;v-text-anchor:middle" o:gfxdata="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" fillcolor="#156082 [3204]" strokecolor="#030e13 [484]" strokeweight="1.5pt"/>
             </w:pict>
           </mc:Fallback>
         </mc:AlternateContent>
@@ -6396,7 +6396,7 @@
           </mc:Choice>
           <mc:Fallback>
             <w:pict>
-              <v:line w14:anchorId="15B7F128" id="Straight Connector 40" o:spid="_x0000_s1026" style="position:absolute;z-index:251680256;visibility:visible;mso-wrap-style:square;mso-wrap-distance-left:9pt;mso-wrap-distance-top:0;mso-wrap-distance-right:9pt;mso-wrap-distance-bottom:0;mso-position-horizontal:absolute;mso-position-horizontal-relative:text;mso-position-vertical:absolute;mso-position-vertical-relative:text" from="230pt,1.15pt" to="230.5pt,25.65pt" o:gfxdata="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" strokecolor="#156082 [3204]" strokeweight="1.5pt">
+              <v:line w14:anchorId="5D73B5FC" id="Straight Connector 40" o:spid="_x0000_s1026" style="position:absolute;z-index:251680256;visibility:visible;mso-wrap-style:square;mso-wrap-distance-left:9pt;mso-wrap-distance-top:0;mso-wrap-distance-right:9pt;mso-wrap-distance-bottom:0;mso-position-horizontal:absolute;mso-position-horizontal-relative:text;mso-position-vertical:absolute;mso-position-vertical-relative:text" from="230pt,1.15pt" to="230.5pt,25.65pt" o:gfxdata="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" strokecolor="#156082 [3204]" strokeweight="1.5pt">
                 <v:stroke joinstyle="miter"/>
               </v:line>
             </w:pict>
@@ -6562,7 +6562,7 @@
           </mc:Choice>
           <mc:Fallback>
             <w:pict>
-              <v:rect w14:anchorId="1B84086B" id="Rectangle 41" o:spid="_x0000_s1026" style="position:absolute;margin-left:156pt;margin-top:3.5pt;width:151pt;height:32.5pt;z-index:251681280;visibility:visible;mso-wrap-style:square;mso-width-percent:0;mso-height-percent:0;mso-wrap-distance-left:9pt;mso-wrap-distance-top:0;mso-wrap-distance-right:9pt;mso-wrap-distance-bottom:0;mso-position-horizontal:absolute;mso-position-horizontal-relative:text;mso-position-vertical:absolute;mso-position-vertical-relative:text;mso-width-percent:0;mso-height-percent:0;mso-width-relative:margin;mso-height-relative:margin;v-text-anchor:middle" o:gfxdata="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" fillcolor="#156082 [3204]" strokecolor="#030e13 [484]" strokeweight="1.5pt"/>
+              <v:rect w14:anchorId="72992161" id="Rectangle 41" o:spid="_x0000_s1026" style="position:absolute;margin-left:156pt;margin-top:3.5pt;width:151pt;height:32.5pt;z-index:251681280;visibility:visible;mso-wrap-style:square;mso-width-percent:0;mso-height-percent:0;mso-wrap-distance-left:9pt;mso-wrap-distance-top:0;mso-wrap-distance-right:9pt;mso-wrap-distance-bottom:0;mso-position-horizontal:absolute;mso-position-horizontal-relative:text;mso-position-vertical:absolute;mso-position-vertical-relative:text;mso-width-percent:0;mso-height-percent:0;mso-width-relative:margin;mso-height-relative:margin;v-text-anchor:middle" o:gfxdata="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" fillcolor="#156082 [3204]" strokecolor="#030e13 [484]" strokeweight="1.5pt"/>
             </w:pict>
           </mc:Fallback>
         </mc:AlternateContent>
@@ -6628,7 +6628,7 @@
           </mc:Choice>
           <mc:Fallback>
             <w:pict>
-              <v:line w14:anchorId="011CD86E" id="Straight Connector 43" o:spid="_x0000_s1026" style="position:absolute;z-index:251683328;visibility:visible;mso-wrap-style:square;mso-wrap-distance-left:9pt;mso-wrap-distance-top:0;mso-wrap-distance-right:9pt;mso-wrap-distance-bottom:0;mso-position-horizontal:absolute;mso-position-horizontal-relative:text;mso-position-vertical:absolute;mso-position-vertical-relative:text" from="229.5pt,13.85pt" to="230pt,36.85pt" o:gfxdata="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" strokecolor="#156082 [3204]" strokeweight="1.5pt">
+              <v:line w14:anchorId="53E1C6A3" id="Straight Connector 43" o:spid="_x0000_s1026" style="position:absolute;z-index:251683328;visibility:visible;mso-wrap-style:square;mso-wrap-distance-left:9pt;mso-wrap-distance-top:0;mso-wrap-distance-right:9pt;mso-wrap-distance-bottom:0;mso-position-horizontal:absolute;mso-position-horizontal-relative:text;mso-position-vertical:absolute;mso-position-vertical-relative:text" from="229.5pt,13.85pt" to="230pt,36.85pt" o:gfxdata="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" strokecolor="#156082 [3204]" strokeweight="1.5pt">
                 <v:stroke joinstyle="miter"/>
               </v:line>
             </w:pict>
@@ -6709,7 +6709,7 @@
           </mc:Choice>
           <mc:Fallback>
             <w:pict>
-              <v:rect w14:anchorId="19BBA085" id="Rectangle 44" o:spid="_x0000_s1026" style="position:absolute;margin-left:157.5pt;margin-top:14.7pt;width:154pt;height:31.5pt;z-index:251684352;visibility:visible;mso-wrap-style:square;mso-width-percent:0;mso-height-percent:0;mso-wrap-distance-left:9pt;mso-wrap-distance-top:0;mso-wrap-distance-right:9pt;mso-wrap-distance-bottom:0;mso-position-horizontal:absolute;mso-position-horizontal-relative:text;mso-position-vertical:absolute;mso-position-vertical-relative:text;mso-width-percent:0;mso-height-percent:0;mso-width-relative:margin;mso-height-relative:margin;v-text-anchor:middle" o:gfxdata="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" fillcolor="#156082 [3204]" strokecolor="#030e13 [484]" strokeweight="1.5pt"/>
+              <v:rect w14:anchorId="0FEB1B46" id="Rectangle 44" o:spid="_x0000_s1026" style="position:absolute;margin-left:157.5pt;margin-top:14.7pt;width:154pt;height:31.5pt;z-index:251684352;visibility:visible;mso-wrap-style:square;mso-width-percent:0;mso-height-percent:0;mso-wrap-distance-left:9pt;mso-wrap-distance-top:0;mso-wrap-distance-right:9pt;mso-wrap-distance-bottom:0;mso-position-horizontal:absolute;mso-position-horizontal-relative:text;mso-position-vertical:absolute;mso-position-vertical-relative:text;mso-width-percent:0;mso-height-percent:0;mso-width-relative:margin;mso-height-relative:margin;v-text-anchor:middle" o:gfxdata="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" fillcolor="#156082 [3204]" strokecolor="#030e13 [484]" strokeweight="1.5pt"/>
             </w:pict>
           </mc:Fallback>
         </mc:AlternateContent>
@@ -6883,7 +6883,7 @@
           </mc:Choice>
           <mc:Fallback>
             <w:pict>
-              <v:line w14:anchorId="46BA488D" id="Straight Connector 46" o:spid="_x0000_s1026" style="position:absolute;z-index:251686400;visibility:visible;mso-wrap-style:square;mso-wrap-distance-left:9pt;mso-wrap-distance-top:0;mso-wrap-distance-right:9pt;mso-wrap-distance-bottom:0;mso-position-horizontal:absolute;mso-position-horizontal-relative:text;mso-position-vertical:absolute;mso-position-vertical-relative:text" from="230.5pt,1.4pt" to="231pt,30.4pt" o:gfxdata="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" strokecolor="#156082 [3204]" strokeweight="1.5pt">
+              <v:line w14:anchorId="3EF56106" id="Straight Connector 46" o:spid="_x0000_s1026" style="position:absolute;z-index:251686400;visibility:visible;mso-wrap-style:square;mso-wrap-distance-left:9pt;mso-wrap-distance-top:0;mso-wrap-distance-right:9pt;mso-wrap-distance-bottom:0;mso-position-horizontal:absolute;mso-position-horizontal-relative:text;mso-position-vertical:absolute;mso-position-vertical-relative:text" from="230.5pt,1.4pt" to="231pt,30.4pt" o:gfxdata="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" strokecolor="#156082 [3204]" strokeweight="1.5pt">
                 <v:stroke joinstyle="miter"/>
               </v:line>
             </w:pict>
@@ -6961,7 +6961,7 @@
           </mc:Choice>
           <mc:Fallback>
             <w:pict>
-              <v:oval w14:anchorId="3258DBA1" id="Oval 47" o:spid="_x0000_s1026" style="position:absolute;margin-left:175.5pt;margin-top:6.25pt;width:111.5pt;height:40.5pt;z-index:251687424;visibility:visible;mso-wrap-style:square;mso-width-percent:0;mso-wrap-distance-left:9pt;mso-wrap-distance-top:0;mso-wrap-distance-right:9pt;mso-wrap-distance-bottom:0;mso-position-horizontal:absolute;mso-position-horizontal-relative:text;mso-position-vertical:absolute;mso-position-vertical-relative:text;mso-width-percent:0;mso-width-relative:margin;v-text-anchor:middle" o:gfxdata="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" fillcolor="#156082 [3204]" strokecolor="#030e13 [484]" strokeweight="1.5pt">
+              <v:oval w14:anchorId="341FFBD6" id="Oval 47" o:spid="_x0000_s1026" style="position:absolute;margin-left:175.5pt;margin-top:6.25pt;width:111.5pt;height:40.5pt;z-index:251687424;visibility:visible;mso-wrap-style:square;mso-width-percent:0;mso-wrap-distance-left:9pt;mso-wrap-distance-top:0;mso-wrap-distance-right:9pt;mso-wrap-distance-bottom:0;mso-position-horizontal:absolute;mso-position-horizontal-relative:text;mso-position-vertical:absolute;mso-position-vertical-relative:text;mso-width-percent:0;mso-width-relative:margin;v-text-anchor:middle" o:gfxdata="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" fillcolor="#156082 [3204]" strokecolor="#030e13 [484]" strokeweight="1.5pt">
                 <v:stroke joinstyle="miter"/>
               </v:oval>
             </w:pict>
@@ -7249,7 +7249,7 @@
           </mc:Choice>
           <mc:Fallback>
             <w:pict>
-              <v:oval w14:anchorId="33B225D6" id="Oval 49" o:spid="_x0000_s1026" style="position:absolute;margin-left:183.5pt;margin-top:1.55pt;width:87.5pt;height:41.5pt;z-index:251689472;visibility:visible;mso-wrap-style:square;mso-width-percent:0;mso-wrap-distance-left:9pt;mso-wrap-distance-top:0;mso-wrap-distance-right:9pt;mso-wrap-distance-bottom:0;mso-position-horizontal:absolute;mso-position-horizontal-relative:text;mso-position-vertical:absolute;mso-position-vertical-relative:text;mso-width-percent:0;mso-width-relative:margin;v-text-anchor:middle" o:gfxdata="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" fillcolor="#156082 [3204]" strokecolor="#030e13 [484]" strokeweight="1.5pt">
+              <v:oval w14:anchorId="062D57DA" id="Oval 49" o:spid="_x0000_s1026" style="position:absolute;margin-left:183.5pt;margin-top:1.55pt;width:87.5pt;height:41.5pt;z-index:251689472;visibility:visible;mso-wrap-style:square;mso-width-percent:0;mso-wrap-distance-left:9pt;mso-wrap-distance-top:0;mso-wrap-distance-right:9pt;mso-wrap-distance-bottom:0;mso-position-horizontal:absolute;mso-position-horizontal-relative:text;mso-position-vertical:absolute;mso-position-vertical-relative:text;mso-width-percent:0;mso-width-relative:margin;v-text-anchor:middle" o:gfxdata="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" fillcolor="#156082 [3204]" strokecolor="#030e13 [484]" strokeweight="1.5pt">
                 <v:stroke joinstyle="miter"/>
               </v:oval>
             </w:pict>
@@ -7317,7 +7317,7 @@
           </mc:Choice>
           <mc:Fallback>
             <w:pict>
-              <v:line w14:anchorId="2882D1B4" id="Straight Connector 51" o:spid="_x0000_s1026" style="position:absolute;z-index:251691520;visibility:visible;mso-wrap-style:square;mso-wrap-distance-left:9pt;mso-wrap-distance-top:0;mso-wrap-distance-right:9pt;mso-wrap-distance-bottom:0;mso-position-horizontal:absolute;mso-position-horizontal-relative:text;mso-position-vertical:absolute;mso-position-vertical-relative:text" from="227pt,20.9pt" to="227.5pt,40.9pt" o:gfxdata="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" strokecolor="#156082 [3204]" strokeweight="1.5pt">
+              <v:line w14:anchorId="26D459D5" id="Straight Connector 51" o:spid="_x0000_s1026" style="position:absolute;z-index:251691520;visibility:visible;mso-wrap-style:square;mso-wrap-distance-left:9pt;mso-wrap-distance-top:0;mso-wrap-distance-right:9pt;mso-wrap-distance-bottom:0;mso-position-horizontal:absolute;mso-position-horizontal-relative:text;mso-position-vertical:absolute;mso-position-vertical-relative:text" from="227pt,20.9pt" to="227.5pt,40.9pt" o:gfxdata="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" strokecolor="#156082 [3204]" strokeweight="1.5pt">
                 <v:stroke joinstyle="miter"/>
               </v:line>
             </w:pict>
@@ -7398,7 +7398,7 @@
           </mc:Choice>
           <mc:Fallback>
             <w:pict>
-              <v:shape w14:anchorId="16F91628" id="Diamond 52" o:spid="_x0000_s1026" type="#_x0000_t4" style="position:absolute;margin-left:133.5pt;margin-top:17.75pt;width:190.5pt;height:51.5pt;z-index:251692544;visibility:visible;mso-wrap-style:square;mso-width-percent:0;mso-height-percent:0;mso-wrap-distance-left:9pt;mso-wrap-distance-top:0;mso-wrap-distance-right:9pt;mso-wrap-distance-bottom:0;mso-position-horizontal:absolute;mso-position-horizontal-relative:text;mso-position-vertical:absolute;mso-position-vertical-relative:text;mso-width-percent:0;mso-height-percent:0;mso-width-relative:margin;mso-height-relative:margin;v-text-anchor:middle" o:gfxdata="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" fillcolor="#156082 [3204]" strokecolor="#030e13 [484]" strokeweight="1.5pt"/>
+              <v:shape w14:anchorId="5C54F82E" id="Diamond 52" o:spid="_x0000_s1026" type="#_x0000_t4" style="position:absolute;margin-left:133.5pt;margin-top:17.75pt;width:190.5pt;height:51.5pt;z-index:251692544;visibility:visible;mso-wrap-style:square;mso-width-percent:0;mso-height-percent:0;mso-wrap-distance-left:9pt;mso-wrap-distance-top:0;mso-wrap-distance-right:9pt;mso-wrap-distance-bottom:0;mso-position-horizontal:absolute;mso-position-horizontal-relative:text;mso-position-vertical:absolute;mso-position-vertical-relative:text;mso-width-percent:0;mso-height-percent:0;mso-width-relative:margin;mso-height-relative:margin;v-text-anchor:middle" o:gfxdata="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" fillcolor="#156082 [3204]" strokecolor="#030e13 [484]" strokeweight="1.5pt"/>
             </w:pict>
           </mc:Fallback>
         </mc:AlternateContent>
@@ -7573,7 +7573,7 @@
           </mc:Choice>
           <mc:Fallback>
             <w:pict>
-              <v:line w14:anchorId="624C3F32" id="Straight Connector 54" o:spid="_x0000_s1026" style="position:absolute;z-index:251694592;visibility:visible;mso-wrap-style:square;mso-width-percent:0;mso-height-percent:0;mso-wrap-distance-left:9pt;mso-wrap-distance-top:0;mso-wrap-distance-right:9pt;mso-wrap-distance-bottom:0;mso-position-horizontal:absolute;mso-position-horizontal-relative:text;mso-position-vertical:absolute;mso-position-vertical-relative:text;mso-width-percent:0;mso-height-percent:0;mso-width-relative:margin;mso-height-relative:margin" from="228pt,8.3pt" to="228.5pt,29.8pt" o:gfxdata="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" strokecolor="#156082 [3204]" strokeweight="1.5pt">
+              <v:line w14:anchorId="67EC90FB" id="Straight Connector 54" o:spid="_x0000_s1026" style="position:absolute;z-index:251694592;visibility:visible;mso-wrap-style:square;mso-width-percent:0;mso-height-percent:0;mso-wrap-distance-left:9pt;mso-wrap-distance-top:0;mso-wrap-distance-right:9pt;mso-wrap-distance-bottom:0;mso-position-horizontal:absolute;mso-position-horizontal-relative:text;mso-position-vertical:absolute;mso-position-vertical-relative:text;mso-width-percent:0;mso-height-percent:0;mso-width-relative:margin;mso-height-relative:margin" from="228pt,8.3pt" to="228.5pt,29.8pt" o:gfxdata="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" strokecolor="#156082 [3204]" strokeweight="1.5pt">
                 <v:stroke joinstyle="miter"/>
               </v:line>
             </w:pict>
@@ -7654,7 +7654,7 @@
           </mc:Choice>
           <mc:Fallback>
             <w:pict>
-              <v:rect w14:anchorId="3054C5B9" id="Rectangle 55" o:spid="_x0000_s1026" style="position:absolute;margin-left:168.5pt;margin-top:7.65pt;width:122pt;height:33.5pt;z-index:251695616;visibility:visible;mso-wrap-style:square;mso-width-percent:0;mso-height-percent:0;mso-wrap-distance-left:9pt;mso-wrap-distance-top:0;mso-wrap-distance-right:9pt;mso-wrap-distance-bottom:0;mso-position-horizontal:absolute;mso-position-horizontal-relative:text;mso-position-vertical:absolute;mso-position-vertical-relative:text;mso-width-percent:0;mso-height-percent:0;mso-width-relative:margin;mso-height-relative:margin;v-text-anchor:middle" o:gfxdata="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" fillcolor="#156082 [3204]" strokecolor="#030e13 [484]" strokeweight="1.5pt"/>
+              <v:rect w14:anchorId="77B8B621" id="Rectangle 55" o:spid="_x0000_s1026" style="position:absolute;margin-left:168.5pt;margin-top:7.65pt;width:122pt;height:33.5pt;z-index:251695616;visibility:visible;mso-wrap-style:square;mso-width-percent:0;mso-height-percent:0;mso-wrap-distance-left:9pt;mso-wrap-distance-top:0;mso-wrap-distance-right:9pt;mso-wrap-distance-bottom:0;mso-position-horizontal:absolute;mso-position-horizontal-relative:text;mso-position-vertical:absolute;mso-position-vertical-relative:text;mso-width-percent:0;mso-height-percent:0;mso-width-relative:margin;mso-height-relative:margin;v-text-anchor:middle" o:gfxdata="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" fillcolor="#156082 [3204]" strokecolor="#030e13 [484]" strokeweight="1.5pt"/>
             </w:pict>
           </mc:Fallback>
         </mc:AlternateContent>
@@ -7808,7 +7808,7 @@
           </mc:Choice>
           <mc:Fallback>
             <w:pict>
-              <v:line w14:anchorId="796D49DD" id="Straight Connector 57" o:spid="_x0000_s1026" style="position:absolute;flip:x;z-index:251697664;visibility:visible;mso-wrap-style:square;mso-width-percent:0;mso-height-percent:0;mso-wrap-distance-left:9pt;mso-wrap-distance-top:0;mso-wrap-distance-right:9pt;mso-wrap-distance-bottom:0;mso-position-horizontal:absolute;mso-position-horizontal-relative:text;mso-position-vertical:absolute;mso-position-vertical-relative:text;mso-width-percent:0;mso-height-percent:0;mso-width-relative:margin;mso-height-relative:margin" from="227.5pt,19.5pt" to="227.5pt,40pt" o:gfxdata="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" strokecolor="#156082 [3204]" strokeweight="1.5pt">
+              <v:line w14:anchorId="51C48621" id="Straight Connector 57" o:spid="_x0000_s1026" style="position:absolute;flip:x;z-index:251697664;visibility:visible;mso-wrap-style:square;mso-width-percent:0;mso-height-percent:0;mso-wrap-distance-left:9pt;mso-wrap-distance-top:0;mso-wrap-distance-right:9pt;mso-wrap-distance-bottom:0;mso-position-horizontal:absolute;mso-position-horizontal-relative:text;mso-position-vertical:absolute;mso-position-vertical-relative:text;mso-width-percent:0;mso-height-percent:0;mso-width-relative:margin;mso-height-relative:margin" from="227.5pt,19.5pt" to="227.5pt,40pt" o:gfxdata="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" strokecolor="#156082 [3204]" strokeweight="1.5pt">
                 <v:stroke joinstyle="miter"/>
               </v:line>
             </w:pict>
@@ -7886,7 +7886,7 @@
           </mc:Choice>
           <mc:Fallback>
             <w:pict>
-              <v:rect w14:anchorId="69C9F434" id="Rectangle 58" o:spid="_x0000_s1026" style="position:absolute;margin-left:142pt;margin-top:13.5pt;width:169.5pt;height:32pt;z-index:251698688;visibility:visible;mso-wrap-style:square;mso-width-percent:0;mso-height-percent:0;mso-wrap-distance-left:9pt;mso-wrap-distance-top:0;mso-wrap-distance-right:9pt;mso-wrap-distance-bottom:0;mso-position-horizontal:absolute;mso-position-horizontal-relative:text;mso-position-vertical:absolute;mso-position-vertical-relative:text;mso-width-percent:0;mso-height-percent:0;mso-width-relative:margin;mso-height-relative:margin;v-text-anchor:middle" o:gfxdata="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" fillcolor="#156082 [3204]" strokecolor="#030e13 [484]" strokeweight="1.5pt"/>
+              <v:rect w14:anchorId="3F4491E1" id="Rectangle 58" o:spid="_x0000_s1026" style="position:absolute;margin-left:142pt;margin-top:13.5pt;width:169.5pt;height:32pt;z-index:251698688;visibility:visible;mso-wrap-style:square;mso-width-percent:0;mso-height-percent:0;mso-wrap-distance-left:9pt;mso-wrap-distance-top:0;mso-wrap-distance-right:9pt;mso-wrap-distance-bottom:0;mso-position-horizontal:absolute;mso-position-horizontal-relative:text;mso-position-vertical:absolute;mso-position-vertical-relative:text;mso-width-percent:0;mso-height-percent:0;mso-width-relative:margin;mso-height-relative:margin;v-text-anchor:middle" o:gfxdata="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" fillcolor="#156082 [3204]" strokecolor="#030e13 [484]" strokeweight="1.5pt"/>
             </w:pict>
           </mc:Fallback>
         </mc:AlternateContent>
@@ -8043,7 +8043,7 @@
           </mc:Choice>
           <mc:Fallback>
             <w:pict>
-              <v:line w14:anchorId="529B7FED" id="Straight Connector 60" o:spid="_x0000_s1026" style="position:absolute;z-index:251700736;visibility:visible;mso-wrap-style:square;mso-width-percent:0;mso-height-percent:0;mso-wrap-distance-left:9pt;mso-wrap-distance-top:0;mso-wrap-distance-right:9pt;mso-wrap-distance-bottom:0;mso-position-horizontal:absolute;mso-position-horizontal-relative:margin;mso-position-vertical:absolute;mso-position-vertical-relative:text;mso-width-percent:0;mso-height-percent:0;mso-width-relative:margin;mso-height-relative:margin" from="227pt,19.05pt" to="227pt,41.05pt" o:gfxdata="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" strokecolor="#156082 [3204]" strokeweight="1.5pt">
+              <v:line w14:anchorId="19FBF67B" id="Straight Connector 60" o:spid="_x0000_s1026" style="position:absolute;z-index:251700736;visibility:visible;mso-wrap-style:square;mso-width-percent:0;mso-height-percent:0;mso-wrap-distance-left:9pt;mso-wrap-distance-top:0;mso-wrap-distance-right:9pt;mso-wrap-distance-bottom:0;mso-position-horizontal:absolute;mso-position-horizontal-relative:margin;mso-position-vertical:absolute;mso-position-vertical-relative:text;mso-width-percent:0;mso-height-percent:0;mso-width-relative:margin;mso-height-relative:margin" from="227pt,19.05pt" to="227pt,41.05pt" o:gfxdata="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" strokecolor="#156082 [3204]" strokeweight="1.5pt">
                 <v:stroke joinstyle="miter"/>
                 <w10:wrap anchorx="margin"/>
               </v:line>
@@ -8122,7 +8122,7 @@
           </mc:Choice>
           <mc:Fallback>
             <w:pict>
-              <v:oval w14:anchorId="1ABEF9A1" id="Oval 61" o:spid="_x0000_s1026" style="position:absolute;margin-left:178pt;margin-top:767.5pt;width:102pt;height:34.5pt;z-index:251701760;visibility:visible;mso-wrap-style:square;mso-width-percent:0;mso-height-percent:0;mso-wrap-distance-left:9pt;mso-wrap-distance-top:0;mso-wrap-distance-right:9pt;mso-wrap-distance-bottom:0;mso-position-horizontal:absolute;mso-position-horizontal-relative:text;mso-position-vertical:absolute;mso-position-vertical-relative:page;mso-width-percent:0;mso-height-percent:0;mso-width-relative:margin;mso-height-relative:margin;v-text-anchor:middle" o:gfxdata="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" fillcolor="#156082 [3204]" strokecolor="#030e13 [484]" strokeweight="1.5pt">
+              <v:oval w14:anchorId="7376D488" id="Oval 61" o:spid="_x0000_s1026" style="position:absolute;margin-left:178pt;margin-top:767.5pt;width:102pt;height:34.5pt;z-index:251701760;visibility:visible;mso-wrap-style:square;mso-width-percent:0;mso-height-percent:0;mso-wrap-distance-left:9pt;mso-wrap-distance-top:0;mso-wrap-distance-right:9pt;mso-wrap-distance-bottom:0;mso-position-horizontal:absolute;mso-position-horizontal-relative:text;mso-position-vertical:absolute;mso-position-vertical-relative:page;mso-width-percent:0;mso-height-percent:0;mso-width-relative:margin;mso-height-relative:margin;v-text-anchor:middle" o:gfxdata="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" fillcolor="#156082 [3204]" strokecolor="#030e13 [484]" strokeweight="1.5pt">
                 <v:stroke joinstyle="miter"/>
                 <w10:wrap anchory="page"/>
               </v:oval>
@@ -12628,7 +12628,249 @@
         <w:t xml:space="preserve">GANTT CHART </w:t>
       </w:r>
     </w:p>
-    <w:p/>
+    <w:p>
+      <w:pPr>
+        <w:rPr>
+          <w:b/>
+          <w:bCs/>
+          <w:u w:val="single"/>
+        </w:rPr>
+      </w:pPr>
+      <w:r>
+        <w:rPr>
+          <w:b/>
+          <w:bCs/>
+          <w:u w:val="single"/>
+        </w:rPr>
+        <w:t>REFERENCES</w:t>
+      </w:r>
+    </w:p>
+    <w:p>
+      <w:pPr>
+        <w:rPr>
+          <w:b/>
+          <w:bCs/>
+          <w:u w:val="single"/>
+        </w:rPr>
+      </w:pPr>
+    </w:p>
+    <w:p>
+      <w:pPr>
+        <w:pStyle w:val="ListParagraph"/>
+        <w:numPr>
+          <w:ilvl w:val="0"/>
+          <w:numId w:val="11"/>
+        </w:numPr>
+      </w:pPr>
+      <w:r>
+        <w:t xml:space="preserve">Brunel University London, Department of Computer Science (2025) </w:t>
+      </w:r>
+      <w:r>
+        <w:rPr>
+          <w:i/>
+          <w:iCs/>
+        </w:rPr>
+        <w:t>CS1704 Worksheet 3: Writing User Requirements</w:t>
+      </w:r>
+      <w:r>
+        <w:t xml:space="preserve"> (Version 2, 2025–26). Module worksheet.</w:t>
+      </w:r>
+    </w:p>
+    <w:p>
+      <w:pPr>
+        <w:pStyle w:val="ListParagraph"/>
+        <w:numPr>
+          <w:ilvl w:val="0"/>
+          <w:numId w:val="11"/>
+        </w:numPr>
+      </w:pPr>
+      <w:r>
+        <w:t xml:space="preserve">Brunel University London, Department of Computer Science (2025) </w:t>
+      </w:r>
+      <w:r>
+        <w:rPr>
+          <w:i/>
+          <w:iCs/>
+        </w:rPr>
+        <w:t>CS1704 Worksheet 3: Writing User Requirements – Sample Answer</w:t>
+      </w:r>
+      <w:r>
+        <w:t xml:space="preserve"> (Version 2, 2025–26). Module sample solution.</w:t>
+      </w:r>
+    </w:p>
+    <w:p>
+      <w:pPr>
+        <w:pStyle w:val="ListParagraph"/>
+        <w:numPr>
+          <w:ilvl w:val="0"/>
+          <w:numId w:val="11"/>
+        </w:numPr>
+      </w:pPr>
+      <w:r>
+        <w:t xml:space="preserve">Brunel University London, Department of Computer Science (2025) </w:t>
+      </w:r>
+      <w:proofErr w:type="spellStart"/>
+      <w:r>
+        <w:rPr>
+          <w:i/>
+          <w:iCs/>
+        </w:rPr>
+        <w:t>SimonSwift</w:t>
+      </w:r>
+      <w:proofErr w:type="spellEnd"/>
+      <w:r>
+        <w:rPr>
+          <w:i/>
+          <w:iCs/>
+        </w:rPr>
+        <w:t xml:space="preserve"> Formative Task – Annotated Sample Answer</w:t>
+      </w:r>
+      <w:r>
+        <w:t xml:space="preserve"> (Version 2). Module formative assessment material.</w:t>
+      </w:r>
+    </w:p>
+    <w:p>
+      <w:pPr>
+        <w:pStyle w:val="ListParagraph"/>
+        <w:numPr>
+          <w:ilvl w:val="0"/>
+          <w:numId w:val="11"/>
+        </w:numPr>
+      </w:pPr>
+      <w:r>
+        <w:t xml:space="preserve">Brunel University London, Department of Computer Science (2025) </w:t>
+      </w:r>
+      <w:r>
+        <w:rPr>
+          <w:i/>
+          <w:iCs/>
+        </w:rPr>
+        <w:t>CS1704 Week 5 Lecture 5: Designing Algorithms Using Flowcharts – Part 2</w:t>
+      </w:r>
+      <w:r>
+        <w:t xml:space="preserve"> (Version 2, 2025–26). Lecture slides.</w:t>
+      </w:r>
+    </w:p>
+    <w:p>
+      <w:pPr>
+        <w:pStyle w:val="ListParagraph"/>
+        <w:numPr>
+          <w:ilvl w:val="0"/>
+          <w:numId w:val="11"/>
+        </w:numPr>
+      </w:pPr>
+      <w:r>
+        <w:t xml:space="preserve">Brunel University London, Department of Computer Science (2025) </w:t>
+      </w:r>
+      <w:r>
+        <w:rPr>
+          <w:i/>
+          <w:iCs/>
+        </w:rPr>
+        <w:t>CS1704 Worksheet 4: Designing Algorithms Using Flowcharts – Sample Answer</w:t>
+      </w:r>
+      <w:r>
+        <w:t xml:space="preserve"> (Version 2, 2025–26). Module worksheet sample solution.</w:t>
+      </w:r>
+    </w:p>
+    <w:p>
+      <w:pPr>
+        <w:pStyle w:val="NormalWeb"/>
+        <w:numPr>
+          <w:ilvl w:val="0"/>
+          <w:numId w:val="11"/>
+        </w:numPr>
+        <w:spacing w:before="0" w:beforeAutospacing="0" w:after="0" w:afterAutospacing="0" w:line="360" w:lineRule="atLeast"/>
+        <w:rPr>
+          <w:rFonts w:ascii="Calibri" w:hAnsi="Calibri" w:cs="Calibri"/>
+          <w:color w:val="000000"/>
+          <w:sz w:val="27"/>
+          <w:szCs w:val="27"/>
+        </w:rPr>
+      </w:pPr>
+      <w:r>
+        <w:rPr>
+          <w:rFonts w:ascii="Calibri" w:hAnsi="Calibri" w:cs="Calibri"/>
+          <w:color w:val="000000"/>
+          <w:sz w:val="27"/>
+          <w:szCs w:val="27"/>
+        </w:rPr>
+        <w:t>Microsoft Excel Online. (2023). </w:t>
+      </w:r>
+      <w:r>
+        <w:rPr>
+          <w:rFonts w:ascii="Calibri" w:hAnsi="Calibri" w:cs="Calibri"/>
+          <w:i/>
+          <w:iCs/>
+          <w:color w:val="000000"/>
+          <w:sz w:val="27"/>
+          <w:szCs w:val="27"/>
+        </w:rPr>
+        <w:t>Microsoft Excel</w:t>
+      </w:r>
+      <w:r>
+        <w:rPr>
+          <w:rFonts w:ascii="Calibri" w:hAnsi="Calibri" w:cs="Calibri"/>
+          <w:color w:val="000000"/>
+          <w:sz w:val="27"/>
+          <w:szCs w:val="27"/>
+        </w:rPr>
+        <w:t xml:space="preserve">. [online] Available at: </w:t>
+      </w:r>
+      <w:hyperlink r:id="rId5" w:history="1">
+        <w:r>
+          <w:rPr>
+            <w:rStyle w:val="Hyperlink"/>
+            <w:rFonts w:ascii="Calibri" w:hAnsi="Calibri" w:cs="Calibri"/>
+            <w:sz w:val="27"/>
+            <w:szCs w:val="27"/>
+          </w:rPr>
+          <w:t>https://excel.cloud.microsoft/search/gantt%20chart/?wdOrigin=SEO-INTENT.SEARCHENGINE-LANDING-INTENT2003.SEARCHTEMPLATES</w:t>
+        </w:r>
+      </w:hyperlink>
+    </w:p>
+    <w:p>
+      <w:pPr>
+        <w:pStyle w:val="NormalWeb"/>
+        <w:numPr>
+          <w:ilvl w:val="0"/>
+          <w:numId w:val="11"/>
+        </w:numPr>
+        <w:spacing w:before="0" w:beforeAutospacing="0" w:after="0" w:afterAutospacing="0" w:line="360" w:lineRule="atLeast"/>
+        <w:rPr>
+          <w:rFonts w:ascii="Calibri" w:hAnsi="Calibri" w:cs="Calibri"/>
+          <w:color w:val="000000"/>
+          <w:sz w:val="27"/>
+          <w:szCs w:val="27"/>
+        </w:rPr>
+      </w:pPr>
+      <w:r>
+        <w:rPr>
+          <w:rFonts w:ascii="Calibri" w:hAnsi="Calibri" w:cs="Calibri"/>
+          <w:color w:val="000000"/>
+          <w:sz w:val="27"/>
+          <w:szCs w:val="27"/>
+        </w:rPr>
+        <w:t>[Accessed 28 Jan. 2026].</w:t>
+      </w:r>
+    </w:p>
+    <w:p>
+      <w:pPr>
+        <w:pStyle w:val="NormalWeb"/>
+        <w:ind w:left="360"/>
+        <w:rPr>
+          <w:rFonts w:ascii="Calibri" w:hAnsi="Calibri" w:cs="Calibri"/>
+          <w:color w:val="000000"/>
+          <w:sz w:val="27"/>
+          <w:szCs w:val="27"/>
+        </w:rPr>
+      </w:pPr>
+    </w:p>
+    <w:p>
+      <w:pPr>
+        <w:pStyle w:val="ListParagraph"/>
+      </w:pPr>
+    </w:p>
     <w:p/>
     <w:p/>
     <w:p/>
@@ -12648,6 +12890,92 @@
 <file path=word/numbering.xml><?xml version="1.0" encoding="utf-8"?>
 <w:numbering xmlns:wpc="http://schemas.microsoft.com/office/word/2010/wordprocessingCanvas" xmlns:cx="http://schemas.microsoft.com/office/drawing/2014/chartex" xmlns:cx1="http://schemas.microsoft.com/office/drawing/2015/9/8/chartex" xmlns:cx2="http://schemas.microsoft.com/office/drawing/2015/10/21/chartex" xmlns:cx3="http://schemas.microsoft.com/office/drawing/2016/5/9/chartex" xmlns:cx4="http://schemas.microsoft.com/office/drawing/2016/5/10/chartex" xmlns:cx5="http://schemas.microsoft.com/office/drawing/2016/5/11/chartex" xmlns:cx6="http://schemas.microsoft.com/office/drawing/2016/5/12/chartex" xmlns:cx7="http://schemas.microsoft.com/office/drawing/2016/5/13/chartex" xmlns:cx8="http://schemas.microsoft.com/office/drawing/2016/5/14/chartex" xmlns:mc="http://schemas.openxmlformats.org/markup-compatibility/2006" xmlns:aink="http://schemas.microsoft.com/office/drawing/2016/ink" xmlns:am3d="http://schemas.microsoft.com/office/drawing/2017/model3d" xmlns:o="urn:schemas-microsoft-com:office:office" xmlns:oel="http://schemas.microsoft.com/office/2019/extlst" xmlns:r="http://schemas.openxmlformats.org/officeDocument/2006/relationships" xmlns:m="http://schemas.openxmlformats.org/officeDocument/2006/math" xmlns:v="urn:schemas-microsoft-com:vml" xmlns:wp14="http://schemas.microsoft.com/office/word/2010/wordprocessingDrawing" xmlns:wp="http://schemas.openxmlformats.org/drawingml/2006/wordprocessingDrawing" xmlns:w10="urn:schemas-microsoft-com:office:word" xmlns:w="http://schemas.openxmlformats.org/wordprocessingml/2006/main" xmlns:w14="http://schemas.microsoft.com/office/word/2010/wordml" xmlns:w15="http://schemas.microsoft.com/office/word/2012/wordml" xmlns:w16cex="http://schemas.microsoft.com/office/word/2018/wordml/cex" xmlns:w16cid="http://schemas.microsoft.com/office/word/2016/wordml/cid" xmlns:w16="http://schemas.microsoft.com/office/word/2018/wordml" xmlns:w16du="http://schemas.microsoft.com/office/word/2023/wordml/word16du" xmlns:w16sdtdh="http://schemas.microsoft.com/office/word/2020/wordml/sdtdatahash" xmlns:w16sdtfl="http://schemas.microsoft.com/office/word/2024/wordml/sdtformatlock" xmlns:w16se="http://schemas.microsoft.com/office/word/2015/wordml/symex" xmlns:wpg="http://schemas.microsoft.com/office/word/2010/wordprocessingGroup" xmlns:wpi="http://schemas.microsoft.com/office/word/2010/wordprocessingInk" xmlns:wne="http://schemas.microsoft.com/office/word/2006/wordml" xmlns:wps="http://schemas.microsoft.com/office/word/2010/wordprocessingShape" mc:Ignorable="w14 w15 w16se w16cid w16 w16cex w16sdtdh w16sdtfl w16du wp14">
   <w:abstractNum w:abstractNumId="0" w15:restartNumberingAfterBreak="0">
+    <w:nsid w:val="049D3861"/>
+    <w:multiLevelType w:val="hybridMultilevel"/>
+    <w:tmpl w:val="2B7203E2"/>
+    <w:lvl w:ilvl="0" w:tplc="0809000F">
+      <w:start w:val="1"/>
+      <w:numFmt w:val="decimal"/>
+      <w:lvlText w:val="%1."/>
+      <w:lvlJc w:val="left"/>
+      <w:pPr>
+        <w:ind w:left="720" w:hanging="360"/>
+      </w:pPr>
+    </w:lvl>
+    <w:lvl w:ilvl="1" w:tplc="08090019" w:tentative="1">
+      <w:start w:val="1"/>
+      <w:numFmt w:val="lowerLetter"/>
+      <w:lvlText w:val="%2."/>
+      <w:lvlJc w:val="left"/>
+      <w:pPr>
+        <w:ind w:left="1440" w:hanging="360"/>
+      </w:pPr>
+    </w:lvl>
+    <w:lvl w:ilvl="2" w:tplc="0809001B" w:tentative="1">
+      <w:start w:val="1"/>
+      <w:numFmt w:val="lowerRoman"/>
+      <w:lvlText w:val="%3."/>
+      <w:lvlJc w:val="right"/>
+      <w:pPr>
+        <w:ind w:left="2160" w:hanging="180"/>
+      </w:pPr>
+    </w:lvl>
+    <w:lvl w:ilvl="3" w:tplc="0809000F" w:tentative="1">
+      <w:start w:val="1"/>
+      <w:numFmt w:val="decimal"/>
+      <w:lvlText w:val="%4."/>
+      <w:lvlJc w:val="left"/>
+      <w:pPr>
+        <w:ind w:left="2880" w:hanging="360"/>
+      </w:pPr>
+    </w:lvl>
+    <w:lvl w:ilvl="4" w:tplc="08090019" w:tentative="1">
+      <w:start w:val="1"/>
+      <w:numFmt w:val="lowerLetter"/>
+      <w:lvlText w:val="%5."/>
+      <w:lvlJc w:val="left"/>
+      <w:pPr>
+        <w:ind w:left="3600" w:hanging="360"/>
+      </w:pPr>
+    </w:lvl>
+    <w:lvl w:ilvl="5" w:tplc="0809001B" w:tentative="1">
+      <w:start w:val="1"/>
+      <w:numFmt w:val="lowerRoman"/>
+      <w:lvlText w:val="%6."/>
+      <w:lvlJc w:val="right"/>
+      <w:pPr>
+        <w:ind w:left="4320" w:hanging="180"/>
+      </w:pPr>
+    </w:lvl>
+    <w:lvl w:ilvl="6" w:tplc="0809000F" w:tentative="1">
+      <w:start w:val="1"/>
+      <w:numFmt w:val="decimal"/>
+      <w:lvlText w:val="%7."/>
+      <w:lvlJc w:val="left"/>
+      <w:pPr>
+        <w:ind w:left="5040" w:hanging="360"/>
+      </w:pPr>
+    </w:lvl>
+    <w:lvl w:ilvl="7" w:tplc="08090019" w:tentative="1">
+      <w:start w:val="1"/>
+      <w:numFmt w:val="lowerLetter"/>
+      <w:lvlText w:val="%8."/>
+      <w:lvlJc w:val="left"/>
+      <w:pPr>
+        <w:ind w:left="5760" w:hanging="360"/>
+      </w:pPr>
+    </w:lvl>
+    <w:lvl w:ilvl="8" w:tplc="0809001B" w:tentative="1">
+      <w:start w:val="1"/>
+      <w:numFmt w:val="lowerRoman"/>
+      <w:lvlText w:val="%9."/>
+      <w:lvlJc w:val="right"/>
+      <w:pPr>
+        <w:ind w:left="6480" w:hanging="180"/>
+      </w:pPr>
+    </w:lvl>
+  </w:abstractNum>
+  <w:abstractNum w:abstractNumId="1" w15:restartNumberingAfterBreak="0">
     <w:nsid w:val="0EC72BF8"/>
     <w:multiLevelType w:val="multilevel"/>
     <w:tmpl w:val="08090021"/>
@@ -12760,7 +13088,7 @@
       </w:rPr>
     </w:lvl>
   </w:abstractNum>
-  <w:abstractNum w:abstractNumId="1" w15:restartNumberingAfterBreak="0">
+  <w:abstractNum w:abstractNumId="2" w15:restartNumberingAfterBreak="0">
     <w:nsid w:val="1B0B24B8"/>
     <w:multiLevelType w:val="multilevel"/>
     <w:tmpl w:val="08090021"/>
@@ -12873,7 +13201,7 @@
       </w:rPr>
     </w:lvl>
   </w:abstractNum>
-  <w:abstractNum w:abstractNumId="2" w15:restartNumberingAfterBreak="0">
+  <w:abstractNum w:abstractNumId="3" w15:restartNumberingAfterBreak="0">
     <w:nsid w:val="2412109F"/>
     <w:multiLevelType w:val="multilevel"/>
     <w:tmpl w:val="0809001D"/>
@@ -12959,7 +13287,7 @@
       </w:pPr>
     </w:lvl>
   </w:abstractNum>
-  <w:abstractNum w:abstractNumId="3" w15:restartNumberingAfterBreak="0">
+  <w:abstractNum w:abstractNumId="4" w15:restartNumberingAfterBreak="0">
     <w:nsid w:val="2C336E97"/>
     <w:multiLevelType w:val="multilevel"/>
     <w:tmpl w:val="08090021"/>
@@ -13072,7 +13400,7 @@
       </w:rPr>
     </w:lvl>
   </w:abstractNum>
-  <w:abstractNum w:abstractNumId="4" w15:restartNumberingAfterBreak="0">
+  <w:abstractNum w:abstractNumId="5" w15:restartNumberingAfterBreak="0">
     <w:nsid w:val="2F8247BD"/>
     <w:multiLevelType w:val="hybridMultilevel"/>
     <w:tmpl w:val="BA84D5A2"/>
@@ -13185,7 +13513,7 @@
       </w:rPr>
     </w:lvl>
   </w:abstractNum>
-  <w:abstractNum w:abstractNumId="5" w15:restartNumberingAfterBreak="0">
+  <w:abstractNum w:abstractNumId="6" w15:restartNumberingAfterBreak="0">
     <w:nsid w:val="37F319B4"/>
     <w:multiLevelType w:val="multilevel"/>
     <w:tmpl w:val="08090021"/>
@@ -13298,7 +13626,7 @@
       </w:rPr>
     </w:lvl>
   </w:abstractNum>
-  <w:abstractNum w:abstractNumId="6" w15:restartNumberingAfterBreak="0">
+  <w:abstractNum w:abstractNumId="7" w15:restartNumberingAfterBreak="0">
     <w:nsid w:val="40AF4512"/>
     <w:multiLevelType w:val="hybridMultilevel"/>
     <w:tmpl w:val="0FDE075C"/>
@@ -13384,7 +13712,7 @@
       </w:pPr>
     </w:lvl>
   </w:abstractNum>
-  <w:abstractNum w:abstractNumId="7" w15:restartNumberingAfterBreak="0">
+  <w:abstractNum w:abstractNumId="8" w15:restartNumberingAfterBreak="0">
     <w:nsid w:val="431248B4"/>
     <w:multiLevelType w:val="hybridMultilevel"/>
     <w:tmpl w:val="D602CC28"/>
@@ -13497,7 +13825,7 @@
       </w:rPr>
     </w:lvl>
   </w:abstractNum>
-  <w:abstractNum w:abstractNumId="8" w15:restartNumberingAfterBreak="0">
+  <w:abstractNum w:abstractNumId="9" w15:restartNumberingAfterBreak="0">
     <w:nsid w:val="45A4738B"/>
     <w:multiLevelType w:val="hybridMultilevel"/>
     <w:tmpl w:val="D80CE256"/>
@@ -13583,7 +13911,7 @@
       </w:pPr>
     </w:lvl>
   </w:abstractNum>
-  <w:abstractNum w:abstractNumId="9" w15:restartNumberingAfterBreak="0">
+  <w:abstractNum w:abstractNumId="10" w15:restartNumberingAfterBreak="0">
     <w:nsid w:val="761549F7"/>
     <w:multiLevelType w:val="hybridMultilevel"/>
     <w:tmpl w:val="BB984282"/>
@@ -13697,34 +14025,37 @@
     </w:lvl>
   </w:abstractNum>
   <w:num w:numId="1" w16cid:durableId="1045789527">
-    <w:abstractNumId w:val="0"/>
+    <w:abstractNumId w:val="1"/>
   </w:num>
   <w:num w:numId="2" w16cid:durableId="353507854">
+    <w:abstractNumId w:val="6"/>
+  </w:num>
+  <w:num w:numId="3" w16cid:durableId="991444405">
+    <w:abstractNumId w:val="2"/>
+  </w:num>
+  <w:num w:numId="4" w16cid:durableId="1139609871">
+    <w:abstractNumId w:val="4"/>
+  </w:num>
+  <w:num w:numId="5" w16cid:durableId="1420440728">
+    <w:abstractNumId w:val="3"/>
+  </w:num>
+  <w:num w:numId="6" w16cid:durableId="1934971347">
+    <w:abstractNumId w:val="9"/>
+  </w:num>
+  <w:num w:numId="7" w16cid:durableId="936402260">
     <w:abstractNumId w:val="5"/>
   </w:num>
-  <w:num w:numId="3" w16cid:durableId="991444405">
-    <w:abstractNumId w:val="1"/>
+  <w:num w:numId="8" w16cid:durableId="105733699">
+    <w:abstractNumId w:val="10"/>
   </w:num>
-  <w:num w:numId="4" w16cid:durableId="1139609871">
-    <w:abstractNumId w:val="3"/>
-  </w:num>
-  <w:num w:numId="5" w16cid:durableId="1420440728">
-    <w:abstractNumId w:val="2"/>
-  </w:num>
-  <w:num w:numId="6" w16cid:durableId="1934971347">
+  <w:num w:numId="9" w16cid:durableId="1433623129">
     <w:abstractNumId w:val="8"/>
   </w:num>
-  <w:num w:numId="7" w16cid:durableId="936402260">
-    <w:abstractNumId w:val="4"/>
-  </w:num>
-  <w:num w:numId="8" w16cid:durableId="105733699">
-    <w:abstractNumId w:val="9"/>
-  </w:num>
-  <w:num w:numId="9" w16cid:durableId="1433623129">
+  <w:num w:numId="10" w16cid:durableId="1522357451">
     <w:abstractNumId w:val="7"/>
   </w:num>
-  <w:num w:numId="10" w16cid:durableId="1522357451">
-    <w:abstractNumId w:val="6"/>
+  <w:num w:numId="11" w16cid:durableId="1589726529">
+    <w:abstractNumId w:val="0"/>
   </w:num>
 </w:numbering>
 </file>
@@ -14746,6 +15077,45 @@
       </w:tcPr>
     </w:tblStylePr>
   </w:style>
+  <w:style w:type="paragraph" w:styleId="NormalWeb">
+    <w:name w:val="Normal (Web)"/>
+    <w:basedOn w:val="Normal"/>
+    <w:uiPriority w:val="99"/>
+    <w:unhideWhenUsed/>
+    <w:rsid w:val="008B250D"/>
+    <w:pPr>
+      <w:spacing w:before="100" w:beforeAutospacing="1" w:after="100" w:afterAutospacing="1" w:line="240" w:lineRule="auto"/>
+    </w:pPr>
+    <w:rPr>
+      <w:rFonts w:ascii="Times New Roman" w:eastAsia="Times New Roman" w:hAnsi="Times New Roman" w:cs="Times New Roman"/>
+      <w:kern w:val="0"/>
+      <w:lang w:eastAsia="en-GB"/>
+      <w14:ligatures w14:val="none"/>
+    </w:rPr>
+  </w:style>
+  <w:style w:type="character" w:styleId="Hyperlink">
+    <w:name w:val="Hyperlink"/>
+    <w:basedOn w:val="DefaultParagraphFont"/>
+    <w:uiPriority w:val="99"/>
+    <w:unhideWhenUsed/>
+    <w:rsid w:val="008B250D"/>
+    <w:rPr>
+      <w:color w:val="467886" w:themeColor="hyperlink"/>
+      <w:u w:val="single"/>
+    </w:rPr>
+  </w:style>
+  <w:style w:type="character" w:styleId="UnresolvedMention">
+    <w:name w:val="Unresolved Mention"/>
+    <w:basedOn w:val="DefaultParagraphFont"/>
+    <w:uiPriority w:val="99"/>
+    <w:semiHidden/>
+    <w:unhideWhenUsed/>
+    <w:rsid w:val="008B250D"/>
+    <w:rPr>
+      <w:color w:val="605E5C"/>
+      <w:shd w:val="clear" w:color="auto" w:fill="E1DFDD"/>
+    </w:rPr>
+  </w:style>
 </w:styles>
 </file>
 

</xml_diff>